<commit_message>
Guide Rev31: lettere greche e segni combinati in Calibri nel testo corrente
Manrope, font del corpo del modello ITEC, disegna η, ν e χ con i contorni di
n, v e x e non ha il macron combinato, il primo, il meno in apice, ₐ e ℓ:
nei PDF "η" si leggeva "n" (anche nella Rev30) e i segni mancanti venivano
da Times New Roman (N̄ con la barra spostata). Build-AntheaGuides-Itec.py
mette questi caratteri, nel testo corrente, in run con Calibri, font del
tema del modello; il resto del testo e le formule OMML non cambiano.
Rev31 rigenerata con la pipeline completa: 65 e 134 pagine, frammenti e 319
formule conservati, 26 parti del modello ITEC identiche. Nei PDF nessun
carattere greco o combinato resta in Manrope o Times; nessuna espressione
vietata da W0.4. Profilo quick: 18 PASS, 0 NEW-FAIL.

Co-Authored-By: Claude Opus 5.5 <noreply@anthropic.com>
</commit_message>
<xml_diff>
--- a/supporto/documentazione/Guide_ANTHEA/ANTHEA_Guida_pratica_ITEC_Rev31.docx
+++ b/supporto/documentazione/Guide_ANTHEA/ANTHEA_Guida_pratica_ITEC_Rev31.docx
@@ -2334,7 +2334,7 @@
       <w:r>
         <w:fldChar w:fldCharType="separate"/>
       </w:r>
-      <w:hyperlink w:anchor="_Toc242228758" w:history="1">
+      <w:hyperlink w:anchor="_Toc242229524" w:history="1">
         <w:r>
           <w:rPr>
             <w:rStyle w:val="Collegamentoipertestuale"/>
@@ -2382,7 +2382,7 @@
             <w:noProof/>
             <w:webHidden/>
           </w:rPr>
-          <w:instrText xml:space="preserve"> PAGEREF _Toc242228758 \h </w:instrText>
+          <w:instrText xml:space="preserve"> PAGEREF _Toc242229524 \h </w:instrText>
         </w:r>
         <w:r>
           <w:rPr>
@@ -2429,7 +2429,7 @@
           <w14:ligatures w14:val="standardContextual"/>
         </w:rPr>
       </w:pPr>
-      <w:hyperlink w:anchor="_Toc242228759" w:history="1">
+      <w:hyperlink w:anchor="_Toc242229525" w:history="1">
         <w:r>
           <w:rPr>
             <w:rStyle w:val="Collegamentoipertestuale"/>
@@ -2474,7 +2474,7 @@
             <w:noProof/>
             <w:webHidden/>
           </w:rPr>
-          <w:instrText xml:space="preserve"> PAGEREF _Toc242228759 \h </w:instrText>
+          <w:instrText xml:space="preserve"> PAGEREF _Toc242229525 \h </w:instrText>
         </w:r>
         <w:r>
           <w:rPr>
@@ -2521,7 +2521,7 @@
           <w14:ligatures w14:val="standardContextual"/>
         </w:rPr>
       </w:pPr>
-      <w:hyperlink w:anchor="_Toc242228760" w:history="1">
+      <w:hyperlink w:anchor="_Toc242229526" w:history="1">
         <w:r>
           <w:rPr>
             <w:rStyle w:val="Collegamentoipertestuale"/>
@@ -2566,7 +2566,7 @@
             <w:noProof/>
             <w:webHidden/>
           </w:rPr>
-          <w:instrText xml:space="preserve"> PAGEREF _Toc242228760 \h </w:instrText>
+          <w:instrText xml:space="preserve"> PAGEREF _Toc242229526 \h </w:instrText>
         </w:r>
         <w:r>
           <w:rPr>
@@ -2613,7 +2613,7 @@
           <w14:ligatures w14:val="standardContextual"/>
         </w:rPr>
       </w:pPr>
-      <w:hyperlink w:anchor="_Toc242228761" w:history="1">
+      <w:hyperlink w:anchor="_Toc242229527" w:history="1">
         <w:r>
           <w:rPr>
             <w:rStyle w:val="Collegamentoipertestuale"/>
@@ -2658,7 +2658,7 @@
             <w:noProof/>
             <w:webHidden/>
           </w:rPr>
-          <w:instrText xml:space="preserve"> PAGEREF _Toc242228761 \h </w:instrText>
+          <w:instrText xml:space="preserve"> PAGEREF _Toc242229527 \h </w:instrText>
         </w:r>
         <w:r>
           <w:rPr>
@@ -2705,7 +2705,7 @@
           <w14:ligatures w14:val="standardContextual"/>
         </w:rPr>
       </w:pPr>
-      <w:hyperlink w:anchor="_Toc242228762" w:history="1">
+      <w:hyperlink w:anchor="_Toc242229528" w:history="1">
         <w:r>
           <w:rPr>
             <w:rStyle w:val="Collegamentoipertestuale"/>
@@ -2750,7 +2750,7 @@
             <w:noProof/>
             <w:webHidden/>
           </w:rPr>
-          <w:instrText xml:space="preserve"> PAGEREF _Toc242228762 \h </w:instrText>
+          <w:instrText xml:space="preserve"> PAGEREF _Toc242229528 \h </w:instrText>
         </w:r>
         <w:r>
           <w:rPr>
@@ -2796,7 +2796,7 @@
           <w14:ligatures w14:val="standardContextual"/>
         </w:rPr>
       </w:pPr>
-      <w:hyperlink w:anchor="_Toc242228763" w:history="1">
+      <w:hyperlink w:anchor="_Toc242229529" w:history="1">
         <w:r>
           <w:rPr>
             <w:rStyle w:val="Collegamentoipertestuale"/>
@@ -2844,7 +2844,7 @@
             <w:noProof/>
             <w:webHidden/>
           </w:rPr>
-          <w:instrText xml:space="preserve"> PAGEREF _Toc242228763 \h </w:instrText>
+          <w:instrText xml:space="preserve"> PAGEREF _Toc242229529 \h </w:instrText>
         </w:r>
         <w:r>
           <w:rPr>
@@ -2891,7 +2891,7 @@
           <w14:ligatures w14:val="standardContextual"/>
         </w:rPr>
       </w:pPr>
-      <w:hyperlink w:anchor="_Toc242228764" w:history="1">
+      <w:hyperlink w:anchor="_Toc242229530" w:history="1">
         <w:r>
           <w:rPr>
             <w:rStyle w:val="Collegamentoipertestuale"/>
@@ -2936,7 +2936,7 @@
             <w:noProof/>
             <w:webHidden/>
           </w:rPr>
-          <w:instrText xml:space="preserve"> PAGEREF _Toc242228764 \h </w:instrText>
+          <w:instrText xml:space="preserve"> PAGEREF _Toc242229530 \h </w:instrText>
         </w:r>
         <w:r>
           <w:rPr>
@@ -2983,7 +2983,7 @@
           <w14:ligatures w14:val="standardContextual"/>
         </w:rPr>
       </w:pPr>
-      <w:hyperlink w:anchor="_Toc242228765" w:history="1">
+      <w:hyperlink w:anchor="_Toc242229531" w:history="1">
         <w:r>
           <w:rPr>
             <w:rStyle w:val="Collegamentoipertestuale"/>
@@ -3028,7 +3028,7 @@
             <w:noProof/>
             <w:webHidden/>
           </w:rPr>
-          <w:instrText xml:space="preserve"> PAGEREF _Toc242228765 \h </w:instrText>
+          <w:instrText xml:space="preserve"> PAGEREF _Toc242229531 \h </w:instrText>
         </w:r>
         <w:r>
           <w:rPr>
@@ -3075,7 +3075,7 @@
           <w14:ligatures w14:val="standardContextual"/>
         </w:rPr>
       </w:pPr>
-      <w:hyperlink w:anchor="_Toc242228766" w:history="1">
+      <w:hyperlink w:anchor="_Toc242229532" w:history="1">
         <w:r>
           <w:rPr>
             <w:rStyle w:val="Collegamentoipertestuale"/>
@@ -3120,7 +3120,7 @@
             <w:noProof/>
             <w:webHidden/>
           </w:rPr>
-          <w:instrText xml:space="preserve"> PAGEREF _Toc242228766 \h </w:instrText>
+          <w:instrText xml:space="preserve"> PAGEREF _Toc242229532 \h </w:instrText>
         </w:r>
         <w:r>
           <w:rPr>
@@ -3167,7 +3167,7 @@
           <w14:ligatures w14:val="standardContextual"/>
         </w:rPr>
       </w:pPr>
-      <w:hyperlink w:anchor="_Toc242228767" w:history="1">
+      <w:hyperlink w:anchor="_Toc242229533" w:history="1">
         <w:r>
           <w:rPr>
             <w:rStyle w:val="Collegamentoipertestuale"/>
@@ -3212,7 +3212,7 @@
             <w:noProof/>
             <w:webHidden/>
           </w:rPr>
-          <w:instrText xml:space="preserve"> PAGEREF _Toc242228767 \h </w:instrText>
+          <w:instrText xml:space="preserve"> PAGEREF _Toc242229533 \h </w:instrText>
         </w:r>
         <w:r>
           <w:rPr>
@@ -3259,7 +3259,7 @@
           <w14:ligatures w14:val="standardContextual"/>
         </w:rPr>
       </w:pPr>
-      <w:hyperlink w:anchor="_Toc242228768" w:history="1">
+      <w:hyperlink w:anchor="_Toc242229534" w:history="1">
         <w:r>
           <w:rPr>
             <w:rStyle w:val="Collegamentoipertestuale"/>
@@ -3304,7 +3304,7 @@
             <w:noProof/>
             <w:webHidden/>
           </w:rPr>
-          <w:instrText xml:space="preserve"> PAGEREF _Toc242228768 \h </w:instrText>
+          <w:instrText xml:space="preserve"> PAGEREF _Toc242229534 \h </w:instrText>
         </w:r>
         <w:r>
           <w:rPr>
@@ -3351,7 +3351,7 @@
           <w14:ligatures w14:val="standardContextual"/>
         </w:rPr>
       </w:pPr>
-      <w:hyperlink w:anchor="_Toc242228769" w:history="1">
+      <w:hyperlink w:anchor="_Toc242229535" w:history="1">
         <w:r>
           <w:rPr>
             <w:rStyle w:val="Collegamentoipertestuale"/>
@@ -3396,7 +3396,7 @@
             <w:noProof/>
             <w:webHidden/>
           </w:rPr>
-          <w:instrText xml:space="preserve"> PAGEREF _Toc242228769 \h </w:instrText>
+          <w:instrText xml:space="preserve"> PAGEREF _Toc242229535 \h </w:instrText>
         </w:r>
         <w:r>
           <w:rPr>
@@ -3442,7 +3442,7 @@
           <w14:ligatures w14:val="standardContextual"/>
         </w:rPr>
       </w:pPr>
-      <w:hyperlink w:anchor="_Toc242228770" w:history="1">
+      <w:hyperlink w:anchor="_Toc242229536" w:history="1">
         <w:r>
           <w:rPr>
             <w:rStyle w:val="Collegamentoipertestuale"/>
@@ -3490,7 +3490,7 @@
             <w:noProof/>
             <w:webHidden/>
           </w:rPr>
-          <w:instrText xml:space="preserve"> PAGEREF _Toc242228770 \h </w:instrText>
+          <w:instrText xml:space="preserve"> PAGEREF _Toc242229536 \h </w:instrText>
         </w:r>
         <w:r>
           <w:rPr>
@@ -3537,7 +3537,7 @@
           <w14:ligatures w14:val="standardContextual"/>
         </w:rPr>
       </w:pPr>
-      <w:hyperlink w:anchor="_Toc242228771" w:history="1">
+      <w:hyperlink w:anchor="_Toc242229537" w:history="1">
         <w:r>
           <w:rPr>
             <w:rStyle w:val="Collegamentoipertestuale"/>
@@ -3582,7 +3582,7 @@
             <w:noProof/>
             <w:webHidden/>
           </w:rPr>
-          <w:instrText xml:space="preserve"> PAGEREF _Toc242228771 \h </w:instrText>
+          <w:instrText xml:space="preserve"> PAGEREF _Toc242229537 \h </w:instrText>
         </w:r>
         <w:r>
           <w:rPr>
@@ -3629,7 +3629,7 @@
           <w14:ligatures w14:val="standardContextual"/>
         </w:rPr>
       </w:pPr>
-      <w:hyperlink w:anchor="_Toc242228772" w:history="1">
+      <w:hyperlink w:anchor="_Toc242229538" w:history="1">
         <w:r>
           <w:rPr>
             <w:rStyle w:val="Collegamentoipertestuale"/>
@@ -3674,7 +3674,7 @@
             <w:noProof/>
             <w:webHidden/>
           </w:rPr>
-          <w:instrText xml:space="preserve"> PAGEREF _Toc242228772 \h </w:instrText>
+          <w:instrText xml:space="preserve"> PAGEREF _Toc242229538 \h </w:instrText>
         </w:r>
         <w:r>
           <w:rPr>
@@ -3720,7 +3720,7 @@
           <w14:ligatures w14:val="standardContextual"/>
         </w:rPr>
       </w:pPr>
-      <w:hyperlink w:anchor="_Toc242228773" w:history="1">
+      <w:hyperlink w:anchor="_Toc242229539" w:history="1">
         <w:r>
           <w:rPr>
             <w:rStyle w:val="Collegamentoipertestuale"/>
@@ -3768,7 +3768,7 @@
             <w:noProof/>
             <w:webHidden/>
           </w:rPr>
-          <w:instrText xml:space="preserve"> PAGEREF _Toc242228773 \h </w:instrText>
+          <w:instrText xml:space="preserve"> PAGEREF _Toc242229539 \h </w:instrText>
         </w:r>
         <w:r>
           <w:rPr>
@@ -3815,7 +3815,7 @@
           <w14:ligatures w14:val="standardContextual"/>
         </w:rPr>
       </w:pPr>
-      <w:hyperlink w:anchor="_Toc242228774" w:history="1">
+      <w:hyperlink w:anchor="_Toc242229540" w:history="1">
         <w:r>
           <w:rPr>
             <w:rStyle w:val="Collegamentoipertestuale"/>
@@ -3860,7 +3860,7 @@
             <w:noProof/>
             <w:webHidden/>
           </w:rPr>
-          <w:instrText xml:space="preserve"> PAGEREF _Toc242228774 \h </w:instrText>
+          <w:instrText xml:space="preserve"> PAGEREF _Toc242229540 \h </w:instrText>
         </w:r>
         <w:r>
           <w:rPr>
@@ -3907,7 +3907,7 @@
           <w14:ligatures w14:val="standardContextual"/>
         </w:rPr>
       </w:pPr>
-      <w:hyperlink w:anchor="_Toc242228775" w:history="1">
+      <w:hyperlink w:anchor="_Toc242229541" w:history="1">
         <w:r>
           <w:rPr>
             <w:rStyle w:val="Collegamentoipertestuale"/>
@@ -3952,7 +3952,7 @@
             <w:noProof/>
             <w:webHidden/>
           </w:rPr>
-          <w:instrText xml:space="preserve"> PAGEREF _Toc242228775 \h </w:instrText>
+          <w:instrText xml:space="preserve"> PAGEREF _Toc242229541 \h </w:instrText>
         </w:r>
         <w:r>
           <w:rPr>
@@ -3999,7 +3999,7 @@
           <w14:ligatures w14:val="standardContextual"/>
         </w:rPr>
       </w:pPr>
-      <w:hyperlink w:anchor="_Toc242228776" w:history="1">
+      <w:hyperlink w:anchor="_Toc242229542" w:history="1">
         <w:r>
           <w:rPr>
             <w:rStyle w:val="Collegamentoipertestuale"/>
@@ -4044,7 +4044,7 @@
             <w:noProof/>
             <w:webHidden/>
           </w:rPr>
-          <w:instrText xml:space="preserve"> PAGEREF _Toc242228776 \h </w:instrText>
+          <w:instrText xml:space="preserve"> PAGEREF _Toc242229542 \h </w:instrText>
         </w:r>
         <w:r>
           <w:rPr>
@@ -4091,7 +4091,7 @@
           <w14:ligatures w14:val="standardContextual"/>
         </w:rPr>
       </w:pPr>
-      <w:hyperlink w:anchor="_Toc242228777" w:history="1">
+      <w:hyperlink w:anchor="_Toc242229543" w:history="1">
         <w:r>
           <w:rPr>
             <w:rStyle w:val="Collegamentoipertestuale"/>
@@ -4136,7 +4136,7 @@
             <w:noProof/>
             <w:webHidden/>
           </w:rPr>
-          <w:instrText xml:space="preserve"> PAGEREF _Toc242228777 \h </w:instrText>
+          <w:instrText xml:space="preserve"> PAGEREF _Toc242229543 \h </w:instrText>
         </w:r>
         <w:r>
           <w:rPr>
@@ -4182,7 +4182,7 @@
           <w14:ligatures w14:val="standardContextual"/>
         </w:rPr>
       </w:pPr>
-      <w:hyperlink w:anchor="_Toc242228778" w:history="1">
+      <w:hyperlink w:anchor="_Toc242229544" w:history="1">
         <w:r>
           <w:rPr>
             <w:rStyle w:val="Collegamentoipertestuale"/>
@@ -4230,7 +4230,7 @@
             <w:noProof/>
             <w:webHidden/>
           </w:rPr>
-          <w:instrText xml:space="preserve"> PAGEREF _Toc242228778 \h </w:instrText>
+          <w:instrText xml:space="preserve"> PAGEREF _Toc242229544 \h </w:instrText>
         </w:r>
         <w:r>
           <w:rPr>
@@ -4277,7 +4277,7 @@
           <w14:ligatures w14:val="standardContextual"/>
         </w:rPr>
       </w:pPr>
-      <w:hyperlink w:anchor="_Toc242228779" w:history="1">
+      <w:hyperlink w:anchor="_Toc242229545" w:history="1">
         <w:r>
           <w:rPr>
             <w:rStyle w:val="Collegamentoipertestuale"/>
@@ -4322,7 +4322,7 @@
             <w:noProof/>
             <w:webHidden/>
           </w:rPr>
-          <w:instrText xml:space="preserve"> PAGEREF _Toc242228779 \h </w:instrText>
+          <w:instrText xml:space="preserve"> PAGEREF _Toc242229545 \h </w:instrText>
         </w:r>
         <w:r>
           <w:rPr>
@@ -4369,7 +4369,7 @@
           <w14:ligatures w14:val="standardContextual"/>
         </w:rPr>
       </w:pPr>
-      <w:hyperlink w:anchor="_Toc242228780" w:history="1">
+      <w:hyperlink w:anchor="_Toc242229546" w:history="1">
         <w:r>
           <w:rPr>
             <w:rStyle w:val="Collegamentoipertestuale"/>
@@ -4414,7 +4414,7 @@
             <w:noProof/>
             <w:webHidden/>
           </w:rPr>
-          <w:instrText xml:space="preserve"> PAGEREF _Toc242228780 \h </w:instrText>
+          <w:instrText xml:space="preserve"> PAGEREF _Toc242229546 \h </w:instrText>
         </w:r>
         <w:r>
           <w:rPr>
@@ -4460,7 +4460,7 @@
           <w14:ligatures w14:val="standardContextual"/>
         </w:rPr>
       </w:pPr>
-      <w:hyperlink w:anchor="_Toc242228781" w:history="1">
+      <w:hyperlink w:anchor="_Toc242229547" w:history="1">
         <w:r>
           <w:rPr>
             <w:rStyle w:val="Collegamentoipertestuale"/>
@@ -4508,7 +4508,7 @@
             <w:noProof/>
             <w:webHidden/>
           </w:rPr>
-          <w:instrText xml:space="preserve"> PAGEREF _Toc242228781 \h </w:instrText>
+          <w:instrText xml:space="preserve"> PAGEREF _Toc242229547 \h </w:instrText>
         </w:r>
         <w:r>
           <w:rPr>
@@ -4555,7 +4555,7 @@
           <w14:ligatures w14:val="standardContextual"/>
         </w:rPr>
       </w:pPr>
-      <w:hyperlink w:anchor="_Toc242228782" w:history="1">
+      <w:hyperlink w:anchor="_Toc242229548" w:history="1">
         <w:r>
           <w:rPr>
             <w:rStyle w:val="Collegamentoipertestuale"/>
@@ -4600,7 +4600,7 @@
             <w:noProof/>
             <w:webHidden/>
           </w:rPr>
-          <w:instrText xml:space="preserve"> PAGEREF _Toc242228782 \h </w:instrText>
+          <w:instrText xml:space="preserve"> PAGEREF _Toc242229548 \h </w:instrText>
         </w:r>
         <w:r>
           <w:rPr>
@@ -4647,7 +4647,7 @@
           <w14:ligatures w14:val="standardContextual"/>
         </w:rPr>
       </w:pPr>
-      <w:hyperlink w:anchor="_Toc242228783" w:history="1">
+      <w:hyperlink w:anchor="_Toc242229549" w:history="1">
         <w:r>
           <w:rPr>
             <w:rStyle w:val="Collegamentoipertestuale"/>
@@ -4692,7 +4692,7 @@
             <w:noProof/>
             <w:webHidden/>
           </w:rPr>
-          <w:instrText xml:space="preserve"> PAGEREF _Toc242228783 \h </w:instrText>
+          <w:instrText xml:space="preserve"> PAGEREF _Toc242229549 \h </w:instrText>
         </w:r>
         <w:r>
           <w:rPr>
@@ -4739,7 +4739,7 @@
           <w14:ligatures w14:val="standardContextual"/>
         </w:rPr>
       </w:pPr>
-      <w:hyperlink w:anchor="_Toc242228784" w:history="1">
+      <w:hyperlink w:anchor="_Toc242229550" w:history="1">
         <w:r>
           <w:rPr>
             <w:rStyle w:val="Collegamentoipertestuale"/>
@@ -4784,7 +4784,7 @@
             <w:noProof/>
             <w:webHidden/>
           </w:rPr>
-          <w:instrText xml:space="preserve"> PAGEREF _Toc242228784 \h </w:instrText>
+          <w:instrText xml:space="preserve"> PAGEREF _Toc242229550 \h </w:instrText>
         </w:r>
         <w:r>
           <w:rPr>
@@ -4831,7 +4831,7 @@
           <w14:ligatures w14:val="standardContextual"/>
         </w:rPr>
       </w:pPr>
-      <w:hyperlink w:anchor="_Toc242228785" w:history="1">
+      <w:hyperlink w:anchor="_Toc242229551" w:history="1">
         <w:r>
           <w:rPr>
             <w:rStyle w:val="Collegamentoipertestuale"/>
@@ -4876,7 +4876,7 @@
             <w:noProof/>
             <w:webHidden/>
           </w:rPr>
-          <w:instrText xml:space="preserve"> PAGEREF _Toc242228785 \h </w:instrText>
+          <w:instrText xml:space="preserve"> PAGEREF _Toc242229551 \h </w:instrText>
         </w:r>
         <w:r>
           <w:rPr>
@@ -4923,7 +4923,7 @@
           <w14:ligatures w14:val="standardContextual"/>
         </w:rPr>
       </w:pPr>
-      <w:hyperlink w:anchor="_Toc242228786" w:history="1">
+      <w:hyperlink w:anchor="_Toc242229552" w:history="1">
         <w:r>
           <w:rPr>
             <w:rStyle w:val="Collegamentoipertestuale"/>
@@ -4968,7 +4968,7 @@
             <w:noProof/>
             <w:webHidden/>
           </w:rPr>
-          <w:instrText xml:space="preserve"> PAGEREF _Toc242228786 \h </w:instrText>
+          <w:instrText xml:space="preserve"> PAGEREF _Toc242229552 \h </w:instrText>
         </w:r>
         <w:r>
           <w:rPr>
@@ -5014,7 +5014,7 @@
           <w14:ligatures w14:val="standardContextual"/>
         </w:rPr>
       </w:pPr>
-      <w:hyperlink w:anchor="_Toc242228787" w:history="1">
+      <w:hyperlink w:anchor="_Toc242229553" w:history="1">
         <w:r>
           <w:rPr>
             <w:rStyle w:val="Collegamentoipertestuale"/>
@@ -5062,7 +5062,7 @@
             <w:noProof/>
             <w:webHidden/>
           </w:rPr>
-          <w:instrText xml:space="preserve"> PAGEREF _Toc242228787 \h </w:instrText>
+          <w:instrText xml:space="preserve"> PAGEREF _Toc242229553 \h </w:instrText>
         </w:r>
         <w:r>
           <w:rPr>
@@ -5109,7 +5109,7 @@
           <w14:ligatures w14:val="standardContextual"/>
         </w:rPr>
       </w:pPr>
-      <w:hyperlink w:anchor="_Toc242228788" w:history="1">
+      <w:hyperlink w:anchor="_Toc242229554" w:history="1">
         <w:r>
           <w:rPr>
             <w:rStyle w:val="Collegamentoipertestuale"/>
@@ -5154,7 +5154,7 @@
             <w:noProof/>
             <w:webHidden/>
           </w:rPr>
-          <w:instrText xml:space="preserve"> PAGEREF _Toc242228788 \h </w:instrText>
+          <w:instrText xml:space="preserve"> PAGEREF _Toc242229554 \h </w:instrText>
         </w:r>
         <w:r>
           <w:rPr>
@@ -5201,7 +5201,7 @@
           <w14:ligatures w14:val="standardContextual"/>
         </w:rPr>
       </w:pPr>
-      <w:hyperlink w:anchor="_Toc242228789" w:history="1">
+      <w:hyperlink w:anchor="_Toc242229555" w:history="1">
         <w:r>
           <w:rPr>
             <w:rStyle w:val="Collegamentoipertestuale"/>
@@ -5246,7 +5246,7 @@
             <w:noProof/>
             <w:webHidden/>
           </w:rPr>
-          <w:instrText xml:space="preserve"> PAGEREF _Toc242228789 \h </w:instrText>
+          <w:instrText xml:space="preserve"> PAGEREF _Toc242229555 \h </w:instrText>
         </w:r>
         <w:r>
           <w:rPr>
@@ -5293,7 +5293,7 @@
           <w14:ligatures w14:val="standardContextual"/>
         </w:rPr>
       </w:pPr>
-      <w:hyperlink w:anchor="_Toc242228790" w:history="1">
+      <w:hyperlink w:anchor="_Toc242229556" w:history="1">
         <w:r>
           <w:rPr>
             <w:rStyle w:val="Collegamentoipertestuale"/>
@@ -5338,7 +5338,7 @@
             <w:noProof/>
             <w:webHidden/>
           </w:rPr>
-          <w:instrText xml:space="preserve"> PAGEREF _Toc242228790 \h </w:instrText>
+          <w:instrText xml:space="preserve"> PAGEREF _Toc242229556 \h </w:instrText>
         </w:r>
         <w:r>
           <w:rPr>
@@ -5385,7 +5385,7 @@
           <w14:ligatures w14:val="standardContextual"/>
         </w:rPr>
       </w:pPr>
-      <w:hyperlink w:anchor="_Toc242228791" w:history="1">
+      <w:hyperlink w:anchor="_Toc242229557" w:history="1">
         <w:r>
           <w:rPr>
             <w:rStyle w:val="Collegamentoipertestuale"/>
@@ -5430,7 +5430,7 @@
             <w:noProof/>
             <w:webHidden/>
           </w:rPr>
-          <w:instrText xml:space="preserve"> PAGEREF _Toc242228791 \h </w:instrText>
+          <w:instrText xml:space="preserve"> PAGEREF _Toc242229557 \h </w:instrText>
         </w:r>
         <w:r>
           <w:rPr>
@@ -5477,7 +5477,7 @@
           <w14:ligatures w14:val="standardContextual"/>
         </w:rPr>
       </w:pPr>
-      <w:hyperlink w:anchor="_Toc242228792" w:history="1">
+      <w:hyperlink w:anchor="_Toc242229558" w:history="1">
         <w:r>
           <w:rPr>
             <w:rStyle w:val="Collegamentoipertestuale"/>
@@ -5522,7 +5522,7 @@
             <w:noProof/>
             <w:webHidden/>
           </w:rPr>
-          <w:instrText xml:space="preserve"> PAGEREF _Toc242228792 \h </w:instrText>
+          <w:instrText xml:space="preserve"> PAGEREF _Toc242229558 \h </w:instrText>
         </w:r>
         <w:r>
           <w:rPr>
@@ -5569,7 +5569,7 @@
           <w14:ligatures w14:val="standardContextual"/>
         </w:rPr>
       </w:pPr>
-      <w:hyperlink w:anchor="_Toc242228793" w:history="1">
+      <w:hyperlink w:anchor="_Toc242229559" w:history="1">
         <w:r>
           <w:rPr>
             <w:rStyle w:val="Collegamentoipertestuale"/>
@@ -5614,7 +5614,7 @@
             <w:noProof/>
             <w:webHidden/>
           </w:rPr>
-          <w:instrText xml:space="preserve"> PAGEREF _Toc242228793 \h </w:instrText>
+          <w:instrText xml:space="preserve"> PAGEREF _Toc242229559 \h </w:instrText>
         </w:r>
         <w:r>
           <w:rPr>
@@ -5661,7 +5661,7 @@
           <w14:ligatures w14:val="standardContextual"/>
         </w:rPr>
       </w:pPr>
-      <w:hyperlink w:anchor="_Toc242228794" w:history="1">
+      <w:hyperlink w:anchor="_Toc242229560" w:history="1">
         <w:r>
           <w:rPr>
             <w:rStyle w:val="Collegamentoipertestuale"/>
@@ -5706,7 +5706,7 @@
             <w:noProof/>
             <w:webHidden/>
           </w:rPr>
-          <w:instrText xml:space="preserve"> PAGEREF _Toc242228794 \h </w:instrText>
+          <w:instrText xml:space="preserve"> PAGEREF _Toc242229560 \h </w:instrText>
         </w:r>
         <w:r>
           <w:rPr>
@@ -5753,7 +5753,7 @@
           <w14:ligatures w14:val="standardContextual"/>
         </w:rPr>
       </w:pPr>
-      <w:hyperlink w:anchor="_Toc242228795" w:history="1">
+      <w:hyperlink w:anchor="_Toc242229561" w:history="1">
         <w:r>
           <w:rPr>
             <w:rStyle w:val="Collegamentoipertestuale"/>
@@ -5798,7 +5798,7 @@
             <w:noProof/>
             <w:webHidden/>
           </w:rPr>
-          <w:instrText xml:space="preserve"> PAGEREF _Toc242228795 \h </w:instrText>
+          <w:instrText xml:space="preserve"> PAGEREF _Toc242229561 \h </w:instrText>
         </w:r>
         <w:r>
           <w:rPr>
@@ -5845,7 +5845,7 @@
           <w14:ligatures w14:val="standardContextual"/>
         </w:rPr>
       </w:pPr>
-      <w:hyperlink w:anchor="_Toc242228796" w:history="1">
+      <w:hyperlink w:anchor="_Toc242229562" w:history="1">
         <w:r>
           <w:rPr>
             <w:rStyle w:val="Collegamentoipertestuale"/>
@@ -5890,7 +5890,7 @@
             <w:noProof/>
             <w:webHidden/>
           </w:rPr>
-          <w:instrText xml:space="preserve"> PAGEREF _Toc242228796 \h </w:instrText>
+          <w:instrText xml:space="preserve"> PAGEREF _Toc242229562 \h </w:instrText>
         </w:r>
         <w:r>
           <w:rPr>
@@ -5936,7 +5936,7 @@
           <w14:ligatures w14:val="standardContextual"/>
         </w:rPr>
       </w:pPr>
-      <w:hyperlink w:anchor="_Toc242228797" w:history="1">
+      <w:hyperlink w:anchor="_Toc242229563" w:history="1">
         <w:r>
           <w:rPr>
             <w:rStyle w:val="Collegamentoipertestuale"/>
@@ -5984,7 +5984,7 @@
             <w:noProof/>
             <w:webHidden/>
           </w:rPr>
-          <w:instrText xml:space="preserve"> PAGEREF _Toc242228797 \h </w:instrText>
+          <w:instrText xml:space="preserve"> PAGEREF _Toc242229563 \h </w:instrText>
         </w:r>
         <w:r>
           <w:rPr>
@@ -6031,7 +6031,7 @@
           <w14:ligatures w14:val="standardContextual"/>
         </w:rPr>
       </w:pPr>
-      <w:hyperlink w:anchor="_Toc242228798" w:history="1">
+      <w:hyperlink w:anchor="_Toc242229564" w:history="1">
         <w:r>
           <w:rPr>
             <w:rStyle w:val="Collegamentoipertestuale"/>
@@ -6076,7 +6076,7 @@
             <w:noProof/>
             <w:webHidden/>
           </w:rPr>
-          <w:instrText xml:space="preserve"> PAGEREF _Toc242228798 \h </w:instrText>
+          <w:instrText xml:space="preserve"> PAGEREF _Toc242229564 \h </w:instrText>
         </w:r>
         <w:r>
           <w:rPr>
@@ -6123,7 +6123,7 @@
           <w14:ligatures w14:val="standardContextual"/>
         </w:rPr>
       </w:pPr>
-      <w:hyperlink w:anchor="_Toc242228799" w:history="1">
+      <w:hyperlink w:anchor="_Toc242229565" w:history="1">
         <w:r>
           <w:rPr>
             <w:rStyle w:val="Collegamentoipertestuale"/>
@@ -6168,7 +6168,7 @@
             <w:noProof/>
             <w:webHidden/>
           </w:rPr>
-          <w:instrText xml:space="preserve"> PAGEREF _Toc242228799 \h </w:instrText>
+          <w:instrText xml:space="preserve"> PAGEREF _Toc242229565 \h </w:instrText>
         </w:r>
         <w:r>
           <w:rPr>
@@ -6215,7 +6215,7 @@
           <w14:ligatures w14:val="standardContextual"/>
         </w:rPr>
       </w:pPr>
-      <w:hyperlink w:anchor="_Toc242228800" w:history="1">
+      <w:hyperlink w:anchor="_Toc242229566" w:history="1">
         <w:r>
           <w:rPr>
             <w:rStyle w:val="Collegamentoipertestuale"/>
@@ -6260,7 +6260,7 @@
             <w:noProof/>
             <w:webHidden/>
           </w:rPr>
-          <w:instrText xml:space="preserve"> PAGEREF _Toc242228800 \h </w:instrText>
+          <w:instrText xml:space="preserve"> PAGEREF _Toc242229566 \h </w:instrText>
         </w:r>
         <w:r>
           <w:rPr>
@@ -6307,7 +6307,7 @@
           <w14:ligatures w14:val="standardContextual"/>
         </w:rPr>
       </w:pPr>
-      <w:hyperlink w:anchor="_Toc242228801" w:history="1">
+      <w:hyperlink w:anchor="_Toc242229567" w:history="1">
         <w:r>
           <w:rPr>
             <w:rStyle w:val="Collegamentoipertestuale"/>
@@ -6352,7 +6352,7 @@
             <w:noProof/>
             <w:webHidden/>
           </w:rPr>
-          <w:instrText xml:space="preserve"> PAGEREF _Toc242228801 \h </w:instrText>
+          <w:instrText xml:space="preserve"> PAGEREF _Toc242229567 \h </w:instrText>
         </w:r>
         <w:r>
           <w:rPr>
@@ -6399,7 +6399,7 @@
           <w14:ligatures w14:val="standardContextual"/>
         </w:rPr>
       </w:pPr>
-      <w:hyperlink w:anchor="_Toc242228802" w:history="1">
+      <w:hyperlink w:anchor="_Toc242229568" w:history="1">
         <w:r>
           <w:rPr>
             <w:rStyle w:val="Collegamentoipertestuale"/>
@@ -6444,7 +6444,7 @@
             <w:noProof/>
             <w:webHidden/>
           </w:rPr>
-          <w:instrText xml:space="preserve"> PAGEREF _Toc242228802 \h </w:instrText>
+          <w:instrText xml:space="preserve"> PAGEREF _Toc242229568 \h </w:instrText>
         </w:r>
         <w:r>
           <w:rPr>
@@ -6491,7 +6491,7 @@
           <w14:ligatures w14:val="standardContextual"/>
         </w:rPr>
       </w:pPr>
-      <w:hyperlink w:anchor="_Toc242228803" w:history="1">
+      <w:hyperlink w:anchor="_Toc242229569" w:history="1">
         <w:r>
           <w:rPr>
             <w:rStyle w:val="Collegamentoipertestuale"/>
@@ -6536,7 +6536,7 @@
             <w:noProof/>
             <w:webHidden/>
           </w:rPr>
-          <w:instrText xml:space="preserve"> PAGEREF _Toc242228803 \h </w:instrText>
+          <w:instrText xml:space="preserve"> PAGEREF _Toc242229569 \h </w:instrText>
         </w:r>
         <w:r>
           <w:rPr>
@@ -6583,7 +6583,7 @@
           <w14:ligatures w14:val="standardContextual"/>
         </w:rPr>
       </w:pPr>
-      <w:hyperlink w:anchor="_Toc242228804" w:history="1">
+      <w:hyperlink w:anchor="_Toc242229570" w:history="1">
         <w:r>
           <w:rPr>
             <w:rStyle w:val="Collegamentoipertestuale"/>
@@ -6628,7 +6628,7 @@
             <w:noProof/>
             <w:webHidden/>
           </w:rPr>
-          <w:instrText xml:space="preserve"> PAGEREF _Toc242228804 \h </w:instrText>
+          <w:instrText xml:space="preserve"> PAGEREF _Toc242229570 \h </w:instrText>
         </w:r>
         <w:r>
           <w:rPr>
@@ -6675,7 +6675,7 @@
           <w14:ligatures w14:val="standardContextual"/>
         </w:rPr>
       </w:pPr>
-      <w:hyperlink w:anchor="_Toc242228805" w:history="1">
+      <w:hyperlink w:anchor="_Toc242229571" w:history="1">
         <w:r>
           <w:rPr>
             <w:rStyle w:val="Collegamentoipertestuale"/>
@@ -6720,7 +6720,7 @@
             <w:noProof/>
             <w:webHidden/>
           </w:rPr>
-          <w:instrText xml:space="preserve"> PAGEREF _Toc242228805 \h </w:instrText>
+          <w:instrText xml:space="preserve"> PAGEREF _Toc242229571 \h </w:instrText>
         </w:r>
         <w:r>
           <w:rPr>
@@ -6767,7 +6767,7 @@
           <w14:ligatures w14:val="standardContextual"/>
         </w:rPr>
       </w:pPr>
-      <w:hyperlink w:anchor="_Toc242228806" w:history="1">
+      <w:hyperlink w:anchor="_Toc242229572" w:history="1">
         <w:r>
           <w:rPr>
             <w:rStyle w:val="Collegamentoipertestuale"/>
@@ -6812,7 +6812,7 @@
             <w:noProof/>
             <w:webHidden/>
           </w:rPr>
-          <w:instrText xml:space="preserve"> PAGEREF _Toc242228806 \h </w:instrText>
+          <w:instrText xml:space="preserve"> PAGEREF _Toc242229572 \h </w:instrText>
         </w:r>
         <w:r>
           <w:rPr>
@@ -6859,7 +6859,7 @@
           <w14:ligatures w14:val="standardContextual"/>
         </w:rPr>
       </w:pPr>
-      <w:hyperlink w:anchor="_Toc242228807" w:history="1">
+      <w:hyperlink w:anchor="_Toc242229573" w:history="1">
         <w:r>
           <w:rPr>
             <w:rStyle w:val="Collegamentoipertestuale"/>
@@ -6904,7 +6904,7 @@
             <w:noProof/>
             <w:webHidden/>
           </w:rPr>
-          <w:instrText xml:space="preserve"> PAGEREF _Toc242228807 \h </w:instrText>
+          <w:instrText xml:space="preserve"> PAGEREF _Toc242229573 \h </w:instrText>
         </w:r>
         <w:r>
           <w:rPr>
@@ -6951,7 +6951,7 @@
           <w14:ligatures w14:val="standardContextual"/>
         </w:rPr>
       </w:pPr>
-      <w:hyperlink w:anchor="_Toc242228808" w:history="1">
+      <w:hyperlink w:anchor="_Toc242229574" w:history="1">
         <w:r>
           <w:rPr>
             <w:rStyle w:val="Collegamentoipertestuale"/>
@@ -6996,7 +6996,7 @@
             <w:noProof/>
             <w:webHidden/>
           </w:rPr>
-          <w:instrText xml:space="preserve"> PAGEREF _Toc242228808 \h </w:instrText>
+          <w:instrText xml:space="preserve"> PAGEREF _Toc242229574 \h </w:instrText>
         </w:r>
         <w:r>
           <w:rPr>
@@ -7043,7 +7043,7 @@
           <w14:ligatures w14:val="standardContextual"/>
         </w:rPr>
       </w:pPr>
-      <w:hyperlink w:anchor="_Toc242228809" w:history="1">
+      <w:hyperlink w:anchor="_Toc242229575" w:history="1">
         <w:r>
           <w:rPr>
             <w:rStyle w:val="Collegamentoipertestuale"/>
@@ -7088,7 +7088,7 @@
             <w:noProof/>
             <w:webHidden/>
           </w:rPr>
-          <w:instrText xml:space="preserve"> PAGEREF _Toc242228809 \h </w:instrText>
+          <w:instrText xml:space="preserve"> PAGEREF _Toc242229575 \h </w:instrText>
         </w:r>
         <w:r>
           <w:rPr>
@@ -7135,7 +7135,7 @@
           <w14:ligatures w14:val="standardContextual"/>
         </w:rPr>
       </w:pPr>
-      <w:hyperlink w:anchor="_Toc242228810" w:history="1">
+      <w:hyperlink w:anchor="_Toc242229576" w:history="1">
         <w:r>
           <w:rPr>
             <w:rStyle w:val="Collegamentoipertestuale"/>
@@ -7180,7 +7180,7 @@
             <w:noProof/>
             <w:webHidden/>
           </w:rPr>
-          <w:instrText xml:space="preserve"> PAGEREF _Toc242228810 \h </w:instrText>
+          <w:instrText xml:space="preserve"> PAGEREF _Toc242229576 \h </w:instrText>
         </w:r>
         <w:r>
           <w:rPr>
@@ -7227,7 +7227,7 @@
           <w14:ligatures w14:val="standardContextual"/>
         </w:rPr>
       </w:pPr>
-      <w:hyperlink w:anchor="_Toc242228811" w:history="1">
+      <w:hyperlink w:anchor="_Toc242229577" w:history="1">
         <w:r>
           <w:rPr>
             <w:rStyle w:val="Collegamentoipertestuale"/>
@@ -7272,7 +7272,7 @@
             <w:noProof/>
             <w:webHidden/>
           </w:rPr>
-          <w:instrText xml:space="preserve"> PAGEREF _Toc242228811 \h </w:instrText>
+          <w:instrText xml:space="preserve"> PAGEREF _Toc242229577 \h </w:instrText>
         </w:r>
         <w:r>
           <w:rPr>
@@ -7318,7 +7318,7 @@
           <w14:ligatures w14:val="standardContextual"/>
         </w:rPr>
       </w:pPr>
-      <w:hyperlink w:anchor="_Toc242228812" w:history="1">
+      <w:hyperlink w:anchor="_Toc242229578" w:history="1">
         <w:r>
           <w:rPr>
             <w:rStyle w:val="Collegamentoipertestuale"/>
@@ -7366,7 +7366,7 @@
             <w:noProof/>
             <w:webHidden/>
           </w:rPr>
-          <w:instrText xml:space="preserve"> PAGEREF _Toc242228812 \h </w:instrText>
+          <w:instrText xml:space="preserve"> PAGEREF _Toc242229578 \h </w:instrText>
         </w:r>
         <w:r>
           <w:rPr>
@@ -7413,7 +7413,7 @@
           <w14:ligatures w14:val="standardContextual"/>
         </w:rPr>
       </w:pPr>
-      <w:hyperlink w:anchor="_Toc242228813" w:history="1">
+      <w:hyperlink w:anchor="_Toc242229579" w:history="1">
         <w:r>
           <w:rPr>
             <w:rStyle w:val="Collegamentoipertestuale"/>
@@ -7458,7 +7458,7 @@
             <w:noProof/>
             <w:webHidden/>
           </w:rPr>
-          <w:instrText xml:space="preserve"> PAGEREF _Toc242228813 \h </w:instrText>
+          <w:instrText xml:space="preserve"> PAGEREF _Toc242229579 \h </w:instrText>
         </w:r>
         <w:r>
           <w:rPr>
@@ -7505,7 +7505,7 @@
           <w14:ligatures w14:val="standardContextual"/>
         </w:rPr>
       </w:pPr>
-      <w:hyperlink w:anchor="_Toc242228814" w:history="1">
+      <w:hyperlink w:anchor="_Toc242229580" w:history="1">
         <w:r>
           <w:rPr>
             <w:rStyle w:val="Collegamentoipertestuale"/>
@@ -7550,7 +7550,7 @@
             <w:noProof/>
             <w:webHidden/>
           </w:rPr>
-          <w:instrText xml:space="preserve"> PAGEREF _Toc242228814 \h </w:instrText>
+          <w:instrText xml:space="preserve"> PAGEREF _Toc242229580 \h </w:instrText>
         </w:r>
         <w:r>
           <w:rPr>
@@ -7597,7 +7597,7 @@
           <w14:ligatures w14:val="standardContextual"/>
         </w:rPr>
       </w:pPr>
-      <w:hyperlink w:anchor="_Toc242228815" w:history="1">
+      <w:hyperlink w:anchor="_Toc242229581" w:history="1">
         <w:r>
           <w:rPr>
             <w:rStyle w:val="Collegamentoipertestuale"/>
@@ -7642,7 +7642,7 @@
             <w:noProof/>
             <w:webHidden/>
           </w:rPr>
-          <w:instrText xml:space="preserve"> PAGEREF _Toc242228815 \h </w:instrText>
+          <w:instrText xml:space="preserve"> PAGEREF _Toc242229581 \h </w:instrText>
         </w:r>
         <w:r>
           <w:rPr>
@@ -7688,7 +7688,7 @@
           <w14:ligatures w14:val="standardContextual"/>
         </w:rPr>
       </w:pPr>
-      <w:hyperlink w:anchor="_Toc242228816" w:history="1">
+      <w:hyperlink w:anchor="_Toc242229582" w:history="1">
         <w:r>
           <w:rPr>
             <w:rStyle w:val="Collegamentoipertestuale"/>
@@ -7736,7 +7736,7 @@
             <w:noProof/>
             <w:webHidden/>
           </w:rPr>
-          <w:instrText xml:space="preserve"> PAGEREF _Toc242228816 \h </w:instrText>
+          <w:instrText xml:space="preserve"> PAGEREF _Toc242229582 \h </w:instrText>
         </w:r>
         <w:r>
           <w:rPr>
@@ -7782,7 +7782,7 @@
           <w14:ligatures w14:val="standardContextual"/>
         </w:rPr>
       </w:pPr>
-      <w:hyperlink w:anchor="_Toc242228817" w:history="1">
+      <w:hyperlink w:anchor="_Toc242229583" w:history="1">
         <w:r>
           <w:rPr>
             <w:rStyle w:val="Collegamentoipertestuale"/>
@@ -7830,7 +7830,7 @@
             <w:noProof/>
             <w:webHidden/>
           </w:rPr>
-          <w:instrText xml:space="preserve"> PAGEREF _Toc242228817 \h </w:instrText>
+          <w:instrText xml:space="preserve"> PAGEREF _Toc242229583 \h </w:instrText>
         </w:r>
         <w:r>
           <w:rPr>
@@ -7877,7 +7877,7 @@
           <w14:ligatures w14:val="standardContextual"/>
         </w:rPr>
       </w:pPr>
-      <w:hyperlink w:anchor="_Toc242228818" w:history="1">
+      <w:hyperlink w:anchor="_Toc242229584" w:history="1">
         <w:r>
           <w:rPr>
             <w:rStyle w:val="Collegamentoipertestuale"/>
@@ -7922,7 +7922,7 @@
             <w:noProof/>
             <w:webHidden/>
           </w:rPr>
-          <w:instrText xml:space="preserve"> PAGEREF _Toc242228818 \h </w:instrText>
+          <w:instrText xml:space="preserve"> PAGEREF _Toc242229584 \h </w:instrText>
         </w:r>
         <w:r>
           <w:rPr>
@@ -7968,7 +7968,7 @@
           <w14:ligatures w14:val="standardContextual"/>
         </w:rPr>
       </w:pPr>
-      <w:hyperlink w:anchor="_Toc242228819" w:history="1">
+      <w:hyperlink w:anchor="_Toc242229585" w:history="1">
         <w:r>
           <w:rPr>
             <w:rStyle w:val="Collegamentoipertestuale"/>
@@ -8016,7 +8016,7 @@
             <w:noProof/>
             <w:webHidden/>
           </w:rPr>
-          <w:instrText xml:space="preserve"> PAGEREF _Toc242228819 \h </w:instrText>
+          <w:instrText xml:space="preserve"> PAGEREF _Toc242229585 \h </w:instrText>
         </w:r>
         <w:r>
           <w:rPr>
@@ -8063,7 +8063,7 @@
           <w14:ligatures w14:val="standardContextual"/>
         </w:rPr>
       </w:pPr>
-      <w:hyperlink w:anchor="_Toc242228820" w:history="1">
+      <w:hyperlink w:anchor="_Toc242229586" w:history="1">
         <w:r>
           <w:rPr>
             <w:rStyle w:val="Collegamentoipertestuale"/>
@@ -8108,7 +8108,7 @@
             <w:noProof/>
             <w:webHidden/>
           </w:rPr>
-          <w:instrText xml:space="preserve"> PAGEREF _Toc242228820 \h </w:instrText>
+          <w:instrText xml:space="preserve"> PAGEREF _Toc242229586 \h </w:instrText>
         </w:r>
         <w:r>
           <w:rPr>
@@ -8155,7 +8155,7 @@
           <w14:ligatures w14:val="standardContextual"/>
         </w:rPr>
       </w:pPr>
-      <w:hyperlink w:anchor="_Toc242228821" w:history="1">
+      <w:hyperlink w:anchor="_Toc242229587" w:history="1">
         <w:r>
           <w:rPr>
             <w:rStyle w:val="Collegamentoipertestuale"/>
@@ -8200,7 +8200,7 @@
             <w:noProof/>
             <w:webHidden/>
           </w:rPr>
-          <w:instrText xml:space="preserve"> PAGEREF _Toc242228821 \h </w:instrText>
+          <w:instrText xml:space="preserve"> PAGEREF _Toc242229587 \h </w:instrText>
         </w:r>
         <w:r>
           <w:rPr>
@@ -8247,7 +8247,7 @@
           <w14:ligatures w14:val="standardContextual"/>
         </w:rPr>
       </w:pPr>
-      <w:hyperlink w:anchor="_Toc242228822" w:history="1">
+      <w:hyperlink w:anchor="_Toc242229588" w:history="1">
         <w:r>
           <w:rPr>
             <w:rStyle w:val="Collegamentoipertestuale"/>
@@ -8292,7 +8292,7 @@
             <w:noProof/>
             <w:webHidden/>
           </w:rPr>
-          <w:instrText xml:space="preserve"> PAGEREF _Toc242228822 \h </w:instrText>
+          <w:instrText xml:space="preserve"> PAGEREF _Toc242229588 \h </w:instrText>
         </w:r>
         <w:r>
           <w:rPr>
@@ -8339,7 +8339,7 @@
           <w14:ligatures w14:val="standardContextual"/>
         </w:rPr>
       </w:pPr>
-      <w:hyperlink w:anchor="_Toc242228823" w:history="1">
+      <w:hyperlink w:anchor="_Toc242229589" w:history="1">
         <w:r>
           <w:rPr>
             <w:rStyle w:val="Collegamentoipertestuale"/>
@@ -8384,7 +8384,7 @@
             <w:noProof/>
             <w:webHidden/>
           </w:rPr>
-          <w:instrText xml:space="preserve"> PAGEREF _Toc242228823 \h </w:instrText>
+          <w:instrText xml:space="preserve"> PAGEREF _Toc242229589 \h </w:instrText>
         </w:r>
         <w:r>
           <w:rPr>
@@ -8431,7 +8431,7 @@
           <w14:ligatures w14:val="standardContextual"/>
         </w:rPr>
       </w:pPr>
-      <w:hyperlink w:anchor="_Toc242228824" w:history="1">
+      <w:hyperlink w:anchor="_Toc242229590" w:history="1">
         <w:r>
           <w:rPr>
             <w:rStyle w:val="Collegamentoipertestuale"/>
@@ -8476,7 +8476,7 @@
             <w:noProof/>
             <w:webHidden/>
           </w:rPr>
-          <w:instrText xml:space="preserve"> PAGEREF _Toc242228824 \h </w:instrText>
+          <w:instrText xml:space="preserve"> PAGEREF _Toc242229590 \h </w:instrText>
         </w:r>
         <w:r>
           <w:rPr>
@@ -8523,7 +8523,7 @@
           <w14:ligatures w14:val="standardContextual"/>
         </w:rPr>
       </w:pPr>
-      <w:hyperlink w:anchor="_Toc242228825" w:history="1">
+      <w:hyperlink w:anchor="_Toc242229591" w:history="1">
         <w:r>
           <w:rPr>
             <w:rStyle w:val="Collegamentoipertestuale"/>
@@ -8568,7 +8568,7 @@
             <w:noProof/>
             <w:webHidden/>
           </w:rPr>
-          <w:instrText xml:space="preserve"> PAGEREF _Toc242228825 \h </w:instrText>
+          <w:instrText xml:space="preserve"> PAGEREF _Toc242229591 \h </w:instrText>
         </w:r>
         <w:r>
           <w:rPr>
@@ -8614,7 +8614,7 @@
           <w14:ligatures w14:val="standardContextual"/>
         </w:rPr>
       </w:pPr>
-      <w:hyperlink w:anchor="_Toc242228826" w:history="1">
+      <w:hyperlink w:anchor="_Toc242229592" w:history="1">
         <w:r>
           <w:rPr>
             <w:rStyle w:val="Collegamentoipertestuale"/>
@@ -8662,7 +8662,7 @@
             <w:noProof/>
             <w:webHidden/>
           </w:rPr>
-          <w:instrText xml:space="preserve"> PAGEREF _Toc242228826 \h </w:instrText>
+          <w:instrText xml:space="preserve"> PAGEREF _Toc242229592 \h </w:instrText>
         </w:r>
         <w:r>
           <w:rPr>
@@ -8709,7 +8709,7 @@
           <w14:ligatures w14:val="standardContextual"/>
         </w:rPr>
       </w:pPr>
-      <w:hyperlink w:anchor="_Toc242228827" w:history="1">
+      <w:hyperlink w:anchor="_Toc242229593" w:history="1">
         <w:r>
           <w:rPr>
             <w:rStyle w:val="Collegamentoipertestuale"/>
@@ -8754,7 +8754,7 @@
             <w:noProof/>
             <w:webHidden/>
           </w:rPr>
-          <w:instrText xml:space="preserve"> PAGEREF _Toc242228827 \h </w:instrText>
+          <w:instrText xml:space="preserve"> PAGEREF _Toc242229593 \h </w:instrText>
         </w:r>
         <w:r>
           <w:rPr>
@@ -8801,7 +8801,7 @@
           <w14:ligatures w14:val="standardContextual"/>
         </w:rPr>
       </w:pPr>
-      <w:hyperlink w:anchor="_Toc242228828" w:history="1">
+      <w:hyperlink w:anchor="_Toc242229594" w:history="1">
         <w:r>
           <w:rPr>
             <w:rStyle w:val="Collegamentoipertestuale"/>
@@ -8846,7 +8846,7 @@
             <w:noProof/>
             <w:webHidden/>
           </w:rPr>
-          <w:instrText xml:space="preserve"> PAGEREF _Toc242228828 \h </w:instrText>
+          <w:instrText xml:space="preserve"> PAGEREF _Toc242229594 \h </w:instrText>
         </w:r>
         <w:r>
           <w:rPr>
@@ -8893,7 +8893,7 @@
           <w14:ligatures w14:val="standardContextual"/>
         </w:rPr>
       </w:pPr>
-      <w:hyperlink w:anchor="_Toc242228829" w:history="1">
+      <w:hyperlink w:anchor="_Toc242229595" w:history="1">
         <w:r>
           <w:rPr>
             <w:rStyle w:val="Collegamentoipertestuale"/>
@@ -8938,7 +8938,7 @@
             <w:noProof/>
             <w:webHidden/>
           </w:rPr>
-          <w:instrText xml:space="preserve"> PAGEREF _Toc242228829 \h </w:instrText>
+          <w:instrText xml:space="preserve"> PAGEREF _Toc242229595 \h </w:instrText>
         </w:r>
         <w:r>
           <w:rPr>
@@ -8985,7 +8985,7 @@
           <w14:ligatures w14:val="standardContextual"/>
         </w:rPr>
       </w:pPr>
-      <w:hyperlink w:anchor="_Toc242228830" w:history="1">
+      <w:hyperlink w:anchor="_Toc242229596" w:history="1">
         <w:r>
           <w:rPr>
             <w:rStyle w:val="Collegamentoipertestuale"/>
@@ -9030,7 +9030,7 @@
             <w:noProof/>
             <w:webHidden/>
           </w:rPr>
-          <w:instrText xml:space="preserve"> PAGEREF _Toc242228830 \h </w:instrText>
+          <w:instrText xml:space="preserve"> PAGEREF _Toc242229596 \h </w:instrText>
         </w:r>
         <w:r>
           <w:rPr>
@@ -9077,7 +9077,7 @@
           <w14:ligatures w14:val="standardContextual"/>
         </w:rPr>
       </w:pPr>
-      <w:hyperlink w:anchor="_Toc242228831" w:history="1">
+      <w:hyperlink w:anchor="_Toc242229597" w:history="1">
         <w:r>
           <w:rPr>
             <w:rStyle w:val="Collegamentoipertestuale"/>
@@ -9122,7 +9122,7 @@
             <w:noProof/>
             <w:webHidden/>
           </w:rPr>
-          <w:instrText xml:space="preserve"> PAGEREF _Toc242228831 \h </w:instrText>
+          <w:instrText xml:space="preserve"> PAGEREF _Toc242229597 \h </w:instrText>
         </w:r>
         <w:r>
           <w:rPr>
@@ -9169,7 +9169,7 @@
           <w14:ligatures w14:val="standardContextual"/>
         </w:rPr>
       </w:pPr>
-      <w:hyperlink w:anchor="_Toc242228832" w:history="1">
+      <w:hyperlink w:anchor="_Toc242229598" w:history="1">
         <w:r>
           <w:rPr>
             <w:rStyle w:val="Collegamentoipertestuale"/>
@@ -9214,7 +9214,7 @@
             <w:noProof/>
             <w:webHidden/>
           </w:rPr>
-          <w:instrText xml:space="preserve"> PAGEREF _Toc242228832 \h </w:instrText>
+          <w:instrText xml:space="preserve"> PAGEREF _Toc242229598 \h </w:instrText>
         </w:r>
         <w:r>
           <w:rPr>
@@ -9261,7 +9261,7 @@
           <w14:ligatures w14:val="standardContextual"/>
         </w:rPr>
       </w:pPr>
-      <w:hyperlink w:anchor="_Toc242228833" w:history="1">
+      <w:hyperlink w:anchor="_Toc242229599" w:history="1">
         <w:r>
           <w:rPr>
             <w:rStyle w:val="Collegamentoipertestuale"/>
@@ -9306,7 +9306,7 @@
             <w:noProof/>
             <w:webHidden/>
           </w:rPr>
-          <w:instrText xml:space="preserve"> PAGEREF _Toc242228833 \h </w:instrText>
+          <w:instrText xml:space="preserve"> PAGEREF _Toc242229599 \h </w:instrText>
         </w:r>
         <w:r>
           <w:rPr>
@@ -9352,7 +9352,7 @@
           <w14:ligatures w14:val="standardContextual"/>
         </w:rPr>
       </w:pPr>
-      <w:hyperlink w:anchor="_Toc242228834" w:history="1">
+      <w:hyperlink w:anchor="_Toc242229600" w:history="1">
         <w:r>
           <w:rPr>
             <w:rStyle w:val="Collegamentoipertestuale"/>
@@ -9400,7 +9400,7 @@
             <w:noProof/>
             <w:webHidden/>
           </w:rPr>
-          <w:instrText xml:space="preserve"> PAGEREF _Toc242228834 \h </w:instrText>
+          <w:instrText xml:space="preserve"> PAGEREF _Toc242229600 \h </w:instrText>
         </w:r>
         <w:r>
           <w:rPr>
@@ -9447,7 +9447,7 @@
           <w14:ligatures w14:val="standardContextual"/>
         </w:rPr>
       </w:pPr>
-      <w:hyperlink w:anchor="_Toc242228835" w:history="1">
+      <w:hyperlink w:anchor="_Toc242229601" w:history="1">
         <w:r>
           <w:rPr>
             <w:rStyle w:val="Collegamentoipertestuale"/>
@@ -9492,7 +9492,7 @@
             <w:noProof/>
             <w:webHidden/>
           </w:rPr>
-          <w:instrText xml:space="preserve"> PAGEREF _Toc242228835 \h </w:instrText>
+          <w:instrText xml:space="preserve"> PAGEREF _Toc242229601 \h </w:instrText>
         </w:r>
         <w:r>
           <w:rPr>
@@ -9539,7 +9539,7 @@
           <w14:ligatures w14:val="standardContextual"/>
         </w:rPr>
       </w:pPr>
-      <w:hyperlink w:anchor="_Toc242228836" w:history="1">
+      <w:hyperlink w:anchor="_Toc242229602" w:history="1">
         <w:r>
           <w:rPr>
             <w:rStyle w:val="Collegamentoipertestuale"/>
@@ -9584,7 +9584,7 @@
             <w:noProof/>
             <w:webHidden/>
           </w:rPr>
-          <w:instrText xml:space="preserve"> PAGEREF _Toc242228836 \h </w:instrText>
+          <w:instrText xml:space="preserve"> PAGEREF _Toc242229602 \h </w:instrText>
         </w:r>
         <w:r>
           <w:rPr>
@@ -9631,7 +9631,7 @@
           <w14:ligatures w14:val="standardContextual"/>
         </w:rPr>
       </w:pPr>
-      <w:hyperlink w:anchor="_Toc242228837" w:history="1">
+      <w:hyperlink w:anchor="_Toc242229603" w:history="1">
         <w:r>
           <w:rPr>
             <w:rStyle w:val="Collegamentoipertestuale"/>
@@ -9676,7 +9676,7 @@
             <w:noProof/>
             <w:webHidden/>
           </w:rPr>
-          <w:instrText xml:space="preserve"> PAGEREF _Toc242228837 \h </w:instrText>
+          <w:instrText xml:space="preserve"> PAGEREF _Toc242229603 \h </w:instrText>
         </w:r>
         <w:r>
           <w:rPr>
@@ -9722,7 +9722,7 @@
           <w14:ligatures w14:val="standardContextual"/>
         </w:rPr>
       </w:pPr>
-      <w:hyperlink w:anchor="_Toc242228838" w:history="1">
+      <w:hyperlink w:anchor="_Toc242229604" w:history="1">
         <w:r>
           <w:rPr>
             <w:rStyle w:val="Collegamentoipertestuale"/>
@@ -9770,7 +9770,7 @@
             <w:noProof/>
             <w:webHidden/>
           </w:rPr>
-          <w:instrText xml:space="preserve"> PAGEREF _Toc242228838 \h </w:instrText>
+          <w:instrText xml:space="preserve"> PAGEREF _Toc242229604 \h </w:instrText>
         </w:r>
         <w:r>
           <w:rPr>
@@ -9817,7 +9817,7 @@
           <w14:ligatures w14:val="standardContextual"/>
         </w:rPr>
       </w:pPr>
-      <w:hyperlink w:anchor="_Toc242228839" w:history="1">
+      <w:hyperlink w:anchor="_Toc242229605" w:history="1">
         <w:r>
           <w:rPr>
             <w:rStyle w:val="Collegamentoipertestuale"/>
@@ -9862,7 +9862,7 @@
             <w:noProof/>
             <w:webHidden/>
           </w:rPr>
-          <w:instrText xml:space="preserve"> PAGEREF _Toc242228839 \h </w:instrText>
+          <w:instrText xml:space="preserve"> PAGEREF _Toc242229605 \h </w:instrText>
         </w:r>
         <w:r>
           <w:rPr>
@@ -9909,7 +9909,7 @@
           <w14:ligatures w14:val="standardContextual"/>
         </w:rPr>
       </w:pPr>
-      <w:hyperlink w:anchor="_Toc242228840" w:history="1">
+      <w:hyperlink w:anchor="_Toc242229606" w:history="1">
         <w:r>
           <w:rPr>
             <w:rStyle w:val="Collegamentoipertestuale"/>
@@ -9954,7 +9954,7 @@
             <w:noProof/>
             <w:webHidden/>
           </w:rPr>
-          <w:instrText xml:space="preserve"> PAGEREF _Toc242228840 \h </w:instrText>
+          <w:instrText xml:space="preserve"> PAGEREF _Toc242229606 \h </w:instrText>
         </w:r>
         <w:r>
           <w:rPr>
@@ -10001,7 +10001,7 @@
           <w14:ligatures w14:val="standardContextual"/>
         </w:rPr>
       </w:pPr>
-      <w:hyperlink w:anchor="_Toc242228841" w:history="1">
+      <w:hyperlink w:anchor="_Toc242229607" w:history="1">
         <w:r>
           <w:rPr>
             <w:rStyle w:val="Collegamentoipertestuale"/>
@@ -10046,7 +10046,7 @@
             <w:noProof/>
             <w:webHidden/>
           </w:rPr>
-          <w:instrText xml:space="preserve"> PAGEREF _Toc242228841 \h </w:instrText>
+          <w:instrText xml:space="preserve"> PAGEREF _Toc242229607 \h </w:instrText>
         </w:r>
         <w:r>
           <w:rPr>
@@ -10093,7 +10093,7 @@
           <w14:ligatures w14:val="standardContextual"/>
         </w:rPr>
       </w:pPr>
-      <w:hyperlink w:anchor="_Toc242228842" w:history="1">
+      <w:hyperlink w:anchor="_Toc242229608" w:history="1">
         <w:r>
           <w:rPr>
             <w:rStyle w:val="Collegamentoipertestuale"/>
@@ -10138,7 +10138,7 @@
             <w:noProof/>
             <w:webHidden/>
           </w:rPr>
-          <w:instrText xml:space="preserve"> PAGEREF _Toc242228842 \h </w:instrText>
+          <w:instrText xml:space="preserve"> PAGEREF _Toc242229608 \h </w:instrText>
         </w:r>
         <w:r>
           <w:rPr>
@@ -10185,7 +10185,7 @@
           <w14:ligatures w14:val="standardContextual"/>
         </w:rPr>
       </w:pPr>
-      <w:hyperlink w:anchor="_Toc242228843" w:history="1">
+      <w:hyperlink w:anchor="_Toc242229609" w:history="1">
         <w:r>
           <w:rPr>
             <w:rStyle w:val="Collegamentoipertestuale"/>
@@ -10230,7 +10230,7 @@
             <w:noProof/>
             <w:webHidden/>
           </w:rPr>
-          <w:instrText xml:space="preserve"> PAGEREF _Toc242228843 \h </w:instrText>
+          <w:instrText xml:space="preserve"> PAGEREF _Toc242229609 \h </w:instrText>
         </w:r>
         <w:r>
           <w:rPr>
@@ -10277,7 +10277,7 @@
           <w14:ligatures w14:val="standardContextual"/>
         </w:rPr>
       </w:pPr>
-      <w:hyperlink w:anchor="_Toc242228844" w:history="1">
+      <w:hyperlink w:anchor="_Toc242229610" w:history="1">
         <w:r>
           <w:rPr>
             <w:rStyle w:val="Collegamentoipertestuale"/>
@@ -10322,7 +10322,7 @@
             <w:noProof/>
             <w:webHidden/>
           </w:rPr>
-          <w:instrText xml:space="preserve"> PAGEREF _Toc242228844 \h </w:instrText>
+          <w:instrText xml:space="preserve"> PAGEREF _Toc242229610 \h </w:instrText>
         </w:r>
         <w:r>
           <w:rPr>
@@ -10369,7 +10369,7 @@
           <w14:ligatures w14:val="standardContextual"/>
         </w:rPr>
       </w:pPr>
-      <w:hyperlink w:anchor="_Toc242228845" w:history="1">
+      <w:hyperlink w:anchor="_Toc242229611" w:history="1">
         <w:r>
           <w:rPr>
             <w:rStyle w:val="Collegamentoipertestuale"/>
@@ -10414,7 +10414,7 @@
             <w:noProof/>
             <w:webHidden/>
           </w:rPr>
-          <w:instrText xml:space="preserve"> PAGEREF _Toc242228845 \h </w:instrText>
+          <w:instrText xml:space="preserve"> PAGEREF _Toc242229611 \h </w:instrText>
         </w:r>
         <w:r>
           <w:rPr>
@@ -10461,7 +10461,7 @@
           <w14:ligatures w14:val="standardContextual"/>
         </w:rPr>
       </w:pPr>
-      <w:hyperlink w:anchor="_Toc242228846" w:history="1">
+      <w:hyperlink w:anchor="_Toc242229612" w:history="1">
         <w:r>
           <w:rPr>
             <w:rStyle w:val="Collegamentoipertestuale"/>
@@ -10506,7 +10506,7 @@
             <w:noProof/>
             <w:webHidden/>
           </w:rPr>
-          <w:instrText xml:space="preserve"> PAGEREF _Toc242228846 \h </w:instrText>
+          <w:instrText xml:space="preserve"> PAGEREF _Toc242229612 \h </w:instrText>
         </w:r>
         <w:r>
           <w:rPr>
@@ -10553,7 +10553,7 @@
           <w14:ligatures w14:val="standardContextual"/>
         </w:rPr>
       </w:pPr>
-      <w:hyperlink w:anchor="_Toc242228847" w:history="1">
+      <w:hyperlink w:anchor="_Toc242229613" w:history="1">
         <w:r>
           <w:rPr>
             <w:rStyle w:val="Collegamentoipertestuale"/>
@@ -10598,7 +10598,7 @@
             <w:noProof/>
             <w:webHidden/>
           </w:rPr>
-          <w:instrText xml:space="preserve"> PAGEREF _Toc242228847 \h </w:instrText>
+          <w:instrText xml:space="preserve"> PAGEREF _Toc242229613 \h </w:instrText>
         </w:r>
         <w:r>
           <w:rPr>
@@ -10645,7 +10645,7 @@
           <w14:ligatures w14:val="standardContextual"/>
         </w:rPr>
       </w:pPr>
-      <w:hyperlink w:anchor="_Toc242228848" w:history="1">
+      <w:hyperlink w:anchor="_Toc242229614" w:history="1">
         <w:r>
           <w:rPr>
             <w:rStyle w:val="Collegamentoipertestuale"/>
@@ -10690,7 +10690,7 @@
             <w:noProof/>
             <w:webHidden/>
           </w:rPr>
-          <w:instrText xml:space="preserve"> PAGEREF _Toc242228848 \h </w:instrText>
+          <w:instrText xml:space="preserve"> PAGEREF _Toc242229614 \h </w:instrText>
         </w:r>
         <w:r>
           <w:rPr>
@@ -10737,7 +10737,7 @@
           <w14:ligatures w14:val="standardContextual"/>
         </w:rPr>
       </w:pPr>
-      <w:hyperlink w:anchor="_Toc242228849" w:history="1">
+      <w:hyperlink w:anchor="_Toc242229615" w:history="1">
         <w:r>
           <w:rPr>
             <w:rStyle w:val="Collegamentoipertestuale"/>
@@ -10782,7 +10782,7 @@
             <w:noProof/>
             <w:webHidden/>
           </w:rPr>
-          <w:instrText xml:space="preserve"> PAGEREF _Toc242228849 \h </w:instrText>
+          <w:instrText xml:space="preserve"> PAGEREF _Toc242229615 \h </w:instrText>
         </w:r>
         <w:r>
           <w:rPr>
@@ -10829,7 +10829,7 @@
           <w14:ligatures w14:val="standardContextual"/>
         </w:rPr>
       </w:pPr>
-      <w:hyperlink w:anchor="_Toc242228850" w:history="1">
+      <w:hyperlink w:anchor="_Toc242229616" w:history="1">
         <w:r>
           <w:rPr>
             <w:rStyle w:val="Collegamentoipertestuale"/>
@@ -10874,7 +10874,7 @@
             <w:noProof/>
             <w:webHidden/>
           </w:rPr>
-          <w:instrText xml:space="preserve"> PAGEREF _Toc242228850 \h </w:instrText>
+          <w:instrText xml:space="preserve"> PAGEREF _Toc242229616 \h </w:instrText>
         </w:r>
         <w:r>
           <w:rPr>
@@ -10920,7 +10920,7 @@
           <w14:ligatures w14:val="standardContextual"/>
         </w:rPr>
       </w:pPr>
-      <w:hyperlink w:anchor="_Toc242228851" w:history="1">
+      <w:hyperlink w:anchor="_Toc242229617" w:history="1">
         <w:r>
           <w:rPr>
             <w:rStyle w:val="Collegamentoipertestuale"/>
@@ -10968,7 +10968,7 @@
             <w:noProof/>
             <w:webHidden/>
           </w:rPr>
-          <w:instrText xml:space="preserve"> PAGEREF _Toc242228851 \h </w:instrText>
+          <w:instrText xml:space="preserve"> PAGEREF _Toc242229617 \h </w:instrText>
         </w:r>
         <w:r>
           <w:rPr>
@@ -11015,7 +11015,7 @@
           <w14:ligatures w14:val="standardContextual"/>
         </w:rPr>
       </w:pPr>
-      <w:hyperlink w:anchor="_Toc242228852" w:history="1">
+      <w:hyperlink w:anchor="_Toc242229618" w:history="1">
         <w:r>
           <w:rPr>
             <w:rStyle w:val="Collegamentoipertestuale"/>
@@ -11060,7 +11060,7 @@
             <w:noProof/>
             <w:webHidden/>
           </w:rPr>
-          <w:instrText xml:space="preserve"> PAGEREF _Toc242228852 \h </w:instrText>
+          <w:instrText xml:space="preserve"> PAGEREF _Toc242229618 \h </w:instrText>
         </w:r>
         <w:r>
           <w:rPr>
@@ -11107,7 +11107,7 @@
           <w14:ligatures w14:val="standardContextual"/>
         </w:rPr>
       </w:pPr>
-      <w:hyperlink w:anchor="_Toc242228853" w:history="1">
+      <w:hyperlink w:anchor="_Toc242229619" w:history="1">
         <w:r>
           <w:rPr>
             <w:rStyle w:val="Collegamentoipertestuale"/>
@@ -11152,7 +11152,7 @@
             <w:noProof/>
             <w:webHidden/>
           </w:rPr>
-          <w:instrText xml:space="preserve"> PAGEREF _Toc242228853 \h </w:instrText>
+          <w:instrText xml:space="preserve"> PAGEREF _Toc242229619 \h </w:instrText>
         </w:r>
         <w:r>
           <w:rPr>
@@ -11199,7 +11199,7 @@
           <w14:ligatures w14:val="standardContextual"/>
         </w:rPr>
       </w:pPr>
-      <w:hyperlink w:anchor="_Toc242228854" w:history="1">
+      <w:hyperlink w:anchor="_Toc242229620" w:history="1">
         <w:r>
           <w:rPr>
             <w:rStyle w:val="Collegamentoipertestuale"/>
@@ -11244,7 +11244,7 @@
             <w:noProof/>
             <w:webHidden/>
           </w:rPr>
-          <w:instrText xml:space="preserve"> PAGEREF _Toc242228854 \h </w:instrText>
+          <w:instrText xml:space="preserve"> PAGEREF _Toc242229620 \h </w:instrText>
         </w:r>
         <w:r>
           <w:rPr>
@@ -11291,7 +11291,7 @@
           <w14:ligatures w14:val="standardContextual"/>
         </w:rPr>
       </w:pPr>
-      <w:hyperlink w:anchor="_Toc242228855" w:history="1">
+      <w:hyperlink w:anchor="_Toc242229621" w:history="1">
         <w:r>
           <w:rPr>
             <w:rStyle w:val="Collegamentoipertestuale"/>
@@ -11336,7 +11336,7 @@
             <w:noProof/>
             <w:webHidden/>
           </w:rPr>
-          <w:instrText xml:space="preserve"> PAGEREF _Toc242228855 \h </w:instrText>
+          <w:instrText xml:space="preserve"> PAGEREF _Toc242229621 \h </w:instrText>
         </w:r>
         <w:r>
           <w:rPr>
@@ -11383,7 +11383,7 @@
           <w14:ligatures w14:val="standardContextual"/>
         </w:rPr>
       </w:pPr>
-      <w:hyperlink w:anchor="_Toc242228856" w:history="1">
+      <w:hyperlink w:anchor="_Toc242229622" w:history="1">
         <w:r>
           <w:rPr>
             <w:rStyle w:val="Collegamentoipertestuale"/>
@@ -11428,7 +11428,7 @@
             <w:noProof/>
             <w:webHidden/>
           </w:rPr>
-          <w:instrText xml:space="preserve"> PAGEREF _Toc242228856 \h </w:instrText>
+          <w:instrText xml:space="preserve"> PAGEREF _Toc242229622 \h </w:instrText>
         </w:r>
         <w:r>
           <w:rPr>
@@ -11475,7 +11475,7 @@
           <w14:ligatures w14:val="standardContextual"/>
         </w:rPr>
       </w:pPr>
-      <w:hyperlink w:anchor="_Toc242228857" w:history="1">
+      <w:hyperlink w:anchor="_Toc242229623" w:history="1">
         <w:r>
           <w:rPr>
             <w:rStyle w:val="Collegamentoipertestuale"/>
@@ -11520,7 +11520,7 @@
             <w:noProof/>
             <w:webHidden/>
           </w:rPr>
-          <w:instrText xml:space="preserve"> PAGEREF _Toc242228857 \h </w:instrText>
+          <w:instrText xml:space="preserve"> PAGEREF _Toc242229623 \h </w:instrText>
         </w:r>
         <w:r>
           <w:rPr>
@@ -11567,7 +11567,7 @@
           <w14:ligatures w14:val="standardContextual"/>
         </w:rPr>
       </w:pPr>
-      <w:hyperlink w:anchor="_Toc242228858" w:history="1">
+      <w:hyperlink w:anchor="_Toc242229624" w:history="1">
         <w:r>
           <w:rPr>
             <w:rStyle w:val="Collegamentoipertestuale"/>
@@ -11612,7 +11612,7 @@
             <w:noProof/>
             <w:webHidden/>
           </w:rPr>
-          <w:instrText xml:space="preserve"> PAGEREF _Toc242228858 \h </w:instrText>
+          <w:instrText xml:space="preserve"> PAGEREF _Toc242229624 \h </w:instrText>
         </w:r>
         <w:r>
           <w:rPr>
@@ -11658,7 +11658,7 @@
           <w14:ligatures w14:val="standardContextual"/>
         </w:rPr>
       </w:pPr>
-      <w:hyperlink w:anchor="_Toc242228859" w:history="1">
+      <w:hyperlink w:anchor="_Toc242229625" w:history="1">
         <w:r>
           <w:rPr>
             <w:rStyle w:val="Collegamentoipertestuale"/>
@@ -11706,7 +11706,7 @@
             <w:noProof/>
             <w:webHidden/>
           </w:rPr>
-          <w:instrText xml:space="preserve"> PAGEREF _Toc242228859 \h </w:instrText>
+          <w:instrText xml:space="preserve"> PAGEREF _Toc242229625 \h </w:instrText>
         </w:r>
         <w:r>
           <w:rPr>
@@ -11753,7 +11753,7 @@
           <w14:ligatures w14:val="standardContextual"/>
         </w:rPr>
       </w:pPr>
-      <w:hyperlink w:anchor="_Toc242228860" w:history="1">
+      <w:hyperlink w:anchor="_Toc242229626" w:history="1">
         <w:r>
           <w:rPr>
             <w:rStyle w:val="Collegamentoipertestuale"/>
@@ -11798,7 +11798,7 @@
             <w:noProof/>
             <w:webHidden/>
           </w:rPr>
-          <w:instrText xml:space="preserve"> PAGEREF _Toc242228860 \h </w:instrText>
+          <w:instrText xml:space="preserve"> PAGEREF _Toc242229626 \h </w:instrText>
         </w:r>
         <w:r>
           <w:rPr>
@@ -11845,7 +11845,7 @@
           <w14:ligatures w14:val="standardContextual"/>
         </w:rPr>
       </w:pPr>
-      <w:hyperlink w:anchor="_Toc242228861" w:history="1">
+      <w:hyperlink w:anchor="_Toc242229627" w:history="1">
         <w:r>
           <w:rPr>
             <w:rStyle w:val="Collegamentoipertestuale"/>
@@ -11890,7 +11890,7 @@
             <w:noProof/>
             <w:webHidden/>
           </w:rPr>
-          <w:instrText xml:space="preserve"> PAGEREF _Toc242228861 \h </w:instrText>
+          <w:instrText xml:space="preserve"> PAGEREF _Toc242229627 \h </w:instrText>
         </w:r>
         <w:r>
           <w:rPr>
@@ -11937,7 +11937,7 @@
           <w14:ligatures w14:val="standardContextual"/>
         </w:rPr>
       </w:pPr>
-      <w:hyperlink w:anchor="_Toc242228862" w:history="1">
+      <w:hyperlink w:anchor="_Toc242229628" w:history="1">
         <w:r>
           <w:rPr>
             <w:rStyle w:val="Collegamentoipertestuale"/>
@@ -11982,7 +11982,7 @@
             <w:noProof/>
             <w:webHidden/>
           </w:rPr>
-          <w:instrText xml:space="preserve"> PAGEREF _Toc242228862 \h </w:instrText>
+          <w:instrText xml:space="preserve"> PAGEREF _Toc242229628 \h </w:instrText>
         </w:r>
         <w:r>
           <w:rPr>
@@ -12029,7 +12029,7 @@
           <w14:ligatures w14:val="standardContextual"/>
         </w:rPr>
       </w:pPr>
-      <w:hyperlink w:anchor="_Toc242228863" w:history="1">
+      <w:hyperlink w:anchor="_Toc242229629" w:history="1">
         <w:r>
           <w:rPr>
             <w:rStyle w:val="Collegamentoipertestuale"/>
@@ -12074,7 +12074,7 @@
             <w:noProof/>
             <w:webHidden/>
           </w:rPr>
-          <w:instrText xml:space="preserve"> PAGEREF _Toc242228863 \h </w:instrText>
+          <w:instrText xml:space="preserve"> PAGEREF _Toc242229629 \h </w:instrText>
         </w:r>
         <w:r>
           <w:rPr>
@@ -12121,7 +12121,7 @@
           <w14:ligatures w14:val="standardContextual"/>
         </w:rPr>
       </w:pPr>
-      <w:hyperlink w:anchor="_Toc242228864" w:history="1">
+      <w:hyperlink w:anchor="_Toc242229630" w:history="1">
         <w:r>
           <w:rPr>
             <w:rStyle w:val="Collegamentoipertestuale"/>
@@ -12166,7 +12166,7 @@
             <w:noProof/>
             <w:webHidden/>
           </w:rPr>
-          <w:instrText xml:space="preserve"> PAGEREF _Toc242228864 \h </w:instrText>
+          <w:instrText xml:space="preserve"> PAGEREF _Toc242229630 \h </w:instrText>
         </w:r>
         <w:r>
           <w:rPr>
@@ -12213,7 +12213,7 @@
           <w14:ligatures w14:val="standardContextual"/>
         </w:rPr>
       </w:pPr>
-      <w:hyperlink w:anchor="_Toc242228865" w:history="1">
+      <w:hyperlink w:anchor="_Toc242229631" w:history="1">
         <w:r>
           <w:rPr>
             <w:rStyle w:val="Collegamentoipertestuale"/>
@@ -12258,7 +12258,7 @@
             <w:noProof/>
             <w:webHidden/>
           </w:rPr>
-          <w:instrText xml:space="preserve"> PAGEREF _Toc242228865 \h </w:instrText>
+          <w:instrText xml:space="preserve"> PAGEREF _Toc242229631 \h </w:instrText>
         </w:r>
         <w:r>
           <w:rPr>
@@ -12305,7 +12305,7 @@
           <w14:ligatures w14:val="standardContextual"/>
         </w:rPr>
       </w:pPr>
-      <w:hyperlink w:anchor="_Toc242228866" w:history="1">
+      <w:hyperlink w:anchor="_Toc242229632" w:history="1">
         <w:r>
           <w:rPr>
             <w:rStyle w:val="Collegamentoipertestuale"/>
@@ -12350,7 +12350,7 @@
             <w:noProof/>
             <w:webHidden/>
           </w:rPr>
-          <w:instrText xml:space="preserve"> PAGEREF _Toc242228866 \h </w:instrText>
+          <w:instrText xml:space="preserve"> PAGEREF _Toc242229632 \h </w:instrText>
         </w:r>
         <w:r>
           <w:rPr>
@@ -12397,7 +12397,7 @@
           <w14:ligatures w14:val="standardContextual"/>
         </w:rPr>
       </w:pPr>
-      <w:hyperlink w:anchor="_Toc242228867" w:history="1">
+      <w:hyperlink w:anchor="_Toc242229633" w:history="1">
         <w:r>
           <w:rPr>
             <w:rStyle w:val="Collegamentoipertestuale"/>
@@ -12442,7 +12442,7 @@
             <w:noProof/>
             <w:webHidden/>
           </w:rPr>
-          <w:instrText xml:space="preserve"> PAGEREF _Toc242228867 \h </w:instrText>
+          <w:instrText xml:space="preserve"> PAGEREF _Toc242229633 \h </w:instrText>
         </w:r>
         <w:r>
           <w:rPr>
@@ -12489,7 +12489,7 @@
           <w14:ligatures w14:val="standardContextual"/>
         </w:rPr>
       </w:pPr>
-      <w:hyperlink w:anchor="_Toc242228868" w:history="1">
+      <w:hyperlink w:anchor="_Toc242229634" w:history="1">
         <w:r>
           <w:rPr>
             <w:rStyle w:val="Collegamentoipertestuale"/>
@@ -12534,7 +12534,7 @@
             <w:noProof/>
             <w:webHidden/>
           </w:rPr>
-          <w:instrText xml:space="preserve"> PAGEREF _Toc242228868 \h </w:instrText>
+          <w:instrText xml:space="preserve"> PAGEREF _Toc242229634 \h </w:instrText>
         </w:r>
         <w:r>
           <w:rPr>
@@ -12581,7 +12581,7 @@
           <w14:ligatures w14:val="standardContextual"/>
         </w:rPr>
       </w:pPr>
-      <w:hyperlink w:anchor="_Toc242228869" w:history="1">
+      <w:hyperlink w:anchor="_Toc242229635" w:history="1">
         <w:r>
           <w:rPr>
             <w:rStyle w:val="Collegamentoipertestuale"/>
@@ -12626,7 +12626,7 @@
             <w:noProof/>
             <w:webHidden/>
           </w:rPr>
-          <w:instrText xml:space="preserve"> PAGEREF _Toc242228869 \h </w:instrText>
+          <w:instrText xml:space="preserve"> PAGEREF _Toc242229635 \h </w:instrText>
         </w:r>
         <w:r>
           <w:rPr>
@@ -12673,7 +12673,7 @@
           <w14:ligatures w14:val="standardContextual"/>
         </w:rPr>
       </w:pPr>
-      <w:hyperlink w:anchor="_Toc242228870" w:history="1">
+      <w:hyperlink w:anchor="_Toc242229636" w:history="1">
         <w:r>
           <w:rPr>
             <w:rStyle w:val="Collegamentoipertestuale"/>
@@ -12718,7 +12718,7 @@
             <w:noProof/>
             <w:webHidden/>
           </w:rPr>
-          <w:instrText xml:space="preserve"> PAGEREF _Toc242228870 \h </w:instrText>
+          <w:instrText xml:space="preserve"> PAGEREF _Toc242229636 \h </w:instrText>
         </w:r>
         <w:r>
           <w:rPr>
@@ -12765,7 +12765,7 @@
           <w14:ligatures w14:val="standardContextual"/>
         </w:rPr>
       </w:pPr>
-      <w:hyperlink w:anchor="_Toc242228871" w:history="1">
+      <w:hyperlink w:anchor="_Toc242229637" w:history="1">
         <w:r>
           <w:rPr>
             <w:rStyle w:val="Collegamentoipertestuale"/>
@@ -12810,7 +12810,7 @@
             <w:noProof/>
             <w:webHidden/>
           </w:rPr>
-          <w:instrText xml:space="preserve"> PAGEREF _Toc242228871 \h </w:instrText>
+          <w:instrText xml:space="preserve"> PAGEREF _Toc242229637 \h </w:instrText>
         </w:r>
         <w:r>
           <w:rPr>
@@ -12857,7 +12857,7 @@
           <w14:ligatures w14:val="standardContextual"/>
         </w:rPr>
       </w:pPr>
-      <w:hyperlink w:anchor="_Toc242228872" w:history="1">
+      <w:hyperlink w:anchor="_Toc242229638" w:history="1">
         <w:r>
           <w:rPr>
             <w:rStyle w:val="Collegamentoipertestuale"/>
@@ -12902,7 +12902,7 @@
             <w:noProof/>
             <w:webHidden/>
           </w:rPr>
-          <w:instrText xml:space="preserve"> PAGEREF _Toc242228872 \h </w:instrText>
+          <w:instrText xml:space="preserve"> PAGEREF _Toc242229638 \h </w:instrText>
         </w:r>
         <w:r>
           <w:rPr>
@@ -12949,7 +12949,7 @@
           <w14:ligatures w14:val="standardContextual"/>
         </w:rPr>
       </w:pPr>
-      <w:hyperlink w:anchor="_Toc242228873" w:history="1">
+      <w:hyperlink w:anchor="_Toc242229639" w:history="1">
         <w:r>
           <w:rPr>
             <w:rStyle w:val="Collegamentoipertestuale"/>
@@ -12994,7 +12994,7 @@
             <w:noProof/>
             <w:webHidden/>
           </w:rPr>
-          <w:instrText xml:space="preserve"> PAGEREF _Toc242228873 \h </w:instrText>
+          <w:instrText xml:space="preserve"> PAGEREF _Toc242229639 \h </w:instrText>
         </w:r>
         <w:r>
           <w:rPr>
@@ -13041,7 +13041,7 @@
           <w14:ligatures w14:val="standardContextual"/>
         </w:rPr>
       </w:pPr>
-      <w:hyperlink w:anchor="_Toc242228874" w:history="1">
+      <w:hyperlink w:anchor="_Toc242229640" w:history="1">
         <w:r>
           <w:rPr>
             <w:rStyle w:val="Collegamentoipertestuale"/>
@@ -13086,7 +13086,7 @@
             <w:noProof/>
             <w:webHidden/>
           </w:rPr>
-          <w:instrText xml:space="preserve"> PAGEREF _Toc242228874 \h </w:instrText>
+          <w:instrText xml:space="preserve"> PAGEREF _Toc242229640 \h </w:instrText>
         </w:r>
         <w:r>
           <w:rPr>
@@ -13133,7 +13133,7 @@
           <w14:ligatures w14:val="standardContextual"/>
         </w:rPr>
       </w:pPr>
-      <w:hyperlink w:anchor="_Toc242228875" w:history="1">
+      <w:hyperlink w:anchor="_Toc242229641" w:history="1">
         <w:r>
           <w:rPr>
             <w:rStyle w:val="Collegamentoipertestuale"/>
@@ -13178,7 +13178,7 @@
             <w:noProof/>
             <w:webHidden/>
           </w:rPr>
-          <w:instrText xml:space="preserve"> PAGEREF _Toc242228875 \h </w:instrText>
+          <w:instrText xml:space="preserve"> PAGEREF _Toc242229641 \h </w:instrText>
         </w:r>
         <w:r>
           <w:rPr>
@@ -13224,7 +13224,7 @@
           <w14:ligatures w14:val="standardContextual"/>
         </w:rPr>
       </w:pPr>
-      <w:hyperlink w:anchor="_Toc242228876" w:history="1">
+      <w:hyperlink w:anchor="_Toc242229642" w:history="1">
         <w:r>
           <w:rPr>
             <w:rStyle w:val="Collegamentoipertestuale"/>
@@ -13272,7 +13272,7 @@
             <w:noProof/>
             <w:webHidden/>
           </w:rPr>
-          <w:instrText xml:space="preserve"> PAGEREF _Toc242228876 \h </w:instrText>
+          <w:instrText xml:space="preserve"> PAGEREF _Toc242229642 \h </w:instrText>
         </w:r>
         <w:r>
           <w:rPr>
@@ -13319,7 +13319,7 @@
           <w14:ligatures w14:val="standardContextual"/>
         </w:rPr>
       </w:pPr>
-      <w:hyperlink w:anchor="_Toc242228877" w:history="1">
+      <w:hyperlink w:anchor="_Toc242229643" w:history="1">
         <w:r>
           <w:rPr>
             <w:rStyle w:val="Collegamentoipertestuale"/>
@@ -13364,7 +13364,7 @@
             <w:noProof/>
             <w:webHidden/>
           </w:rPr>
-          <w:instrText xml:space="preserve"> PAGEREF _Toc242228877 \h </w:instrText>
+          <w:instrText xml:space="preserve"> PAGEREF _Toc242229643 \h </w:instrText>
         </w:r>
         <w:r>
           <w:rPr>
@@ -13411,7 +13411,7 @@
           <w14:ligatures w14:val="standardContextual"/>
         </w:rPr>
       </w:pPr>
-      <w:hyperlink w:anchor="_Toc242228878" w:history="1">
+      <w:hyperlink w:anchor="_Toc242229644" w:history="1">
         <w:r>
           <w:rPr>
             <w:rStyle w:val="Collegamentoipertestuale"/>
@@ -13456,7 +13456,7 @@
             <w:noProof/>
             <w:webHidden/>
           </w:rPr>
-          <w:instrText xml:space="preserve"> PAGEREF _Toc242228878 \h </w:instrText>
+          <w:instrText xml:space="preserve"> PAGEREF _Toc242229644 \h </w:instrText>
         </w:r>
         <w:r>
           <w:rPr>
@@ -13503,7 +13503,7 @@
           <w14:ligatures w14:val="standardContextual"/>
         </w:rPr>
       </w:pPr>
-      <w:hyperlink w:anchor="_Toc242228879" w:history="1">
+      <w:hyperlink w:anchor="_Toc242229645" w:history="1">
         <w:r>
           <w:rPr>
             <w:rStyle w:val="Collegamentoipertestuale"/>
@@ -13548,7 +13548,7 @@
             <w:noProof/>
             <w:webHidden/>
           </w:rPr>
-          <w:instrText xml:space="preserve"> PAGEREF _Toc242228879 \h </w:instrText>
+          <w:instrText xml:space="preserve"> PAGEREF _Toc242229645 \h </w:instrText>
         </w:r>
         <w:r>
           <w:rPr>
@@ -13594,7 +13594,7 @@
           <w14:ligatures w14:val="standardContextual"/>
         </w:rPr>
       </w:pPr>
-      <w:hyperlink w:anchor="_Toc242228880" w:history="1">
+      <w:hyperlink w:anchor="_Toc242229646" w:history="1">
         <w:r>
           <w:rPr>
             <w:rStyle w:val="Collegamentoipertestuale"/>
@@ -13642,7 +13642,7 @@
             <w:noProof/>
             <w:webHidden/>
           </w:rPr>
-          <w:instrText xml:space="preserve"> PAGEREF _Toc242228880 \h </w:instrText>
+          <w:instrText xml:space="preserve"> PAGEREF _Toc242229646 \h </w:instrText>
         </w:r>
         <w:r>
           <w:rPr>
@@ -13689,7 +13689,7 @@
           <w14:ligatures w14:val="standardContextual"/>
         </w:rPr>
       </w:pPr>
-      <w:hyperlink w:anchor="_Toc242228881" w:history="1">
+      <w:hyperlink w:anchor="_Toc242229647" w:history="1">
         <w:r>
           <w:rPr>
             <w:rStyle w:val="Collegamentoipertestuale"/>
@@ -13734,7 +13734,7 @@
             <w:noProof/>
             <w:webHidden/>
           </w:rPr>
-          <w:instrText xml:space="preserve"> PAGEREF _Toc242228881 \h </w:instrText>
+          <w:instrText xml:space="preserve"> PAGEREF _Toc242229647 \h </w:instrText>
         </w:r>
         <w:r>
           <w:rPr>
@@ -13781,7 +13781,7 @@
           <w14:ligatures w14:val="standardContextual"/>
         </w:rPr>
       </w:pPr>
-      <w:hyperlink w:anchor="_Toc242228882" w:history="1">
+      <w:hyperlink w:anchor="_Toc242229648" w:history="1">
         <w:r>
           <w:rPr>
             <w:rStyle w:val="Collegamentoipertestuale"/>
@@ -13826,7 +13826,7 @@
             <w:noProof/>
             <w:webHidden/>
           </w:rPr>
-          <w:instrText xml:space="preserve"> PAGEREF _Toc242228882 \h </w:instrText>
+          <w:instrText xml:space="preserve"> PAGEREF _Toc242229648 \h </w:instrText>
         </w:r>
         <w:r>
           <w:rPr>
@@ -13873,7 +13873,7 @@
           <w14:ligatures w14:val="standardContextual"/>
         </w:rPr>
       </w:pPr>
-      <w:hyperlink w:anchor="_Toc242228883" w:history="1">
+      <w:hyperlink w:anchor="_Toc242229649" w:history="1">
         <w:r>
           <w:rPr>
             <w:rStyle w:val="Collegamentoipertestuale"/>
@@ -13918,7 +13918,7 @@
             <w:noProof/>
             <w:webHidden/>
           </w:rPr>
-          <w:instrText xml:space="preserve"> PAGEREF _Toc242228883 \h </w:instrText>
+          <w:instrText xml:space="preserve"> PAGEREF _Toc242229649 \h </w:instrText>
         </w:r>
         <w:r>
           <w:rPr>
@@ -13983,7 +13983,7 @@
         <w:keepNext/>
         <w:spacing w:after="140"/>
       </w:pPr>
-      <w:bookmarkStart w:id="2" w:name="_Toc242228758"/>
+      <w:bookmarkStart w:id="2" w:name="_Toc242229524"/>
       <w:r>
         <w:t>Avvio e scelta del modulo</w:t>
       </w:r>
@@ -13995,7 +13995,7 @@
         <w:keepNext/>
         <w:spacing w:after="140"/>
       </w:pPr>
-      <w:bookmarkStart w:id="3" w:name="_Toc242228759"/>
+      <w:bookmarkStart w:id="3" w:name="_Toc242229525"/>
       <w:r>
         <w:t>Avviare la versione aggiornata</w:t>
       </w:r>
@@ -14023,7 +14023,7 @@
         <w:keepNext/>
         <w:spacing w:after="140"/>
       </w:pPr>
-      <w:bookmarkStart w:id="4" w:name="_Toc242228760"/>
+      <w:bookmarkStart w:id="4" w:name="_Toc242229526"/>
       <w:r>
         <w:t>Scegliere l’aspetto</w:t>
       </w:r>
@@ -14051,7 +14051,7 @@
         <w:keepNext/>
         <w:spacing w:after="140"/>
       </w:pPr>
-      <w:bookmarkStart w:id="5" w:name="_Toc242228761"/>
+      <w:bookmarkStart w:id="5" w:name="_Toc242229527"/>
       <w:r>
         <w:t>Scegliere il foglio adatto</w:t>
       </w:r>
@@ -15037,7 +15037,7 @@
         <w:keepNext/>
         <w:spacing w:after="140"/>
       </w:pPr>
-      <w:bookmarkStart w:id="6" w:name="_Toc242228762"/>
+      <w:bookmarkStart w:id="6" w:name="_Toc242229528"/>
       <w:r>
         <w:t>Leggere e compilare i campi</w:t>
       </w:r>
@@ -15074,7 +15074,7 @@
         <w:keepNext/>
         <w:spacing w:after="140"/>
       </w:pPr>
-      <w:bookmarkStart w:id="7" w:name="_Toc242228763"/>
+      <w:bookmarkStart w:id="7" w:name="_Toc242229529"/>
       <w:r>
         <w:t>Progetti e gestione del lavoro</w:t>
       </w:r>
@@ -15086,7 +15086,7 @@
         <w:keepNext/>
         <w:spacing w:after="140"/>
       </w:pPr>
-      <w:bookmarkStart w:id="8" w:name="_Toc242228764"/>
+      <w:bookmarkStart w:id="8" w:name="_Toc242229530"/>
       <w:r>
         <w:t>Costruire una struttura leggibile</w:t>
       </w:r>
@@ -15122,7 +15122,7 @@
         <w:keepNext/>
         <w:spacing w:after="140"/>
       </w:pPr>
-      <w:bookmarkStart w:id="9" w:name="_Toc242228765"/>
+      <w:bookmarkStart w:id="9" w:name="_Toc242229531"/>
       <w:r>
         <w:t>Comprendere i dati comuni</w:t>
       </w:r>
@@ -15170,7 +15170,7 @@
         <w:keepNext/>
         <w:spacing w:after="140"/>
       </w:pPr>
-      <w:bookmarkStart w:id="10" w:name="_Toc242228766"/>
+      <w:bookmarkStart w:id="10" w:name="_Toc242229532"/>
       <w:r>
         <w:t>Spostare duplicare e annullare</w:t>
       </w:r>
@@ -15206,7 +15206,7 @@
         <w:keepNext/>
         <w:spacing w:after="140"/>
       </w:pPr>
-      <w:bookmarkStart w:id="11" w:name="_Toc242228767"/>
+      <w:bookmarkStart w:id="11" w:name="_Toc242229533"/>
       <w:r>
         <w:t>Usare le revisioni</w:t>
       </w:r>
@@ -15242,7 +15242,7 @@
         <w:keepNext/>
         <w:spacing w:after="140"/>
       </w:pPr>
-      <w:bookmarkStart w:id="12" w:name="_Toc242228768"/>
+      <w:bookmarkStart w:id="12" w:name="_Toc242229534"/>
       <w:r>
         <w:lastRenderedPageBreak/>
         <w:t>Report del ramo e compatibilità degli archivi</w:t>
@@ -15279,7 +15279,7 @@
         <w:keepNext/>
         <w:spacing w:after="140"/>
       </w:pPr>
-      <w:bookmarkStart w:id="13" w:name="_Toc242228769"/>
+      <w:bookmarkStart w:id="13" w:name="_Toc242229535"/>
       <w:r>
         <w:t>Controllo della condivisione</w:t>
       </w:r>
@@ -15307,7 +15307,7 @@
         <w:keepNext/>
         <w:spacing w:after="140"/>
       </w:pPr>
-      <w:bookmarkStart w:id="14" w:name="_Toc242228770"/>
+      <w:bookmarkStart w:id="14" w:name="_Toc242229536"/>
       <w:r>
         <w:t>Materiali e durabilità</w:t>
       </w:r>
@@ -15319,7 +15319,7 @@
         <w:keepNext/>
         <w:spacing w:after="140"/>
       </w:pPr>
-      <w:bookmarkStart w:id="15" w:name="_Toc242228771"/>
+      <w:bookmarkStart w:id="15" w:name="_Toc242229537"/>
       <w:r>
         <w:t>Preparare il calcestruzzo</w:t>
       </w:r>
@@ -15367,7 +15367,7 @@
         <w:keepNext/>
         <w:spacing w:after="140"/>
       </w:pPr>
-      <w:bookmarkStart w:id="16" w:name="_Toc242228772"/>
+      <w:bookmarkStart w:id="16" w:name="_Toc242229538"/>
       <w:r>
         <w:t>Preparare l'acciaio per armature</w:t>
       </w:r>
@@ -15403,7 +15403,7 @@
         <w:keepNext/>
         <w:spacing w:after="140"/>
       </w:pPr>
-      <w:bookmarkStart w:id="17" w:name="_Toc242228773"/>
+      <w:bookmarkStart w:id="17" w:name="_Toc242229539"/>
       <w:r>
         <w:t>Palo verticale</w:t>
       </w:r>
@@ -15415,7 +15415,7 @@
         <w:keepNext/>
         <w:spacing w:after="140"/>
       </w:pPr>
-      <w:bookmarkStart w:id="18" w:name="_Toc242228774"/>
+      <w:bookmarkStart w:id="18" w:name="_Toc242229540"/>
       <w:r>
         <w:t>Compilazione ordinata</w:t>
       </w:r>
@@ -15434,7 +15434,25 @@
         <w:spacing w:after="140"/>
       </w:pPr>
       <w:r>
-        <w:t>Per un calcolo drenato occorrono i parametri efficaci. Per il ramo non drenato degli strati coesivi occorre Cu; il programma considera anche la posizione della falda per decidere il tratto nel quale applicare quel ramo. Non usare c′ e Cu come sinonimi. Negli strati granulari il contributo c′ alla resistenza laterale drenata è nullo, anche se il campo contiene un numero.</w:t>
+        <w:t>Per un calcolo drenato occorrono i parametri efficaci. Per il ramo non drenato degli strati coesivi occorre Cu; il programma considera anche la posizione della falda per decidere il tratto nel quale applicare quel ramo. Non usare c</w:t>
+      </w:r>
+      <w:r>
+        <w:rPr>
+          <w:rFonts w:ascii="Calibri" w:eastAsia="Calibri" w:hAnsi="Calibri" w:cs="Calibri"/>
+        </w:rPr>
+        <w:t>′</w:t>
+      </w:r>
+      <w:r>
+        <w:t xml:space="preserve"> e Cu come sinonimi. Negli strati granulari il contributo c</w:t>
+      </w:r>
+      <w:r>
+        <w:rPr>
+          <w:rFonts w:ascii="Calibri" w:eastAsia="Calibri" w:hAnsi="Calibri" w:cs="Calibri"/>
+        </w:rPr>
+        <w:t>′</w:t>
+      </w:r>
+      <w:r>
+        <w:t xml:space="preserve"> alla resistenza laterale drenata è nullo, anche se il campo contiene un numero.</w:t>
       </w:r>
     </w:p>
     <w:p>
@@ -15460,7 +15478,7 @@
         <w:keepNext/>
         <w:spacing w:after="140"/>
       </w:pPr>
-      <w:bookmarkStart w:id="19" w:name="_Toc242228775"/>
+      <w:bookmarkStart w:id="19" w:name="_Toc242229541"/>
       <w:r>
         <w:t>Coefficienti e gruppo di pali</w:t>
       </w:r>
@@ -15471,7 +15489,25 @@
         <w:spacing w:after="140"/>
       </w:pPr>
       <w:r>
-        <w:t>Verificare K e μ proposti per la tecnologia e l'addensamento. Controllare l'abaco Nq e la posizione del punto: un parametro sul bordo dell'abaco non dimostra che il terreno appartenga al campo sperimentale. Il numero di indagini scelto per ξ non è semplicemente il numero di linguette visibili. Deve rappresentare la base conoscitiva che si intende utilizzare.</w:t>
+        <w:t xml:space="preserve">Verificare K e </w:t>
+      </w:r>
+      <w:r>
+        <w:rPr>
+          <w:rFonts w:ascii="Calibri" w:eastAsia="Calibri" w:hAnsi="Calibri" w:cs="Calibri"/>
+        </w:rPr>
+        <w:t>μ</w:t>
+      </w:r>
+      <w:r>
+        <w:t xml:space="preserve"> proposti per la tecnologia e l'addensamento. Controllare l'abaco Nq e la posizione del punto: un parametro sul bordo dell'abaco non dimostra che il terreno appartenga al campo sperimentale. Il numero di indagini scelto per </w:t>
+      </w:r>
+      <w:r>
+        <w:rPr>
+          <w:rFonts w:ascii="Calibri" w:eastAsia="Calibri" w:hAnsi="Calibri" w:cs="Calibri"/>
+        </w:rPr>
+        <w:t>ξ</w:t>
+      </w:r>
+      <w:r>
+        <w:t xml:space="preserve"> non è semplicemente il numero di linguette visibili. Deve rappresentare la base conoscitiva che si intende utilizzare.</w:t>
       </w:r>
     </w:p>
     <w:p>
@@ -15488,7 +15524,7 @@
         <w:keepNext/>
         <w:spacing w:after="140"/>
       </w:pPr>
-      <w:bookmarkStart w:id="20" w:name="_Toc242228776"/>
+      <w:bookmarkStart w:id="20" w:name="_Toc242229542"/>
       <w:r>
         <w:t>Leggere i risultati</w:t>
       </w:r>
@@ -15524,7 +15560,7 @@
         <w:keepNext/>
         <w:spacing w:after="140"/>
       </w:pPr>
-      <w:bookmarkStart w:id="21" w:name="_Toc242228777"/>
+      <w:bookmarkStart w:id="21" w:name="_Toc242229543"/>
       <w:r>
         <w:t>Esempio di controllo manuale</w:t>
       </w:r>
@@ -15535,15 +15571,78 @@
         <w:spacing w:after="140"/>
       </w:pPr>
       <w:r>
-        <w:t>Per una sola tratta con D = 1 m, lunghezza attiva 10 m e resistenza laterale uniforme τ = 50 kPa, il contributo laterale è π × 1 × 10 × 50 = 1570,8 kN. Questo è un controllo della geometria e delle unità, prima dei coefficienti ξ, γ ed η. Se il foglio restituisce un ordine di grandezza mille volte diverso, verificare MPa contro kPa e metri contro millimetri.</w:t>
-      </w:r>
-    </w:p>
-    <w:p>
-      <w:pPr>
-        <w:spacing w:after="140"/>
-      </w:pPr>
-      <w:r>
-        <w:t xml:space="preserve">Procedere poi con i parametri realmente variabili del terreno. Non inserire τ = 50 nel campo Cu o c′ aspettandosi lo stesso risultato: quei parametri entrano in formule </w:t>
+        <w:t xml:space="preserve">Per una sola tratta con D = 1 m, lunghezza attiva 10 m e resistenza laterale uniforme </w:t>
+      </w:r>
+      <w:r>
+        <w:rPr>
+          <w:rFonts w:ascii="Calibri" w:eastAsia="Calibri" w:hAnsi="Calibri" w:cs="Calibri"/>
+        </w:rPr>
+        <w:t>τ</w:t>
+      </w:r>
+      <w:r>
+        <w:t xml:space="preserve"> = 50 kPa, il contributo laterale è </w:t>
+      </w:r>
+      <w:r>
+        <w:rPr>
+          <w:rFonts w:ascii="Calibri" w:eastAsia="Calibri" w:hAnsi="Calibri" w:cs="Calibri"/>
+        </w:rPr>
+        <w:t>π</w:t>
+      </w:r>
+      <w:r>
+        <w:t xml:space="preserve"> × 1 × 10 × 50 = 1570,8 kN. Questo è un controllo della geometria e delle unità, prima dei coefficienti </w:t>
+      </w:r>
+      <w:r>
+        <w:rPr>
+          <w:rFonts w:ascii="Calibri" w:eastAsia="Calibri" w:hAnsi="Calibri" w:cs="Calibri"/>
+        </w:rPr>
+        <w:t>ξ</w:t>
+      </w:r>
+      <w:r>
+        <w:t xml:space="preserve">, </w:t>
+      </w:r>
+      <w:r>
+        <w:rPr>
+          <w:rFonts w:ascii="Calibri" w:eastAsia="Calibri" w:hAnsi="Calibri" w:cs="Calibri"/>
+        </w:rPr>
+        <w:t>γ</w:t>
+      </w:r>
+      <w:r>
+        <w:t xml:space="preserve"> ed </w:t>
+      </w:r>
+      <w:r>
+        <w:rPr>
+          <w:rFonts w:ascii="Calibri" w:eastAsia="Calibri" w:hAnsi="Calibri" w:cs="Calibri"/>
+        </w:rPr>
+        <w:t>η</w:t>
+      </w:r>
+      <w:r>
+        <w:t>. Se il foglio restituisce un ordine di grandezza mille volte diverso, verificare MPa contro kPa e metri contro millimetri.</w:t>
+      </w:r>
+    </w:p>
+    <w:p>
+      <w:pPr>
+        <w:spacing w:after="140"/>
+      </w:pPr>
+      <w:r>
+        <w:t xml:space="preserve">Procedere poi con i parametri realmente variabili del terreno. Non inserire </w:t>
+      </w:r>
+      <w:r>
+        <w:rPr>
+          <w:rFonts w:ascii="Calibri" w:eastAsia="Calibri" w:hAnsi="Calibri" w:cs="Calibri"/>
+        </w:rPr>
+        <w:t>τ</w:t>
+      </w:r>
+      <w:r>
+        <w:t xml:space="preserve"> = 50 nel campo Cu o c</w:t>
+      </w:r>
+      <w:r>
+        <w:rPr>
+          <w:rFonts w:ascii="Calibri" w:eastAsia="Calibri" w:hAnsi="Calibri" w:cs="Calibri"/>
+        </w:rPr>
+        <w:t>′</w:t>
+      </w:r>
+      <w:r>
+        <w:t xml:space="preserve"> aspettandosi lo stesso risultato: quei parametri entrano in formule </w:t>
       </w:r>
       <w:r>
         <w:lastRenderedPageBreak/>
@@ -15556,7 +15655,7 @@
         <w:keepNext/>
         <w:spacing w:after="140"/>
       </w:pPr>
-      <w:bookmarkStart w:id="22" w:name="_Toc242228778"/>
+      <w:bookmarkStart w:id="22" w:name="_Toc242229544"/>
       <w:r>
         <w:t>Micropalo verticale</w:t>
       </w:r>
@@ -15568,7 +15667,7 @@
         <w:keepNext/>
         <w:spacing w:after="140"/>
       </w:pPr>
-      <w:bookmarkStart w:id="23" w:name="_Toc242228779"/>
+      <w:bookmarkStart w:id="23" w:name="_Toc242229545"/>
       <w:r>
         <w:t>Dati del bulbo e dell'iniezione</w:t>
       </w:r>
@@ -15579,7 +15678,16 @@
         <w:spacing w:after="140"/>
       </w:pPr>
       <w:r>
-        <w:t>Assegnare diametro di perforazione, iniezione IGU o IRS, famiglia di terreno, coefficiente di espansione α e p_l utilizzato dall'abaco. L'interfaccia espone il campo «Pressione p_i = p_l» e il codice assume quell'uguaglianza. p_l è però la grandezza geotecnica dell'abaco: usare il valore della pompa richiede una giustificazione della correlazione, non la sola coincidenza delle unità. Documentare quindi quale misura o interpretazione abbia prodotto il dato inserito.</w:t>
+        <w:t xml:space="preserve">Assegnare diametro di perforazione, iniezione IGU o IRS, famiglia di terreno, coefficiente di espansione </w:t>
+      </w:r>
+      <w:r>
+        <w:rPr>
+          <w:rFonts w:ascii="Calibri" w:eastAsia="Calibri" w:hAnsi="Calibri" w:cs="Calibri"/>
+        </w:rPr>
+        <w:t>α</w:t>
+      </w:r>
+      <w:r>
+        <w:t xml:space="preserve"> e p_l utilizzato dall'abaco. L'interfaccia espone il campo «Pressione p_i = p_l» e il codice assume quell'uguaglianza. p_l è però la grandezza geotecnica dell'abaco: usare il valore della pompa richiede una giustificazione della correlazione, non la sola coincidenza delle unità. Documentare quindi quale misura o interpretazione abbia prodotto il dato inserito.</w:t>
       </w:r>
     </w:p>
     <w:p>
@@ -15604,7 +15712,7 @@
         <w:keepNext/>
         <w:spacing w:after="140"/>
       </w:pPr>
-      <w:bookmarkStart w:id="24" w:name="_Toc242228780"/>
+      <w:bookmarkStart w:id="24" w:name="_Toc242229546"/>
       <w:r>
         <w:t>Tubo e peso</w:t>
       </w:r>
@@ -15623,7 +15731,16 @@
         <w:spacing w:after="140"/>
       </w:pPr>
       <w:r>
-        <w:t>Verificare che p_l rientri nel campo della curva selezionata: il motore rifiuta l'estrapolazione. Un messaggio di fuori abaco va risolto cambiando la base di calcolo o il dato, non forzando il valore al bordo senza motivazione. Nel report conservare curva, tipo di iniezione, α, pressione e tratte: sono le informazioni che consentono di ricostruire la stima.</w:t>
+        <w:t xml:space="preserve">Verificare che p_l rientri nel campo della curva selezionata: il motore rifiuta l'estrapolazione. Un messaggio di fuori abaco va risolto cambiando la base di calcolo o il dato, non forzando il valore al bordo senza motivazione. Nel report conservare curva, tipo di iniezione, </w:t>
+      </w:r>
+      <w:r>
+        <w:rPr>
+          <w:rFonts w:ascii="Calibri" w:eastAsia="Calibri" w:hAnsi="Calibri" w:cs="Calibri"/>
+        </w:rPr>
+        <w:t>α</w:t>
+      </w:r>
+      <w:r>
+        <w:t>, pressione e tratte: sono le informazioni che consentono di ricostruire la stima.</w:t>
       </w:r>
     </w:p>
     <w:p>
@@ -15632,7 +15749,7 @@
         <w:keepNext/>
         <w:spacing w:after="140"/>
       </w:pPr>
-      <w:bookmarkStart w:id="25" w:name="_Toc242228781"/>
+      <w:bookmarkStart w:id="25" w:name="_Toc242229547"/>
       <w:r>
         <w:t>Pali e micropali caricati orizzontalmente</w:t>
       </w:r>
@@ -15644,7 +15761,7 @@
         <w:keepNext/>
         <w:spacing w:after="140"/>
       </w:pPr>
-      <w:bookmarkStart w:id="26" w:name="_Toc242228782"/>
+      <w:bookmarkStart w:id="26" w:name="_Toc242229548"/>
       <w:r>
         <w:t>Preparare un modello coerente</w:t>
       </w:r>
@@ -15681,7 +15798,7 @@
         <w:keepNext/>
         <w:spacing w:after="140"/>
       </w:pPr>
-      <w:bookmarkStart w:id="27" w:name="_Toc242228783"/>
+      <w:bookmarkStart w:id="27" w:name="_Toc242229549"/>
       <w:r>
         <w:t>Momento resistente del palo in calcestruzzo</w:t>
       </w:r>
@@ -15709,7 +15826,7 @@
         <w:keepNext/>
         <w:spacing w:after="140"/>
       </w:pPr>
-      <w:bookmarkStart w:id="28" w:name="_Toc242228784"/>
+      <w:bookmarkStart w:id="28" w:name="_Toc242229550"/>
       <w:r>
         <w:t>Sezione CHS del micropalo</w:t>
       </w:r>
@@ -15737,7 +15854,7 @@
         <w:keepNext/>
         <w:spacing w:after="140"/>
       </w:pPr>
-      <w:bookmarkStart w:id="29" w:name="_Toc242228785"/>
+      <w:bookmarkStart w:id="29" w:name="_Toc242229551"/>
       <w:r>
         <w:t>Interpretare diagrammi e capacità</w:t>
       </w:r>
@@ -15769,7 +15886,7 @@
         <w:keepNext/>
         <w:spacing w:after="140"/>
       </w:pPr>
-      <w:bookmarkStart w:id="30" w:name="_Toc242228786"/>
+      <w:bookmarkStart w:id="30" w:name="_Toc242229552"/>
       <w:r>
         <w:t>Separare tubo e diametro geotecnico</w:t>
       </w:r>
@@ -15805,7 +15922,7 @@
         <w:keepNext/>
         <w:spacing w:after="140"/>
       </w:pPr>
-      <w:bookmarkStart w:id="31" w:name="_Toc242228787"/>
+      <w:bookmarkStart w:id="31" w:name="_Toc242229553"/>
       <w:r>
         <w:t>Sezione composta da ponte</w:t>
       </w:r>
@@ -15817,7 +15934,7 @@
         <w:keepNext/>
         <w:spacing w:after="140"/>
       </w:pPr>
-      <w:bookmarkStart w:id="32" w:name="_Toc242228788"/>
+      <w:bookmarkStart w:id="32" w:name="_Toc242229554"/>
       <w:r>
         <w:t>Definire la sezione locale</w:t>
       </w:r>
@@ -15865,7 +15982,7 @@
         <w:keepNext/>
         <w:spacing w:after="140"/>
       </w:pPr>
-      <w:bookmarkStart w:id="33" w:name="_Toc242228789"/>
+      <w:bookmarkStart w:id="33" w:name="_Toc242229555"/>
       <w:r>
         <w:t>Compilare la sezione con anima inclinata</w:t>
       </w:r>
@@ -15900,7 +16017,7 @@
           <w:noProof/>
         </w:rPr>
         <w:drawing>
-          <wp:inline distT="0" distB="0" distL="0" distR="0" wp14:anchorId="0DC58778" wp14:editId="6DEAADB4">
+          <wp:inline distT="0" distB="0" distL="0" distR="0" wp14:anchorId="111F346A" wp14:editId="752A71E3">
             <wp:extent cx="6120000" cy="3677403"/>
             <wp:effectExtent l="0" t="0" r="0" b="0"/>
             <wp:docPr id="1" name="Picture 1" descr="H con anima inclinata e scostamento positivo di 300 mm"/>
@@ -15958,7 +16075,7 @@
         <w:keepNext/>
         <w:spacing w:after="140"/>
       </w:pPr>
-      <w:bookmarkStart w:id="34" w:name="_Toc242228790"/>
+      <w:bookmarkStart w:id="34" w:name="_Toc242229556"/>
       <w:r>
         <w:lastRenderedPageBreak/>
         <w:t>Compilare il cassoncino</w:t>
@@ -15999,7 +16116,7 @@
           <w:noProof/>
         </w:rPr>
         <w:drawing>
-          <wp:inline distT="0" distB="0" distL="0" distR="0" wp14:anchorId="5F16D70D" wp14:editId="0A44EB50">
+          <wp:inline distT="0" distB="0" distL="0" distR="0" wp14:anchorId="7860182F" wp14:editId="198CB3B2">
             <wp:extent cx="6120000" cy="3677403"/>
             <wp:effectExtent l="0" t="0" r="0" b="0"/>
             <wp:docPr id="2" name="Picture 2" descr="Cassoncino con due anime inclinate e due piattabande superiori"/>
@@ -16061,7 +16178,7 @@
         <w:keepNext/>
         <w:spacing w:after="140"/>
       </w:pPr>
-      <w:bookmarkStart w:id="35" w:name="_Toc242228791"/>
+      <w:bookmarkStart w:id="35" w:name="_Toc242229557"/>
       <w:r>
         <w:t>Leggere le proprietà e riconoscere i limiti</w:t>
       </w:r>
@@ -16522,7 +16639,16 @@
       </w:r>
       <w:r>
         <w:lastRenderedPageBreak/>
-        <w:t>il fondo non viene verificato come piastra irrigidita longitudinalmente. L'H con anima inclinata resta in flessione retta e un ΔT salvato nelle sue fasi non viene considerato. La rappresentazione grafica chiusa e un esito positivo delle verifiche disponibili non coprono i fenomeni esclusi. Leggere Info modello, gli avvisi e la descrizione del tipo di sezione nel report prima di utilizzare i risultati.</w:t>
+        <w:t xml:space="preserve">il fondo non viene verificato come piastra irrigidita longitudinalmente. L'H con anima inclinata resta in flessione retta e un </w:t>
+      </w:r>
+      <w:r>
+        <w:rPr>
+          <w:rFonts w:ascii="Calibri" w:eastAsia="Calibri" w:hAnsi="Calibri" w:cs="Calibri"/>
+        </w:rPr>
+        <w:t>Δ</w:t>
+      </w:r>
+      <w:r>
+        <w:t>T salvato nelle sue fasi non viene considerato. La rappresentazione grafica chiusa e un esito positivo delle verifiche disponibili non coprono i fenomeni esclusi. Leggere Info modello, gli avvisi e la descrizione del tipo di sezione nel report prima di utilizzare i risultati.</w:t>
       </w:r>
     </w:p>
     <w:p>
@@ -16539,7 +16665,7 @@
         <w:keepNext/>
         <w:spacing w:after="140"/>
       </w:pPr>
-      <w:bookmarkStart w:id="36" w:name="_Toc242228792"/>
+      <w:bookmarkStart w:id="36" w:name="_Toc242229558"/>
       <w:r>
         <w:t>Scegliere consapevolmente il metodo</w:t>
       </w:r>
@@ -16799,9 +16925,16 @@
             </w:pPr>
             <w:r>
               <w:rPr>
+                <w:rFonts w:ascii="Calibri" w:eastAsia="Calibri" w:hAnsi="Calibri" w:cs="Calibri"/>
                 <w:sz w:val="21"/>
               </w:rPr>
-              <w:t>φ o n del nuovo incremento non rilassa automaticamente tutto il passato</w:t>
+              <w:t>φ</w:t>
+            </w:r>
+            <w:r>
+              <w:rPr>
+                <w:sz w:val="21"/>
+              </w:rPr>
+              <w:t xml:space="preserve"> o n del nuovo incremento non rilassa automaticamente tutto il passato</w:t>
             </w:r>
           </w:p>
         </w:tc>
@@ -16900,7 +17033,7 @@
         <w:keepNext/>
         <w:spacing w:after="140"/>
       </w:pPr>
-      <w:bookmarkStart w:id="37" w:name="_Toc242228793"/>
+      <w:bookmarkStart w:id="37" w:name="_Toc242229559"/>
       <w:r>
         <w:t>Costruire le fasi</w:t>
       </w:r>
@@ -16919,7 +17052,16 @@
         <w:spacing w:after="140"/>
       </w:pPr>
       <w:r>
-        <w:t>Ogni riga rappresenta un incremento, non necessariamente il totale della situazione. Inserire un totale in ciascuna riga può duplicare i carichi. Assegnare φ oppure n, controllando che il valore di uno derivi coerentemente dall'altro. Scegliere il punto di applicazione di N: baricentro lordo della fase, baricentro efficace aggiornato o riferimento comune. Il momento riportato al riferimento cambia con questa scelta.</w:t>
+        <w:t xml:space="preserve">Ogni riga rappresenta un incremento, non necessariamente il totale della situazione. Inserire un totale in ciascuna riga può duplicare i carichi. Assegnare </w:t>
+      </w:r>
+      <w:r>
+        <w:rPr>
+          <w:rFonts w:ascii="Calibri" w:eastAsia="Calibri" w:hAnsi="Calibri" w:cs="Calibri"/>
+        </w:rPr>
+        <w:t>φ</w:t>
+      </w:r>
+      <w:r>
+        <w:t xml:space="preserve"> oppure n, controllando che il valore di uno derivi coerentemente dall'altro. Scegliere il punto di applicazione di N: baricentro lordo della fase, baricentro efficace aggiornato o riferimento comune. Il momento riportato al riferimento cambia con questa scelta.</w:t>
       </w:r>
     </w:p>
     <w:p>
@@ -16945,7 +17087,7 @@
         <w:keepNext/>
         <w:spacing w:after="140"/>
       </w:pPr>
-      <w:bookmarkStart w:id="38" w:name="_Toc242228794"/>
+      <w:bookmarkStart w:id="38" w:name="_Toc242229560"/>
       <w:r>
         <w:t>Leggere efficacia tensioni e controlli locali</w:t>
       </w:r>
@@ -16980,7 +17122,25 @@
         <w:spacing w:after="140"/>
       </w:pPr>
       <w:r>
-        <w:t>Con anime inclinate il taglio V inserito nelle fasi rimane il taglio verticale totale della sezione. Non trasformarlo preventivamente nel taglio della singola lamiera: il programma applica V/cos α per l'H inclinata e V/(2 cos α) per ciascuna anima del cassoncino. Con V = 600 kN negli esempi precedenti le domande nel piano delle lamiere sono rispettivamente 608,276 kN e 302,880 kN per anima. Il risultato di resistenza globale viene riportato alla componente verticale totale.</w:t>
+        <w:t xml:space="preserve">Con anime inclinate il taglio V inserito nelle fasi rimane il taglio verticale totale della sezione. Non trasformarlo preventivamente nel taglio della singola lamiera: il programma applica V/cos </w:t>
+      </w:r>
+      <w:r>
+        <w:rPr>
+          <w:rFonts w:ascii="Calibri" w:eastAsia="Calibri" w:hAnsi="Calibri" w:cs="Calibri"/>
+        </w:rPr>
+        <w:t>α</w:t>
+      </w:r>
+      <w:r>
+        <w:t xml:space="preserve"> per l'H inclinata e V/(2 cos </w:t>
+      </w:r>
+      <w:r>
+        <w:rPr>
+          <w:rFonts w:ascii="Calibri" w:eastAsia="Calibri" w:hAnsi="Calibri" w:cs="Calibri"/>
+        </w:rPr>
+        <w:t>α</w:t>
+      </w:r>
+      <w:r>
+        <w:t>) per ciascuna anima del cassoncino. Con V = 600 kN negli esempi precedenti le domande nel piano delle lamiere sono rispettivamente 608,276 kN e 302,880 kN per anima. Il risultato di resistenza globale viene riportato alla componente verticale totale.</w:t>
       </w:r>
     </w:p>
     <w:p>
@@ -16989,7 +17149,7 @@
         <w:keepNext/>
         <w:spacing w:after="140"/>
       </w:pPr>
-      <w:bookmarkStart w:id="39" w:name="_Toc242228795"/>
+      <w:bookmarkStart w:id="39" w:name="_Toc242229561"/>
       <w:r>
         <w:t>Torsione distorsione e diaframmi del cassoncino</w:t>
       </w:r>
@@ -17000,10 +17160,25 @@
         <w:spacing w:after="140"/>
       </w:pPr>
       <w:r>
-        <w:t>Con Cassoncino selezionato, in fondo al Pannello di controllo compare il riquadro Cassoncino · torsione, distorsione e diaframmi. Attivare Verifiche a torsione del cassoncino: nella tabella Sollecitazioni diventa modificabile la colonna ΔT [kNm] e ogni scheda di fase mostra Momento torcente T. ΔT è l'incremento del momento torcente della fase nella sezione, ricavato dal modello globale e già combinato come N, Mx e V. Il ritiro non ha momento torcente. Per H saldato e H con anima inclinata la colonna non com</w:t>
-      </w:r>
-      <w:r>
-        <w:t>pare e un valore rimasto nell'archivio non partecipa al calcolo.</w:t>
+        <w:t xml:space="preserve">Con Cassoncino selezionato, in fondo al Pannello di controllo compare il riquadro Cassoncino · torsione, distorsione e diaframmi. Attivare Verifiche a torsione del cassoncino: nella tabella Sollecitazioni diventa modificabile la colonna </w:t>
+      </w:r>
+      <w:r>
+        <w:rPr>
+          <w:rFonts w:ascii="Calibri" w:eastAsia="Calibri" w:hAnsi="Calibri" w:cs="Calibri"/>
+        </w:rPr>
+        <w:t>Δ</w:t>
+      </w:r>
+      <w:r>
+        <w:t xml:space="preserve">T [kNm] e ogni scheda di fase mostra Momento torcente T. </w:t>
+      </w:r>
+      <w:r>
+        <w:rPr>
+          <w:rFonts w:ascii="Calibri" w:eastAsia="Calibri" w:hAnsi="Calibri" w:cs="Calibri"/>
+        </w:rPr>
+        <w:t>Δ</w:t>
+      </w:r>
+      <w:r>
+        <w:t>T è l'incremento del momento torcente della fase nella sezione, ricavato dal modello globale e già combinato come N, Mx e V. Il ritiro non ha momento torcente. Per H saldato e H con anima inclinata la colonna non compare e un valore rimasto nell'archivio non partecipa al calcolo.</w:t>
       </w:r>
     </w:p>
     <w:p>
@@ -17053,7 +17228,7 @@
           <w:noProof/>
         </w:rPr>
         <w:drawing>
-          <wp:inline distT="0" distB="0" distL="0" distR="0" wp14:anchorId="11040A85" wp14:editId="63145B78">
+          <wp:inline distT="0" distB="0" distL="0" distR="0" wp14:anchorId="45D66771" wp14:editId="4D4B213B">
             <wp:extent cx="6120000" cy="3677403"/>
             <wp:effectExtent l="0" t="0" r="0" b="0"/>
             <wp:docPr id="3" name="Picture 3" descr="Riquadro delle verifiche a torsione del cassoncino"/>
@@ -17102,7 +17277,16 @@
         <w:spacing w:after="140"/>
       </w:pPr>
       <w:r>
-        <w:t xml:space="preserve">Per riprodurre l'esempio della guida teorica usare il cassoncino descritto sopra con le tre fasi iniziali del foglio, t* = 4 mm e ΔT pari a 200, 300 e 1000 kNm. Nella scheda Verifiche il gruppo Cassoncino · torsione, distorsione e diaframmi riporta per la fase di solo acciaio </w:t>
+        <w:t xml:space="preserve">Per riprodurre l'esempio della guida teorica usare il cassoncino descritto sopra con le tre fasi iniziali del foglio, t* = 4 mm e </w:t>
+      </w:r>
+      <w:r>
+        <w:rPr>
+          <w:rFonts w:ascii="Calibri" w:eastAsia="Calibri" w:hAnsi="Calibri" w:cs="Calibri"/>
+        </w:rPr>
+        <w:t>Δ</w:t>
+      </w:r>
+      <w:r>
+        <w:t xml:space="preserve">T pari a 200, 300 e 1000 kNm. Nella scheda Verifiche il gruppo Cassoncino · torsione, distorsione e diaframmi riporta per la fase di solo acciaio </w:t>
       </w:r>
       <w:r>
         <w:lastRenderedPageBreak/>
@@ -17119,7 +17303,7 @@
           <w:noProof/>
         </w:rPr>
         <w:drawing>
-          <wp:inline distT="0" distB="0" distL="0" distR="0" wp14:anchorId="1F05EB8E" wp14:editId="412A5BB6">
+          <wp:inline distT="0" distB="0" distL="0" distR="0" wp14:anchorId="5646C3B3" wp14:editId="73CEA01D">
             <wp:extent cx="6120000" cy="3677403"/>
             <wp:effectExtent l="0" t="0" r="0" b="0"/>
             <wp:docPr id="4" name="Picture 4" descr="Flussi di torsione per fase nella scheda Verifiche"/>
@@ -17168,7 +17352,25 @@
         <w:spacing w:after="140"/>
       </w:pPr>
       <w:r>
-        <w:t>Aggiungendo luce 40000 mm, diaframmi a piastra da 12 mm ogni 5000 mm, m_t = 60 kNm/m e T_c = 600 kNm, il programma individua 7 diaframmi intermedi e calcola al fondo σdw = 14,946 MPa, pari al 20,2% della tensione di flessione: la tensione di distorsione viene quindi sommata nelle verifiche del fondo. Il diaframma intermedio più sollecitato ha τ = 8,394 MPa.</w:t>
+        <w:t xml:space="preserve">Aggiungendo luce 40000 mm, diaframmi a piastra da 12 mm ogni 5000 mm, m_t = 60 kNm/m e T_c = 600 kNm, il programma individua 7 diaframmi intermedi e calcola al fondo </w:t>
+      </w:r>
+      <w:r>
+        <w:rPr>
+          <w:rFonts w:ascii="Calibri" w:eastAsia="Calibri" w:hAnsi="Calibri" w:cs="Calibri"/>
+        </w:rPr>
+        <w:t>σ</w:t>
+      </w:r>
+      <w:r>
+        <w:t xml:space="preserve">dw = 14,946 MPa, pari al 20,2% della tensione di flessione: la tensione di distorsione viene quindi sommata nelle verifiche del fondo. Il diaframma intermedio più sollecitato ha </w:t>
+      </w:r>
+      <w:r>
+        <w:rPr>
+          <w:rFonts w:ascii="Calibri" w:eastAsia="Calibri" w:hAnsi="Calibri" w:cs="Calibri"/>
+        </w:rPr>
+        <w:t>τ</w:t>
+      </w:r>
+      <w:r>
+        <w:t xml:space="preserve"> = 8,394 MPa.</w:t>
       </w:r>
     </w:p>
     <w:p>
@@ -17185,7 +17387,7 @@
         <w:keepNext/>
         <w:spacing w:after="140"/>
       </w:pPr>
-      <w:bookmarkStart w:id="40" w:name="_Toc242228796"/>
+      <w:bookmarkStart w:id="40" w:name="_Toc242229562"/>
       <w:r>
         <w:t>Curve di risposta</w:t>
       </w:r>
@@ -17196,7 +17398,25 @@
         <w:spacing w:after="140"/>
       </w:pPr>
       <w:r>
-        <w:t>La terza scheda permette curve M κ a N fissato oppure N ε a curvatura fissata. Si può partire da uno stato vergine oppure dalla storia di una fase ricostruita dal motore non lineare. Quando si parte da una fase caricata, il ramo di risposta conserva la memoria prevista dal modello e non riparte da zero tensioni.</w:t>
+        <w:t xml:space="preserve">La terza scheda permette curve M </w:t>
+      </w:r>
+      <w:r>
+        <w:rPr>
+          <w:rFonts w:ascii="Calibri" w:eastAsia="Calibri" w:hAnsi="Calibri" w:cs="Calibri"/>
+        </w:rPr>
+        <w:t>κ</w:t>
+      </w:r>
+      <w:r>
+        <w:t xml:space="preserve"> a N fissato oppure N </w:t>
+      </w:r>
+      <w:r>
+        <w:rPr>
+          <w:rFonts w:ascii="Calibri" w:eastAsia="Calibri" w:hAnsi="Calibri" w:cs="Calibri"/>
+        </w:rPr>
+        <w:t>ε</w:t>
+      </w:r>
+      <w:r>
+        <w:t xml:space="preserve"> a curvatura fissata. Si può partire da uno stato vergine oppure dalla storia di una fase ricostruita dal motore non lineare. Quando si parte da una fase caricata, il ramo di risposta conserva la memoria prevista dal modello e non riparte da zero tensioni.</w:t>
       </w:r>
     </w:p>
     <w:p>
@@ -17222,7 +17442,7 @@
         <w:keepNext/>
         <w:spacing w:after="140"/>
       </w:pPr>
-      <w:bookmarkStart w:id="41" w:name="_Toc242228797"/>
+      <w:bookmarkStart w:id="41" w:name="_Toc242229563"/>
       <w:r>
         <w:t>Bridge Design</w:t>
       </w:r>
@@ -17250,7 +17470,7 @@
         <w:keepNext/>
         <w:spacing w:after="140"/>
       </w:pPr>
-      <w:bookmarkStart w:id="42" w:name="_Toc242228798"/>
+      <w:bookmarkStart w:id="42" w:name="_Toc242229564"/>
       <w:r>
         <w:t>Preparare i dati prima di aprire la ricerca</w:t>
       </w:r>
@@ -17932,7 +18152,7 @@
         <w:keepNext/>
         <w:spacing w:after="140"/>
       </w:pPr>
-      <w:bookmarkStart w:id="43" w:name="_Toc242228799"/>
+      <w:bookmarkStart w:id="43" w:name="_Toc242229565"/>
       <w:r>
         <w:t>Creare il progetto di riferimento</w:t>
       </w:r>
@@ -18027,7 +18247,7 @@
         <w:keepNext/>
         <w:spacing w:after="140"/>
       </w:pPr>
-      <w:bookmarkStart w:id="44" w:name="_Toc242228800"/>
+      <w:bookmarkStart w:id="44" w:name="_Toc242229566"/>
       <w:r>
         <w:t>Leggere sezioni spessori e lunghezze</w:t>
       </w:r>
@@ -18071,7 +18291,7 @@
         <w:keepNext/>
         <w:spacing w:after="140"/>
       </w:pPr>
-      <w:bookmarkStart w:id="45" w:name="_Toc242228801"/>
+      <w:bookmarkStart w:id="45" w:name="_Toc242229567"/>
       <w:r>
         <w:t>Scegliere obiettivo e costanti</w:t>
       </w:r>
@@ -18761,7 +18981,7 @@
         <w:keepNext/>
         <w:spacing w:after="140"/>
       </w:pPr>
-      <w:bookmarkStart w:id="46" w:name="_Toc242228802"/>
+      <w:bookmarkStart w:id="46" w:name="_Toc242229568"/>
       <w:r>
         <w:t>Impostare range utili</w:t>
       </w:r>
@@ -18814,7 +19034,7 @@
         <w:keepNext/>
         <w:spacing w:after="140"/>
       </w:pPr>
-      <w:bookmarkStart w:id="47" w:name="_Toc242228803"/>
+      <w:bookmarkStart w:id="47" w:name="_Toc242229569"/>
       <w:r>
         <w:t>Avviare e leggere l’avanzamento</w:t>
       </w:r>
@@ -18850,7 +19070,7 @@
         <w:keepNext/>
         <w:spacing w:after="140"/>
       </w:pPr>
-      <w:bookmarkStart w:id="48" w:name="_Toc242228804"/>
+      <w:bookmarkStart w:id="48" w:name="_Toc242229570"/>
       <w:r>
         <w:t>Usare i grafici</w:t>
       </w:r>
@@ -18891,7 +19111,7 @@
         </w:rPr>
         <w:lastRenderedPageBreak/>
         <w:drawing>
-          <wp:inline distT="0" distB="0" distL="0" distR="0" wp14:anchorId="110D26A4" wp14:editId="40902D08">
+          <wp:inline distT="0" distB="0" distL="0" distR="0" wp14:anchorId="58E15C90" wp14:editId="58A8ED08">
             <wp:extent cx="6120000" cy="3519000"/>
             <wp:effectExtent l="0" t="0" r="0" b="0"/>
             <wp:docPr id="5" name="Picture 5" descr="Nuvola costo e CO₂ ricavata dai risultati riproducibili dell’esempio"/>
@@ -18953,7 +19173,7 @@
           <w:noProof/>
         </w:rPr>
         <w:drawing>
-          <wp:inline distT="0" distB="0" distL="0" distR="0" wp14:anchorId="761C625F" wp14:editId="39F6C7E1">
+          <wp:inline distT="0" distB="0" distL="0" distR="0" wp14:anchorId="639A3B3F" wp14:editId="2EDFDCF2">
             <wp:extent cx="6120000" cy="3519000"/>
             <wp:effectExtent l="0" t="0" r="0" b="0"/>
             <wp:docPr id="6" name="Picture 6" descr="Variazione di altezza e costo durante l’enumerazione dell’esempio"/>
@@ -19003,7 +19223,7 @@
         <w:keepNext/>
         <w:spacing w:after="140"/>
       </w:pPr>
-      <w:bookmarkStart w:id="49" w:name="_Toc242228805"/>
+      <w:bookmarkStart w:id="49" w:name="_Toc242229571"/>
       <w:r>
         <w:lastRenderedPageBreak/>
         <w:t>Esempio guidato da centoventi metri</w:t>
@@ -19738,7 +19958,7 @@
           <w:noProof/>
         </w:rPr>
         <w:drawing>
-          <wp:inline distT="0" distB="0" distL="0" distR="0" wp14:anchorId="4B5ED5D5" wp14:editId="103E3714">
+          <wp:inline distT="0" distB="0" distL="0" distR="0" wp14:anchorId="5D2BE975" wp14:editId="78A81A85">
             <wp:extent cx="6120000" cy="2601000"/>
             <wp:effectExtent l="0" t="0" r="0" b="0"/>
             <wp:docPr id="7" name="Picture 7" descr="Differenze di costo fra il riferimento e alcuni scenari dell’esempio"/>
@@ -19804,7 +20024,7 @@
         <w:keepNext/>
         <w:spacing w:after="140"/>
       </w:pPr>
-      <w:bookmarkStart w:id="50" w:name="_Toc242228806"/>
+      <w:bookmarkStart w:id="50" w:name="_Toc242229572"/>
       <w:r>
         <w:t>Selezionare applicare e conservare le alternative</w:t>
       </w:r>
@@ -19849,7 +20069,7 @@
         <w:keepNext/>
         <w:spacing w:after="140"/>
       </w:pPr>
-      <w:bookmarkStart w:id="51" w:name="_Toc242228807"/>
+      <w:bookmarkStart w:id="51" w:name="_Toc242229573"/>
       <w:r>
         <w:t>Prezzi geotecnica e scenari da confrontare</w:t>
       </w:r>
@@ -19885,7 +20105,7 @@
         <w:keepNext/>
         <w:spacing w:after="140"/>
       </w:pPr>
-      <w:bookmarkStart w:id="52" w:name="_Toc242228808"/>
+      <w:bookmarkStart w:id="52" w:name="_Toc242229574"/>
       <w:r>
         <w:t>Usare le famiglie speciali</w:t>
       </w:r>
@@ -19930,7 +20150,7 @@
         <w:keepNext/>
         <w:spacing w:after="140"/>
       </w:pPr>
-      <w:bookmarkStart w:id="53" w:name="_Toc242228809"/>
+      <w:bookmarkStart w:id="53" w:name="_Toc242229575"/>
       <w:r>
         <w:t>Risolvere i messaggi più comuni</w:t>
       </w:r>
@@ -20837,7 +21057,7 @@
         <w:keepNext/>
         <w:spacing w:after="140"/>
       </w:pPr>
-      <w:bookmarkStart w:id="54" w:name="_Toc242228810"/>
+      <w:bookmarkStart w:id="54" w:name="_Toc242229576"/>
       <w:r>
         <w:t>Esportare un confronto leggibile</w:t>
       </w:r>
@@ -20869,7 +21089,7 @@
         <w:keepNext/>
         <w:spacing w:after="140"/>
       </w:pPr>
-      <w:bookmarkStart w:id="55" w:name="_Toc242228811"/>
+      <w:bookmarkStart w:id="55" w:name="_Toc242229577"/>
       <w:r>
         <w:t>Quanto fidarsi dei risultati</w:t>
       </w:r>
@@ -20905,7 +21125,7 @@
         <w:keepNext/>
         <w:spacing w:after="140"/>
       </w:pPr>
-      <w:bookmarkStart w:id="56" w:name="_Toc242228812"/>
+      <w:bookmarkStart w:id="56" w:name="_Toc242229578"/>
       <w:r>
         <w:t>Salvataggio e report</w:t>
       </w:r>
@@ -20917,7 +21137,7 @@
         <w:keepNext/>
         <w:spacing w:after="140"/>
       </w:pPr>
-      <w:bookmarkStart w:id="57" w:name="_Toc242228813"/>
+      <w:bookmarkStart w:id="57" w:name="_Toc242229579"/>
       <w:r>
         <w:t>Conservare dati modificabili</w:t>
       </w:r>
@@ -20945,7 +21165,7 @@
         <w:keepNext/>
         <w:spacing w:after="140"/>
       </w:pPr>
-      <w:bookmarkStart w:id="58" w:name="_Toc242228814"/>
+      <w:bookmarkStart w:id="58" w:name="_Toc242229580"/>
       <w:r>
         <w:t>Report del singolo foglio e del progetto</w:t>
       </w:r>
@@ -20982,7 +21202,7 @@
         <w:keepNext/>
         <w:spacing w:after="140"/>
       </w:pPr>
-      <w:bookmarkStart w:id="59" w:name="_Toc242228815"/>
+      <w:bookmarkStart w:id="59" w:name="_Toc242229581"/>
       <w:r>
         <w:t>Conservare dati e risultati insieme</w:t>
       </w:r>
@@ -21010,7 +21230,7 @@
         <w:keepNext/>
         <w:spacing w:after="140"/>
       </w:pPr>
-      <w:bookmarkStart w:id="60" w:name="_Toc242228816"/>
+      <w:bookmarkStart w:id="60" w:name="_Toc242229582"/>
       <w:r>
         <w:t>Percorso completo per un primo progetto</w:t>
       </w:r>
@@ -21093,7 +21313,7 @@
         <w:keepNext/>
         <w:spacing w:after="140"/>
       </w:pPr>
-      <w:bookmarkStart w:id="61" w:name="_Toc242228817"/>
+      <w:bookmarkStart w:id="61" w:name="_Toc242229583"/>
       <w:r>
         <w:lastRenderedPageBreak/>
         <w:t>Problemi frequenti e controlli finali</w:t>
@@ -21680,7 +21900,7 @@
         <w:keepNext/>
         <w:spacing w:after="140"/>
       </w:pPr>
-      <w:bookmarkStart w:id="62" w:name="_Toc242228818"/>
+      <w:bookmarkStart w:id="62" w:name="_Toc242229584"/>
       <w:r>
         <w:t>Riferimenti per approfondire</w:t>
       </w:r>
@@ -21703,7 +21923,7 @@
         <w:keepNext/>
         <w:spacing w:after="140"/>
       </w:pPr>
-      <w:bookmarkStart w:id="63" w:name="_Toc242228819"/>
+      <w:bookmarkStart w:id="63" w:name="_Toc242229585"/>
       <w:r>
         <w:lastRenderedPageBreak/>
         <w:t>Muri di sostegno con stratigrafie di monte e valle</w:t>
@@ -21723,10 +21943,16 @@
         <w:spacing w:after="140"/>
       </w:pPr>
       <w:r>
-        <w:t>Le stratigrafie di monte e valle sono affiancate, indipendenti o collegate per spessori e proprietà; le profondità partono dalle rispettive superfici. Hlib è la distanza dalla sommità al terreno di valle: Dv=H+t−Hlib. Il terreno davanti al muro entra nei pesi, nei momenti, nelle sollecitazioni della mensola e nel ricoprimento efficace della portanza. La passiva richiede attivazione e frazione mobilitata; è esclusa nel sisma. Gli attriti del muro e della fondazione sono assegnabili oppure ricavati da φcv,k e</w:t>
-      </w:r>
-      <w:r>
-        <w:t xml:space="preserve"> tipo di interfaccia. Il valore a volume costante va caratterizzato, senza sostituirlo automaticamente con quello di picco.</w:t>
+        <w:t xml:space="preserve">Le stratigrafie di monte e valle sono affiancate, indipendenti o collegate per spessori e proprietà; le profondità partono dalle rispettive superfici. Hlib è la distanza dalla sommità al terreno di valle: Dv=H+t−Hlib. Il terreno davanti al muro entra nei pesi, nei momenti, nelle sollecitazioni della mensola e nel ricoprimento efficace della portanza. La passiva richiede attivazione e frazione mobilitata; è esclusa nel sisma. Gli attriti del muro e della fondazione sono assegnabili oppure ricavati da </w:t>
+      </w:r>
+      <w:r>
+        <w:rPr>
+          <w:rFonts w:ascii="Calibri" w:eastAsia="Calibri" w:hAnsi="Calibri" w:cs="Calibri"/>
+        </w:rPr>
+        <w:t>φ</w:t>
+      </w:r>
+      <w:r>
+        <w:t>cv,k e tipo di interfaccia. Il valore a volume costante va caratterizzato, senza sostituirlo automaticamente con quello di picco.</w:t>
       </w:r>
     </w:p>
     <w:p>
@@ -21765,7 +21991,7 @@
         <w:keepNext/>
         <w:spacing w:after="140"/>
       </w:pPr>
-      <w:bookmarkStart w:id="64" w:name="_Toc242228820"/>
+      <w:bookmarkStart w:id="64" w:name="_Toc242229586"/>
       <w:r>
         <w:t>Materiali e copriferro del muro</w:t>
       </w:r>
@@ -21776,7 +22002,34 @@
         <w:spacing w:after="140"/>
       </w:pPr>
       <w:r>
-        <w:t>La scheda Materiali del muro usa gli stessi cataloghi GPC del verificatore delle sezioni in calcestruzzo. Selezionare la classe del CLS e dell'acciaio; le proprietà di catalogo sono protette. Personalizzato consente di assegnare resistenze, modulo dell'acciaio, deformazione ultima e nome. Il diagramma costitutivo e i coefficienti αcc, γc e γs sono interrogabili; fcd, fyd ed Ecm mostrano i valori effettivi. Il trasferimento Apri sezione in c.a. conserva questi dati.</w:t>
+        <w:t xml:space="preserve">La scheda Materiali del muro usa gli stessi cataloghi GPC del verificatore delle sezioni in calcestruzzo. Selezionare la classe del CLS e dell'acciaio; le proprietà di catalogo sono protette. Personalizzato consente di assegnare resistenze, modulo dell'acciaio, deformazione ultima e nome. Il diagramma costitutivo e i coefficienti </w:t>
+      </w:r>
+      <w:r>
+        <w:rPr>
+          <w:rFonts w:ascii="Calibri" w:eastAsia="Calibri" w:hAnsi="Calibri" w:cs="Calibri"/>
+        </w:rPr>
+        <w:t>α</w:t>
+      </w:r>
+      <w:r>
+        <w:t xml:space="preserve">cc, </w:t>
+      </w:r>
+      <w:r>
+        <w:rPr>
+          <w:rFonts w:ascii="Calibri" w:eastAsia="Calibri" w:hAnsi="Calibri" w:cs="Calibri"/>
+        </w:rPr>
+        <w:t>γ</w:t>
+      </w:r>
+      <w:r>
+        <w:t xml:space="preserve">c e </w:t>
+      </w:r>
+      <w:r>
+        <w:rPr>
+          <w:rFonts w:ascii="Calibri" w:eastAsia="Calibri" w:hAnsi="Calibri" w:cs="Calibri"/>
+        </w:rPr>
+        <w:t>γ</w:t>
+      </w:r>
+      <w:r>
+        <w:t>s sono interrogabili; fcd, fyd ed Ecm mostrano i valori effettivi. Il trasferimento Apri sezione in c.a. conserva questi dati.</w:t>
       </w:r>
     </w:p>
     <w:p>
@@ -21805,7 +22058,7 @@
         <w:keepNext/>
         <w:spacing w:after="140"/>
       </w:pPr>
-      <w:bookmarkStart w:id="65" w:name="_Toc242228821"/>
+      <w:bookmarkStart w:id="65" w:name="_Toc242229587"/>
       <w:r>
         <w:t>Avviare la verifica globale</w:t>
       </w:r>
@@ -21852,7 +22105,7 @@
         <w:keepNext/>
         <w:spacing w:after="140"/>
       </w:pPr>
-      <w:bookmarkStart w:id="66" w:name="_Toc242228822"/>
+      <w:bookmarkStart w:id="66" w:name="_Toc242229588"/>
       <w:r>
         <w:t>Inserire spessori e proprietà dei terreni</w:t>
       </w:r>
@@ -22524,7 +22777,43 @@
         <w:spacing w:after="140"/>
       </w:pPr>
       <w:r>
-        <w:t>Selezionando una riga compaiono γ e γsat in kN/m³ e le resistenze caratteristiche: φ′k in gradi e c′k in kPa per Drenata; cu,k in kPa per Non drenata. Un nuovo strato ha proprietà da completare. Stesso nome del terreno significa stesso colore nelle due colonne e nel disegno, ma non collega automaticamente i valori.</w:t>
+        <w:t xml:space="preserve">Selezionando una riga compaiono </w:t>
+      </w:r>
+      <w:r>
+        <w:rPr>
+          <w:rFonts w:ascii="Calibri" w:eastAsia="Calibri" w:hAnsi="Calibri" w:cs="Calibri"/>
+        </w:rPr>
+        <w:t>γ</w:t>
+      </w:r>
+      <w:r>
+        <w:t xml:space="preserve"> e </w:t>
+      </w:r>
+      <w:r>
+        <w:rPr>
+          <w:rFonts w:ascii="Calibri" w:eastAsia="Calibri" w:hAnsi="Calibri" w:cs="Calibri"/>
+        </w:rPr>
+        <w:t>γ</w:t>
+      </w:r>
+      <w:r>
+        <w:t xml:space="preserve">sat in kN/m³ e le resistenze caratteristiche: </w:t>
+      </w:r>
+      <w:r>
+        <w:rPr>
+          <w:rFonts w:ascii="Calibri" w:eastAsia="Calibri" w:hAnsi="Calibri" w:cs="Calibri"/>
+        </w:rPr>
+        <w:t>φ′</w:t>
+      </w:r>
+      <w:r>
+        <w:t>k in gradi e c</w:t>
+      </w:r>
+      <w:r>
+        <w:rPr>
+          <w:rFonts w:ascii="Calibri" w:eastAsia="Calibri" w:hAnsi="Calibri" w:cs="Calibri"/>
+        </w:rPr>
+        <w:t>′</w:t>
+      </w:r>
+      <w:r>
+        <w:t>k in kPa per Drenata; cu,k in kPa per Non drenata. Un nuovo strato ha proprietà da completare. Stesso nome del terreno significa stesso colore nelle due colonne e nel disegno, ma non collega automaticamente i valori.</w:t>
       </w:r>
     </w:p>
     <w:p>
@@ -22537,7 +22826,7 @@
           <w:noProof/>
         </w:rPr>
         <w:drawing>
-          <wp:inline distT="0" distB="0" distL="0" distR="0" wp14:anchorId="3DD3C6EB" wp14:editId="0082F83F">
+          <wp:inline distT="0" distB="0" distL="0" distR="0" wp14:anchorId="640E6B88" wp14:editId="18402D21">
             <wp:extent cx="6120000" cy="2570400"/>
             <wp:effectExtent l="0" t="0" r="0" b="0"/>
             <wp:docPr id="8" name="Picture 8" descr="Profilo dell’esempio stratificato con terreno sotto la fondazione e limiti di ricerca evidenziati in blu."/>
@@ -22595,7 +22884,7 @@
         <w:keepNext/>
         <w:spacing w:after="140"/>
       </w:pPr>
-      <w:bookmarkStart w:id="67" w:name="_Toc242228823"/>
+      <w:bookmarkStart w:id="67" w:name="_Toc242229589"/>
       <w:r>
         <w:t>Controllare rilievo falda sisma e ricerca</w:t>
       </w:r>
@@ -22618,7 +22907,16 @@
         <w:spacing w:after="140"/>
       </w:pPr>
       <w:r>
-        <w:t>L’attivazione del sisma globale viene ripresa dal muro durante la precompilazione. Il gruppo Falda e sisma espone l’opzione e la sorgente dei coefficienti. Da sito usa i dati del progetto con βs=0,38; in alternativa si assegnano kh e il modulo di kv. Il coefficiente globale non va confuso con quello delle spinte del muro. Se i dati del sito non sono disponibili, occorre completare la sorgente scelta; non viene assunto un valore sismico implicito.</w:t>
+        <w:t xml:space="preserve">L’attivazione del sisma globale viene ripresa dal muro durante la precompilazione. Il gruppo Falda e sisma espone l’opzione e la sorgente dei coefficienti. Da sito usa i dati del progetto con </w:t>
+      </w:r>
+      <w:r>
+        <w:rPr>
+          <w:rFonts w:ascii="Calibri" w:eastAsia="Calibri" w:hAnsi="Calibri" w:cs="Calibri"/>
+        </w:rPr>
+        <w:t>β</w:t>
+      </w:r>
+      <w:r>
+        <w:t>s=0,38; in alternativa si assegnano kh e il modulo di kv. Il coefficiente globale non va confuso con quello delle spinte del muro. Se i dati del sito non sono disponibili, occorre completare la sorgente scelta; non viene assunto un valore sismico implicito.</w:t>
       </w:r>
     </w:p>
     <w:p>
@@ -22635,7 +22933,7 @@
         <w:keepNext/>
         <w:spacing w:after="140"/>
       </w:pPr>
-      <w:bookmarkStart w:id="68" w:name="_Toc242228824"/>
+      <w:bookmarkStart w:id="68" w:name="_Toc242229590"/>
       <w:r>
         <w:t>Leggere il risultato e riprodurre l’esempio</w:t>
       </w:r>
@@ -22646,15 +22944,60 @@
         <w:spacing w:after="140"/>
       </w:pPr>
       <w:r>
-        <w:t>Controllare l’Esito di tutte le combinazioni. F è il fattore trovato con i parametri di progetto; il tasso di lavoro è η=γR/F. Il caso iniziale è quello con tasso maggiore, non necessariamente quello con F minore se γR cambia; un caso privo di superficie valida ha priorità. La tabella e il cerchio restano interrogabili per ogni combinazione.</w:t>
-      </w:r>
-    </w:p>
-    <w:p>
-      <w:pPr>
-        <w:spacing w:after="140"/>
-      </w:pPr>
-      <w:r>
-        <w:t>Soddisfatta nel dominio esplorato richiede η≤1 e controlli della ricerca superati. Minimo sul bordo richiede di ampliare l’area, sempre entro rilievo e indagini disponibili. Ricerca incompleta o discretizzazione non convergente impediscono una conclusione favorevole anche con η≤1. Non modificare arbitrariamente i parametri del terreno per ottenere un esito favorevole.</w:t>
+        <w:t xml:space="preserve">Controllare l’Esito di tutte le combinazioni. F è il fattore trovato con i parametri di progetto; il tasso di lavoro è </w:t>
+      </w:r>
+      <w:r>
+        <w:rPr>
+          <w:rFonts w:ascii="Calibri" w:eastAsia="Calibri" w:hAnsi="Calibri" w:cs="Calibri"/>
+        </w:rPr>
+        <w:t>η</w:t>
+      </w:r>
+      <w:r>
+        <w:t>=</w:t>
+      </w:r>
+      <w:r>
+        <w:rPr>
+          <w:rFonts w:ascii="Calibri" w:eastAsia="Calibri" w:hAnsi="Calibri" w:cs="Calibri"/>
+        </w:rPr>
+        <w:t>γ</w:t>
+      </w:r>
+      <w:r>
+        <w:t xml:space="preserve">R/F. Il caso iniziale è quello con tasso maggiore, non necessariamente quello con F minore se </w:t>
+      </w:r>
+      <w:r>
+        <w:rPr>
+          <w:rFonts w:ascii="Calibri" w:eastAsia="Calibri" w:hAnsi="Calibri" w:cs="Calibri"/>
+        </w:rPr>
+        <w:t>γ</w:t>
+      </w:r>
+      <w:r>
+        <w:t>R cambia; un caso privo di superficie valida ha priorità. La tabella e il cerchio restano interrogabili per ogni combinazione.</w:t>
+      </w:r>
+    </w:p>
+    <w:p>
+      <w:pPr>
+        <w:spacing w:after="140"/>
+      </w:pPr>
+      <w:r>
+        <w:t xml:space="preserve">Soddisfatta nel dominio esplorato richiede </w:t>
+      </w:r>
+      <w:r>
+        <w:rPr>
+          <w:rFonts w:ascii="Calibri" w:eastAsia="Calibri" w:hAnsi="Calibri" w:cs="Calibri"/>
+        </w:rPr>
+        <w:t>η</w:t>
+      </w:r>
+      <w:r>
+        <w:t xml:space="preserve">≤1 e controlli della ricerca superati. Minimo sul bordo richiede di ampliare l’area, sempre entro rilievo e indagini disponibili. Ricerca incompleta o discretizzazione non convergente impediscono una conclusione favorevole anche con </w:t>
+      </w:r>
+      <w:r>
+        <w:rPr>
+          <w:rFonts w:ascii="Calibri" w:eastAsia="Calibri" w:hAnsi="Calibri" w:cs="Calibri"/>
+        </w:rPr>
+        <w:t>η</w:t>
+      </w:r>
+      <w:r>
+        <w:t>≤1. Non modificare arbitrariamente i parametri del terreno per ottenere un esito favorevole.</w:t>
       </w:r>
     </w:p>
     <w:p>
@@ -22670,7 +23013,16 @@
         <w:spacing w:after="140"/>
       </w:pPr>
       <w:r>
-        <w:t>Per riprodurre il caso illustrato aprire supporto/artefatti/globale-guidata-20260930/offscreen-rilascio/esempio-stratificato.anthea e premere Calcola globale, senza ripreparare i dati locali. Le proprietà e il dominio completi sono riportati nell’esempio seguente. Il secondo caso statico ha F=1,075737 e η=1,022555: l’esito non soddisfatto è conservato nell’esempio. È un controllo interno ANTHEA.</w:t>
+        <w:t xml:space="preserve">Per riprodurre il caso illustrato aprire supporto/artefatti/globale-guidata-20260930/offscreen-rilascio/esempio-stratificato.anthea e premere Calcola globale, senza ripreparare i dati locali. Le proprietà e il dominio completi sono riportati nell’esempio seguente. Il secondo caso statico ha F=1,075737 e </w:t>
+      </w:r>
+      <w:r>
+        <w:rPr>
+          <w:rFonts w:ascii="Calibri" w:eastAsia="Calibri" w:hAnsi="Calibri" w:cs="Calibri"/>
+        </w:rPr>
+        <w:t>η</w:t>
+      </w:r>
+      <w:r>
+        <w:t>=1,022555: l’esito non soddisfatto è conservato nell’esempio. È un controllo interno ANTHEA.</w:t>
       </w:r>
     </w:p>
     <w:p>
@@ -22679,7 +23031,7 @@
         <w:keepNext/>
         <w:spacing w:after="140"/>
       </w:pPr>
-      <w:bookmarkStart w:id="69" w:name="_Toc242228825"/>
+      <w:bookmarkStart w:id="69" w:name="_Toc242229591"/>
       <w:r>
         <w:t>Esempio salvato e risultati ripercorribili</w:t>
       </w:r>
@@ -22708,15 +23060,60 @@
       </w:pPr>
       <w:r>
         <w:lastRenderedPageBreak/>
-        <w:t>Muro a mensola: H=3 m, t=0,45 m, fusto 0,40/0,25 m, mensola di valle 0,80 m e di monte 1,80 m; peso del muro 25 kN/m³. Terreno di valle fino al piano di posa, qk=10 kPa uniforme a monte. Profilo da x=−13,80 m a valle a x=16,80 m a monte; confine delle colonne x=1,20 m. I pesi γ/γsat sono 18/20, 19/21 e 20/22 kN/m³ rispettivamente per Riempimento, Alluvioni e Ghiaia; φ′k è 30°, 28° e 36°, con c′k nullo. Non sono presenti falda e sisma.</w:t>
-      </w:r>
-    </w:p>
-    <w:p>
-      <w:pPr>
-        <w:spacing w:after="140"/>
-      </w:pPr>
-      <w:r>
-        <w:t>Ricerca: uscite x=−13,80/−0,10 m, ingressi x=3,10/16,80 m, profondità 0,10/6,90 m; 9 nodi per direzione, 60 conci iniziali, 4 raffinamenti. Preset statico A2–M2–R2, γR=1,10. Si ottengono:</w:t>
+        <w:t xml:space="preserve">Muro a mensola: H=3 m, t=0,45 m, fusto 0,40/0,25 m, mensola di valle 0,80 m e di monte 1,80 m; peso del muro 25 kN/m³. Terreno di valle fino al piano di posa, qk=10 kPa uniforme a monte. Profilo da x=−13,80 m a valle a x=16,80 m a monte; confine delle colonne x=1,20 m. I pesi </w:t>
+      </w:r>
+      <w:r>
+        <w:rPr>
+          <w:rFonts w:ascii="Calibri" w:eastAsia="Calibri" w:hAnsi="Calibri" w:cs="Calibri"/>
+        </w:rPr>
+        <w:t>γ</w:t>
+      </w:r>
+      <w:r>
+        <w:t>/</w:t>
+      </w:r>
+      <w:r>
+        <w:rPr>
+          <w:rFonts w:ascii="Calibri" w:eastAsia="Calibri" w:hAnsi="Calibri" w:cs="Calibri"/>
+        </w:rPr>
+        <w:t>γ</w:t>
+      </w:r>
+      <w:r>
+        <w:t xml:space="preserve">sat sono 18/20, 19/21 e 20/22 kN/m³ rispettivamente per Riempimento, Alluvioni e Ghiaia; </w:t>
+      </w:r>
+      <w:r>
+        <w:rPr>
+          <w:rFonts w:ascii="Calibri" w:eastAsia="Calibri" w:hAnsi="Calibri" w:cs="Calibri"/>
+        </w:rPr>
+        <w:t>φ′</w:t>
+      </w:r>
+      <w:r>
+        <w:t>k è 30°, 28° e 36°, con c</w:t>
+      </w:r>
+      <w:r>
+        <w:rPr>
+          <w:rFonts w:ascii="Calibri" w:eastAsia="Calibri" w:hAnsi="Calibri" w:cs="Calibri"/>
+        </w:rPr>
+        <w:t>′</w:t>
+      </w:r>
+      <w:r>
+        <w:t>k nullo. Non sono presenti falda e sisma.</w:t>
+      </w:r>
+    </w:p>
+    <w:p>
+      <w:pPr>
+        <w:spacing w:after="140"/>
+      </w:pPr>
+      <w:r>
+        <w:t xml:space="preserve">Ricerca: uscite x=−13,80/−0,10 m, ingressi x=3,10/16,80 m, profondità 0,10/6,90 m; 9 nodi per direzione, 60 conci iniziali, 4 raffinamenti. Preset statico A2–M2–R2, </w:t>
+      </w:r>
+      <w:r>
+        <w:rPr>
+          <w:rFonts w:ascii="Calibri" w:eastAsia="Calibri" w:hAnsi="Calibri" w:cs="Calibri"/>
+        </w:rPr>
+        <w:t>γ</w:t>
+      </w:r>
+      <w:r>
+        <w:t>R=1,10. Si ottengono:</w:t>
       </w:r>
     </w:p>
     <w:tbl>
@@ -22817,10 +23214,33 @@
             </w:pPr>
             <w:r>
               <w:rPr>
+                <w:rFonts w:ascii="Calibri" w:eastAsia="Calibri" w:hAnsi="Calibri" w:cs="Calibri"/>
                 <w:b/>
                 <w:sz w:val="21"/>
               </w:rPr>
-              <w:t>η=γR/F</w:t>
+              <w:t>η</w:t>
+            </w:r>
+            <w:r>
+              <w:rPr>
+                <w:b/>
+                <w:sz w:val="21"/>
+              </w:rPr>
+              <w:t>=</w:t>
+            </w:r>
+            <w:r>
+              <w:rPr>
+                <w:rFonts w:ascii="Calibri" w:eastAsia="Calibri" w:hAnsi="Calibri" w:cs="Calibri"/>
+                <w:b/>
+                <w:sz w:val="21"/>
+              </w:rPr>
+              <w:t>γ</w:t>
+            </w:r>
+            <w:r>
+              <w:rPr>
+                <w:b/>
+                <w:sz w:val="21"/>
+              </w:rPr>
+              <w:t>R/F</w:t>
             </w:r>
           </w:p>
         </w:tc>
@@ -23067,7 +23487,7 @@
           <w:noProof/>
         </w:rPr>
         <w:drawing>
-          <wp:inline distT="0" distB="0" distL="0" distR="0" wp14:anchorId="3B7A3851" wp14:editId="5ACF5471">
+          <wp:inline distT="0" distB="0" distL="0" distR="0" wp14:anchorId="711013F7" wp14:editId="10DAE7CA">
             <wp:extent cx="6120000" cy="2570400"/>
             <wp:effectExtent l="0" t="0" r="0" b="0"/>
             <wp:docPr id="9" name="Picture 9" descr="Superficie della seconda combinazione: il tasso supera 1 e il cerchio è rosso. L’esempio conserva l’esito sfavorevole per mostrare la lettura della verifica."/>
@@ -23134,7 +23554,7 @@
         <w:keepNext/>
         <w:spacing w:after="140"/>
       </w:pPr>
-      <w:bookmarkStart w:id="70" w:name="_Toc242228826"/>
+      <w:bookmarkStart w:id="70" w:name="_Toc242229592"/>
       <w:r>
         <w:t>Portanza, cedimenti e armature dei muri: procedura</w:t>
       </w:r>
@@ -23154,7 +23574,7 @@
         <w:keepNext/>
         <w:spacing w:after="140"/>
       </w:pPr>
-      <w:bookmarkStart w:id="71" w:name="_Toc242228827"/>
+      <w:bookmarkStart w:id="71" w:name="_Toc242229593"/>
       <w:r>
         <w:lastRenderedPageBreak/>
         <w:t>Scegliere il controllo</w:t>
@@ -23664,7 +24084,7 @@
         <w:keepNext/>
         <w:spacing w:after="140"/>
       </w:pPr>
-      <w:bookmarkStart w:id="72" w:name="_Toc242228828"/>
+      <w:bookmarkStart w:id="72" w:name="_Toc242229594"/>
       <w:r>
         <w:t>Procedura e lettura</w:t>
       </w:r>
@@ -23700,7 +24120,7 @@
         <w:keepNext/>
         <w:spacing w:after="140"/>
       </w:pPr>
-      <w:bookmarkStart w:id="73" w:name="_Toc242228829"/>
+      <w:bookmarkStart w:id="73" w:name="_Toc242229595"/>
       <w:r>
         <w:t>Dati della portanza sismica</w:t>
       </w:r>
@@ -23711,15 +24131,60 @@
         <w:spacing w:after="140"/>
       </w:pPr>
       <w:r>
-        <w:t>In Terreno aprire Portanza sismica. Con Da sito si usa ah/g=ag/g·Ss·St, prima della riduzione β del muro; av/g=±0,5ah/g. In alternativa assegnare entrambe le accelerazioni. Il fattore γRD è modificabile: 1 per sabbia medio densa, 1,15 per sabbia sciolta asciutta. Non è un valore ricavato automaticamente dal solo angolo di attrito.</w:t>
-      </w:r>
-    </w:p>
-    <w:p>
-      <w:pPr>
-        <w:spacing w:after="140"/>
-      </w:pPr>
-      <w:r>
-        <w:t xml:space="preserve">In Verifiche scegliere una combinazione SISMA e Portanza sismica nel riepilogo. Sono leggibili Nmax, F, N̄, V̄, M̄, limite verticale, interazione, tasso ed esito. Un’accelerazione </w:t>
+        <w:t xml:space="preserve">In Terreno aprire Portanza sismica. Con Da sito si usa ah/g=ag/g·Ss·St, prima della riduzione </w:t>
+      </w:r>
+      <w:r>
+        <w:rPr>
+          <w:rFonts w:ascii="Calibri" w:eastAsia="Calibri" w:hAnsi="Calibri" w:cs="Calibri"/>
+        </w:rPr>
+        <w:t>β</w:t>
+      </w:r>
+      <w:r>
+        <w:t xml:space="preserve"> del muro; av/g=±0,5ah/g. In alternativa assegnare entrambe le accelerazioni. Il fattore </w:t>
+      </w:r>
+      <w:r>
+        <w:rPr>
+          <w:rFonts w:ascii="Calibri" w:eastAsia="Calibri" w:hAnsi="Calibri" w:cs="Calibri"/>
+        </w:rPr>
+        <w:t>γ</w:t>
+      </w:r>
+      <w:r>
+        <w:t>RD è modificabile: 1 per sabbia medio densa, 1,15 per sabbia sciolta asciutta. Non è un valore ricavato automaticamente dal solo angolo di attrito.</w:t>
+      </w:r>
+    </w:p>
+    <w:p>
+      <w:pPr>
+        <w:spacing w:after="140"/>
+      </w:pPr>
+      <w:r>
+        <w:t xml:space="preserve">In Verifiche scegliere una combinazione SISMA e Portanza sismica nel riepilogo. Sono leggibili Nmax, F, </w:t>
+      </w:r>
+      <w:r>
+        <w:rPr>
+          <w:rFonts w:ascii="Calibri" w:eastAsia="Calibri" w:hAnsi="Calibri" w:cs="Calibri"/>
+        </w:rPr>
+        <w:t>N̄</w:t>
+      </w:r>
+      <w:r>
+        <w:t xml:space="preserve">, </w:t>
+      </w:r>
+      <w:r>
+        <w:rPr>
+          <w:rFonts w:ascii="Calibri" w:eastAsia="Calibri" w:hAnsi="Calibri" w:cs="Calibri"/>
+        </w:rPr>
+        <w:t>V̄</w:t>
+      </w:r>
+      <w:r>
+        <w:t xml:space="preserve">, </w:t>
+      </w:r>
+      <w:r>
+        <w:rPr>
+          <w:rFonts w:ascii="Calibri" w:eastAsia="Calibri" w:hAnsi="Calibri" w:cs="Calibri"/>
+        </w:rPr>
+        <w:t>M̄</w:t>
+      </w:r>
+      <w:r>
+        <w:t xml:space="preserve">, limite verticale, interazione, tasso ed esito. Un’accelerazione </w:t>
       </w:r>
       <w:r>
         <w:lastRenderedPageBreak/>
@@ -23732,7 +24197,7 @@
         <w:keepNext/>
         <w:spacing w:after="140"/>
       </w:pPr>
-      <w:bookmarkStart w:id="74" w:name="_Toc242228830"/>
+      <w:bookmarkStart w:id="74" w:name="_Toc242229596"/>
       <w:r>
         <w:t>Dati dei cedimenti</w:t>
       </w:r>
@@ -23743,7 +24208,16 @@
         <w:spacing w:after="140"/>
       </w:pPr>
       <w:r>
-        <w:t>In Terreno attivare Calcola cedimenti finali e inserire, a partire dal piano di posa, nome, spessore e modulo edometrico M di ciascuno strato. M è espresso in kPa: per esempio 30 MPa corrispondono a 30000 kPa. Non viene dedotto da φ o riempito con un valore presunto. La pressione del terreno rimosso è il carico geostatico eliminato con lo scavo, da valutare nel modello scelto; zero è una scelta esplicita.</w:t>
+        <w:t xml:space="preserve">In Terreno attivare Calcola cedimenti finali e inserire, a partire dal piano di posa, nome, spessore e modulo edometrico M di ciascuno strato. M è espresso in kPa: per esempio 30 MPa corrispondono a 30000 kPa. Non viene dedotto da </w:t>
+      </w:r>
+      <w:r>
+        <w:rPr>
+          <w:rFonts w:ascii="Calibri" w:eastAsia="Calibri" w:hAnsi="Calibri" w:cs="Calibri"/>
+        </w:rPr>
+        <w:t>φ</w:t>
+      </w:r>
+      <w:r>
+        <w:t xml:space="preserve"> o riempito con un valore presunto. La pressione del terreno rimosso è il carico geostatico eliminato con lo scavo, da valutare nel modello scelto; zero è una scelta esplicita.</w:t>
       </w:r>
     </w:p>
     <w:p>
@@ -23760,7 +24234,7 @@
         <w:keepNext/>
         <w:spacing w:after="140"/>
       </w:pPr>
-      <w:bookmarkStart w:id="75" w:name="_Toc242228831"/>
+      <w:bookmarkStart w:id="75" w:name="_Toc242229597"/>
       <w:r>
         <w:t>Importare una storia Newmark</w:t>
       </w:r>
@@ -23788,7 +24262,7 @@
         <w:keepNext/>
         <w:spacing w:after="140"/>
       </w:pPr>
-      <w:bookmarkStart w:id="76" w:name="_Toc242228832"/>
+      <w:bookmarkStart w:id="76" w:name="_Toc242229598"/>
       <w:r>
         <w:t>Disporre e proporre le armature</w:t>
       </w:r>
@@ -23839,7 +24313,7 @@
         <w:keepNext/>
         <w:spacing w:after="140"/>
       </w:pPr>
-      <w:bookmarkStart w:id="77" w:name="_Toc242228833"/>
+      <w:bookmarkStart w:id="77" w:name="_Toc242229599"/>
       <w:r>
         <w:t>Tavola delle armature e distinta ferri del muro</w:t>
       </w:r>
@@ -23891,7 +24365,7 @@
         </w:rPr>
         <w:lastRenderedPageBreak/>
         <w:drawing>
-          <wp:inline distT="0" distB="0" distL="0" distR="0" wp14:anchorId="5EE75043" wp14:editId="6AFEF2AE">
+          <wp:inline distT="0" distB="0" distL="0" distR="0" wp14:anchorId="38FAEA01" wp14:editId="0CEFF5FE">
             <wp:extent cx="6120000" cy="4316786"/>
             <wp:effectExtent l="0" t="0" r="0" b="0"/>
             <wp:docPr id="10" name="Picture 10" descr="Esempio di distinta del muro con due zone di armatura e tratto di quattro metri"/>
@@ -23949,7 +24423,7 @@
         <w:keepNext/>
         <w:spacing w:after="140"/>
       </w:pPr>
-      <w:bookmarkStart w:id="78" w:name="_Toc242228834"/>
+      <w:bookmarkStart w:id="78" w:name="_Toc242229600"/>
       <w:r>
         <w:t>Efficienza orizzontale della palificata</w:t>
       </w:r>
@@ -23969,7 +24443,7 @@
         <w:keepNext/>
         <w:spacing w:after="140"/>
       </w:pPr>
-      <w:bookmarkStart w:id="79" w:name="_Toc242228835"/>
+      <w:bookmarkStart w:id="79" w:name="_Toc242229601"/>
       <w:r>
         <w:t>Apertura e geometria</w:t>
       </w:r>
@@ -24009,7 +24483,7 @@
         <w:keepNext/>
         <w:spacing w:after="140"/>
       </w:pPr>
-      <w:bookmarkStart w:id="80" w:name="_Toc242228836"/>
+      <w:bookmarkStart w:id="80" w:name="_Toc242229602"/>
       <w:r>
         <w:t>Metodo e applicabilità</w:t>
       </w:r>
@@ -24627,7 +25101,7 @@
         <w:keepNext/>
         <w:spacing w:after="140"/>
       </w:pPr>
-      <w:bookmarkStart w:id="81" w:name="_Toc242228837"/>
+      <w:bookmarkStart w:id="81" w:name="_Toc242229603"/>
       <w:r>
         <w:t>Risultati e confronto</w:t>
       </w:r>
@@ -24674,7 +25148,7 @@
         <w:keepNext/>
         <w:spacing w:after="140"/>
       </w:pPr>
-      <w:bookmarkStart w:id="82" w:name="_Toc242228838"/>
+      <w:bookmarkStart w:id="82" w:name="_Toc242229604"/>
       <w:r>
         <w:lastRenderedPageBreak/>
         <w:t>Risposta elastica del palo orizzontale</w:t>
@@ -24695,7 +25169,7 @@
         <w:keepNext/>
         <w:spacing w:after="140"/>
       </w:pPr>
-      <w:bookmarkStart w:id="83" w:name="_Toc242228839"/>
+      <w:bookmarkStart w:id="83" w:name="_Toc242229605"/>
       <w:r>
         <w:t>Dati iniziali condivisi</w:t>
       </w:r>
@@ -24714,10 +25188,16 @@
         <w:spacing w:after="140"/>
       </w:pPr>
       <w:r>
-        <w:t>La lunghezza del campo principale rimane la lunghezza infissa. Il tratto libero è una quantità aggiuntiva: la lunghezza totale del modello è infissa più libera. L'eccentricità condivisa indica la quota della forza sopra il piano campagna, come nel modulo precedente. Checker ricava il momento equivalente alla testa C = H (Llibero − e_da_pc), nella convenzione con θ = dy/dx: il braccio del tratto libero non viene contato due volte. Con tratto libero nullo ed eccentricità positiva il momento interno al piano c</w:t>
-      </w:r>
-      <w:r>
-        <w:t>ampagna è H e. Non è presente un secondo campo modificabile C nella scheda elastica.</w:t>
+        <w:t xml:space="preserve">La lunghezza del campo principale rimane la lunghezza infissa. Il tratto libero è una quantità aggiuntiva: la lunghezza totale del modello è infissa più libera. L'eccentricità condivisa indica la quota della forza sopra il piano campagna, come nel modulo precedente. Checker ricava il momento equivalente alla testa C = H (Llibero − e_da_pc), nella convenzione con </w:t>
+      </w:r>
+      <w:r>
+        <w:rPr>
+          <w:rFonts w:ascii="Calibri" w:eastAsia="Calibri" w:hAnsi="Calibri" w:cs="Calibri"/>
+        </w:rPr>
+        <w:t>θ</w:t>
+      </w:r>
+      <w:r>
+        <w:t xml:space="preserve"> = dy/dx: il braccio del tratto libero non viene contato due volte. Con tratto libero nullo ed eccentricità positiva il momento interno al piano campagna è H e. Non è presente un secondo campo modificabile C nella scheda elastica.</w:t>
       </w:r>
     </w:p>
     <w:p>
@@ -24745,7 +25225,7 @@
         <w:keepNext/>
         <w:spacing w:after="140"/>
       </w:pPr>
-      <w:bookmarkStart w:id="84" w:name="_Toc242228840"/>
+      <w:bookmarkStart w:id="84" w:name="_Toc242229606"/>
       <w:r>
         <w:t>Parametri nella riga dello strato</w:t>
       </w:r>
@@ -24764,7 +25244,16 @@
         <w:spacing w:after="140"/>
       </w:pPr>
       <w:r>
-        <w:t xml:space="preserve">Per un nuovo terreno granulare la modalità iniziale è A γ/1,35. Sciolto usa A 100–300, media 200; Medio 300–1000, media 650; Denso 1000–3000, media 2000. A è </w:t>
+        <w:t xml:space="preserve">Per un nuovo terreno granulare la modalità iniziale è A </w:t>
+      </w:r>
+      <w:r>
+        <w:rPr>
+          <w:rFonts w:ascii="Calibri" w:eastAsia="Calibri" w:hAnsi="Calibri" w:cs="Calibri"/>
+        </w:rPr>
+        <w:t>γ</w:t>
+      </w:r>
+      <w:r>
+        <w:t xml:space="preserve">/1,35. Sciolto usa A 100–300, media 200; Medio 300–1000, media 650; Denso 1000–3000, media 2000. A è </w:t>
       </w:r>
       <w:r>
         <w:lastRenderedPageBreak/>
@@ -24788,7 +25277,7 @@
         <w:keepNext/>
         <w:spacing w:after="140"/>
       </w:pPr>
-      <w:bookmarkStart w:id="85" w:name="_Toc242228841"/>
+      <w:bookmarkStart w:id="85" w:name="_Toc242229607"/>
       <w:r>
         <w:t>Sforzo normale e lettura dei diagrammi</w:t>
       </w:r>
@@ -24807,7 +25296,16 @@
         <w:spacing w:after="140"/>
       </w:pPr>
       <w:r>
-        <w:t>I pannelli sono ordinati: profilo, k, y, θ, q, N, V, M, tratti. La scala verticale e la selezione della quota sono comuni. N è positivo a compressione e cresce del peso tra testa e quota considerata. Non sono modellati trasferimento assiale al terreno, galleggiamento o secondo ordine. I passi degli assi seguono valori 1, 2, 5 per potenze di dieci; i valori selezionati conservano la precisione numerica. Alle interfacce il clic ripetuto legge i due lati.</w:t>
+        <w:t xml:space="preserve">I pannelli sono ordinati: profilo, k, y, </w:t>
+      </w:r>
+      <w:r>
+        <w:rPr>
+          <w:rFonts w:ascii="Calibri" w:eastAsia="Calibri" w:hAnsi="Calibri" w:cs="Calibri"/>
+        </w:rPr>
+        <w:t>θ</w:t>
+      </w:r>
+      <w:r>
+        <w:t>, q, N, V, M, tratti. La scala verticale e la selezione della quota sono comuni. N è positivo a compressione e cresce del peso tra testa e quota considerata. Non sono modellati trasferimento assiale al terreno, galleggiamento o secondo ordine. I passi degli assi seguono valori 1, 2, 5 per potenze di dieci; i valori selezionati conservano la precisione numerica. Alle interfacce il clic ripetuto legge i due lati.</w:t>
       </w:r>
     </w:p>
     <w:p>
@@ -24816,7 +25314,7 @@
         <w:keepNext/>
         <w:spacing w:after="140"/>
       </w:pPr>
-      <w:bookmarkStart w:id="86" w:name="_Toc242228842"/>
+      <w:bookmarkStart w:id="86" w:name="_Toc242229608"/>
       <w:r>
         <w:t>Materiali e parametri per strato</w:t>
       </w:r>
@@ -24867,7 +25365,7 @@
         <w:keepNext/>
         <w:spacing w:after="140"/>
       </w:pPr>
-      <w:bookmarkStart w:id="87" w:name="_Toc242228843"/>
+      <w:bookmarkStart w:id="87" w:name="_Toc242229609"/>
       <w:r>
         <w:t>Avanzamento e controlli da completare</w:t>
       </w:r>
@@ -24917,7 +25415,7 @@
         <w:keepNext/>
         <w:spacing w:after="140"/>
       </w:pPr>
-      <w:bookmarkStart w:id="88" w:name="_Toc242228844"/>
+      <w:bookmarkStart w:id="88" w:name="_Toc242229610"/>
       <w:r>
         <w:lastRenderedPageBreak/>
         <w:t>Tratti colorati e verificatore della sezione</w:t>
@@ -24967,13 +25465,28 @@
         <w:spacing w:after="140"/>
       </w:pPr>
       <w:r>
-        <w:t>La sovrapposizione iniziale è 60φ, arrotondata per eccesso al decimetro, per convenzione di ANTHEA; non è attribuita a una norma. Il riquadro distingue lunghezza iniziale, richiesta dal verificatore, adottata ed effettiva. Per ogni giunto si adotta il massimo fra lunghezze iniziali e richieste delle armature collegate. La barra entrante risale di questa lunghezza; la barra superiore termina alla fine del suo tratto. φ24 dà 1,44 m, arrotondati a 1,50 m. Il pulsante Distinta ferri di ogni tratto apre la disti</w:t>
-      </w:r>
-      <w:r>
-        <w:t>nta e la seleziona nel riepilogo a destra. Barre e staffe sono visibili inizialmente; la scelta di richiudere il pannello viene conservata durante il ricalcolo. I testi si aggiornano anche mantenendo il cursore in un campo. Quando la distinta non può essere prodotta, la vista delle armature e il tratto mostrano il motivo specifico, senza un riquadro bianco o un’attesa permanente. La distinta di ciascun tratto indica il proprio gruppo, quantità, diametro, quote fisiche, lunghezza di taglio, barra commerciale</w:t>
-      </w:r>
-      <w:r>
-        <w:t xml:space="preserve"> e sovrapposizione. Ogni pezzo è conteggiato una sola volta; i giunti richiamano i pezzi collegati senza aggiungere </w:t>
+        <w:t>La sovrapposizione iniziale è 60</w:t>
+      </w:r>
+      <w:r>
+        <w:rPr>
+          <w:rFonts w:ascii="Calibri" w:eastAsia="Calibri" w:hAnsi="Calibri" w:cs="Calibri"/>
+        </w:rPr>
+        <w:t>φ</w:t>
+      </w:r>
+      <w:r>
+        <w:t xml:space="preserve">, arrotondata per eccesso al decimetro, per convenzione di ANTHEA; non è attribuita a una norma. Il riquadro distingue lunghezza iniziale, richiesta dal verificatore, adottata ed effettiva. Per ogni giunto si adotta il massimo fra lunghezze iniziali e richieste delle armature collegate. La barra entrante risale di questa lunghezza; la barra superiore termina alla fine del suo tratto. </w:t>
+      </w:r>
+      <w:r>
+        <w:rPr>
+          <w:rFonts w:ascii="Calibri" w:eastAsia="Calibri" w:hAnsi="Calibri" w:cs="Calibri"/>
+        </w:rPr>
+        <w:t>φ</w:t>
+      </w:r>
+      <w:r>
+        <w:t>24 dà 1,44 m, arrotondati a 1,50 m. Il pulsante Distinta ferri di ogni tratto apre la distinta e la seleziona nel riepilogo a destra. Barre e staffe sono visibili inizialmente; la scelta di richiudere il pannello viene conservata durante il ricalcolo. I testi si aggiornano anche mantenendo il cursore in un campo. Quando la distinta non può essere prodotta, la vista delle armature e il tratto mostrano il motivo specifico, senza un riquadro bianco o un’attesa permanente. La distinta di ciascun tratto indica i</w:t>
+      </w:r>
+      <w:r>
+        <w:t xml:space="preserve">l proprio gruppo, quantità, diametro, quote fisiche, lunghezza di taglio, barra commerciale e sovrapposizione. Ogni pezzo è conteggiato una sola volta; i giunti richiamano i pezzi collegati senza aggiungere </w:t>
       </w:r>
       <w:r>
         <w:lastRenderedPageBreak/>
@@ -24986,7 +25499,7 @@
         <w:keepNext/>
         <w:spacing w:after="140"/>
       </w:pPr>
-      <w:bookmarkStart w:id="89" w:name="_Toc242228845"/>
+      <w:bookmarkStart w:id="89" w:name="_Toc242229611"/>
       <w:r>
         <w:t>Approvazione delle ipotesi ed esito delle armature</w:t>
       </w:r>
@@ -25047,7 +25560,7 @@
         <w:keepNext/>
         <w:spacing w:after="140"/>
       </w:pPr>
-      <w:bookmarkStart w:id="90" w:name="_Toc242228846"/>
+      <w:bookmarkStart w:id="90" w:name="_Toc242229612"/>
       <w:r>
         <w:lastRenderedPageBreak/>
         <w:t>Controlli sismici della testa del palo</w:t>
@@ -25086,10 +25599,25 @@
         <w:spacing w:after="140"/>
       </w:pPr>
       <w:r>
-        <w:t>Nel riepilogo a destra selezionare Sisma · testa palo. Sono mostrati estensione, minimo longitudinale, diametro e passo delle staffe, tipologia trasversale, margine a taglio, compressione media e momento elastico, con valore, limite, quota critica e criterio. Dentro la zona valgono As almeno 1% Ac e passo massimo 6φL; fuori valgono 0,3% e 8φL. Il diametro trasversale minimo è 8 mm. La modalità sismica applica questi minimi anche se il controllo ordinario dei minimi pali è disattivato. I coefficienti unitari</w:t>
-      </w:r>
-      <w:r>
-        <w:t>/custom non possono dare un esito di conformità NTC.</w:t>
+        <w:t>Nel riepilogo a destra selezionare Sisma · testa palo. Sono mostrati estensione, minimo longitudinale, diametro e passo delle staffe, tipologia trasversale, margine a taglio, compressione media e momento elastico, con valore, limite, quota critica e criterio. Dentro la zona valgono As almeno 1% Ac e passo massimo 6</w:t>
+      </w:r>
+      <w:r>
+        <w:rPr>
+          <w:rFonts w:ascii="Calibri" w:eastAsia="Calibri" w:hAnsi="Calibri" w:cs="Calibri"/>
+        </w:rPr>
+        <w:t>φ</w:t>
+      </w:r>
+      <w:r>
+        <w:t>L; fuori valgono 0,3% e 8</w:t>
+      </w:r>
+      <w:r>
+        <w:rPr>
+          <w:rFonts w:ascii="Calibri" w:eastAsia="Calibri" w:hAnsi="Calibri" w:cs="Calibri"/>
+        </w:rPr>
+        <w:t>φ</w:t>
+      </w:r>
+      <w:r>
+        <w:t>L. Il diametro trasversale minimo è 8 mm. La modalità sismica applica questi minimi anche se il controllo ordinario dei minimi pali è disattivato. I coefficienti unitari/custom non possono dare un esito di conformità NTC.</w:t>
       </w:r>
     </w:p>
     <w:p>
@@ -25118,7 +25646,7 @@
         <w:keepNext/>
         <w:spacing w:after="140"/>
       </w:pPr>
-      <w:bookmarkStart w:id="91" w:name="_Toc242228847"/>
+      <w:bookmarkStart w:id="91" w:name="_Toc242229613"/>
       <w:r>
         <w:t>Ricalcolo delle sollecitazioni e delle resistenze</w:t>
       </w:r>
@@ -25141,7 +25669,7 @@
         <w:keepNext/>
         <w:spacing w:after="140"/>
       </w:pPr>
-      <w:bookmarkStart w:id="92" w:name="_Toc242228848"/>
+      <w:bookmarkStart w:id="92" w:name="_Toc242229614"/>
       <w:r>
         <w:t>Tratti e verifica delle sezioni</w:t>
       </w:r>
@@ -25183,7 +25711,7 @@
         <w:keepNext/>
         <w:spacing w:after="140"/>
       </w:pPr>
-      <w:bookmarkStart w:id="93" w:name="_Toc242228849"/>
+      <w:bookmarkStart w:id="93" w:name="_Toc242229615"/>
       <w:r>
         <w:t>Proposte e vista delle armature</w:t>
       </w:r>
@@ -25278,7 +25806,7 @@
         <w:keepNext/>
         <w:spacing w:after="140"/>
       </w:pPr>
-      <w:bookmarkStart w:id="94" w:name="_Toc242228850"/>
+      <w:bookmarkStart w:id="94" w:name="_Toc242229616"/>
       <w:r>
         <w:t>Esempio riproducibile e limiti</w:t>
       </w:r>
@@ -25309,7 +25837,7 @@
         <w:keepNext/>
         <w:spacing w:after="140"/>
       </w:pPr>
-      <w:bookmarkStart w:id="95" w:name="_Toc242228851"/>
+      <w:bookmarkStart w:id="95" w:name="_Toc242229617"/>
       <w:r>
         <w:t>Wiki e centro della conoscenza</w:t>
       </w:r>
@@ -25321,7 +25849,7 @@
         <w:keepNext/>
         <w:spacing w:after="140"/>
       </w:pPr>
-      <w:bookmarkStart w:id="96" w:name="_Toc242228852"/>
+      <w:bookmarkStart w:id="96" w:name="_Toc242229618"/>
       <w:r>
         <w:t>Wiki del modulo e aiuti sui singoli dati</w:t>
       </w:r>
@@ -25349,7 +25877,7 @@
         <w:keepNext/>
         <w:spacing w:after="140"/>
       </w:pPr>
-      <w:bookmarkStart w:id="97" w:name="_Toc242228853"/>
+      <w:bookmarkStart w:id="97" w:name="_Toc242229619"/>
       <w:r>
         <w:t>Consultare la nuova biblioteca tecnica</w:t>
       </w:r>
@@ -25373,7 +25901,7 @@
         <w:keepNext/>
         <w:spacing w:after="140"/>
       </w:pPr>
-      <w:bookmarkStart w:id="98" w:name="_Toc242228854"/>
+      <w:bookmarkStart w:id="98" w:name="_Toc242229620"/>
       <w:r>
         <w:t>Engineering Handbook</w:t>
       </w:r>
@@ -25431,7 +25959,7 @@
         <w:keepNext/>
         <w:spacing w:after="140"/>
       </w:pPr>
-      <w:bookmarkStart w:id="99" w:name="_Toc242228855"/>
+      <w:bookmarkStart w:id="99" w:name="_Toc242229621"/>
       <w:r>
         <w:t>Cercare e scegliere un percorso</w:t>
       </w:r>
@@ -25451,7 +25979,7 @@
         <w:keepNext/>
         <w:spacing w:after="140"/>
       </w:pPr>
-      <w:bookmarkStart w:id="100" w:name="_Toc242228856"/>
+      <w:bookmarkStart w:id="100" w:name="_Toc242229622"/>
       <w:r>
         <w:lastRenderedPageBreak/>
         <w:t>Leggere e riprendere</w:t>
@@ -25480,7 +26008,7 @@
         <w:keepNext/>
         <w:spacing w:after="140"/>
       </w:pPr>
-      <w:bookmarkStart w:id="101" w:name="_Toc242228857"/>
+      <w:bookmarkStart w:id="101" w:name="_Toc242229623"/>
       <w:r>
         <w:t>Passare dalla teoria al calcolo</w:t>
       </w:r>
@@ -25516,7 +26044,7 @@
         <w:keepNext/>
         <w:spacing w:after="140"/>
       </w:pPr>
-      <w:bookmarkStart w:id="102" w:name="_Toc242228858"/>
+      <w:bookmarkStart w:id="102" w:name="_Toc242229624"/>
       <w:r>
         <w:t>Progetti e problemi frequenti</w:t>
       </w:r>
@@ -25536,7 +26064,7 @@
         <w:keepNext/>
         <w:spacing w:after="140"/>
       </w:pPr>
-      <w:bookmarkStart w:id="103" w:name="_Toc242228859"/>
+      <w:bookmarkStart w:id="103" w:name="_Toc242229625"/>
       <w:r>
         <w:t>Modulo Sezione in c.a.</w:t>
       </w:r>
@@ -25560,7 +26088,7 @@
         <w:keepNext/>
         <w:spacing w:after="140"/>
       </w:pPr>
-      <w:bookmarkStart w:id="104" w:name="_Toc242228860"/>
+      <w:bookmarkStart w:id="104" w:name="_Toc242229626"/>
       <w:r>
         <w:t>A cosa serve e quando usarlo</w:t>
       </w:r>
@@ -25588,7 +26116,7 @@
         <w:keepNext/>
         <w:spacing w:after="140"/>
       </w:pPr>
-      <w:bookmarkStart w:id="105" w:name="_Toc242228861"/>
+      <w:bookmarkStart w:id="105" w:name="_Toc242229627"/>
       <w:r>
         <w:t>Input geometria e unità</w:t>
       </w:r>
@@ -26183,7 +26711,7 @@
         <w:keepNext/>
         <w:spacing w:after="140"/>
       </w:pPr>
-      <w:bookmarkStart w:id="106" w:name="_Toc242228862"/>
+      <w:bookmarkStart w:id="106" w:name="_Toc242229628"/>
       <w:r>
         <w:t>Input materiali armature e default</w:t>
       </w:r>
@@ -26220,7 +26748,7 @@
         <w:keepNext/>
         <w:spacing w:after="140"/>
       </w:pPr>
-      <w:bookmarkStart w:id="107" w:name="_Toc242228863"/>
+      <w:bookmarkStart w:id="107" w:name="_Toc242229629"/>
       <w:r>
         <w:t>Input azioni e convenzioni</w:t>
       </w:r>
@@ -26248,7 +26776,7 @@
         <w:keepNext/>
         <w:spacing w:after="140"/>
       </w:pPr>
-      <w:bookmarkStart w:id="108" w:name="_Toc242228864"/>
+      <w:bookmarkStart w:id="108" w:name="_Toc242229630"/>
       <w:r>
         <w:t>Descrizione del calcolo</w:t>
       </w:r>
@@ -26276,7 +26804,7 @@
         <w:keepNext/>
         <w:spacing w:after="140"/>
       </w:pPr>
-      <w:bookmarkStart w:id="109" w:name="_Toc242228865"/>
+      <w:bookmarkStart w:id="109" w:name="_Toc242229631"/>
       <w:r>
         <w:t>Output e lettura dei risultati</w:t>
       </w:r>
@@ -26794,7 +27322,7 @@
         <w:keepNext/>
         <w:spacing w:after="140"/>
       </w:pPr>
-      <w:bookmarkStart w:id="110" w:name="_Toc242228866"/>
+      <w:bookmarkStart w:id="110" w:name="_Toc242229632"/>
       <w:r>
         <w:t>Warning e problemi frequenti</w:t>
       </w:r>
@@ -26832,7 +27360,7 @@
         <w:keepNext/>
         <w:spacing w:after="140"/>
       </w:pPr>
-      <w:bookmarkStart w:id="111" w:name="_Toc242228867"/>
+      <w:bookmarkStart w:id="111" w:name="_Toc242229633"/>
       <w:r>
         <w:t>Esempio completo dalla Wiki</w:t>
       </w:r>
@@ -26915,7 +27443,7 @@
         <w:keepNext/>
         <w:spacing w:after="140"/>
       </w:pPr>
-      <w:bookmarkStart w:id="112" w:name="_Toc242228868"/>
+      <w:bookmarkStart w:id="112" w:name="_Toc242229634"/>
       <w:r>
         <w:t>Teoria collegata e riepilogo</w:t>
       </w:r>
@@ -26943,7 +27471,7 @@
         <w:keepNext/>
         <w:spacing w:after="140"/>
       </w:pPr>
-      <w:bookmarkStart w:id="113" w:name="_Toc242228869"/>
+      <w:bookmarkStart w:id="113" w:name="_Toc242229635"/>
       <w:r>
         <w:t>Domini tridimensionali e bidimensionali</w:t>
       </w:r>
@@ -26979,7 +27507,7 @@
         <w:keepNext/>
         <w:spacing w:after="140"/>
       </w:pPr>
-      <w:bookmarkStart w:id="114" w:name="_Toc242228870"/>
+      <w:bookmarkStart w:id="114" w:name="_Toc242229636"/>
       <w:r>
         <w:t>Tensioni e fessurazione</w:t>
       </w:r>
@@ -27019,7 +27547,7 @@
         <w:keepNext/>
         <w:spacing w:after="140"/>
       </w:pPr>
-      <w:bookmarkStart w:id="115" w:name="_Toc242228871"/>
+      <w:bookmarkStart w:id="115" w:name="_Toc242229637"/>
       <w:r>
         <w:t>Taglio torsione e dettagli</w:t>
       </w:r>
@@ -27055,7 +27583,7 @@
         <w:keepNext/>
         <w:spacing w:after="140"/>
       </w:pPr>
-      <w:bookmarkStart w:id="116" w:name="_Toc242228872"/>
+      <w:bookmarkStart w:id="116" w:name="_Toc242229638"/>
       <w:r>
         <w:t>Curva momento curvatura e aggiornamento</w:t>
       </w:r>
@@ -27066,7 +27594,16 @@
         <w:spacing w:after="140"/>
       </w:pPr>
       <w:r>
-        <w:t>La curva M χ si avvia con il proprio comando. Assegnare N, direzione del momento, numero di passi e distribuzione dei punti. Esaminare la progressione della risposta e le deformazioni terminali. La curva arriva al limite trattato dal motore e non descrive automaticamente un ramo post picco di degradazione della struttura.</w:t>
+        <w:t xml:space="preserve">La curva M </w:t>
+      </w:r>
+      <w:r>
+        <w:rPr>
+          <w:rFonts w:ascii="Calibri" w:eastAsia="Calibri" w:hAnsi="Calibri" w:cs="Calibri"/>
+        </w:rPr>
+        <w:t>χ</w:t>
+      </w:r>
+      <w:r>
+        <w:t xml:space="preserve"> si avvia con il proprio comando. Assegnare N, direzione del momento, numero di passi e distribuzione dei punti. Esaminare la progressione della risposta e le deformazioni terminali. La curva arriva al limite trattato dal motore e non descrive automaticamente un ramo post picco di degradazione della struttura.</w:t>
       </w:r>
     </w:p>
     <w:p>
@@ -27091,7 +27628,7 @@
         <w:keepNext/>
         <w:spacing w:after="140"/>
       </w:pPr>
-      <w:bookmarkStart w:id="117" w:name="_Toc242228873"/>
+      <w:bookmarkStart w:id="117" w:name="_Toc242229639"/>
       <w:r>
         <w:lastRenderedPageBreak/>
         <w:t>Importare ed esportare le azioni</w:t>
@@ -27136,7 +27673,7 @@
         <w:keepNext/>
         <w:spacing w:after="140"/>
       </w:pPr>
-      <w:bookmarkStart w:id="118" w:name="_Toc242228874"/>
+      <w:bookmarkStart w:id="118" w:name="_Toc242229640"/>
       <w:r>
         <w:t>Report short della sezione in calcestruzzo armato</w:t>
       </w:r>
@@ -27184,7 +27721,7 @@
         <w:keepNext/>
         <w:spacing w:after="140"/>
       </w:pPr>
-      <w:bookmarkStart w:id="119" w:name="_Toc242228875"/>
+      <w:bookmarkStart w:id="119" w:name="_Toc242229641"/>
       <w:r>
         <w:t>Leggere asse neutro, mappe e report</w:t>
       </w:r>
@@ -27220,7 +27757,7 @@
         <w:keepNext/>
         <w:spacing w:after="140"/>
       </w:pPr>
-      <w:bookmarkStart w:id="120" w:name="_Toc242228876"/>
+      <w:bookmarkStart w:id="120" w:name="_Toc242229642"/>
       <w:r>
         <w:t>Interpretazione dei risultati e controlli indipendenti</w:t>
       </w:r>
@@ -27240,7 +27777,7 @@
         <w:keepNext/>
         <w:spacing w:after="140"/>
       </w:pPr>
-      <w:bookmarkStart w:id="121" w:name="_Toc242228877"/>
+      <w:bookmarkStart w:id="121" w:name="_Toc242229643"/>
       <w:r>
         <w:t>Dalla domanda alla capacità</w:t>
       </w:r>
@@ -27260,7 +27797,7 @@
         <w:keepNext/>
         <w:spacing w:after="140"/>
       </w:pPr>
-      <w:bookmarkStart w:id="122" w:name="_Toc242228878"/>
+      <w:bookmarkStart w:id="122" w:name="_Toc242229644"/>
       <w:r>
         <w:t>Controllo numerico e fisico</w:t>
       </w:r>
@@ -27280,7 +27817,7 @@
         <w:keepNext/>
         <w:spacing w:after="140"/>
       </w:pPr>
-      <w:bookmarkStart w:id="123" w:name="_Toc242228879"/>
+      <w:bookmarkStart w:id="123" w:name="_Toc242229645"/>
       <w:r>
         <w:t>Archiviazione</w:t>
       </w:r>
@@ -27300,7 +27837,7 @@
         <w:keepNext/>
         <w:spacing w:after="140"/>
       </w:pPr>
-      <w:bookmarkStart w:id="124" w:name="_Toc242228880"/>
+      <w:bookmarkStart w:id="124" w:name="_Toc242229646"/>
       <w:r>
         <w:lastRenderedPageBreak/>
         <w:t>Tutorial dal modello Beam alla verifica di sezione</w:t>
@@ -27321,7 +27858,7 @@
         <w:keepNext/>
         <w:spacing w:after="140"/>
       </w:pPr>
-      <w:bookmarkStart w:id="125" w:name="_Toc242228881"/>
+      <w:bookmarkStart w:id="125" w:name="_Toc242229647"/>
       <w:r>
         <w:t>Capisci e controlla</w:t>
       </w:r>
@@ -27341,7 +27878,7 @@
         <w:keepNext/>
         <w:spacing w:after="140"/>
       </w:pPr>
-      <w:bookmarkStart w:id="126" w:name="_Toc242228882"/>
+      <w:bookmarkStart w:id="126" w:name="_Toc242229648"/>
       <w:r>
         <w:t>Calcola e modifica</w:t>
       </w:r>
@@ -27361,7 +27898,7 @@
         <w:keepNext/>
         <w:spacing w:after="140"/>
       </w:pPr>
-      <w:bookmarkStart w:id="127" w:name="_Toc242228883"/>
+      <w:bookmarkStart w:id="127" w:name="_Toc242229649"/>
       <w:r>
         <w:t>Osserva e archivia</w:t>
       </w:r>

</xml_diff>

<commit_message>
Guide Rev31: segni < e > in Calibri nel testo corrente
In Manrope "<" e ">" sono piccole parentesi angolari: a teorica p. 60
"0<N̄<(1−0,96F)" si leggeva "0‹N̄‹". Build-AntheaGuides-Itec.py aggiunge
"<" e ">" ai caratteri del testo corrente impostati in Calibri; il codice
in Consolas e le formule OMML non cambiano. Nei PDF ci sono 19 segni, tutti
confronti: 16 nel testo, ora in Calibri, e 3 in formule (Cambria Math);
nessuno in codice o frecce. Rev31 rigenerata con la pipeline completa:
65 e 134 pagine, 319 formule conservate, 26 parti del modello ITEC
identiche; nessuna espressione vietata nel testo estratto. Profilo quick:
18 PASS, 0 NEW-FAIL.

Co-Authored-By: Claude Opus 5.5 <noreply@anthropic.com>
</commit_message>
<xml_diff>
--- a/supporto/documentazione/Guide_ANTHEA/ANTHEA_Guida_pratica_ITEC_Rev31.docx
+++ b/supporto/documentazione/Guide_ANTHEA/ANTHEA_Guida_pratica_ITEC_Rev31.docx
@@ -2334,7 +2334,7 @@
       <w:r>
         <w:fldChar w:fldCharType="separate"/>
       </w:r>
-      <w:hyperlink w:anchor="_Toc242229524" w:history="1">
+      <w:hyperlink w:anchor="_Toc242229789" w:history="1">
         <w:r>
           <w:rPr>
             <w:rStyle w:val="Collegamentoipertestuale"/>
@@ -2382,7 +2382,7 @@
             <w:noProof/>
             <w:webHidden/>
           </w:rPr>
-          <w:instrText xml:space="preserve"> PAGEREF _Toc242229524 \h </w:instrText>
+          <w:instrText xml:space="preserve"> PAGEREF _Toc242229789 \h </w:instrText>
         </w:r>
         <w:r>
           <w:rPr>
@@ -2429,7 +2429,7 @@
           <w14:ligatures w14:val="standardContextual"/>
         </w:rPr>
       </w:pPr>
-      <w:hyperlink w:anchor="_Toc242229525" w:history="1">
+      <w:hyperlink w:anchor="_Toc242229790" w:history="1">
         <w:r>
           <w:rPr>
             <w:rStyle w:val="Collegamentoipertestuale"/>
@@ -2474,7 +2474,7 @@
             <w:noProof/>
             <w:webHidden/>
           </w:rPr>
-          <w:instrText xml:space="preserve"> PAGEREF _Toc242229525 \h </w:instrText>
+          <w:instrText xml:space="preserve"> PAGEREF _Toc242229790 \h </w:instrText>
         </w:r>
         <w:r>
           <w:rPr>
@@ -2521,7 +2521,7 @@
           <w14:ligatures w14:val="standardContextual"/>
         </w:rPr>
       </w:pPr>
-      <w:hyperlink w:anchor="_Toc242229526" w:history="1">
+      <w:hyperlink w:anchor="_Toc242229791" w:history="1">
         <w:r>
           <w:rPr>
             <w:rStyle w:val="Collegamentoipertestuale"/>
@@ -2566,7 +2566,7 @@
             <w:noProof/>
             <w:webHidden/>
           </w:rPr>
-          <w:instrText xml:space="preserve"> PAGEREF _Toc242229526 \h </w:instrText>
+          <w:instrText xml:space="preserve"> PAGEREF _Toc242229791 \h </w:instrText>
         </w:r>
         <w:r>
           <w:rPr>
@@ -2613,7 +2613,7 @@
           <w14:ligatures w14:val="standardContextual"/>
         </w:rPr>
       </w:pPr>
-      <w:hyperlink w:anchor="_Toc242229527" w:history="1">
+      <w:hyperlink w:anchor="_Toc242229792" w:history="1">
         <w:r>
           <w:rPr>
             <w:rStyle w:val="Collegamentoipertestuale"/>
@@ -2658,7 +2658,7 @@
             <w:noProof/>
             <w:webHidden/>
           </w:rPr>
-          <w:instrText xml:space="preserve"> PAGEREF _Toc242229527 \h </w:instrText>
+          <w:instrText xml:space="preserve"> PAGEREF _Toc242229792 \h </w:instrText>
         </w:r>
         <w:r>
           <w:rPr>
@@ -2705,7 +2705,7 @@
           <w14:ligatures w14:val="standardContextual"/>
         </w:rPr>
       </w:pPr>
-      <w:hyperlink w:anchor="_Toc242229528" w:history="1">
+      <w:hyperlink w:anchor="_Toc242229793" w:history="1">
         <w:r>
           <w:rPr>
             <w:rStyle w:val="Collegamentoipertestuale"/>
@@ -2750,7 +2750,7 @@
             <w:noProof/>
             <w:webHidden/>
           </w:rPr>
-          <w:instrText xml:space="preserve"> PAGEREF _Toc242229528 \h </w:instrText>
+          <w:instrText xml:space="preserve"> PAGEREF _Toc242229793 \h </w:instrText>
         </w:r>
         <w:r>
           <w:rPr>
@@ -2796,7 +2796,7 @@
           <w14:ligatures w14:val="standardContextual"/>
         </w:rPr>
       </w:pPr>
-      <w:hyperlink w:anchor="_Toc242229529" w:history="1">
+      <w:hyperlink w:anchor="_Toc242229794" w:history="1">
         <w:r>
           <w:rPr>
             <w:rStyle w:val="Collegamentoipertestuale"/>
@@ -2844,7 +2844,7 @@
             <w:noProof/>
             <w:webHidden/>
           </w:rPr>
-          <w:instrText xml:space="preserve"> PAGEREF _Toc242229529 \h </w:instrText>
+          <w:instrText xml:space="preserve"> PAGEREF _Toc242229794 \h </w:instrText>
         </w:r>
         <w:r>
           <w:rPr>
@@ -2891,7 +2891,7 @@
           <w14:ligatures w14:val="standardContextual"/>
         </w:rPr>
       </w:pPr>
-      <w:hyperlink w:anchor="_Toc242229530" w:history="1">
+      <w:hyperlink w:anchor="_Toc242229795" w:history="1">
         <w:r>
           <w:rPr>
             <w:rStyle w:val="Collegamentoipertestuale"/>
@@ -2936,7 +2936,7 @@
             <w:noProof/>
             <w:webHidden/>
           </w:rPr>
-          <w:instrText xml:space="preserve"> PAGEREF _Toc242229530 \h </w:instrText>
+          <w:instrText xml:space="preserve"> PAGEREF _Toc242229795 \h </w:instrText>
         </w:r>
         <w:r>
           <w:rPr>
@@ -2983,7 +2983,7 @@
           <w14:ligatures w14:val="standardContextual"/>
         </w:rPr>
       </w:pPr>
-      <w:hyperlink w:anchor="_Toc242229531" w:history="1">
+      <w:hyperlink w:anchor="_Toc242229796" w:history="1">
         <w:r>
           <w:rPr>
             <w:rStyle w:val="Collegamentoipertestuale"/>
@@ -3028,7 +3028,7 @@
             <w:noProof/>
             <w:webHidden/>
           </w:rPr>
-          <w:instrText xml:space="preserve"> PAGEREF _Toc242229531 \h </w:instrText>
+          <w:instrText xml:space="preserve"> PAGEREF _Toc242229796 \h </w:instrText>
         </w:r>
         <w:r>
           <w:rPr>
@@ -3075,7 +3075,7 @@
           <w14:ligatures w14:val="standardContextual"/>
         </w:rPr>
       </w:pPr>
-      <w:hyperlink w:anchor="_Toc242229532" w:history="1">
+      <w:hyperlink w:anchor="_Toc242229797" w:history="1">
         <w:r>
           <w:rPr>
             <w:rStyle w:val="Collegamentoipertestuale"/>
@@ -3120,7 +3120,7 @@
             <w:noProof/>
             <w:webHidden/>
           </w:rPr>
-          <w:instrText xml:space="preserve"> PAGEREF _Toc242229532 \h </w:instrText>
+          <w:instrText xml:space="preserve"> PAGEREF _Toc242229797 \h </w:instrText>
         </w:r>
         <w:r>
           <w:rPr>
@@ -3167,7 +3167,7 @@
           <w14:ligatures w14:val="standardContextual"/>
         </w:rPr>
       </w:pPr>
-      <w:hyperlink w:anchor="_Toc242229533" w:history="1">
+      <w:hyperlink w:anchor="_Toc242229798" w:history="1">
         <w:r>
           <w:rPr>
             <w:rStyle w:val="Collegamentoipertestuale"/>
@@ -3212,7 +3212,7 @@
             <w:noProof/>
             <w:webHidden/>
           </w:rPr>
-          <w:instrText xml:space="preserve"> PAGEREF _Toc242229533 \h </w:instrText>
+          <w:instrText xml:space="preserve"> PAGEREF _Toc242229798 \h </w:instrText>
         </w:r>
         <w:r>
           <w:rPr>
@@ -3259,7 +3259,7 @@
           <w14:ligatures w14:val="standardContextual"/>
         </w:rPr>
       </w:pPr>
-      <w:hyperlink w:anchor="_Toc242229534" w:history="1">
+      <w:hyperlink w:anchor="_Toc242229799" w:history="1">
         <w:r>
           <w:rPr>
             <w:rStyle w:val="Collegamentoipertestuale"/>
@@ -3304,7 +3304,7 @@
             <w:noProof/>
             <w:webHidden/>
           </w:rPr>
-          <w:instrText xml:space="preserve"> PAGEREF _Toc242229534 \h </w:instrText>
+          <w:instrText xml:space="preserve"> PAGEREF _Toc242229799 \h </w:instrText>
         </w:r>
         <w:r>
           <w:rPr>
@@ -3351,7 +3351,7 @@
           <w14:ligatures w14:val="standardContextual"/>
         </w:rPr>
       </w:pPr>
-      <w:hyperlink w:anchor="_Toc242229535" w:history="1">
+      <w:hyperlink w:anchor="_Toc242229800" w:history="1">
         <w:r>
           <w:rPr>
             <w:rStyle w:val="Collegamentoipertestuale"/>
@@ -3396,7 +3396,7 @@
             <w:noProof/>
             <w:webHidden/>
           </w:rPr>
-          <w:instrText xml:space="preserve"> PAGEREF _Toc242229535 \h </w:instrText>
+          <w:instrText xml:space="preserve"> PAGEREF _Toc242229800 \h </w:instrText>
         </w:r>
         <w:r>
           <w:rPr>
@@ -3442,7 +3442,7 @@
           <w14:ligatures w14:val="standardContextual"/>
         </w:rPr>
       </w:pPr>
-      <w:hyperlink w:anchor="_Toc242229536" w:history="1">
+      <w:hyperlink w:anchor="_Toc242229801" w:history="1">
         <w:r>
           <w:rPr>
             <w:rStyle w:val="Collegamentoipertestuale"/>
@@ -3490,7 +3490,7 @@
             <w:noProof/>
             <w:webHidden/>
           </w:rPr>
-          <w:instrText xml:space="preserve"> PAGEREF _Toc242229536 \h </w:instrText>
+          <w:instrText xml:space="preserve"> PAGEREF _Toc242229801 \h </w:instrText>
         </w:r>
         <w:r>
           <w:rPr>
@@ -3537,7 +3537,7 @@
           <w14:ligatures w14:val="standardContextual"/>
         </w:rPr>
       </w:pPr>
-      <w:hyperlink w:anchor="_Toc242229537" w:history="1">
+      <w:hyperlink w:anchor="_Toc242229802" w:history="1">
         <w:r>
           <w:rPr>
             <w:rStyle w:val="Collegamentoipertestuale"/>
@@ -3582,7 +3582,7 @@
             <w:noProof/>
             <w:webHidden/>
           </w:rPr>
-          <w:instrText xml:space="preserve"> PAGEREF _Toc242229537 \h </w:instrText>
+          <w:instrText xml:space="preserve"> PAGEREF _Toc242229802 \h </w:instrText>
         </w:r>
         <w:r>
           <w:rPr>
@@ -3629,7 +3629,7 @@
           <w14:ligatures w14:val="standardContextual"/>
         </w:rPr>
       </w:pPr>
-      <w:hyperlink w:anchor="_Toc242229538" w:history="1">
+      <w:hyperlink w:anchor="_Toc242229803" w:history="1">
         <w:r>
           <w:rPr>
             <w:rStyle w:val="Collegamentoipertestuale"/>
@@ -3674,7 +3674,7 @@
             <w:noProof/>
             <w:webHidden/>
           </w:rPr>
-          <w:instrText xml:space="preserve"> PAGEREF _Toc242229538 \h </w:instrText>
+          <w:instrText xml:space="preserve"> PAGEREF _Toc242229803 \h </w:instrText>
         </w:r>
         <w:r>
           <w:rPr>
@@ -3720,7 +3720,7 @@
           <w14:ligatures w14:val="standardContextual"/>
         </w:rPr>
       </w:pPr>
-      <w:hyperlink w:anchor="_Toc242229539" w:history="1">
+      <w:hyperlink w:anchor="_Toc242229804" w:history="1">
         <w:r>
           <w:rPr>
             <w:rStyle w:val="Collegamentoipertestuale"/>
@@ -3768,7 +3768,7 @@
             <w:noProof/>
             <w:webHidden/>
           </w:rPr>
-          <w:instrText xml:space="preserve"> PAGEREF _Toc242229539 \h </w:instrText>
+          <w:instrText xml:space="preserve"> PAGEREF _Toc242229804 \h </w:instrText>
         </w:r>
         <w:r>
           <w:rPr>
@@ -3815,7 +3815,7 @@
           <w14:ligatures w14:val="standardContextual"/>
         </w:rPr>
       </w:pPr>
-      <w:hyperlink w:anchor="_Toc242229540" w:history="1">
+      <w:hyperlink w:anchor="_Toc242229805" w:history="1">
         <w:r>
           <w:rPr>
             <w:rStyle w:val="Collegamentoipertestuale"/>
@@ -3860,7 +3860,7 @@
             <w:noProof/>
             <w:webHidden/>
           </w:rPr>
-          <w:instrText xml:space="preserve"> PAGEREF _Toc242229540 \h </w:instrText>
+          <w:instrText xml:space="preserve"> PAGEREF _Toc242229805 \h </w:instrText>
         </w:r>
         <w:r>
           <w:rPr>
@@ -3907,7 +3907,7 @@
           <w14:ligatures w14:val="standardContextual"/>
         </w:rPr>
       </w:pPr>
-      <w:hyperlink w:anchor="_Toc242229541" w:history="1">
+      <w:hyperlink w:anchor="_Toc242229806" w:history="1">
         <w:r>
           <w:rPr>
             <w:rStyle w:val="Collegamentoipertestuale"/>
@@ -3952,7 +3952,7 @@
             <w:noProof/>
             <w:webHidden/>
           </w:rPr>
-          <w:instrText xml:space="preserve"> PAGEREF _Toc242229541 \h </w:instrText>
+          <w:instrText xml:space="preserve"> PAGEREF _Toc242229806 \h </w:instrText>
         </w:r>
         <w:r>
           <w:rPr>
@@ -3999,7 +3999,7 @@
           <w14:ligatures w14:val="standardContextual"/>
         </w:rPr>
       </w:pPr>
-      <w:hyperlink w:anchor="_Toc242229542" w:history="1">
+      <w:hyperlink w:anchor="_Toc242229807" w:history="1">
         <w:r>
           <w:rPr>
             <w:rStyle w:val="Collegamentoipertestuale"/>
@@ -4044,7 +4044,7 @@
             <w:noProof/>
             <w:webHidden/>
           </w:rPr>
-          <w:instrText xml:space="preserve"> PAGEREF _Toc242229542 \h </w:instrText>
+          <w:instrText xml:space="preserve"> PAGEREF _Toc242229807 \h </w:instrText>
         </w:r>
         <w:r>
           <w:rPr>
@@ -4091,7 +4091,7 @@
           <w14:ligatures w14:val="standardContextual"/>
         </w:rPr>
       </w:pPr>
-      <w:hyperlink w:anchor="_Toc242229543" w:history="1">
+      <w:hyperlink w:anchor="_Toc242229808" w:history="1">
         <w:r>
           <w:rPr>
             <w:rStyle w:val="Collegamentoipertestuale"/>
@@ -4136,7 +4136,7 @@
             <w:noProof/>
             <w:webHidden/>
           </w:rPr>
-          <w:instrText xml:space="preserve"> PAGEREF _Toc242229543 \h </w:instrText>
+          <w:instrText xml:space="preserve"> PAGEREF _Toc242229808 \h </w:instrText>
         </w:r>
         <w:r>
           <w:rPr>
@@ -4182,7 +4182,7 @@
           <w14:ligatures w14:val="standardContextual"/>
         </w:rPr>
       </w:pPr>
-      <w:hyperlink w:anchor="_Toc242229544" w:history="1">
+      <w:hyperlink w:anchor="_Toc242229809" w:history="1">
         <w:r>
           <w:rPr>
             <w:rStyle w:val="Collegamentoipertestuale"/>
@@ -4230,7 +4230,7 @@
             <w:noProof/>
             <w:webHidden/>
           </w:rPr>
-          <w:instrText xml:space="preserve"> PAGEREF _Toc242229544 \h </w:instrText>
+          <w:instrText xml:space="preserve"> PAGEREF _Toc242229809 \h </w:instrText>
         </w:r>
         <w:r>
           <w:rPr>
@@ -4277,7 +4277,7 @@
           <w14:ligatures w14:val="standardContextual"/>
         </w:rPr>
       </w:pPr>
-      <w:hyperlink w:anchor="_Toc242229545" w:history="1">
+      <w:hyperlink w:anchor="_Toc242229810" w:history="1">
         <w:r>
           <w:rPr>
             <w:rStyle w:val="Collegamentoipertestuale"/>
@@ -4322,7 +4322,7 @@
             <w:noProof/>
             <w:webHidden/>
           </w:rPr>
-          <w:instrText xml:space="preserve"> PAGEREF _Toc242229545 \h </w:instrText>
+          <w:instrText xml:space="preserve"> PAGEREF _Toc242229810 \h </w:instrText>
         </w:r>
         <w:r>
           <w:rPr>
@@ -4369,7 +4369,7 @@
           <w14:ligatures w14:val="standardContextual"/>
         </w:rPr>
       </w:pPr>
-      <w:hyperlink w:anchor="_Toc242229546" w:history="1">
+      <w:hyperlink w:anchor="_Toc242229811" w:history="1">
         <w:r>
           <w:rPr>
             <w:rStyle w:val="Collegamentoipertestuale"/>
@@ -4414,7 +4414,7 @@
             <w:noProof/>
             <w:webHidden/>
           </w:rPr>
-          <w:instrText xml:space="preserve"> PAGEREF _Toc242229546 \h </w:instrText>
+          <w:instrText xml:space="preserve"> PAGEREF _Toc242229811 \h </w:instrText>
         </w:r>
         <w:r>
           <w:rPr>
@@ -4460,7 +4460,7 @@
           <w14:ligatures w14:val="standardContextual"/>
         </w:rPr>
       </w:pPr>
-      <w:hyperlink w:anchor="_Toc242229547" w:history="1">
+      <w:hyperlink w:anchor="_Toc242229812" w:history="1">
         <w:r>
           <w:rPr>
             <w:rStyle w:val="Collegamentoipertestuale"/>
@@ -4508,7 +4508,7 @@
             <w:noProof/>
             <w:webHidden/>
           </w:rPr>
-          <w:instrText xml:space="preserve"> PAGEREF _Toc242229547 \h </w:instrText>
+          <w:instrText xml:space="preserve"> PAGEREF _Toc242229812 \h </w:instrText>
         </w:r>
         <w:r>
           <w:rPr>
@@ -4555,7 +4555,7 @@
           <w14:ligatures w14:val="standardContextual"/>
         </w:rPr>
       </w:pPr>
-      <w:hyperlink w:anchor="_Toc242229548" w:history="1">
+      <w:hyperlink w:anchor="_Toc242229813" w:history="1">
         <w:r>
           <w:rPr>
             <w:rStyle w:val="Collegamentoipertestuale"/>
@@ -4600,7 +4600,7 @@
             <w:noProof/>
             <w:webHidden/>
           </w:rPr>
-          <w:instrText xml:space="preserve"> PAGEREF _Toc242229548 \h </w:instrText>
+          <w:instrText xml:space="preserve"> PAGEREF _Toc242229813 \h </w:instrText>
         </w:r>
         <w:r>
           <w:rPr>
@@ -4647,7 +4647,7 @@
           <w14:ligatures w14:val="standardContextual"/>
         </w:rPr>
       </w:pPr>
-      <w:hyperlink w:anchor="_Toc242229549" w:history="1">
+      <w:hyperlink w:anchor="_Toc242229814" w:history="1">
         <w:r>
           <w:rPr>
             <w:rStyle w:val="Collegamentoipertestuale"/>
@@ -4692,7 +4692,7 @@
             <w:noProof/>
             <w:webHidden/>
           </w:rPr>
-          <w:instrText xml:space="preserve"> PAGEREF _Toc242229549 \h </w:instrText>
+          <w:instrText xml:space="preserve"> PAGEREF _Toc242229814 \h </w:instrText>
         </w:r>
         <w:r>
           <w:rPr>
@@ -4739,7 +4739,7 @@
           <w14:ligatures w14:val="standardContextual"/>
         </w:rPr>
       </w:pPr>
-      <w:hyperlink w:anchor="_Toc242229550" w:history="1">
+      <w:hyperlink w:anchor="_Toc242229815" w:history="1">
         <w:r>
           <w:rPr>
             <w:rStyle w:val="Collegamentoipertestuale"/>
@@ -4784,7 +4784,7 @@
             <w:noProof/>
             <w:webHidden/>
           </w:rPr>
-          <w:instrText xml:space="preserve"> PAGEREF _Toc242229550 \h </w:instrText>
+          <w:instrText xml:space="preserve"> PAGEREF _Toc242229815 \h </w:instrText>
         </w:r>
         <w:r>
           <w:rPr>
@@ -4831,7 +4831,7 @@
           <w14:ligatures w14:val="standardContextual"/>
         </w:rPr>
       </w:pPr>
-      <w:hyperlink w:anchor="_Toc242229551" w:history="1">
+      <w:hyperlink w:anchor="_Toc242229816" w:history="1">
         <w:r>
           <w:rPr>
             <w:rStyle w:val="Collegamentoipertestuale"/>
@@ -4876,7 +4876,7 @@
             <w:noProof/>
             <w:webHidden/>
           </w:rPr>
-          <w:instrText xml:space="preserve"> PAGEREF _Toc242229551 \h </w:instrText>
+          <w:instrText xml:space="preserve"> PAGEREF _Toc242229816 \h </w:instrText>
         </w:r>
         <w:r>
           <w:rPr>
@@ -4923,7 +4923,7 @@
           <w14:ligatures w14:val="standardContextual"/>
         </w:rPr>
       </w:pPr>
-      <w:hyperlink w:anchor="_Toc242229552" w:history="1">
+      <w:hyperlink w:anchor="_Toc242229817" w:history="1">
         <w:r>
           <w:rPr>
             <w:rStyle w:val="Collegamentoipertestuale"/>
@@ -4968,7 +4968,7 @@
             <w:noProof/>
             <w:webHidden/>
           </w:rPr>
-          <w:instrText xml:space="preserve"> PAGEREF _Toc242229552 \h </w:instrText>
+          <w:instrText xml:space="preserve"> PAGEREF _Toc242229817 \h </w:instrText>
         </w:r>
         <w:r>
           <w:rPr>
@@ -5014,7 +5014,7 @@
           <w14:ligatures w14:val="standardContextual"/>
         </w:rPr>
       </w:pPr>
-      <w:hyperlink w:anchor="_Toc242229553" w:history="1">
+      <w:hyperlink w:anchor="_Toc242229818" w:history="1">
         <w:r>
           <w:rPr>
             <w:rStyle w:val="Collegamentoipertestuale"/>
@@ -5062,7 +5062,7 @@
             <w:noProof/>
             <w:webHidden/>
           </w:rPr>
-          <w:instrText xml:space="preserve"> PAGEREF _Toc242229553 \h </w:instrText>
+          <w:instrText xml:space="preserve"> PAGEREF _Toc242229818 \h </w:instrText>
         </w:r>
         <w:r>
           <w:rPr>
@@ -5109,7 +5109,7 @@
           <w14:ligatures w14:val="standardContextual"/>
         </w:rPr>
       </w:pPr>
-      <w:hyperlink w:anchor="_Toc242229554" w:history="1">
+      <w:hyperlink w:anchor="_Toc242229819" w:history="1">
         <w:r>
           <w:rPr>
             <w:rStyle w:val="Collegamentoipertestuale"/>
@@ -5154,7 +5154,7 @@
             <w:noProof/>
             <w:webHidden/>
           </w:rPr>
-          <w:instrText xml:space="preserve"> PAGEREF _Toc242229554 \h </w:instrText>
+          <w:instrText xml:space="preserve"> PAGEREF _Toc242229819 \h </w:instrText>
         </w:r>
         <w:r>
           <w:rPr>
@@ -5201,7 +5201,7 @@
           <w14:ligatures w14:val="standardContextual"/>
         </w:rPr>
       </w:pPr>
-      <w:hyperlink w:anchor="_Toc242229555" w:history="1">
+      <w:hyperlink w:anchor="_Toc242229820" w:history="1">
         <w:r>
           <w:rPr>
             <w:rStyle w:val="Collegamentoipertestuale"/>
@@ -5246,7 +5246,7 @@
             <w:noProof/>
             <w:webHidden/>
           </w:rPr>
-          <w:instrText xml:space="preserve"> PAGEREF _Toc242229555 \h </w:instrText>
+          <w:instrText xml:space="preserve"> PAGEREF _Toc242229820 \h </w:instrText>
         </w:r>
         <w:r>
           <w:rPr>
@@ -5293,7 +5293,7 @@
           <w14:ligatures w14:val="standardContextual"/>
         </w:rPr>
       </w:pPr>
-      <w:hyperlink w:anchor="_Toc242229556" w:history="1">
+      <w:hyperlink w:anchor="_Toc242229821" w:history="1">
         <w:r>
           <w:rPr>
             <w:rStyle w:val="Collegamentoipertestuale"/>
@@ -5338,7 +5338,7 @@
             <w:noProof/>
             <w:webHidden/>
           </w:rPr>
-          <w:instrText xml:space="preserve"> PAGEREF _Toc242229556 \h </w:instrText>
+          <w:instrText xml:space="preserve"> PAGEREF _Toc242229821 \h </w:instrText>
         </w:r>
         <w:r>
           <w:rPr>
@@ -5385,7 +5385,7 @@
           <w14:ligatures w14:val="standardContextual"/>
         </w:rPr>
       </w:pPr>
-      <w:hyperlink w:anchor="_Toc242229557" w:history="1">
+      <w:hyperlink w:anchor="_Toc242229822" w:history="1">
         <w:r>
           <w:rPr>
             <w:rStyle w:val="Collegamentoipertestuale"/>
@@ -5430,7 +5430,7 @@
             <w:noProof/>
             <w:webHidden/>
           </w:rPr>
-          <w:instrText xml:space="preserve"> PAGEREF _Toc242229557 \h </w:instrText>
+          <w:instrText xml:space="preserve"> PAGEREF _Toc242229822 \h </w:instrText>
         </w:r>
         <w:r>
           <w:rPr>
@@ -5477,7 +5477,7 @@
           <w14:ligatures w14:val="standardContextual"/>
         </w:rPr>
       </w:pPr>
-      <w:hyperlink w:anchor="_Toc242229558" w:history="1">
+      <w:hyperlink w:anchor="_Toc242229823" w:history="1">
         <w:r>
           <w:rPr>
             <w:rStyle w:val="Collegamentoipertestuale"/>
@@ -5522,7 +5522,7 @@
             <w:noProof/>
             <w:webHidden/>
           </w:rPr>
-          <w:instrText xml:space="preserve"> PAGEREF _Toc242229558 \h </w:instrText>
+          <w:instrText xml:space="preserve"> PAGEREF _Toc242229823 \h </w:instrText>
         </w:r>
         <w:r>
           <w:rPr>
@@ -5569,7 +5569,7 @@
           <w14:ligatures w14:val="standardContextual"/>
         </w:rPr>
       </w:pPr>
-      <w:hyperlink w:anchor="_Toc242229559" w:history="1">
+      <w:hyperlink w:anchor="_Toc242229824" w:history="1">
         <w:r>
           <w:rPr>
             <w:rStyle w:val="Collegamentoipertestuale"/>
@@ -5614,7 +5614,7 @@
             <w:noProof/>
             <w:webHidden/>
           </w:rPr>
-          <w:instrText xml:space="preserve"> PAGEREF _Toc242229559 \h </w:instrText>
+          <w:instrText xml:space="preserve"> PAGEREF _Toc242229824 \h </w:instrText>
         </w:r>
         <w:r>
           <w:rPr>
@@ -5661,7 +5661,7 @@
           <w14:ligatures w14:val="standardContextual"/>
         </w:rPr>
       </w:pPr>
-      <w:hyperlink w:anchor="_Toc242229560" w:history="1">
+      <w:hyperlink w:anchor="_Toc242229825" w:history="1">
         <w:r>
           <w:rPr>
             <w:rStyle w:val="Collegamentoipertestuale"/>
@@ -5706,7 +5706,7 @@
             <w:noProof/>
             <w:webHidden/>
           </w:rPr>
-          <w:instrText xml:space="preserve"> PAGEREF _Toc242229560 \h </w:instrText>
+          <w:instrText xml:space="preserve"> PAGEREF _Toc242229825 \h </w:instrText>
         </w:r>
         <w:r>
           <w:rPr>
@@ -5753,7 +5753,7 @@
           <w14:ligatures w14:val="standardContextual"/>
         </w:rPr>
       </w:pPr>
-      <w:hyperlink w:anchor="_Toc242229561" w:history="1">
+      <w:hyperlink w:anchor="_Toc242229826" w:history="1">
         <w:r>
           <w:rPr>
             <w:rStyle w:val="Collegamentoipertestuale"/>
@@ -5798,7 +5798,7 @@
             <w:noProof/>
             <w:webHidden/>
           </w:rPr>
-          <w:instrText xml:space="preserve"> PAGEREF _Toc242229561 \h </w:instrText>
+          <w:instrText xml:space="preserve"> PAGEREF _Toc242229826 \h </w:instrText>
         </w:r>
         <w:r>
           <w:rPr>
@@ -5845,7 +5845,7 @@
           <w14:ligatures w14:val="standardContextual"/>
         </w:rPr>
       </w:pPr>
-      <w:hyperlink w:anchor="_Toc242229562" w:history="1">
+      <w:hyperlink w:anchor="_Toc242229827" w:history="1">
         <w:r>
           <w:rPr>
             <w:rStyle w:val="Collegamentoipertestuale"/>
@@ -5890,7 +5890,7 @@
             <w:noProof/>
             <w:webHidden/>
           </w:rPr>
-          <w:instrText xml:space="preserve"> PAGEREF _Toc242229562 \h </w:instrText>
+          <w:instrText xml:space="preserve"> PAGEREF _Toc242229827 \h </w:instrText>
         </w:r>
         <w:r>
           <w:rPr>
@@ -5936,7 +5936,7 @@
           <w14:ligatures w14:val="standardContextual"/>
         </w:rPr>
       </w:pPr>
-      <w:hyperlink w:anchor="_Toc242229563" w:history="1">
+      <w:hyperlink w:anchor="_Toc242229828" w:history="1">
         <w:r>
           <w:rPr>
             <w:rStyle w:val="Collegamentoipertestuale"/>
@@ -5984,7 +5984,7 @@
             <w:noProof/>
             <w:webHidden/>
           </w:rPr>
-          <w:instrText xml:space="preserve"> PAGEREF _Toc242229563 \h </w:instrText>
+          <w:instrText xml:space="preserve"> PAGEREF _Toc242229828 \h </w:instrText>
         </w:r>
         <w:r>
           <w:rPr>
@@ -6031,7 +6031,7 @@
           <w14:ligatures w14:val="standardContextual"/>
         </w:rPr>
       </w:pPr>
-      <w:hyperlink w:anchor="_Toc242229564" w:history="1">
+      <w:hyperlink w:anchor="_Toc242229829" w:history="1">
         <w:r>
           <w:rPr>
             <w:rStyle w:val="Collegamentoipertestuale"/>
@@ -6076,7 +6076,7 @@
             <w:noProof/>
             <w:webHidden/>
           </w:rPr>
-          <w:instrText xml:space="preserve"> PAGEREF _Toc242229564 \h </w:instrText>
+          <w:instrText xml:space="preserve"> PAGEREF _Toc242229829 \h </w:instrText>
         </w:r>
         <w:r>
           <w:rPr>
@@ -6123,7 +6123,7 @@
           <w14:ligatures w14:val="standardContextual"/>
         </w:rPr>
       </w:pPr>
-      <w:hyperlink w:anchor="_Toc242229565" w:history="1">
+      <w:hyperlink w:anchor="_Toc242229830" w:history="1">
         <w:r>
           <w:rPr>
             <w:rStyle w:val="Collegamentoipertestuale"/>
@@ -6168,7 +6168,7 @@
             <w:noProof/>
             <w:webHidden/>
           </w:rPr>
-          <w:instrText xml:space="preserve"> PAGEREF _Toc242229565 \h </w:instrText>
+          <w:instrText xml:space="preserve"> PAGEREF _Toc242229830 \h </w:instrText>
         </w:r>
         <w:r>
           <w:rPr>
@@ -6215,7 +6215,7 @@
           <w14:ligatures w14:val="standardContextual"/>
         </w:rPr>
       </w:pPr>
-      <w:hyperlink w:anchor="_Toc242229566" w:history="1">
+      <w:hyperlink w:anchor="_Toc242229831" w:history="1">
         <w:r>
           <w:rPr>
             <w:rStyle w:val="Collegamentoipertestuale"/>
@@ -6260,7 +6260,7 @@
             <w:noProof/>
             <w:webHidden/>
           </w:rPr>
-          <w:instrText xml:space="preserve"> PAGEREF _Toc242229566 \h </w:instrText>
+          <w:instrText xml:space="preserve"> PAGEREF _Toc242229831 \h </w:instrText>
         </w:r>
         <w:r>
           <w:rPr>
@@ -6307,7 +6307,7 @@
           <w14:ligatures w14:val="standardContextual"/>
         </w:rPr>
       </w:pPr>
-      <w:hyperlink w:anchor="_Toc242229567" w:history="1">
+      <w:hyperlink w:anchor="_Toc242229832" w:history="1">
         <w:r>
           <w:rPr>
             <w:rStyle w:val="Collegamentoipertestuale"/>
@@ -6352,7 +6352,7 @@
             <w:noProof/>
             <w:webHidden/>
           </w:rPr>
-          <w:instrText xml:space="preserve"> PAGEREF _Toc242229567 \h </w:instrText>
+          <w:instrText xml:space="preserve"> PAGEREF _Toc242229832 \h </w:instrText>
         </w:r>
         <w:r>
           <w:rPr>
@@ -6399,7 +6399,7 @@
           <w14:ligatures w14:val="standardContextual"/>
         </w:rPr>
       </w:pPr>
-      <w:hyperlink w:anchor="_Toc242229568" w:history="1">
+      <w:hyperlink w:anchor="_Toc242229833" w:history="1">
         <w:r>
           <w:rPr>
             <w:rStyle w:val="Collegamentoipertestuale"/>
@@ -6444,7 +6444,7 @@
             <w:noProof/>
             <w:webHidden/>
           </w:rPr>
-          <w:instrText xml:space="preserve"> PAGEREF _Toc242229568 \h </w:instrText>
+          <w:instrText xml:space="preserve"> PAGEREF _Toc242229833 \h </w:instrText>
         </w:r>
         <w:r>
           <w:rPr>
@@ -6491,7 +6491,7 @@
           <w14:ligatures w14:val="standardContextual"/>
         </w:rPr>
       </w:pPr>
-      <w:hyperlink w:anchor="_Toc242229569" w:history="1">
+      <w:hyperlink w:anchor="_Toc242229834" w:history="1">
         <w:r>
           <w:rPr>
             <w:rStyle w:val="Collegamentoipertestuale"/>
@@ -6536,7 +6536,7 @@
             <w:noProof/>
             <w:webHidden/>
           </w:rPr>
-          <w:instrText xml:space="preserve"> PAGEREF _Toc242229569 \h </w:instrText>
+          <w:instrText xml:space="preserve"> PAGEREF _Toc242229834 \h </w:instrText>
         </w:r>
         <w:r>
           <w:rPr>
@@ -6583,7 +6583,7 @@
           <w14:ligatures w14:val="standardContextual"/>
         </w:rPr>
       </w:pPr>
-      <w:hyperlink w:anchor="_Toc242229570" w:history="1">
+      <w:hyperlink w:anchor="_Toc242229835" w:history="1">
         <w:r>
           <w:rPr>
             <w:rStyle w:val="Collegamentoipertestuale"/>
@@ -6628,7 +6628,7 @@
             <w:noProof/>
             <w:webHidden/>
           </w:rPr>
-          <w:instrText xml:space="preserve"> PAGEREF _Toc242229570 \h </w:instrText>
+          <w:instrText xml:space="preserve"> PAGEREF _Toc242229835 \h </w:instrText>
         </w:r>
         <w:r>
           <w:rPr>
@@ -6675,7 +6675,7 @@
           <w14:ligatures w14:val="standardContextual"/>
         </w:rPr>
       </w:pPr>
-      <w:hyperlink w:anchor="_Toc242229571" w:history="1">
+      <w:hyperlink w:anchor="_Toc242229836" w:history="1">
         <w:r>
           <w:rPr>
             <w:rStyle w:val="Collegamentoipertestuale"/>
@@ -6720,7 +6720,7 @@
             <w:noProof/>
             <w:webHidden/>
           </w:rPr>
-          <w:instrText xml:space="preserve"> PAGEREF _Toc242229571 \h </w:instrText>
+          <w:instrText xml:space="preserve"> PAGEREF _Toc242229836 \h </w:instrText>
         </w:r>
         <w:r>
           <w:rPr>
@@ -6767,7 +6767,7 @@
           <w14:ligatures w14:val="standardContextual"/>
         </w:rPr>
       </w:pPr>
-      <w:hyperlink w:anchor="_Toc242229572" w:history="1">
+      <w:hyperlink w:anchor="_Toc242229837" w:history="1">
         <w:r>
           <w:rPr>
             <w:rStyle w:val="Collegamentoipertestuale"/>
@@ -6812,7 +6812,7 @@
             <w:noProof/>
             <w:webHidden/>
           </w:rPr>
-          <w:instrText xml:space="preserve"> PAGEREF _Toc242229572 \h </w:instrText>
+          <w:instrText xml:space="preserve"> PAGEREF _Toc242229837 \h </w:instrText>
         </w:r>
         <w:r>
           <w:rPr>
@@ -6859,7 +6859,7 @@
           <w14:ligatures w14:val="standardContextual"/>
         </w:rPr>
       </w:pPr>
-      <w:hyperlink w:anchor="_Toc242229573" w:history="1">
+      <w:hyperlink w:anchor="_Toc242229838" w:history="1">
         <w:r>
           <w:rPr>
             <w:rStyle w:val="Collegamentoipertestuale"/>
@@ -6904,7 +6904,7 @@
             <w:noProof/>
             <w:webHidden/>
           </w:rPr>
-          <w:instrText xml:space="preserve"> PAGEREF _Toc242229573 \h </w:instrText>
+          <w:instrText xml:space="preserve"> PAGEREF _Toc242229838 \h </w:instrText>
         </w:r>
         <w:r>
           <w:rPr>
@@ -6951,7 +6951,7 @@
           <w14:ligatures w14:val="standardContextual"/>
         </w:rPr>
       </w:pPr>
-      <w:hyperlink w:anchor="_Toc242229574" w:history="1">
+      <w:hyperlink w:anchor="_Toc242229839" w:history="1">
         <w:r>
           <w:rPr>
             <w:rStyle w:val="Collegamentoipertestuale"/>
@@ -6996,7 +6996,7 @@
             <w:noProof/>
             <w:webHidden/>
           </w:rPr>
-          <w:instrText xml:space="preserve"> PAGEREF _Toc242229574 \h </w:instrText>
+          <w:instrText xml:space="preserve"> PAGEREF _Toc242229839 \h </w:instrText>
         </w:r>
         <w:r>
           <w:rPr>
@@ -7043,7 +7043,7 @@
           <w14:ligatures w14:val="standardContextual"/>
         </w:rPr>
       </w:pPr>
-      <w:hyperlink w:anchor="_Toc242229575" w:history="1">
+      <w:hyperlink w:anchor="_Toc242229840" w:history="1">
         <w:r>
           <w:rPr>
             <w:rStyle w:val="Collegamentoipertestuale"/>
@@ -7088,7 +7088,7 @@
             <w:noProof/>
             <w:webHidden/>
           </w:rPr>
-          <w:instrText xml:space="preserve"> PAGEREF _Toc242229575 \h </w:instrText>
+          <w:instrText xml:space="preserve"> PAGEREF _Toc242229840 \h </w:instrText>
         </w:r>
         <w:r>
           <w:rPr>
@@ -7135,7 +7135,7 @@
           <w14:ligatures w14:val="standardContextual"/>
         </w:rPr>
       </w:pPr>
-      <w:hyperlink w:anchor="_Toc242229576" w:history="1">
+      <w:hyperlink w:anchor="_Toc242229841" w:history="1">
         <w:r>
           <w:rPr>
             <w:rStyle w:val="Collegamentoipertestuale"/>
@@ -7180,7 +7180,7 @@
             <w:noProof/>
             <w:webHidden/>
           </w:rPr>
-          <w:instrText xml:space="preserve"> PAGEREF _Toc242229576 \h </w:instrText>
+          <w:instrText xml:space="preserve"> PAGEREF _Toc242229841 \h </w:instrText>
         </w:r>
         <w:r>
           <w:rPr>
@@ -7227,7 +7227,7 @@
           <w14:ligatures w14:val="standardContextual"/>
         </w:rPr>
       </w:pPr>
-      <w:hyperlink w:anchor="_Toc242229577" w:history="1">
+      <w:hyperlink w:anchor="_Toc242229842" w:history="1">
         <w:r>
           <w:rPr>
             <w:rStyle w:val="Collegamentoipertestuale"/>
@@ -7272,7 +7272,7 @@
             <w:noProof/>
             <w:webHidden/>
           </w:rPr>
-          <w:instrText xml:space="preserve"> PAGEREF _Toc242229577 \h </w:instrText>
+          <w:instrText xml:space="preserve"> PAGEREF _Toc242229842 \h </w:instrText>
         </w:r>
         <w:r>
           <w:rPr>
@@ -7318,7 +7318,7 @@
           <w14:ligatures w14:val="standardContextual"/>
         </w:rPr>
       </w:pPr>
-      <w:hyperlink w:anchor="_Toc242229578" w:history="1">
+      <w:hyperlink w:anchor="_Toc242229843" w:history="1">
         <w:r>
           <w:rPr>
             <w:rStyle w:val="Collegamentoipertestuale"/>
@@ -7366,7 +7366,7 @@
             <w:noProof/>
             <w:webHidden/>
           </w:rPr>
-          <w:instrText xml:space="preserve"> PAGEREF _Toc242229578 \h </w:instrText>
+          <w:instrText xml:space="preserve"> PAGEREF _Toc242229843 \h </w:instrText>
         </w:r>
         <w:r>
           <w:rPr>
@@ -7413,7 +7413,7 @@
           <w14:ligatures w14:val="standardContextual"/>
         </w:rPr>
       </w:pPr>
-      <w:hyperlink w:anchor="_Toc242229579" w:history="1">
+      <w:hyperlink w:anchor="_Toc242229844" w:history="1">
         <w:r>
           <w:rPr>
             <w:rStyle w:val="Collegamentoipertestuale"/>
@@ -7458,7 +7458,7 @@
             <w:noProof/>
             <w:webHidden/>
           </w:rPr>
-          <w:instrText xml:space="preserve"> PAGEREF _Toc242229579 \h </w:instrText>
+          <w:instrText xml:space="preserve"> PAGEREF _Toc242229844 \h </w:instrText>
         </w:r>
         <w:r>
           <w:rPr>
@@ -7505,7 +7505,7 @@
           <w14:ligatures w14:val="standardContextual"/>
         </w:rPr>
       </w:pPr>
-      <w:hyperlink w:anchor="_Toc242229580" w:history="1">
+      <w:hyperlink w:anchor="_Toc242229845" w:history="1">
         <w:r>
           <w:rPr>
             <w:rStyle w:val="Collegamentoipertestuale"/>
@@ -7550,7 +7550,7 @@
             <w:noProof/>
             <w:webHidden/>
           </w:rPr>
-          <w:instrText xml:space="preserve"> PAGEREF _Toc242229580 \h </w:instrText>
+          <w:instrText xml:space="preserve"> PAGEREF _Toc242229845 \h </w:instrText>
         </w:r>
         <w:r>
           <w:rPr>
@@ -7597,7 +7597,7 @@
           <w14:ligatures w14:val="standardContextual"/>
         </w:rPr>
       </w:pPr>
-      <w:hyperlink w:anchor="_Toc242229581" w:history="1">
+      <w:hyperlink w:anchor="_Toc242229846" w:history="1">
         <w:r>
           <w:rPr>
             <w:rStyle w:val="Collegamentoipertestuale"/>
@@ -7642,7 +7642,7 @@
             <w:noProof/>
             <w:webHidden/>
           </w:rPr>
-          <w:instrText xml:space="preserve"> PAGEREF _Toc242229581 \h </w:instrText>
+          <w:instrText xml:space="preserve"> PAGEREF _Toc242229846 \h </w:instrText>
         </w:r>
         <w:r>
           <w:rPr>
@@ -7688,7 +7688,7 @@
           <w14:ligatures w14:val="standardContextual"/>
         </w:rPr>
       </w:pPr>
-      <w:hyperlink w:anchor="_Toc242229582" w:history="1">
+      <w:hyperlink w:anchor="_Toc242229847" w:history="1">
         <w:r>
           <w:rPr>
             <w:rStyle w:val="Collegamentoipertestuale"/>
@@ -7736,7 +7736,7 @@
             <w:noProof/>
             <w:webHidden/>
           </w:rPr>
-          <w:instrText xml:space="preserve"> PAGEREF _Toc242229582 \h </w:instrText>
+          <w:instrText xml:space="preserve"> PAGEREF _Toc242229847 \h </w:instrText>
         </w:r>
         <w:r>
           <w:rPr>
@@ -7782,7 +7782,7 @@
           <w14:ligatures w14:val="standardContextual"/>
         </w:rPr>
       </w:pPr>
-      <w:hyperlink w:anchor="_Toc242229583" w:history="1">
+      <w:hyperlink w:anchor="_Toc242229848" w:history="1">
         <w:r>
           <w:rPr>
             <w:rStyle w:val="Collegamentoipertestuale"/>
@@ -7830,7 +7830,7 @@
             <w:noProof/>
             <w:webHidden/>
           </w:rPr>
-          <w:instrText xml:space="preserve"> PAGEREF _Toc242229583 \h </w:instrText>
+          <w:instrText xml:space="preserve"> PAGEREF _Toc242229848 \h </w:instrText>
         </w:r>
         <w:r>
           <w:rPr>
@@ -7877,7 +7877,7 @@
           <w14:ligatures w14:val="standardContextual"/>
         </w:rPr>
       </w:pPr>
-      <w:hyperlink w:anchor="_Toc242229584" w:history="1">
+      <w:hyperlink w:anchor="_Toc242229849" w:history="1">
         <w:r>
           <w:rPr>
             <w:rStyle w:val="Collegamentoipertestuale"/>
@@ -7922,7 +7922,7 @@
             <w:noProof/>
             <w:webHidden/>
           </w:rPr>
-          <w:instrText xml:space="preserve"> PAGEREF _Toc242229584 \h </w:instrText>
+          <w:instrText xml:space="preserve"> PAGEREF _Toc242229849 \h </w:instrText>
         </w:r>
         <w:r>
           <w:rPr>
@@ -7968,7 +7968,7 @@
           <w14:ligatures w14:val="standardContextual"/>
         </w:rPr>
       </w:pPr>
-      <w:hyperlink w:anchor="_Toc242229585" w:history="1">
+      <w:hyperlink w:anchor="_Toc242229850" w:history="1">
         <w:r>
           <w:rPr>
             <w:rStyle w:val="Collegamentoipertestuale"/>
@@ -8016,7 +8016,7 @@
             <w:noProof/>
             <w:webHidden/>
           </w:rPr>
-          <w:instrText xml:space="preserve"> PAGEREF _Toc242229585 \h </w:instrText>
+          <w:instrText xml:space="preserve"> PAGEREF _Toc242229850 \h </w:instrText>
         </w:r>
         <w:r>
           <w:rPr>
@@ -8063,7 +8063,7 @@
           <w14:ligatures w14:val="standardContextual"/>
         </w:rPr>
       </w:pPr>
-      <w:hyperlink w:anchor="_Toc242229586" w:history="1">
+      <w:hyperlink w:anchor="_Toc242229851" w:history="1">
         <w:r>
           <w:rPr>
             <w:rStyle w:val="Collegamentoipertestuale"/>
@@ -8108,7 +8108,7 @@
             <w:noProof/>
             <w:webHidden/>
           </w:rPr>
-          <w:instrText xml:space="preserve"> PAGEREF _Toc242229586 \h </w:instrText>
+          <w:instrText xml:space="preserve"> PAGEREF _Toc242229851 \h </w:instrText>
         </w:r>
         <w:r>
           <w:rPr>
@@ -8155,7 +8155,7 @@
           <w14:ligatures w14:val="standardContextual"/>
         </w:rPr>
       </w:pPr>
-      <w:hyperlink w:anchor="_Toc242229587" w:history="1">
+      <w:hyperlink w:anchor="_Toc242229852" w:history="1">
         <w:r>
           <w:rPr>
             <w:rStyle w:val="Collegamentoipertestuale"/>
@@ -8200,7 +8200,7 @@
             <w:noProof/>
             <w:webHidden/>
           </w:rPr>
-          <w:instrText xml:space="preserve"> PAGEREF _Toc242229587 \h </w:instrText>
+          <w:instrText xml:space="preserve"> PAGEREF _Toc242229852 \h </w:instrText>
         </w:r>
         <w:r>
           <w:rPr>
@@ -8247,7 +8247,7 @@
           <w14:ligatures w14:val="standardContextual"/>
         </w:rPr>
       </w:pPr>
-      <w:hyperlink w:anchor="_Toc242229588" w:history="1">
+      <w:hyperlink w:anchor="_Toc242229853" w:history="1">
         <w:r>
           <w:rPr>
             <w:rStyle w:val="Collegamentoipertestuale"/>
@@ -8292,7 +8292,7 @@
             <w:noProof/>
             <w:webHidden/>
           </w:rPr>
-          <w:instrText xml:space="preserve"> PAGEREF _Toc242229588 \h </w:instrText>
+          <w:instrText xml:space="preserve"> PAGEREF _Toc242229853 \h </w:instrText>
         </w:r>
         <w:r>
           <w:rPr>
@@ -8339,7 +8339,7 @@
           <w14:ligatures w14:val="standardContextual"/>
         </w:rPr>
       </w:pPr>
-      <w:hyperlink w:anchor="_Toc242229589" w:history="1">
+      <w:hyperlink w:anchor="_Toc242229854" w:history="1">
         <w:r>
           <w:rPr>
             <w:rStyle w:val="Collegamentoipertestuale"/>
@@ -8384,7 +8384,7 @@
             <w:noProof/>
             <w:webHidden/>
           </w:rPr>
-          <w:instrText xml:space="preserve"> PAGEREF _Toc242229589 \h </w:instrText>
+          <w:instrText xml:space="preserve"> PAGEREF _Toc242229854 \h </w:instrText>
         </w:r>
         <w:r>
           <w:rPr>
@@ -8431,7 +8431,7 @@
           <w14:ligatures w14:val="standardContextual"/>
         </w:rPr>
       </w:pPr>
-      <w:hyperlink w:anchor="_Toc242229590" w:history="1">
+      <w:hyperlink w:anchor="_Toc242229855" w:history="1">
         <w:r>
           <w:rPr>
             <w:rStyle w:val="Collegamentoipertestuale"/>
@@ -8476,7 +8476,7 @@
             <w:noProof/>
             <w:webHidden/>
           </w:rPr>
-          <w:instrText xml:space="preserve"> PAGEREF _Toc242229590 \h </w:instrText>
+          <w:instrText xml:space="preserve"> PAGEREF _Toc242229855 \h </w:instrText>
         </w:r>
         <w:r>
           <w:rPr>
@@ -8523,7 +8523,7 @@
           <w14:ligatures w14:val="standardContextual"/>
         </w:rPr>
       </w:pPr>
-      <w:hyperlink w:anchor="_Toc242229591" w:history="1">
+      <w:hyperlink w:anchor="_Toc242229856" w:history="1">
         <w:r>
           <w:rPr>
             <w:rStyle w:val="Collegamentoipertestuale"/>
@@ -8568,7 +8568,7 @@
             <w:noProof/>
             <w:webHidden/>
           </w:rPr>
-          <w:instrText xml:space="preserve"> PAGEREF _Toc242229591 \h </w:instrText>
+          <w:instrText xml:space="preserve"> PAGEREF _Toc242229856 \h </w:instrText>
         </w:r>
         <w:r>
           <w:rPr>
@@ -8614,7 +8614,7 @@
           <w14:ligatures w14:val="standardContextual"/>
         </w:rPr>
       </w:pPr>
-      <w:hyperlink w:anchor="_Toc242229592" w:history="1">
+      <w:hyperlink w:anchor="_Toc242229857" w:history="1">
         <w:r>
           <w:rPr>
             <w:rStyle w:val="Collegamentoipertestuale"/>
@@ -8662,7 +8662,7 @@
             <w:noProof/>
             <w:webHidden/>
           </w:rPr>
-          <w:instrText xml:space="preserve"> PAGEREF _Toc242229592 \h </w:instrText>
+          <w:instrText xml:space="preserve"> PAGEREF _Toc242229857 \h </w:instrText>
         </w:r>
         <w:r>
           <w:rPr>
@@ -8709,7 +8709,7 @@
           <w14:ligatures w14:val="standardContextual"/>
         </w:rPr>
       </w:pPr>
-      <w:hyperlink w:anchor="_Toc242229593" w:history="1">
+      <w:hyperlink w:anchor="_Toc242229858" w:history="1">
         <w:r>
           <w:rPr>
             <w:rStyle w:val="Collegamentoipertestuale"/>
@@ -8754,7 +8754,7 @@
             <w:noProof/>
             <w:webHidden/>
           </w:rPr>
-          <w:instrText xml:space="preserve"> PAGEREF _Toc242229593 \h </w:instrText>
+          <w:instrText xml:space="preserve"> PAGEREF _Toc242229858 \h </w:instrText>
         </w:r>
         <w:r>
           <w:rPr>
@@ -8801,7 +8801,7 @@
           <w14:ligatures w14:val="standardContextual"/>
         </w:rPr>
       </w:pPr>
-      <w:hyperlink w:anchor="_Toc242229594" w:history="1">
+      <w:hyperlink w:anchor="_Toc242229859" w:history="1">
         <w:r>
           <w:rPr>
             <w:rStyle w:val="Collegamentoipertestuale"/>
@@ -8846,7 +8846,7 @@
             <w:noProof/>
             <w:webHidden/>
           </w:rPr>
-          <w:instrText xml:space="preserve"> PAGEREF _Toc242229594 \h </w:instrText>
+          <w:instrText xml:space="preserve"> PAGEREF _Toc242229859 \h </w:instrText>
         </w:r>
         <w:r>
           <w:rPr>
@@ -8893,7 +8893,7 @@
           <w14:ligatures w14:val="standardContextual"/>
         </w:rPr>
       </w:pPr>
-      <w:hyperlink w:anchor="_Toc242229595" w:history="1">
+      <w:hyperlink w:anchor="_Toc242229860" w:history="1">
         <w:r>
           <w:rPr>
             <w:rStyle w:val="Collegamentoipertestuale"/>
@@ -8938,7 +8938,7 @@
             <w:noProof/>
             <w:webHidden/>
           </w:rPr>
-          <w:instrText xml:space="preserve"> PAGEREF _Toc242229595 \h </w:instrText>
+          <w:instrText xml:space="preserve"> PAGEREF _Toc242229860 \h </w:instrText>
         </w:r>
         <w:r>
           <w:rPr>
@@ -8985,7 +8985,7 @@
           <w14:ligatures w14:val="standardContextual"/>
         </w:rPr>
       </w:pPr>
-      <w:hyperlink w:anchor="_Toc242229596" w:history="1">
+      <w:hyperlink w:anchor="_Toc242229861" w:history="1">
         <w:r>
           <w:rPr>
             <w:rStyle w:val="Collegamentoipertestuale"/>
@@ -9030,7 +9030,7 @@
             <w:noProof/>
             <w:webHidden/>
           </w:rPr>
-          <w:instrText xml:space="preserve"> PAGEREF _Toc242229596 \h </w:instrText>
+          <w:instrText xml:space="preserve"> PAGEREF _Toc242229861 \h </w:instrText>
         </w:r>
         <w:r>
           <w:rPr>
@@ -9077,7 +9077,7 @@
           <w14:ligatures w14:val="standardContextual"/>
         </w:rPr>
       </w:pPr>
-      <w:hyperlink w:anchor="_Toc242229597" w:history="1">
+      <w:hyperlink w:anchor="_Toc242229862" w:history="1">
         <w:r>
           <w:rPr>
             <w:rStyle w:val="Collegamentoipertestuale"/>
@@ -9122,7 +9122,7 @@
             <w:noProof/>
             <w:webHidden/>
           </w:rPr>
-          <w:instrText xml:space="preserve"> PAGEREF _Toc242229597 \h </w:instrText>
+          <w:instrText xml:space="preserve"> PAGEREF _Toc242229862 \h </w:instrText>
         </w:r>
         <w:r>
           <w:rPr>
@@ -9169,7 +9169,7 @@
           <w14:ligatures w14:val="standardContextual"/>
         </w:rPr>
       </w:pPr>
-      <w:hyperlink w:anchor="_Toc242229598" w:history="1">
+      <w:hyperlink w:anchor="_Toc242229863" w:history="1">
         <w:r>
           <w:rPr>
             <w:rStyle w:val="Collegamentoipertestuale"/>
@@ -9214,7 +9214,7 @@
             <w:noProof/>
             <w:webHidden/>
           </w:rPr>
-          <w:instrText xml:space="preserve"> PAGEREF _Toc242229598 \h </w:instrText>
+          <w:instrText xml:space="preserve"> PAGEREF _Toc242229863 \h </w:instrText>
         </w:r>
         <w:r>
           <w:rPr>
@@ -9261,7 +9261,7 @@
           <w14:ligatures w14:val="standardContextual"/>
         </w:rPr>
       </w:pPr>
-      <w:hyperlink w:anchor="_Toc242229599" w:history="1">
+      <w:hyperlink w:anchor="_Toc242229864" w:history="1">
         <w:r>
           <w:rPr>
             <w:rStyle w:val="Collegamentoipertestuale"/>
@@ -9306,7 +9306,7 @@
             <w:noProof/>
             <w:webHidden/>
           </w:rPr>
-          <w:instrText xml:space="preserve"> PAGEREF _Toc242229599 \h </w:instrText>
+          <w:instrText xml:space="preserve"> PAGEREF _Toc242229864 \h </w:instrText>
         </w:r>
         <w:r>
           <w:rPr>
@@ -9352,7 +9352,7 @@
           <w14:ligatures w14:val="standardContextual"/>
         </w:rPr>
       </w:pPr>
-      <w:hyperlink w:anchor="_Toc242229600" w:history="1">
+      <w:hyperlink w:anchor="_Toc242229865" w:history="1">
         <w:r>
           <w:rPr>
             <w:rStyle w:val="Collegamentoipertestuale"/>
@@ -9400,7 +9400,7 @@
             <w:noProof/>
             <w:webHidden/>
           </w:rPr>
-          <w:instrText xml:space="preserve"> PAGEREF _Toc242229600 \h </w:instrText>
+          <w:instrText xml:space="preserve"> PAGEREF _Toc242229865 \h </w:instrText>
         </w:r>
         <w:r>
           <w:rPr>
@@ -9447,7 +9447,7 @@
           <w14:ligatures w14:val="standardContextual"/>
         </w:rPr>
       </w:pPr>
-      <w:hyperlink w:anchor="_Toc242229601" w:history="1">
+      <w:hyperlink w:anchor="_Toc242229866" w:history="1">
         <w:r>
           <w:rPr>
             <w:rStyle w:val="Collegamentoipertestuale"/>
@@ -9492,7 +9492,7 @@
             <w:noProof/>
             <w:webHidden/>
           </w:rPr>
-          <w:instrText xml:space="preserve"> PAGEREF _Toc242229601 \h </w:instrText>
+          <w:instrText xml:space="preserve"> PAGEREF _Toc242229866 \h </w:instrText>
         </w:r>
         <w:r>
           <w:rPr>
@@ -9539,7 +9539,7 @@
           <w14:ligatures w14:val="standardContextual"/>
         </w:rPr>
       </w:pPr>
-      <w:hyperlink w:anchor="_Toc242229602" w:history="1">
+      <w:hyperlink w:anchor="_Toc242229867" w:history="1">
         <w:r>
           <w:rPr>
             <w:rStyle w:val="Collegamentoipertestuale"/>
@@ -9584,7 +9584,7 @@
             <w:noProof/>
             <w:webHidden/>
           </w:rPr>
-          <w:instrText xml:space="preserve"> PAGEREF _Toc242229602 \h </w:instrText>
+          <w:instrText xml:space="preserve"> PAGEREF _Toc242229867 \h </w:instrText>
         </w:r>
         <w:r>
           <w:rPr>
@@ -9631,7 +9631,7 @@
           <w14:ligatures w14:val="standardContextual"/>
         </w:rPr>
       </w:pPr>
-      <w:hyperlink w:anchor="_Toc242229603" w:history="1">
+      <w:hyperlink w:anchor="_Toc242229868" w:history="1">
         <w:r>
           <w:rPr>
             <w:rStyle w:val="Collegamentoipertestuale"/>
@@ -9676,7 +9676,7 @@
             <w:noProof/>
             <w:webHidden/>
           </w:rPr>
-          <w:instrText xml:space="preserve"> PAGEREF _Toc242229603 \h </w:instrText>
+          <w:instrText xml:space="preserve"> PAGEREF _Toc242229868 \h </w:instrText>
         </w:r>
         <w:r>
           <w:rPr>
@@ -9722,7 +9722,7 @@
           <w14:ligatures w14:val="standardContextual"/>
         </w:rPr>
       </w:pPr>
-      <w:hyperlink w:anchor="_Toc242229604" w:history="1">
+      <w:hyperlink w:anchor="_Toc242229869" w:history="1">
         <w:r>
           <w:rPr>
             <w:rStyle w:val="Collegamentoipertestuale"/>
@@ -9770,7 +9770,7 @@
             <w:noProof/>
             <w:webHidden/>
           </w:rPr>
-          <w:instrText xml:space="preserve"> PAGEREF _Toc242229604 \h </w:instrText>
+          <w:instrText xml:space="preserve"> PAGEREF _Toc242229869 \h </w:instrText>
         </w:r>
         <w:r>
           <w:rPr>
@@ -9817,7 +9817,7 @@
           <w14:ligatures w14:val="standardContextual"/>
         </w:rPr>
       </w:pPr>
-      <w:hyperlink w:anchor="_Toc242229605" w:history="1">
+      <w:hyperlink w:anchor="_Toc242229870" w:history="1">
         <w:r>
           <w:rPr>
             <w:rStyle w:val="Collegamentoipertestuale"/>
@@ -9862,7 +9862,7 @@
             <w:noProof/>
             <w:webHidden/>
           </w:rPr>
-          <w:instrText xml:space="preserve"> PAGEREF _Toc242229605 \h </w:instrText>
+          <w:instrText xml:space="preserve"> PAGEREF _Toc242229870 \h </w:instrText>
         </w:r>
         <w:r>
           <w:rPr>
@@ -9909,7 +9909,7 @@
           <w14:ligatures w14:val="standardContextual"/>
         </w:rPr>
       </w:pPr>
-      <w:hyperlink w:anchor="_Toc242229606" w:history="1">
+      <w:hyperlink w:anchor="_Toc242229871" w:history="1">
         <w:r>
           <w:rPr>
             <w:rStyle w:val="Collegamentoipertestuale"/>
@@ -9954,7 +9954,7 @@
             <w:noProof/>
             <w:webHidden/>
           </w:rPr>
-          <w:instrText xml:space="preserve"> PAGEREF _Toc242229606 \h </w:instrText>
+          <w:instrText xml:space="preserve"> PAGEREF _Toc242229871 \h </w:instrText>
         </w:r>
         <w:r>
           <w:rPr>
@@ -10001,7 +10001,7 @@
           <w14:ligatures w14:val="standardContextual"/>
         </w:rPr>
       </w:pPr>
-      <w:hyperlink w:anchor="_Toc242229607" w:history="1">
+      <w:hyperlink w:anchor="_Toc242229872" w:history="1">
         <w:r>
           <w:rPr>
             <w:rStyle w:val="Collegamentoipertestuale"/>
@@ -10046,7 +10046,7 @@
             <w:noProof/>
             <w:webHidden/>
           </w:rPr>
-          <w:instrText xml:space="preserve"> PAGEREF _Toc242229607 \h </w:instrText>
+          <w:instrText xml:space="preserve"> PAGEREF _Toc242229872 \h </w:instrText>
         </w:r>
         <w:r>
           <w:rPr>
@@ -10093,7 +10093,7 @@
           <w14:ligatures w14:val="standardContextual"/>
         </w:rPr>
       </w:pPr>
-      <w:hyperlink w:anchor="_Toc242229608" w:history="1">
+      <w:hyperlink w:anchor="_Toc242229873" w:history="1">
         <w:r>
           <w:rPr>
             <w:rStyle w:val="Collegamentoipertestuale"/>
@@ -10138,7 +10138,7 @@
             <w:noProof/>
             <w:webHidden/>
           </w:rPr>
-          <w:instrText xml:space="preserve"> PAGEREF _Toc242229608 \h </w:instrText>
+          <w:instrText xml:space="preserve"> PAGEREF _Toc242229873 \h </w:instrText>
         </w:r>
         <w:r>
           <w:rPr>
@@ -10185,7 +10185,7 @@
           <w14:ligatures w14:val="standardContextual"/>
         </w:rPr>
       </w:pPr>
-      <w:hyperlink w:anchor="_Toc242229609" w:history="1">
+      <w:hyperlink w:anchor="_Toc242229874" w:history="1">
         <w:r>
           <w:rPr>
             <w:rStyle w:val="Collegamentoipertestuale"/>
@@ -10230,7 +10230,7 @@
             <w:noProof/>
             <w:webHidden/>
           </w:rPr>
-          <w:instrText xml:space="preserve"> PAGEREF _Toc242229609 \h </w:instrText>
+          <w:instrText xml:space="preserve"> PAGEREF _Toc242229874 \h </w:instrText>
         </w:r>
         <w:r>
           <w:rPr>
@@ -10277,7 +10277,7 @@
           <w14:ligatures w14:val="standardContextual"/>
         </w:rPr>
       </w:pPr>
-      <w:hyperlink w:anchor="_Toc242229610" w:history="1">
+      <w:hyperlink w:anchor="_Toc242229875" w:history="1">
         <w:r>
           <w:rPr>
             <w:rStyle w:val="Collegamentoipertestuale"/>
@@ -10322,7 +10322,7 @@
             <w:noProof/>
             <w:webHidden/>
           </w:rPr>
-          <w:instrText xml:space="preserve"> PAGEREF _Toc242229610 \h </w:instrText>
+          <w:instrText xml:space="preserve"> PAGEREF _Toc242229875 \h </w:instrText>
         </w:r>
         <w:r>
           <w:rPr>
@@ -10369,7 +10369,7 @@
           <w14:ligatures w14:val="standardContextual"/>
         </w:rPr>
       </w:pPr>
-      <w:hyperlink w:anchor="_Toc242229611" w:history="1">
+      <w:hyperlink w:anchor="_Toc242229876" w:history="1">
         <w:r>
           <w:rPr>
             <w:rStyle w:val="Collegamentoipertestuale"/>
@@ -10414,7 +10414,7 @@
             <w:noProof/>
             <w:webHidden/>
           </w:rPr>
-          <w:instrText xml:space="preserve"> PAGEREF _Toc242229611 \h </w:instrText>
+          <w:instrText xml:space="preserve"> PAGEREF _Toc242229876 \h </w:instrText>
         </w:r>
         <w:r>
           <w:rPr>
@@ -10461,7 +10461,7 @@
           <w14:ligatures w14:val="standardContextual"/>
         </w:rPr>
       </w:pPr>
-      <w:hyperlink w:anchor="_Toc242229612" w:history="1">
+      <w:hyperlink w:anchor="_Toc242229877" w:history="1">
         <w:r>
           <w:rPr>
             <w:rStyle w:val="Collegamentoipertestuale"/>
@@ -10506,7 +10506,7 @@
             <w:noProof/>
             <w:webHidden/>
           </w:rPr>
-          <w:instrText xml:space="preserve"> PAGEREF _Toc242229612 \h </w:instrText>
+          <w:instrText xml:space="preserve"> PAGEREF _Toc242229877 \h </w:instrText>
         </w:r>
         <w:r>
           <w:rPr>
@@ -10553,7 +10553,7 @@
           <w14:ligatures w14:val="standardContextual"/>
         </w:rPr>
       </w:pPr>
-      <w:hyperlink w:anchor="_Toc242229613" w:history="1">
+      <w:hyperlink w:anchor="_Toc242229878" w:history="1">
         <w:r>
           <w:rPr>
             <w:rStyle w:val="Collegamentoipertestuale"/>
@@ -10598,7 +10598,7 @@
             <w:noProof/>
             <w:webHidden/>
           </w:rPr>
-          <w:instrText xml:space="preserve"> PAGEREF _Toc242229613 \h </w:instrText>
+          <w:instrText xml:space="preserve"> PAGEREF _Toc242229878 \h </w:instrText>
         </w:r>
         <w:r>
           <w:rPr>
@@ -10645,7 +10645,7 @@
           <w14:ligatures w14:val="standardContextual"/>
         </w:rPr>
       </w:pPr>
-      <w:hyperlink w:anchor="_Toc242229614" w:history="1">
+      <w:hyperlink w:anchor="_Toc242229879" w:history="1">
         <w:r>
           <w:rPr>
             <w:rStyle w:val="Collegamentoipertestuale"/>
@@ -10690,7 +10690,7 @@
             <w:noProof/>
             <w:webHidden/>
           </w:rPr>
-          <w:instrText xml:space="preserve"> PAGEREF _Toc242229614 \h </w:instrText>
+          <w:instrText xml:space="preserve"> PAGEREF _Toc242229879 \h </w:instrText>
         </w:r>
         <w:r>
           <w:rPr>
@@ -10737,7 +10737,7 @@
           <w14:ligatures w14:val="standardContextual"/>
         </w:rPr>
       </w:pPr>
-      <w:hyperlink w:anchor="_Toc242229615" w:history="1">
+      <w:hyperlink w:anchor="_Toc242229880" w:history="1">
         <w:r>
           <w:rPr>
             <w:rStyle w:val="Collegamentoipertestuale"/>
@@ -10782,7 +10782,7 @@
             <w:noProof/>
             <w:webHidden/>
           </w:rPr>
-          <w:instrText xml:space="preserve"> PAGEREF _Toc242229615 \h </w:instrText>
+          <w:instrText xml:space="preserve"> PAGEREF _Toc242229880 \h </w:instrText>
         </w:r>
         <w:r>
           <w:rPr>
@@ -10829,7 +10829,7 @@
           <w14:ligatures w14:val="standardContextual"/>
         </w:rPr>
       </w:pPr>
-      <w:hyperlink w:anchor="_Toc242229616" w:history="1">
+      <w:hyperlink w:anchor="_Toc242229881" w:history="1">
         <w:r>
           <w:rPr>
             <w:rStyle w:val="Collegamentoipertestuale"/>
@@ -10874,7 +10874,7 @@
             <w:noProof/>
             <w:webHidden/>
           </w:rPr>
-          <w:instrText xml:space="preserve"> PAGEREF _Toc242229616 \h </w:instrText>
+          <w:instrText xml:space="preserve"> PAGEREF _Toc242229881 \h </w:instrText>
         </w:r>
         <w:r>
           <w:rPr>
@@ -10920,7 +10920,7 @@
           <w14:ligatures w14:val="standardContextual"/>
         </w:rPr>
       </w:pPr>
-      <w:hyperlink w:anchor="_Toc242229617" w:history="1">
+      <w:hyperlink w:anchor="_Toc242229882" w:history="1">
         <w:r>
           <w:rPr>
             <w:rStyle w:val="Collegamentoipertestuale"/>
@@ -10968,7 +10968,7 @@
             <w:noProof/>
             <w:webHidden/>
           </w:rPr>
-          <w:instrText xml:space="preserve"> PAGEREF _Toc242229617 \h </w:instrText>
+          <w:instrText xml:space="preserve"> PAGEREF _Toc242229882 \h </w:instrText>
         </w:r>
         <w:r>
           <w:rPr>
@@ -11015,7 +11015,7 @@
           <w14:ligatures w14:val="standardContextual"/>
         </w:rPr>
       </w:pPr>
-      <w:hyperlink w:anchor="_Toc242229618" w:history="1">
+      <w:hyperlink w:anchor="_Toc242229883" w:history="1">
         <w:r>
           <w:rPr>
             <w:rStyle w:val="Collegamentoipertestuale"/>
@@ -11060,7 +11060,7 @@
             <w:noProof/>
             <w:webHidden/>
           </w:rPr>
-          <w:instrText xml:space="preserve"> PAGEREF _Toc242229618 \h </w:instrText>
+          <w:instrText xml:space="preserve"> PAGEREF _Toc242229883 \h </w:instrText>
         </w:r>
         <w:r>
           <w:rPr>
@@ -11107,7 +11107,7 @@
           <w14:ligatures w14:val="standardContextual"/>
         </w:rPr>
       </w:pPr>
-      <w:hyperlink w:anchor="_Toc242229619" w:history="1">
+      <w:hyperlink w:anchor="_Toc242229884" w:history="1">
         <w:r>
           <w:rPr>
             <w:rStyle w:val="Collegamentoipertestuale"/>
@@ -11152,7 +11152,7 @@
             <w:noProof/>
             <w:webHidden/>
           </w:rPr>
-          <w:instrText xml:space="preserve"> PAGEREF _Toc242229619 \h </w:instrText>
+          <w:instrText xml:space="preserve"> PAGEREF _Toc242229884 \h </w:instrText>
         </w:r>
         <w:r>
           <w:rPr>
@@ -11199,7 +11199,7 @@
           <w14:ligatures w14:val="standardContextual"/>
         </w:rPr>
       </w:pPr>
-      <w:hyperlink w:anchor="_Toc242229620" w:history="1">
+      <w:hyperlink w:anchor="_Toc242229885" w:history="1">
         <w:r>
           <w:rPr>
             <w:rStyle w:val="Collegamentoipertestuale"/>
@@ -11244,7 +11244,7 @@
             <w:noProof/>
             <w:webHidden/>
           </w:rPr>
-          <w:instrText xml:space="preserve"> PAGEREF _Toc242229620 \h </w:instrText>
+          <w:instrText xml:space="preserve"> PAGEREF _Toc242229885 \h </w:instrText>
         </w:r>
         <w:r>
           <w:rPr>
@@ -11291,7 +11291,7 @@
           <w14:ligatures w14:val="standardContextual"/>
         </w:rPr>
       </w:pPr>
-      <w:hyperlink w:anchor="_Toc242229621" w:history="1">
+      <w:hyperlink w:anchor="_Toc242229886" w:history="1">
         <w:r>
           <w:rPr>
             <w:rStyle w:val="Collegamentoipertestuale"/>
@@ -11336,7 +11336,7 @@
             <w:noProof/>
             <w:webHidden/>
           </w:rPr>
-          <w:instrText xml:space="preserve"> PAGEREF _Toc242229621 \h </w:instrText>
+          <w:instrText xml:space="preserve"> PAGEREF _Toc242229886 \h </w:instrText>
         </w:r>
         <w:r>
           <w:rPr>
@@ -11383,7 +11383,7 @@
           <w14:ligatures w14:val="standardContextual"/>
         </w:rPr>
       </w:pPr>
-      <w:hyperlink w:anchor="_Toc242229622" w:history="1">
+      <w:hyperlink w:anchor="_Toc242229887" w:history="1">
         <w:r>
           <w:rPr>
             <w:rStyle w:val="Collegamentoipertestuale"/>
@@ -11428,7 +11428,7 @@
             <w:noProof/>
             <w:webHidden/>
           </w:rPr>
-          <w:instrText xml:space="preserve"> PAGEREF _Toc242229622 \h </w:instrText>
+          <w:instrText xml:space="preserve"> PAGEREF _Toc242229887 \h </w:instrText>
         </w:r>
         <w:r>
           <w:rPr>
@@ -11475,7 +11475,7 @@
           <w14:ligatures w14:val="standardContextual"/>
         </w:rPr>
       </w:pPr>
-      <w:hyperlink w:anchor="_Toc242229623" w:history="1">
+      <w:hyperlink w:anchor="_Toc242229888" w:history="1">
         <w:r>
           <w:rPr>
             <w:rStyle w:val="Collegamentoipertestuale"/>
@@ -11520,7 +11520,7 @@
             <w:noProof/>
             <w:webHidden/>
           </w:rPr>
-          <w:instrText xml:space="preserve"> PAGEREF _Toc242229623 \h </w:instrText>
+          <w:instrText xml:space="preserve"> PAGEREF _Toc242229888 \h </w:instrText>
         </w:r>
         <w:r>
           <w:rPr>
@@ -11567,7 +11567,7 @@
           <w14:ligatures w14:val="standardContextual"/>
         </w:rPr>
       </w:pPr>
-      <w:hyperlink w:anchor="_Toc242229624" w:history="1">
+      <w:hyperlink w:anchor="_Toc242229889" w:history="1">
         <w:r>
           <w:rPr>
             <w:rStyle w:val="Collegamentoipertestuale"/>
@@ -11612,7 +11612,7 @@
             <w:noProof/>
             <w:webHidden/>
           </w:rPr>
-          <w:instrText xml:space="preserve"> PAGEREF _Toc242229624 \h </w:instrText>
+          <w:instrText xml:space="preserve"> PAGEREF _Toc242229889 \h </w:instrText>
         </w:r>
         <w:r>
           <w:rPr>
@@ -11658,7 +11658,7 @@
           <w14:ligatures w14:val="standardContextual"/>
         </w:rPr>
       </w:pPr>
-      <w:hyperlink w:anchor="_Toc242229625" w:history="1">
+      <w:hyperlink w:anchor="_Toc242229890" w:history="1">
         <w:r>
           <w:rPr>
             <w:rStyle w:val="Collegamentoipertestuale"/>
@@ -11706,7 +11706,7 @@
             <w:noProof/>
             <w:webHidden/>
           </w:rPr>
-          <w:instrText xml:space="preserve"> PAGEREF _Toc242229625 \h </w:instrText>
+          <w:instrText xml:space="preserve"> PAGEREF _Toc242229890 \h </w:instrText>
         </w:r>
         <w:r>
           <w:rPr>
@@ -11753,7 +11753,7 @@
           <w14:ligatures w14:val="standardContextual"/>
         </w:rPr>
       </w:pPr>
-      <w:hyperlink w:anchor="_Toc242229626" w:history="1">
+      <w:hyperlink w:anchor="_Toc242229891" w:history="1">
         <w:r>
           <w:rPr>
             <w:rStyle w:val="Collegamentoipertestuale"/>
@@ -11798,7 +11798,7 @@
             <w:noProof/>
             <w:webHidden/>
           </w:rPr>
-          <w:instrText xml:space="preserve"> PAGEREF _Toc242229626 \h </w:instrText>
+          <w:instrText xml:space="preserve"> PAGEREF _Toc242229891 \h </w:instrText>
         </w:r>
         <w:r>
           <w:rPr>
@@ -11845,7 +11845,7 @@
           <w14:ligatures w14:val="standardContextual"/>
         </w:rPr>
       </w:pPr>
-      <w:hyperlink w:anchor="_Toc242229627" w:history="1">
+      <w:hyperlink w:anchor="_Toc242229892" w:history="1">
         <w:r>
           <w:rPr>
             <w:rStyle w:val="Collegamentoipertestuale"/>
@@ -11890,7 +11890,7 @@
             <w:noProof/>
             <w:webHidden/>
           </w:rPr>
-          <w:instrText xml:space="preserve"> PAGEREF _Toc242229627 \h </w:instrText>
+          <w:instrText xml:space="preserve"> PAGEREF _Toc242229892 \h </w:instrText>
         </w:r>
         <w:r>
           <w:rPr>
@@ -11937,7 +11937,7 @@
           <w14:ligatures w14:val="standardContextual"/>
         </w:rPr>
       </w:pPr>
-      <w:hyperlink w:anchor="_Toc242229628" w:history="1">
+      <w:hyperlink w:anchor="_Toc242229893" w:history="1">
         <w:r>
           <w:rPr>
             <w:rStyle w:val="Collegamentoipertestuale"/>
@@ -11982,7 +11982,7 @@
             <w:noProof/>
             <w:webHidden/>
           </w:rPr>
-          <w:instrText xml:space="preserve"> PAGEREF _Toc242229628 \h </w:instrText>
+          <w:instrText xml:space="preserve"> PAGEREF _Toc242229893 \h </w:instrText>
         </w:r>
         <w:r>
           <w:rPr>
@@ -12029,7 +12029,7 @@
           <w14:ligatures w14:val="standardContextual"/>
         </w:rPr>
       </w:pPr>
-      <w:hyperlink w:anchor="_Toc242229629" w:history="1">
+      <w:hyperlink w:anchor="_Toc242229894" w:history="1">
         <w:r>
           <w:rPr>
             <w:rStyle w:val="Collegamentoipertestuale"/>
@@ -12074,7 +12074,7 @@
             <w:noProof/>
             <w:webHidden/>
           </w:rPr>
-          <w:instrText xml:space="preserve"> PAGEREF _Toc242229629 \h </w:instrText>
+          <w:instrText xml:space="preserve"> PAGEREF _Toc242229894 \h </w:instrText>
         </w:r>
         <w:r>
           <w:rPr>
@@ -12121,7 +12121,7 @@
           <w14:ligatures w14:val="standardContextual"/>
         </w:rPr>
       </w:pPr>
-      <w:hyperlink w:anchor="_Toc242229630" w:history="1">
+      <w:hyperlink w:anchor="_Toc242229895" w:history="1">
         <w:r>
           <w:rPr>
             <w:rStyle w:val="Collegamentoipertestuale"/>
@@ -12166,7 +12166,7 @@
             <w:noProof/>
             <w:webHidden/>
           </w:rPr>
-          <w:instrText xml:space="preserve"> PAGEREF _Toc242229630 \h </w:instrText>
+          <w:instrText xml:space="preserve"> PAGEREF _Toc242229895 \h </w:instrText>
         </w:r>
         <w:r>
           <w:rPr>
@@ -12213,7 +12213,7 @@
           <w14:ligatures w14:val="standardContextual"/>
         </w:rPr>
       </w:pPr>
-      <w:hyperlink w:anchor="_Toc242229631" w:history="1">
+      <w:hyperlink w:anchor="_Toc242229896" w:history="1">
         <w:r>
           <w:rPr>
             <w:rStyle w:val="Collegamentoipertestuale"/>
@@ -12258,7 +12258,7 @@
             <w:noProof/>
             <w:webHidden/>
           </w:rPr>
-          <w:instrText xml:space="preserve"> PAGEREF _Toc242229631 \h </w:instrText>
+          <w:instrText xml:space="preserve"> PAGEREF _Toc242229896 \h </w:instrText>
         </w:r>
         <w:r>
           <w:rPr>
@@ -12305,7 +12305,7 @@
           <w14:ligatures w14:val="standardContextual"/>
         </w:rPr>
       </w:pPr>
-      <w:hyperlink w:anchor="_Toc242229632" w:history="1">
+      <w:hyperlink w:anchor="_Toc242229897" w:history="1">
         <w:r>
           <w:rPr>
             <w:rStyle w:val="Collegamentoipertestuale"/>
@@ -12350,7 +12350,7 @@
             <w:noProof/>
             <w:webHidden/>
           </w:rPr>
-          <w:instrText xml:space="preserve"> PAGEREF _Toc242229632 \h </w:instrText>
+          <w:instrText xml:space="preserve"> PAGEREF _Toc242229897 \h </w:instrText>
         </w:r>
         <w:r>
           <w:rPr>
@@ -12397,7 +12397,7 @@
           <w14:ligatures w14:val="standardContextual"/>
         </w:rPr>
       </w:pPr>
-      <w:hyperlink w:anchor="_Toc242229633" w:history="1">
+      <w:hyperlink w:anchor="_Toc242229898" w:history="1">
         <w:r>
           <w:rPr>
             <w:rStyle w:val="Collegamentoipertestuale"/>
@@ -12442,7 +12442,7 @@
             <w:noProof/>
             <w:webHidden/>
           </w:rPr>
-          <w:instrText xml:space="preserve"> PAGEREF _Toc242229633 \h </w:instrText>
+          <w:instrText xml:space="preserve"> PAGEREF _Toc242229898 \h </w:instrText>
         </w:r>
         <w:r>
           <w:rPr>
@@ -12489,7 +12489,7 @@
           <w14:ligatures w14:val="standardContextual"/>
         </w:rPr>
       </w:pPr>
-      <w:hyperlink w:anchor="_Toc242229634" w:history="1">
+      <w:hyperlink w:anchor="_Toc242229899" w:history="1">
         <w:r>
           <w:rPr>
             <w:rStyle w:val="Collegamentoipertestuale"/>
@@ -12534,7 +12534,7 @@
             <w:noProof/>
             <w:webHidden/>
           </w:rPr>
-          <w:instrText xml:space="preserve"> PAGEREF _Toc242229634 \h </w:instrText>
+          <w:instrText xml:space="preserve"> PAGEREF _Toc242229899 \h </w:instrText>
         </w:r>
         <w:r>
           <w:rPr>
@@ -12581,7 +12581,7 @@
           <w14:ligatures w14:val="standardContextual"/>
         </w:rPr>
       </w:pPr>
-      <w:hyperlink w:anchor="_Toc242229635" w:history="1">
+      <w:hyperlink w:anchor="_Toc242229900" w:history="1">
         <w:r>
           <w:rPr>
             <w:rStyle w:val="Collegamentoipertestuale"/>
@@ -12626,7 +12626,7 @@
             <w:noProof/>
             <w:webHidden/>
           </w:rPr>
-          <w:instrText xml:space="preserve"> PAGEREF _Toc242229635 \h </w:instrText>
+          <w:instrText xml:space="preserve"> PAGEREF _Toc242229900 \h </w:instrText>
         </w:r>
         <w:r>
           <w:rPr>
@@ -12673,7 +12673,7 @@
           <w14:ligatures w14:val="standardContextual"/>
         </w:rPr>
       </w:pPr>
-      <w:hyperlink w:anchor="_Toc242229636" w:history="1">
+      <w:hyperlink w:anchor="_Toc242229901" w:history="1">
         <w:r>
           <w:rPr>
             <w:rStyle w:val="Collegamentoipertestuale"/>
@@ -12718,7 +12718,7 @@
             <w:noProof/>
             <w:webHidden/>
           </w:rPr>
-          <w:instrText xml:space="preserve"> PAGEREF _Toc242229636 \h </w:instrText>
+          <w:instrText xml:space="preserve"> PAGEREF _Toc242229901 \h </w:instrText>
         </w:r>
         <w:r>
           <w:rPr>
@@ -12765,7 +12765,7 @@
           <w14:ligatures w14:val="standardContextual"/>
         </w:rPr>
       </w:pPr>
-      <w:hyperlink w:anchor="_Toc242229637" w:history="1">
+      <w:hyperlink w:anchor="_Toc242229902" w:history="1">
         <w:r>
           <w:rPr>
             <w:rStyle w:val="Collegamentoipertestuale"/>
@@ -12810,7 +12810,7 @@
             <w:noProof/>
             <w:webHidden/>
           </w:rPr>
-          <w:instrText xml:space="preserve"> PAGEREF _Toc242229637 \h </w:instrText>
+          <w:instrText xml:space="preserve"> PAGEREF _Toc242229902 \h </w:instrText>
         </w:r>
         <w:r>
           <w:rPr>
@@ -12857,7 +12857,7 @@
           <w14:ligatures w14:val="standardContextual"/>
         </w:rPr>
       </w:pPr>
-      <w:hyperlink w:anchor="_Toc242229638" w:history="1">
+      <w:hyperlink w:anchor="_Toc242229903" w:history="1">
         <w:r>
           <w:rPr>
             <w:rStyle w:val="Collegamentoipertestuale"/>
@@ -12902,7 +12902,7 @@
             <w:noProof/>
             <w:webHidden/>
           </w:rPr>
-          <w:instrText xml:space="preserve"> PAGEREF _Toc242229638 \h </w:instrText>
+          <w:instrText xml:space="preserve"> PAGEREF _Toc242229903 \h </w:instrText>
         </w:r>
         <w:r>
           <w:rPr>
@@ -12949,7 +12949,7 @@
           <w14:ligatures w14:val="standardContextual"/>
         </w:rPr>
       </w:pPr>
-      <w:hyperlink w:anchor="_Toc242229639" w:history="1">
+      <w:hyperlink w:anchor="_Toc242229904" w:history="1">
         <w:r>
           <w:rPr>
             <w:rStyle w:val="Collegamentoipertestuale"/>
@@ -12994,7 +12994,7 @@
             <w:noProof/>
             <w:webHidden/>
           </w:rPr>
-          <w:instrText xml:space="preserve"> PAGEREF _Toc242229639 \h </w:instrText>
+          <w:instrText xml:space="preserve"> PAGEREF _Toc242229904 \h </w:instrText>
         </w:r>
         <w:r>
           <w:rPr>
@@ -13041,7 +13041,7 @@
           <w14:ligatures w14:val="standardContextual"/>
         </w:rPr>
       </w:pPr>
-      <w:hyperlink w:anchor="_Toc242229640" w:history="1">
+      <w:hyperlink w:anchor="_Toc242229905" w:history="1">
         <w:r>
           <w:rPr>
             <w:rStyle w:val="Collegamentoipertestuale"/>
@@ -13086,7 +13086,7 @@
             <w:noProof/>
             <w:webHidden/>
           </w:rPr>
-          <w:instrText xml:space="preserve"> PAGEREF _Toc242229640 \h </w:instrText>
+          <w:instrText xml:space="preserve"> PAGEREF _Toc242229905 \h </w:instrText>
         </w:r>
         <w:r>
           <w:rPr>
@@ -13133,7 +13133,7 @@
           <w14:ligatures w14:val="standardContextual"/>
         </w:rPr>
       </w:pPr>
-      <w:hyperlink w:anchor="_Toc242229641" w:history="1">
+      <w:hyperlink w:anchor="_Toc242229906" w:history="1">
         <w:r>
           <w:rPr>
             <w:rStyle w:val="Collegamentoipertestuale"/>
@@ -13178,7 +13178,7 @@
             <w:noProof/>
             <w:webHidden/>
           </w:rPr>
-          <w:instrText xml:space="preserve"> PAGEREF _Toc242229641 \h </w:instrText>
+          <w:instrText xml:space="preserve"> PAGEREF _Toc242229906 \h </w:instrText>
         </w:r>
         <w:r>
           <w:rPr>
@@ -13224,7 +13224,7 @@
           <w14:ligatures w14:val="standardContextual"/>
         </w:rPr>
       </w:pPr>
-      <w:hyperlink w:anchor="_Toc242229642" w:history="1">
+      <w:hyperlink w:anchor="_Toc242229907" w:history="1">
         <w:r>
           <w:rPr>
             <w:rStyle w:val="Collegamentoipertestuale"/>
@@ -13272,7 +13272,7 @@
             <w:noProof/>
             <w:webHidden/>
           </w:rPr>
-          <w:instrText xml:space="preserve"> PAGEREF _Toc242229642 \h </w:instrText>
+          <w:instrText xml:space="preserve"> PAGEREF _Toc242229907 \h </w:instrText>
         </w:r>
         <w:r>
           <w:rPr>
@@ -13319,7 +13319,7 @@
           <w14:ligatures w14:val="standardContextual"/>
         </w:rPr>
       </w:pPr>
-      <w:hyperlink w:anchor="_Toc242229643" w:history="1">
+      <w:hyperlink w:anchor="_Toc242229908" w:history="1">
         <w:r>
           <w:rPr>
             <w:rStyle w:val="Collegamentoipertestuale"/>
@@ -13364,7 +13364,7 @@
             <w:noProof/>
             <w:webHidden/>
           </w:rPr>
-          <w:instrText xml:space="preserve"> PAGEREF _Toc242229643 \h </w:instrText>
+          <w:instrText xml:space="preserve"> PAGEREF _Toc242229908 \h </w:instrText>
         </w:r>
         <w:r>
           <w:rPr>
@@ -13411,7 +13411,7 @@
           <w14:ligatures w14:val="standardContextual"/>
         </w:rPr>
       </w:pPr>
-      <w:hyperlink w:anchor="_Toc242229644" w:history="1">
+      <w:hyperlink w:anchor="_Toc242229909" w:history="1">
         <w:r>
           <w:rPr>
             <w:rStyle w:val="Collegamentoipertestuale"/>
@@ -13456,7 +13456,7 @@
             <w:noProof/>
             <w:webHidden/>
           </w:rPr>
-          <w:instrText xml:space="preserve"> PAGEREF _Toc242229644 \h </w:instrText>
+          <w:instrText xml:space="preserve"> PAGEREF _Toc242229909 \h </w:instrText>
         </w:r>
         <w:r>
           <w:rPr>
@@ -13503,7 +13503,7 @@
           <w14:ligatures w14:val="standardContextual"/>
         </w:rPr>
       </w:pPr>
-      <w:hyperlink w:anchor="_Toc242229645" w:history="1">
+      <w:hyperlink w:anchor="_Toc242229910" w:history="1">
         <w:r>
           <w:rPr>
             <w:rStyle w:val="Collegamentoipertestuale"/>
@@ -13548,7 +13548,7 @@
             <w:noProof/>
             <w:webHidden/>
           </w:rPr>
-          <w:instrText xml:space="preserve"> PAGEREF _Toc242229645 \h </w:instrText>
+          <w:instrText xml:space="preserve"> PAGEREF _Toc242229910 \h </w:instrText>
         </w:r>
         <w:r>
           <w:rPr>
@@ -13594,7 +13594,7 @@
           <w14:ligatures w14:val="standardContextual"/>
         </w:rPr>
       </w:pPr>
-      <w:hyperlink w:anchor="_Toc242229646" w:history="1">
+      <w:hyperlink w:anchor="_Toc242229911" w:history="1">
         <w:r>
           <w:rPr>
             <w:rStyle w:val="Collegamentoipertestuale"/>
@@ -13642,7 +13642,7 @@
             <w:noProof/>
             <w:webHidden/>
           </w:rPr>
-          <w:instrText xml:space="preserve"> PAGEREF _Toc242229646 \h </w:instrText>
+          <w:instrText xml:space="preserve"> PAGEREF _Toc242229911 \h </w:instrText>
         </w:r>
         <w:r>
           <w:rPr>
@@ -13689,7 +13689,7 @@
           <w14:ligatures w14:val="standardContextual"/>
         </w:rPr>
       </w:pPr>
-      <w:hyperlink w:anchor="_Toc242229647" w:history="1">
+      <w:hyperlink w:anchor="_Toc242229912" w:history="1">
         <w:r>
           <w:rPr>
             <w:rStyle w:val="Collegamentoipertestuale"/>
@@ -13734,7 +13734,7 @@
             <w:noProof/>
             <w:webHidden/>
           </w:rPr>
-          <w:instrText xml:space="preserve"> PAGEREF _Toc242229647 \h </w:instrText>
+          <w:instrText xml:space="preserve"> PAGEREF _Toc242229912 \h </w:instrText>
         </w:r>
         <w:r>
           <w:rPr>
@@ -13781,7 +13781,7 @@
           <w14:ligatures w14:val="standardContextual"/>
         </w:rPr>
       </w:pPr>
-      <w:hyperlink w:anchor="_Toc242229648" w:history="1">
+      <w:hyperlink w:anchor="_Toc242229913" w:history="1">
         <w:r>
           <w:rPr>
             <w:rStyle w:val="Collegamentoipertestuale"/>
@@ -13826,7 +13826,7 @@
             <w:noProof/>
             <w:webHidden/>
           </w:rPr>
-          <w:instrText xml:space="preserve"> PAGEREF _Toc242229648 \h </w:instrText>
+          <w:instrText xml:space="preserve"> PAGEREF _Toc242229913 \h </w:instrText>
         </w:r>
         <w:r>
           <w:rPr>
@@ -13873,7 +13873,7 @@
           <w14:ligatures w14:val="standardContextual"/>
         </w:rPr>
       </w:pPr>
-      <w:hyperlink w:anchor="_Toc242229649" w:history="1">
+      <w:hyperlink w:anchor="_Toc242229914" w:history="1">
         <w:r>
           <w:rPr>
             <w:rStyle w:val="Collegamentoipertestuale"/>
@@ -13918,7 +13918,7 @@
             <w:noProof/>
             <w:webHidden/>
           </w:rPr>
-          <w:instrText xml:space="preserve"> PAGEREF _Toc242229649 \h </w:instrText>
+          <w:instrText xml:space="preserve"> PAGEREF _Toc242229914 \h </w:instrText>
         </w:r>
         <w:r>
           <w:rPr>
@@ -13983,7 +13983,7 @@
         <w:keepNext/>
         <w:spacing w:after="140"/>
       </w:pPr>
-      <w:bookmarkStart w:id="2" w:name="_Toc242229524"/>
+      <w:bookmarkStart w:id="2" w:name="_Toc242229789"/>
       <w:r>
         <w:t>Avvio e scelta del modulo</w:t>
       </w:r>
@@ -13995,7 +13995,7 @@
         <w:keepNext/>
         <w:spacing w:after="140"/>
       </w:pPr>
-      <w:bookmarkStart w:id="3" w:name="_Toc242229525"/>
+      <w:bookmarkStart w:id="3" w:name="_Toc242229790"/>
       <w:r>
         <w:t>Avviare la versione aggiornata</w:t>
       </w:r>
@@ -14023,7 +14023,7 @@
         <w:keepNext/>
         <w:spacing w:after="140"/>
       </w:pPr>
-      <w:bookmarkStart w:id="4" w:name="_Toc242229526"/>
+      <w:bookmarkStart w:id="4" w:name="_Toc242229791"/>
       <w:r>
         <w:t>Scegliere l’aspetto</w:t>
       </w:r>
@@ -14051,7 +14051,7 @@
         <w:keepNext/>
         <w:spacing w:after="140"/>
       </w:pPr>
-      <w:bookmarkStart w:id="5" w:name="_Toc242229527"/>
+      <w:bookmarkStart w:id="5" w:name="_Toc242229792"/>
       <w:r>
         <w:t>Scegliere il foglio adatto</w:t>
       </w:r>
@@ -15037,7 +15037,7 @@
         <w:keepNext/>
         <w:spacing w:after="140"/>
       </w:pPr>
-      <w:bookmarkStart w:id="6" w:name="_Toc242229528"/>
+      <w:bookmarkStart w:id="6" w:name="_Toc242229793"/>
       <w:r>
         <w:t>Leggere e compilare i campi</w:t>
       </w:r>
@@ -15074,7 +15074,7 @@
         <w:keepNext/>
         <w:spacing w:after="140"/>
       </w:pPr>
-      <w:bookmarkStart w:id="7" w:name="_Toc242229529"/>
+      <w:bookmarkStart w:id="7" w:name="_Toc242229794"/>
       <w:r>
         <w:t>Progetti e gestione del lavoro</w:t>
       </w:r>
@@ -15086,7 +15086,7 @@
         <w:keepNext/>
         <w:spacing w:after="140"/>
       </w:pPr>
-      <w:bookmarkStart w:id="8" w:name="_Toc242229530"/>
+      <w:bookmarkStart w:id="8" w:name="_Toc242229795"/>
       <w:r>
         <w:t>Costruire una struttura leggibile</w:t>
       </w:r>
@@ -15122,7 +15122,7 @@
         <w:keepNext/>
         <w:spacing w:after="140"/>
       </w:pPr>
-      <w:bookmarkStart w:id="9" w:name="_Toc242229531"/>
+      <w:bookmarkStart w:id="9" w:name="_Toc242229796"/>
       <w:r>
         <w:t>Comprendere i dati comuni</w:t>
       </w:r>
@@ -15170,7 +15170,7 @@
         <w:keepNext/>
         <w:spacing w:after="140"/>
       </w:pPr>
-      <w:bookmarkStart w:id="10" w:name="_Toc242229532"/>
+      <w:bookmarkStart w:id="10" w:name="_Toc242229797"/>
       <w:r>
         <w:t>Spostare duplicare e annullare</w:t>
       </w:r>
@@ -15206,7 +15206,7 @@
         <w:keepNext/>
         <w:spacing w:after="140"/>
       </w:pPr>
-      <w:bookmarkStart w:id="11" w:name="_Toc242229533"/>
+      <w:bookmarkStart w:id="11" w:name="_Toc242229798"/>
       <w:r>
         <w:t>Usare le revisioni</w:t>
       </w:r>
@@ -15242,7 +15242,7 @@
         <w:keepNext/>
         <w:spacing w:after="140"/>
       </w:pPr>
-      <w:bookmarkStart w:id="12" w:name="_Toc242229534"/>
+      <w:bookmarkStart w:id="12" w:name="_Toc242229799"/>
       <w:r>
         <w:lastRenderedPageBreak/>
         <w:t>Report del ramo e compatibilità degli archivi</w:t>
@@ -15279,7 +15279,7 @@
         <w:keepNext/>
         <w:spacing w:after="140"/>
       </w:pPr>
-      <w:bookmarkStart w:id="13" w:name="_Toc242229535"/>
+      <w:bookmarkStart w:id="13" w:name="_Toc242229800"/>
       <w:r>
         <w:t>Controllo della condivisione</w:t>
       </w:r>
@@ -15307,7 +15307,7 @@
         <w:keepNext/>
         <w:spacing w:after="140"/>
       </w:pPr>
-      <w:bookmarkStart w:id="14" w:name="_Toc242229536"/>
+      <w:bookmarkStart w:id="14" w:name="_Toc242229801"/>
       <w:r>
         <w:t>Materiali e durabilità</w:t>
       </w:r>
@@ -15319,7 +15319,7 @@
         <w:keepNext/>
         <w:spacing w:after="140"/>
       </w:pPr>
-      <w:bookmarkStart w:id="15" w:name="_Toc242229537"/>
+      <w:bookmarkStart w:id="15" w:name="_Toc242229802"/>
       <w:r>
         <w:t>Preparare il calcestruzzo</w:t>
       </w:r>
@@ -15367,7 +15367,7 @@
         <w:keepNext/>
         <w:spacing w:after="140"/>
       </w:pPr>
-      <w:bookmarkStart w:id="16" w:name="_Toc242229538"/>
+      <w:bookmarkStart w:id="16" w:name="_Toc242229803"/>
       <w:r>
         <w:t>Preparare l'acciaio per armature</w:t>
       </w:r>
@@ -15403,7 +15403,7 @@
         <w:keepNext/>
         <w:spacing w:after="140"/>
       </w:pPr>
-      <w:bookmarkStart w:id="17" w:name="_Toc242229539"/>
+      <w:bookmarkStart w:id="17" w:name="_Toc242229804"/>
       <w:r>
         <w:t>Palo verticale</w:t>
       </w:r>
@@ -15415,7 +15415,7 @@
         <w:keepNext/>
         <w:spacing w:after="140"/>
       </w:pPr>
-      <w:bookmarkStart w:id="18" w:name="_Toc242229540"/>
+      <w:bookmarkStart w:id="18" w:name="_Toc242229805"/>
       <w:r>
         <w:t>Compilazione ordinata</w:t>
       </w:r>
@@ -15478,7 +15478,7 @@
         <w:keepNext/>
         <w:spacing w:after="140"/>
       </w:pPr>
-      <w:bookmarkStart w:id="19" w:name="_Toc242229541"/>
+      <w:bookmarkStart w:id="19" w:name="_Toc242229806"/>
       <w:r>
         <w:t>Coefficienti e gruppo di pali</w:t>
       </w:r>
@@ -15524,7 +15524,7 @@
         <w:keepNext/>
         <w:spacing w:after="140"/>
       </w:pPr>
-      <w:bookmarkStart w:id="20" w:name="_Toc242229542"/>
+      <w:bookmarkStart w:id="20" w:name="_Toc242229807"/>
       <w:r>
         <w:t>Leggere i risultati</w:t>
       </w:r>
@@ -15560,7 +15560,7 @@
         <w:keepNext/>
         <w:spacing w:after="140"/>
       </w:pPr>
-      <w:bookmarkStart w:id="21" w:name="_Toc242229543"/>
+      <w:bookmarkStart w:id="21" w:name="_Toc242229808"/>
       <w:r>
         <w:t>Esempio di controllo manuale</w:t>
       </w:r>
@@ -15655,7 +15655,7 @@
         <w:keepNext/>
         <w:spacing w:after="140"/>
       </w:pPr>
-      <w:bookmarkStart w:id="22" w:name="_Toc242229544"/>
+      <w:bookmarkStart w:id="22" w:name="_Toc242229809"/>
       <w:r>
         <w:t>Micropalo verticale</w:t>
       </w:r>
@@ -15667,7 +15667,7 @@
         <w:keepNext/>
         <w:spacing w:after="140"/>
       </w:pPr>
-      <w:bookmarkStart w:id="23" w:name="_Toc242229545"/>
+      <w:bookmarkStart w:id="23" w:name="_Toc242229810"/>
       <w:r>
         <w:t>Dati del bulbo e dell'iniezione</w:t>
       </w:r>
@@ -15712,7 +15712,7 @@
         <w:keepNext/>
         <w:spacing w:after="140"/>
       </w:pPr>
-      <w:bookmarkStart w:id="24" w:name="_Toc242229546"/>
+      <w:bookmarkStart w:id="24" w:name="_Toc242229811"/>
       <w:r>
         <w:t>Tubo e peso</w:t>
       </w:r>
@@ -15749,7 +15749,7 @@
         <w:keepNext/>
         <w:spacing w:after="140"/>
       </w:pPr>
-      <w:bookmarkStart w:id="25" w:name="_Toc242229547"/>
+      <w:bookmarkStart w:id="25" w:name="_Toc242229812"/>
       <w:r>
         <w:t>Pali e micropali caricati orizzontalmente</w:t>
       </w:r>
@@ -15761,7 +15761,7 @@
         <w:keepNext/>
         <w:spacing w:after="140"/>
       </w:pPr>
-      <w:bookmarkStart w:id="26" w:name="_Toc242229548"/>
+      <w:bookmarkStart w:id="26" w:name="_Toc242229813"/>
       <w:r>
         <w:t>Preparare un modello coerente</w:t>
       </w:r>
@@ -15798,7 +15798,7 @@
         <w:keepNext/>
         <w:spacing w:after="140"/>
       </w:pPr>
-      <w:bookmarkStart w:id="27" w:name="_Toc242229549"/>
+      <w:bookmarkStart w:id="27" w:name="_Toc242229814"/>
       <w:r>
         <w:t>Momento resistente del palo in calcestruzzo</w:t>
       </w:r>
@@ -15826,7 +15826,7 @@
         <w:keepNext/>
         <w:spacing w:after="140"/>
       </w:pPr>
-      <w:bookmarkStart w:id="28" w:name="_Toc242229550"/>
+      <w:bookmarkStart w:id="28" w:name="_Toc242229815"/>
       <w:r>
         <w:t>Sezione CHS del micropalo</w:t>
       </w:r>
@@ -15854,7 +15854,7 @@
         <w:keepNext/>
         <w:spacing w:after="140"/>
       </w:pPr>
-      <w:bookmarkStart w:id="29" w:name="_Toc242229551"/>
+      <w:bookmarkStart w:id="29" w:name="_Toc242229816"/>
       <w:r>
         <w:t>Interpretare diagrammi e capacità</w:t>
       </w:r>
@@ -15886,7 +15886,7 @@
         <w:keepNext/>
         <w:spacing w:after="140"/>
       </w:pPr>
-      <w:bookmarkStart w:id="30" w:name="_Toc242229552"/>
+      <w:bookmarkStart w:id="30" w:name="_Toc242229817"/>
       <w:r>
         <w:t>Separare tubo e diametro geotecnico</w:t>
       </w:r>
@@ -15922,7 +15922,7 @@
         <w:keepNext/>
         <w:spacing w:after="140"/>
       </w:pPr>
-      <w:bookmarkStart w:id="31" w:name="_Toc242229553"/>
+      <w:bookmarkStart w:id="31" w:name="_Toc242229818"/>
       <w:r>
         <w:t>Sezione composta da ponte</w:t>
       </w:r>
@@ -15934,7 +15934,7 @@
         <w:keepNext/>
         <w:spacing w:after="140"/>
       </w:pPr>
-      <w:bookmarkStart w:id="32" w:name="_Toc242229554"/>
+      <w:bookmarkStart w:id="32" w:name="_Toc242229819"/>
       <w:r>
         <w:t>Definire la sezione locale</w:t>
       </w:r>
@@ -15982,7 +15982,7 @@
         <w:keepNext/>
         <w:spacing w:after="140"/>
       </w:pPr>
-      <w:bookmarkStart w:id="33" w:name="_Toc242229555"/>
+      <w:bookmarkStart w:id="33" w:name="_Toc242229820"/>
       <w:r>
         <w:t>Compilare la sezione con anima inclinata</w:t>
       </w:r>
@@ -16017,7 +16017,7 @@
           <w:noProof/>
         </w:rPr>
         <w:drawing>
-          <wp:inline distT="0" distB="0" distL="0" distR="0" wp14:anchorId="111F346A" wp14:editId="752A71E3">
+          <wp:inline distT="0" distB="0" distL="0" distR="0" wp14:anchorId="289B43F0" wp14:editId="678A1D76">
             <wp:extent cx="6120000" cy="3677403"/>
             <wp:effectExtent l="0" t="0" r="0" b="0"/>
             <wp:docPr id="1" name="Picture 1" descr="H con anima inclinata e scostamento positivo di 300 mm"/>
@@ -16075,7 +16075,7 @@
         <w:keepNext/>
         <w:spacing w:after="140"/>
       </w:pPr>
-      <w:bookmarkStart w:id="34" w:name="_Toc242229556"/>
+      <w:bookmarkStart w:id="34" w:name="_Toc242229821"/>
       <w:r>
         <w:lastRenderedPageBreak/>
         <w:t>Compilare il cassoncino</w:t>
@@ -16116,7 +16116,7 @@
           <w:noProof/>
         </w:rPr>
         <w:drawing>
-          <wp:inline distT="0" distB="0" distL="0" distR="0" wp14:anchorId="7860182F" wp14:editId="198CB3B2">
+          <wp:inline distT="0" distB="0" distL="0" distR="0" wp14:anchorId="38991873" wp14:editId="644BD2C9">
             <wp:extent cx="6120000" cy="3677403"/>
             <wp:effectExtent l="0" t="0" r="0" b="0"/>
             <wp:docPr id="2" name="Picture 2" descr="Cassoncino con due anime inclinate e due piattabande superiori"/>
@@ -16178,7 +16178,7 @@
         <w:keepNext/>
         <w:spacing w:after="140"/>
       </w:pPr>
-      <w:bookmarkStart w:id="35" w:name="_Toc242229557"/>
+      <w:bookmarkStart w:id="35" w:name="_Toc242229822"/>
       <w:r>
         <w:t>Leggere le proprietà e riconoscere i limiti</w:t>
       </w:r>
@@ -16665,7 +16665,7 @@
         <w:keepNext/>
         <w:spacing w:after="140"/>
       </w:pPr>
-      <w:bookmarkStart w:id="36" w:name="_Toc242229558"/>
+      <w:bookmarkStart w:id="36" w:name="_Toc242229823"/>
       <w:r>
         <w:t>Scegliere consapevolmente il metodo</w:t>
       </w:r>
@@ -17033,7 +17033,7 @@
         <w:keepNext/>
         <w:spacing w:after="140"/>
       </w:pPr>
-      <w:bookmarkStart w:id="37" w:name="_Toc242229559"/>
+      <w:bookmarkStart w:id="37" w:name="_Toc242229824"/>
       <w:r>
         <w:t>Costruire le fasi</w:t>
       </w:r>
@@ -17087,7 +17087,7 @@
         <w:keepNext/>
         <w:spacing w:after="140"/>
       </w:pPr>
-      <w:bookmarkStart w:id="38" w:name="_Toc242229560"/>
+      <w:bookmarkStart w:id="38" w:name="_Toc242229825"/>
       <w:r>
         <w:t>Leggere efficacia tensioni e controlli locali</w:t>
       </w:r>
@@ -17149,7 +17149,7 @@
         <w:keepNext/>
         <w:spacing w:after="140"/>
       </w:pPr>
-      <w:bookmarkStart w:id="39" w:name="_Toc242229561"/>
+      <w:bookmarkStart w:id="39" w:name="_Toc242229826"/>
       <w:r>
         <w:t>Torsione distorsione e diaframmi del cassoncino</w:t>
       </w:r>
@@ -17228,7 +17228,7 @@
           <w:noProof/>
         </w:rPr>
         <w:drawing>
-          <wp:inline distT="0" distB="0" distL="0" distR="0" wp14:anchorId="45D66771" wp14:editId="4D4B213B">
+          <wp:inline distT="0" distB="0" distL="0" distR="0" wp14:anchorId="4BE24F25" wp14:editId="44032E62">
             <wp:extent cx="6120000" cy="3677403"/>
             <wp:effectExtent l="0" t="0" r="0" b="0"/>
             <wp:docPr id="3" name="Picture 3" descr="Riquadro delle verifiche a torsione del cassoncino"/>
@@ -17303,7 +17303,7 @@
           <w:noProof/>
         </w:rPr>
         <w:drawing>
-          <wp:inline distT="0" distB="0" distL="0" distR="0" wp14:anchorId="5646C3B3" wp14:editId="73CEA01D">
+          <wp:inline distT="0" distB="0" distL="0" distR="0" wp14:anchorId="49174DAD" wp14:editId="1E0BCB27">
             <wp:extent cx="6120000" cy="3677403"/>
             <wp:effectExtent l="0" t="0" r="0" b="0"/>
             <wp:docPr id="4" name="Picture 4" descr="Flussi di torsione per fase nella scheda Verifiche"/>
@@ -17387,7 +17387,7 @@
         <w:keepNext/>
         <w:spacing w:after="140"/>
       </w:pPr>
-      <w:bookmarkStart w:id="40" w:name="_Toc242229562"/>
+      <w:bookmarkStart w:id="40" w:name="_Toc242229827"/>
       <w:r>
         <w:t>Curve di risposta</w:t>
       </w:r>
@@ -17442,7 +17442,7 @@
         <w:keepNext/>
         <w:spacing w:after="140"/>
       </w:pPr>
-      <w:bookmarkStart w:id="41" w:name="_Toc242229563"/>
+      <w:bookmarkStart w:id="41" w:name="_Toc242229828"/>
       <w:r>
         <w:t>Bridge Design</w:t>
       </w:r>
@@ -17470,7 +17470,7 @@
         <w:keepNext/>
         <w:spacing w:after="140"/>
       </w:pPr>
-      <w:bookmarkStart w:id="42" w:name="_Toc242229564"/>
+      <w:bookmarkStart w:id="42" w:name="_Toc242229829"/>
       <w:r>
         <w:t>Preparare i dati prima di aprire la ricerca</w:t>
       </w:r>
@@ -18152,7 +18152,7 @@
         <w:keepNext/>
         <w:spacing w:after="140"/>
       </w:pPr>
-      <w:bookmarkStart w:id="43" w:name="_Toc242229565"/>
+      <w:bookmarkStart w:id="43" w:name="_Toc242229830"/>
       <w:r>
         <w:t>Creare il progetto di riferimento</w:t>
       </w:r>
@@ -18247,7 +18247,7 @@
         <w:keepNext/>
         <w:spacing w:after="140"/>
       </w:pPr>
-      <w:bookmarkStart w:id="44" w:name="_Toc242229566"/>
+      <w:bookmarkStart w:id="44" w:name="_Toc242229831"/>
       <w:r>
         <w:t>Leggere sezioni spessori e lunghezze</w:t>
       </w:r>
@@ -18291,7 +18291,7 @@
         <w:keepNext/>
         <w:spacing w:after="140"/>
       </w:pPr>
-      <w:bookmarkStart w:id="45" w:name="_Toc242229567"/>
+      <w:bookmarkStart w:id="45" w:name="_Toc242229832"/>
       <w:r>
         <w:t>Scegliere obiettivo e costanti</w:t>
       </w:r>
@@ -18981,7 +18981,7 @@
         <w:keepNext/>
         <w:spacing w:after="140"/>
       </w:pPr>
-      <w:bookmarkStart w:id="46" w:name="_Toc242229568"/>
+      <w:bookmarkStart w:id="46" w:name="_Toc242229833"/>
       <w:r>
         <w:t>Impostare range utili</w:t>
       </w:r>
@@ -19034,7 +19034,7 @@
         <w:keepNext/>
         <w:spacing w:after="140"/>
       </w:pPr>
-      <w:bookmarkStart w:id="47" w:name="_Toc242229569"/>
+      <w:bookmarkStart w:id="47" w:name="_Toc242229834"/>
       <w:r>
         <w:t>Avviare e leggere l’avanzamento</w:t>
       </w:r>
@@ -19070,7 +19070,7 @@
         <w:keepNext/>
         <w:spacing w:after="140"/>
       </w:pPr>
-      <w:bookmarkStart w:id="48" w:name="_Toc242229570"/>
+      <w:bookmarkStart w:id="48" w:name="_Toc242229835"/>
       <w:r>
         <w:t>Usare i grafici</w:t>
       </w:r>
@@ -19111,7 +19111,7 @@
         </w:rPr>
         <w:lastRenderedPageBreak/>
         <w:drawing>
-          <wp:inline distT="0" distB="0" distL="0" distR="0" wp14:anchorId="58E15C90" wp14:editId="58A8ED08">
+          <wp:inline distT="0" distB="0" distL="0" distR="0" wp14:anchorId="457D60D3" wp14:editId="75F84754">
             <wp:extent cx="6120000" cy="3519000"/>
             <wp:effectExtent l="0" t="0" r="0" b="0"/>
             <wp:docPr id="5" name="Picture 5" descr="Nuvola costo e CO₂ ricavata dai risultati riproducibili dell’esempio"/>
@@ -19173,7 +19173,7 @@
           <w:noProof/>
         </w:rPr>
         <w:drawing>
-          <wp:inline distT="0" distB="0" distL="0" distR="0" wp14:anchorId="639A3B3F" wp14:editId="2EDFDCF2">
+          <wp:inline distT="0" distB="0" distL="0" distR="0" wp14:anchorId="50D5690F" wp14:editId="262C54EB">
             <wp:extent cx="6120000" cy="3519000"/>
             <wp:effectExtent l="0" t="0" r="0" b="0"/>
             <wp:docPr id="6" name="Picture 6" descr="Variazione di altezza e costo durante l’enumerazione dell’esempio"/>
@@ -19223,7 +19223,7 @@
         <w:keepNext/>
         <w:spacing w:after="140"/>
       </w:pPr>
-      <w:bookmarkStart w:id="49" w:name="_Toc242229571"/>
+      <w:bookmarkStart w:id="49" w:name="_Toc242229836"/>
       <w:r>
         <w:lastRenderedPageBreak/>
         <w:t>Esempio guidato da centoventi metri</w:t>
@@ -19958,7 +19958,7 @@
           <w:noProof/>
         </w:rPr>
         <w:drawing>
-          <wp:inline distT="0" distB="0" distL="0" distR="0" wp14:anchorId="5D2BE975" wp14:editId="78A81A85">
+          <wp:inline distT="0" distB="0" distL="0" distR="0" wp14:anchorId="0DC28780" wp14:editId="7AD501F4">
             <wp:extent cx="6120000" cy="2601000"/>
             <wp:effectExtent l="0" t="0" r="0" b="0"/>
             <wp:docPr id="7" name="Picture 7" descr="Differenze di costo fra il riferimento e alcuni scenari dell’esempio"/>
@@ -20024,7 +20024,7 @@
         <w:keepNext/>
         <w:spacing w:after="140"/>
       </w:pPr>
-      <w:bookmarkStart w:id="50" w:name="_Toc242229572"/>
+      <w:bookmarkStart w:id="50" w:name="_Toc242229837"/>
       <w:r>
         <w:t>Selezionare applicare e conservare le alternative</w:t>
       </w:r>
@@ -20069,7 +20069,7 @@
         <w:keepNext/>
         <w:spacing w:after="140"/>
       </w:pPr>
-      <w:bookmarkStart w:id="51" w:name="_Toc242229573"/>
+      <w:bookmarkStart w:id="51" w:name="_Toc242229838"/>
       <w:r>
         <w:t>Prezzi geotecnica e scenari da confrontare</w:t>
       </w:r>
@@ -20105,7 +20105,7 @@
         <w:keepNext/>
         <w:spacing w:after="140"/>
       </w:pPr>
-      <w:bookmarkStart w:id="52" w:name="_Toc242229574"/>
+      <w:bookmarkStart w:id="52" w:name="_Toc242229839"/>
       <w:r>
         <w:t>Usare le famiglie speciali</w:t>
       </w:r>
@@ -20150,7 +20150,7 @@
         <w:keepNext/>
         <w:spacing w:after="140"/>
       </w:pPr>
-      <w:bookmarkStart w:id="53" w:name="_Toc242229575"/>
+      <w:bookmarkStart w:id="53" w:name="_Toc242229840"/>
       <w:r>
         <w:t>Risolvere i messaggi più comuni</w:t>
       </w:r>
@@ -21057,7 +21057,7 @@
         <w:keepNext/>
         <w:spacing w:after="140"/>
       </w:pPr>
-      <w:bookmarkStart w:id="54" w:name="_Toc242229576"/>
+      <w:bookmarkStart w:id="54" w:name="_Toc242229841"/>
       <w:r>
         <w:t>Esportare un confronto leggibile</w:t>
       </w:r>
@@ -21089,7 +21089,7 @@
         <w:keepNext/>
         <w:spacing w:after="140"/>
       </w:pPr>
-      <w:bookmarkStart w:id="55" w:name="_Toc242229577"/>
+      <w:bookmarkStart w:id="55" w:name="_Toc242229842"/>
       <w:r>
         <w:t>Quanto fidarsi dei risultati</w:t>
       </w:r>
@@ -21125,7 +21125,7 @@
         <w:keepNext/>
         <w:spacing w:after="140"/>
       </w:pPr>
-      <w:bookmarkStart w:id="56" w:name="_Toc242229578"/>
+      <w:bookmarkStart w:id="56" w:name="_Toc242229843"/>
       <w:r>
         <w:t>Salvataggio e report</w:t>
       </w:r>
@@ -21137,7 +21137,7 @@
         <w:keepNext/>
         <w:spacing w:after="140"/>
       </w:pPr>
-      <w:bookmarkStart w:id="57" w:name="_Toc242229579"/>
+      <w:bookmarkStart w:id="57" w:name="_Toc242229844"/>
       <w:r>
         <w:t>Conservare dati modificabili</w:t>
       </w:r>
@@ -21165,7 +21165,7 @@
         <w:keepNext/>
         <w:spacing w:after="140"/>
       </w:pPr>
-      <w:bookmarkStart w:id="58" w:name="_Toc242229580"/>
+      <w:bookmarkStart w:id="58" w:name="_Toc242229845"/>
       <w:r>
         <w:t>Report del singolo foglio e del progetto</w:t>
       </w:r>
@@ -21202,7 +21202,7 @@
         <w:keepNext/>
         <w:spacing w:after="140"/>
       </w:pPr>
-      <w:bookmarkStart w:id="59" w:name="_Toc242229581"/>
+      <w:bookmarkStart w:id="59" w:name="_Toc242229846"/>
       <w:r>
         <w:t>Conservare dati e risultati insieme</w:t>
       </w:r>
@@ -21230,7 +21230,7 @@
         <w:keepNext/>
         <w:spacing w:after="140"/>
       </w:pPr>
-      <w:bookmarkStart w:id="60" w:name="_Toc242229582"/>
+      <w:bookmarkStart w:id="60" w:name="_Toc242229847"/>
       <w:r>
         <w:t>Percorso completo per un primo progetto</w:t>
       </w:r>
@@ -21313,7 +21313,7 @@
         <w:keepNext/>
         <w:spacing w:after="140"/>
       </w:pPr>
-      <w:bookmarkStart w:id="61" w:name="_Toc242229583"/>
+      <w:bookmarkStart w:id="61" w:name="_Toc242229848"/>
       <w:r>
         <w:lastRenderedPageBreak/>
         <w:t>Problemi frequenti e controlli finali</w:t>
@@ -21900,7 +21900,7 @@
         <w:keepNext/>
         <w:spacing w:after="140"/>
       </w:pPr>
-      <w:bookmarkStart w:id="62" w:name="_Toc242229584"/>
+      <w:bookmarkStart w:id="62" w:name="_Toc242229849"/>
       <w:r>
         <w:t>Riferimenti per approfondire</w:t>
       </w:r>
@@ -21923,7 +21923,7 @@
         <w:keepNext/>
         <w:spacing w:after="140"/>
       </w:pPr>
-      <w:bookmarkStart w:id="63" w:name="_Toc242229585"/>
+      <w:bookmarkStart w:id="63" w:name="_Toc242229850"/>
       <w:r>
         <w:lastRenderedPageBreak/>
         <w:t>Muri di sostegno con stratigrafie di monte e valle</w:t>
@@ -21991,7 +21991,7 @@
         <w:keepNext/>
         <w:spacing w:after="140"/>
       </w:pPr>
-      <w:bookmarkStart w:id="64" w:name="_Toc242229586"/>
+      <w:bookmarkStart w:id="64" w:name="_Toc242229851"/>
       <w:r>
         <w:t>Materiali e copriferro del muro</w:t>
       </w:r>
@@ -22058,7 +22058,7 @@
         <w:keepNext/>
         <w:spacing w:after="140"/>
       </w:pPr>
-      <w:bookmarkStart w:id="65" w:name="_Toc242229587"/>
+      <w:bookmarkStart w:id="65" w:name="_Toc242229852"/>
       <w:r>
         <w:t>Avviare la verifica globale</w:t>
       </w:r>
@@ -22105,7 +22105,7 @@
         <w:keepNext/>
         <w:spacing w:after="140"/>
       </w:pPr>
-      <w:bookmarkStart w:id="66" w:name="_Toc242229588"/>
+      <w:bookmarkStart w:id="66" w:name="_Toc242229853"/>
       <w:r>
         <w:t>Inserire spessori e proprietà dei terreni</w:t>
       </w:r>
@@ -22826,7 +22826,7 @@
           <w:noProof/>
         </w:rPr>
         <w:drawing>
-          <wp:inline distT="0" distB="0" distL="0" distR="0" wp14:anchorId="640E6B88" wp14:editId="18402D21">
+          <wp:inline distT="0" distB="0" distL="0" distR="0" wp14:anchorId="58B8E048" wp14:editId="478100B3">
             <wp:extent cx="6120000" cy="2570400"/>
             <wp:effectExtent l="0" t="0" r="0" b="0"/>
             <wp:docPr id="8" name="Picture 8" descr="Profilo dell’esempio stratificato con terreno sotto la fondazione e limiti di ricerca evidenziati in blu."/>
@@ -22884,7 +22884,7 @@
         <w:keepNext/>
         <w:spacing w:after="140"/>
       </w:pPr>
-      <w:bookmarkStart w:id="67" w:name="_Toc242229589"/>
+      <w:bookmarkStart w:id="67" w:name="_Toc242229854"/>
       <w:r>
         <w:t>Controllare rilievo falda sisma e ricerca</w:t>
       </w:r>
@@ -22933,7 +22933,7 @@
         <w:keepNext/>
         <w:spacing w:after="140"/>
       </w:pPr>
-      <w:bookmarkStart w:id="68" w:name="_Toc242229590"/>
+      <w:bookmarkStart w:id="68" w:name="_Toc242229855"/>
       <w:r>
         <w:t>Leggere il risultato e riprodurre l’esempio</w:t>
       </w:r>
@@ -23031,7 +23031,7 @@
         <w:keepNext/>
         <w:spacing w:after="140"/>
       </w:pPr>
-      <w:bookmarkStart w:id="69" w:name="_Toc242229591"/>
+      <w:bookmarkStart w:id="69" w:name="_Toc242229856"/>
       <w:r>
         <w:t>Esempio salvato e risultati ripercorribili</w:t>
       </w:r>
@@ -23487,7 +23487,7 @@
           <w:noProof/>
         </w:rPr>
         <w:drawing>
-          <wp:inline distT="0" distB="0" distL="0" distR="0" wp14:anchorId="711013F7" wp14:editId="10DAE7CA">
+          <wp:inline distT="0" distB="0" distL="0" distR="0" wp14:anchorId="3B04A500" wp14:editId="3C3ABFE6">
             <wp:extent cx="6120000" cy="2570400"/>
             <wp:effectExtent l="0" t="0" r="0" b="0"/>
             <wp:docPr id="9" name="Picture 9" descr="Superficie della seconda combinazione: il tasso supera 1 e il cerchio è rosso. L’esempio conserva l’esito sfavorevole per mostrare la lettura della verifica."/>
@@ -23554,7 +23554,7 @@
         <w:keepNext/>
         <w:spacing w:after="140"/>
       </w:pPr>
-      <w:bookmarkStart w:id="70" w:name="_Toc242229592"/>
+      <w:bookmarkStart w:id="70" w:name="_Toc242229857"/>
       <w:r>
         <w:t>Portanza, cedimenti e armature dei muri: procedura</w:t>
       </w:r>
@@ -23574,7 +23574,7 @@
         <w:keepNext/>
         <w:spacing w:after="140"/>
       </w:pPr>
-      <w:bookmarkStart w:id="71" w:name="_Toc242229593"/>
+      <w:bookmarkStart w:id="71" w:name="_Toc242229858"/>
       <w:r>
         <w:lastRenderedPageBreak/>
         <w:t>Scegliere il controllo</w:t>
@@ -24084,7 +24084,7 @@
         <w:keepNext/>
         <w:spacing w:after="140"/>
       </w:pPr>
-      <w:bookmarkStart w:id="72" w:name="_Toc242229594"/>
+      <w:bookmarkStart w:id="72" w:name="_Toc242229859"/>
       <w:r>
         <w:t>Procedura e lettura</w:t>
       </w:r>
@@ -24120,7 +24120,7 @@
         <w:keepNext/>
         <w:spacing w:after="140"/>
       </w:pPr>
-      <w:bookmarkStart w:id="73" w:name="_Toc242229595"/>
+      <w:bookmarkStart w:id="73" w:name="_Toc242229860"/>
       <w:r>
         <w:t>Dati della portanza sismica</w:t>
       </w:r>
@@ -24197,7 +24197,7 @@
         <w:keepNext/>
         <w:spacing w:after="140"/>
       </w:pPr>
-      <w:bookmarkStart w:id="74" w:name="_Toc242229596"/>
+      <w:bookmarkStart w:id="74" w:name="_Toc242229861"/>
       <w:r>
         <w:t>Dati dei cedimenti</w:t>
       </w:r>
@@ -24234,7 +24234,7 @@
         <w:keepNext/>
         <w:spacing w:after="140"/>
       </w:pPr>
-      <w:bookmarkStart w:id="75" w:name="_Toc242229597"/>
+      <w:bookmarkStart w:id="75" w:name="_Toc242229862"/>
       <w:r>
         <w:t>Importare una storia Newmark</w:t>
       </w:r>
@@ -24262,7 +24262,7 @@
         <w:keepNext/>
         <w:spacing w:after="140"/>
       </w:pPr>
-      <w:bookmarkStart w:id="76" w:name="_Toc242229598"/>
+      <w:bookmarkStart w:id="76" w:name="_Toc242229863"/>
       <w:r>
         <w:t>Disporre e proporre le armature</w:t>
       </w:r>
@@ -24313,7 +24313,7 @@
         <w:keepNext/>
         <w:spacing w:after="140"/>
       </w:pPr>
-      <w:bookmarkStart w:id="77" w:name="_Toc242229599"/>
+      <w:bookmarkStart w:id="77" w:name="_Toc242229864"/>
       <w:r>
         <w:t>Tavola delle armature e distinta ferri del muro</w:t>
       </w:r>
@@ -24365,7 +24365,7 @@
         </w:rPr>
         <w:lastRenderedPageBreak/>
         <w:drawing>
-          <wp:inline distT="0" distB="0" distL="0" distR="0" wp14:anchorId="38FAEA01" wp14:editId="0CEFF5FE">
+          <wp:inline distT="0" distB="0" distL="0" distR="0" wp14:anchorId="34E0BEA9" wp14:editId="2CFF26A6">
             <wp:extent cx="6120000" cy="4316786"/>
             <wp:effectExtent l="0" t="0" r="0" b="0"/>
             <wp:docPr id="10" name="Picture 10" descr="Esempio di distinta del muro con due zone di armatura e tratto di quattro metri"/>
@@ -24423,7 +24423,7 @@
         <w:keepNext/>
         <w:spacing w:after="140"/>
       </w:pPr>
-      <w:bookmarkStart w:id="78" w:name="_Toc242229600"/>
+      <w:bookmarkStart w:id="78" w:name="_Toc242229865"/>
       <w:r>
         <w:t>Efficienza orizzontale della palificata</w:t>
       </w:r>
@@ -24443,7 +24443,7 @@
         <w:keepNext/>
         <w:spacing w:after="140"/>
       </w:pPr>
-      <w:bookmarkStart w:id="79" w:name="_Toc242229601"/>
+      <w:bookmarkStart w:id="79" w:name="_Toc242229866"/>
       <w:r>
         <w:t>Apertura e geometria</w:t>
       </w:r>
@@ -24483,7 +24483,7 @@
         <w:keepNext/>
         <w:spacing w:after="140"/>
       </w:pPr>
-      <w:bookmarkStart w:id="80" w:name="_Toc242229602"/>
+      <w:bookmarkStart w:id="80" w:name="_Toc242229867"/>
       <w:r>
         <w:t>Metodo e applicabilità</w:t>
       </w:r>
@@ -25101,7 +25101,7 @@
         <w:keepNext/>
         <w:spacing w:after="140"/>
       </w:pPr>
-      <w:bookmarkStart w:id="81" w:name="_Toc242229603"/>
+      <w:bookmarkStart w:id="81" w:name="_Toc242229868"/>
       <w:r>
         <w:t>Risultati e confronto</w:t>
       </w:r>
@@ -25148,7 +25148,7 @@
         <w:keepNext/>
         <w:spacing w:after="140"/>
       </w:pPr>
-      <w:bookmarkStart w:id="82" w:name="_Toc242229604"/>
+      <w:bookmarkStart w:id="82" w:name="_Toc242229869"/>
       <w:r>
         <w:lastRenderedPageBreak/>
         <w:t>Risposta elastica del palo orizzontale</w:t>
@@ -25169,7 +25169,7 @@
         <w:keepNext/>
         <w:spacing w:after="140"/>
       </w:pPr>
-      <w:bookmarkStart w:id="83" w:name="_Toc242229605"/>
+      <w:bookmarkStart w:id="83" w:name="_Toc242229870"/>
       <w:r>
         <w:t>Dati iniziali condivisi</w:t>
       </w:r>
@@ -25225,7 +25225,7 @@
         <w:keepNext/>
         <w:spacing w:after="140"/>
       </w:pPr>
-      <w:bookmarkStart w:id="84" w:name="_Toc242229606"/>
+      <w:bookmarkStart w:id="84" w:name="_Toc242229871"/>
       <w:r>
         <w:t>Parametri nella riga dello strato</w:t>
       </w:r>
@@ -25277,7 +25277,7 @@
         <w:keepNext/>
         <w:spacing w:after="140"/>
       </w:pPr>
-      <w:bookmarkStart w:id="85" w:name="_Toc242229607"/>
+      <w:bookmarkStart w:id="85" w:name="_Toc242229872"/>
       <w:r>
         <w:t>Sforzo normale e lettura dei diagrammi</w:t>
       </w:r>
@@ -25314,7 +25314,7 @@
         <w:keepNext/>
         <w:spacing w:after="140"/>
       </w:pPr>
-      <w:bookmarkStart w:id="86" w:name="_Toc242229608"/>
+      <w:bookmarkStart w:id="86" w:name="_Toc242229873"/>
       <w:r>
         <w:t>Materiali e parametri per strato</w:t>
       </w:r>
@@ -25365,7 +25365,7 @@
         <w:keepNext/>
         <w:spacing w:after="140"/>
       </w:pPr>
-      <w:bookmarkStart w:id="87" w:name="_Toc242229609"/>
+      <w:bookmarkStart w:id="87" w:name="_Toc242229874"/>
       <w:r>
         <w:t>Avanzamento e controlli da completare</w:t>
       </w:r>
@@ -25415,7 +25415,7 @@
         <w:keepNext/>
         <w:spacing w:after="140"/>
       </w:pPr>
-      <w:bookmarkStart w:id="88" w:name="_Toc242229610"/>
+      <w:bookmarkStart w:id="88" w:name="_Toc242229875"/>
       <w:r>
         <w:lastRenderedPageBreak/>
         <w:t>Tratti colorati e verificatore della sezione</w:t>
@@ -25499,7 +25499,7 @@
         <w:keepNext/>
         <w:spacing w:after="140"/>
       </w:pPr>
-      <w:bookmarkStart w:id="89" w:name="_Toc242229611"/>
+      <w:bookmarkStart w:id="89" w:name="_Toc242229876"/>
       <w:r>
         <w:t>Approvazione delle ipotesi ed esito delle armature</w:t>
       </w:r>
@@ -25560,7 +25560,7 @@
         <w:keepNext/>
         <w:spacing w:after="140"/>
       </w:pPr>
-      <w:bookmarkStart w:id="90" w:name="_Toc242229612"/>
+      <w:bookmarkStart w:id="90" w:name="_Toc242229877"/>
       <w:r>
         <w:lastRenderedPageBreak/>
         <w:t>Controlli sismici della testa del palo</w:t>
@@ -25646,7 +25646,7 @@
         <w:keepNext/>
         <w:spacing w:after="140"/>
       </w:pPr>
-      <w:bookmarkStart w:id="91" w:name="_Toc242229613"/>
+      <w:bookmarkStart w:id="91" w:name="_Toc242229878"/>
       <w:r>
         <w:t>Ricalcolo delle sollecitazioni e delle resistenze</w:t>
       </w:r>
@@ -25669,7 +25669,7 @@
         <w:keepNext/>
         <w:spacing w:after="140"/>
       </w:pPr>
-      <w:bookmarkStart w:id="92" w:name="_Toc242229614"/>
+      <w:bookmarkStart w:id="92" w:name="_Toc242229879"/>
       <w:r>
         <w:t>Tratti e verifica delle sezioni</w:t>
       </w:r>
@@ -25711,7 +25711,7 @@
         <w:keepNext/>
         <w:spacing w:after="140"/>
       </w:pPr>
-      <w:bookmarkStart w:id="93" w:name="_Toc242229615"/>
+      <w:bookmarkStart w:id="93" w:name="_Toc242229880"/>
       <w:r>
         <w:t>Proposte e vista delle armature</w:t>
       </w:r>
@@ -25806,7 +25806,7 @@
         <w:keepNext/>
         <w:spacing w:after="140"/>
       </w:pPr>
-      <w:bookmarkStart w:id="94" w:name="_Toc242229616"/>
+      <w:bookmarkStart w:id="94" w:name="_Toc242229881"/>
       <w:r>
         <w:t>Esempio riproducibile e limiti</w:t>
       </w:r>
@@ -25837,7 +25837,7 @@
         <w:keepNext/>
         <w:spacing w:after="140"/>
       </w:pPr>
-      <w:bookmarkStart w:id="95" w:name="_Toc242229617"/>
+      <w:bookmarkStart w:id="95" w:name="_Toc242229882"/>
       <w:r>
         <w:t>Wiki e centro della conoscenza</w:t>
       </w:r>
@@ -25849,7 +25849,7 @@
         <w:keepNext/>
         <w:spacing w:after="140"/>
       </w:pPr>
-      <w:bookmarkStart w:id="96" w:name="_Toc242229618"/>
+      <w:bookmarkStart w:id="96" w:name="_Toc242229883"/>
       <w:r>
         <w:t>Wiki del modulo e aiuti sui singoli dati</w:t>
       </w:r>
@@ -25877,7 +25877,7 @@
         <w:keepNext/>
         <w:spacing w:after="140"/>
       </w:pPr>
-      <w:bookmarkStart w:id="97" w:name="_Toc242229619"/>
+      <w:bookmarkStart w:id="97" w:name="_Toc242229884"/>
       <w:r>
         <w:t>Consultare la nuova biblioteca tecnica</w:t>
       </w:r>
@@ -25901,7 +25901,7 @@
         <w:keepNext/>
         <w:spacing w:after="140"/>
       </w:pPr>
-      <w:bookmarkStart w:id="98" w:name="_Toc242229620"/>
+      <w:bookmarkStart w:id="98" w:name="_Toc242229885"/>
       <w:r>
         <w:t>Engineering Handbook</w:t>
       </w:r>
@@ -25959,7 +25959,7 @@
         <w:keepNext/>
         <w:spacing w:after="140"/>
       </w:pPr>
-      <w:bookmarkStart w:id="99" w:name="_Toc242229621"/>
+      <w:bookmarkStart w:id="99" w:name="_Toc242229886"/>
       <w:r>
         <w:t>Cercare e scegliere un percorso</w:t>
       </w:r>
@@ -25979,7 +25979,7 @@
         <w:keepNext/>
         <w:spacing w:after="140"/>
       </w:pPr>
-      <w:bookmarkStart w:id="100" w:name="_Toc242229622"/>
+      <w:bookmarkStart w:id="100" w:name="_Toc242229887"/>
       <w:r>
         <w:lastRenderedPageBreak/>
         <w:t>Leggere e riprendere</w:t>
@@ -26008,7 +26008,7 @@
         <w:keepNext/>
         <w:spacing w:after="140"/>
       </w:pPr>
-      <w:bookmarkStart w:id="101" w:name="_Toc242229623"/>
+      <w:bookmarkStart w:id="101" w:name="_Toc242229888"/>
       <w:r>
         <w:t>Passare dalla teoria al calcolo</w:t>
       </w:r>
@@ -26044,7 +26044,7 @@
         <w:keepNext/>
         <w:spacing w:after="140"/>
       </w:pPr>
-      <w:bookmarkStart w:id="102" w:name="_Toc242229624"/>
+      <w:bookmarkStart w:id="102" w:name="_Toc242229889"/>
       <w:r>
         <w:t>Progetti e problemi frequenti</w:t>
       </w:r>
@@ -26064,7 +26064,7 @@
         <w:keepNext/>
         <w:spacing w:after="140"/>
       </w:pPr>
-      <w:bookmarkStart w:id="103" w:name="_Toc242229625"/>
+      <w:bookmarkStart w:id="103" w:name="_Toc242229890"/>
       <w:r>
         <w:t>Modulo Sezione in c.a.</w:t>
       </w:r>
@@ -26088,7 +26088,7 @@
         <w:keepNext/>
         <w:spacing w:after="140"/>
       </w:pPr>
-      <w:bookmarkStart w:id="104" w:name="_Toc242229626"/>
+      <w:bookmarkStart w:id="104" w:name="_Toc242229891"/>
       <w:r>
         <w:t>A cosa serve e quando usarlo</w:t>
       </w:r>
@@ -26116,7 +26116,7 @@
         <w:keepNext/>
         <w:spacing w:after="140"/>
       </w:pPr>
-      <w:bookmarkStart w:id="105" w:name="_Toc242229627"/>
+      <w:bookmarkStart w:id="105" w:name="_Toc242229892"/>
       <w:r>
         <w:t>Input geometria e unità</w:t>
       </w:r>
@@ -26711,7 +26711,7 @@
         <w:keepNext/>
         <w:spacing w:after="140"/>
       </w:pPr>
-      <w:bookmarkStart w:id="106" w:name="_Toc242229628"/>
+      <w:bookmarkStart w:id="106" w:name="_Toc242229893"/>
       <w:r>
         <w:t>Input materiali armature e default</w:t>
       </w:r>
@@ -26748,7 +26748,7 @@
         <w:keepNext/>
         <w:spacing w:after="140"/>
       </w:pPr>
-      <w:bookmarkStart w:id="107" w:name="_Toc242229629"/>
+      <w:bookmarkStart w:id="107" w:name="_Toc242229894"/>
       <w:r>
         <w:t>Input azioni e convenzioni</w:t>
       </w:r>
@@ -26776,7 +26776,7 @@
         <w:keepNext/>
         <w:spacing w:after="140"/>
       </w:pPr>
-      <w:bookmarkStart w:id="108" w:name="_Toc242229630"/>
+      <w:bookmarkStart w:id="108" w:name="_Toc242229895"/>
       <w:r>
         <w:t>Descrizione del calcolo</w:t>
       </w:r>
@@ -26804,7 +26804,7 @@
         <w:keepNext/>
         <w:spacing w:after="140"/>
       </w:pPr>
-      <w:bookmarkStart w:id="109" w:name="_Toc242229631"/>
+      <w:bookmarkStart w:id="109" w:name="_Toc242229896"/>
       <w:r>
         <w:t>Output e lettura dei risultati</w:t>
       </w:r>
@@ -27322,7 +27322,7 @@
         <w:keepNext/>
         <w:spacing w:after="140"/>
       </w:pPr>
-      <w:bookmarkStart w:id="110" w:name="_Toc242229632"/>
+      <w:bookmarkStart w:id="110" w:name="_Toc242229897"/>
       <w:r>
         <w:t>Warning e problemi frequenti</w:t>
       </w:r>
@@ -27360,7 +27360,7 @@
         <w:keepNext/>
         <w:spacing w:after="140"/>
       </w:pPr>
-      <w:bookmarkStart w:id="111" w:name="_Toc242229633"/>
+      <w:bookmarkStart w:id="111" w:name="_Toc242229898"/>
       <w:r>
         <w:t>Esempio completo dalla Wiki</w:t>
       </w:r>
@@ -27443,7 +27443,7 @@
         <w:keepNext/>
         <w:spacing w:after="140"/>
       </w:pPr>
-      <w:bookmarkStart w:id="112" w:name="_Toc242229634"/>
+      <w:bookmarkStart w:id="112" w:name="_Toc242229899"/>
       <w:r>
         <w:t>Teoria collegata e riepilogo</w:t>
       </w:r>
@@ -27471,7 +27471,7 @@
         <w:keepNext/>
         <w:spacing w:after="140"/>
       </w:pPr>
-      <w:bookmarkStart w:id="113" w:name="_Toc242229635"/>
+      <w:bookmarkStart w:id="113" w:name="_Toc242229900"/>
       <w:r>
         <w:t>Domini tridimensionali e bidimensionali</w:t>
       </w:r>
@@ -27507,7 +27507,7 @@
         <w:keepNext/>
         <w:spacing w:after="140"/>
       </w:pPr>
-      <w:bookmarkStart w:id="114" w:name="_Toc242229636"/>
+      <w:bookmarkStart w:id="114" w:name="_Toc242229901"/>
       <w:r>
         <w:t>Tensioni e fessurazione</w:t>
       </w:r>
@@ -27547,7 +27547,7 @@
         <w:keepNext/>
         <w:spacing w:after="140"/>
       </w:pPr>
-      <w:bookmarkStart w:id="115" w:name="_Toc242229637"/>
+      <w:bookmarkStart w:id="115" w:name="_Toc242229902"/>
       <w:r>
         <w:t>Taglio torsione e dettagli</w:t>
       </w:r>
@@ -27583,7 +27583,7 @@
         <w:keepNext/>
         <w:spacing w:after="140"/>
       </w:pPr>
-      <w:bookmarkStart w:id="116" w:name="_Toc242229638"/>
+      <w:bookmarkStart w:id="116" w:name="_Toc242229903"/>
       <w:r>
         <w:t>Curva momento curvatura e aggiornamento</w:t>
       </w:r>
@@ -27628,7 +27628,7 @@
         <w:keepNext/>
         <w:spacing w:after="140"/>
       </w:pPr>
-      <w:bookmarkStart w:id="117" w:name="_Toc242229639"/>
+      <w:bookmarkStart w:id="117" w:name="_Toc242229904"/>
       <w:r>
         <w:lastRenderedPageBreak/>
         <w:t>Importare ed esportare le azioni</w:t>
@@ -27673,7 +27673,7 @@
         <w:keepNext/>
         <w:spacing w:after="140"/>
       </w:pPr>
-      <w:bookmarkStart w:id="118" w:name="_Toc242229640"/>
+      <w:bookmarkStart w:id="118" w:name="_Toc242229905"/>
       <w:r>
         <w:t>Report short della sezione in calcestruzzo armato</w:t>
       </w:r>
@@ -27721,7 +27721,7 @@
         <w:keepNext/>
         <w:spacing w:after="140"/>
       </w:pPr>
-      <w:bookmarkStart w:id="119" w:name="_Toc242229641"/>
+      <w:bookmarkStart w:id="119" w:name="_Toc242229906"/>
       <w:r>
         <w:t>Leggere asse neutro, mappe e report</w:t>
       </w:r>
@@ -27757,7 +27757,7 @@
         <w:keepNext/>
         <w:spacing w:after="140"/>
       </w:pPr>
-      <w:bookmarkStart w:id="120" w:name="_Toc242229642"/>
+      <w:bookmarkStart w:id="120" w:name="_Toc242229907"/>
       <w:r>
         <w:t>Interpretazione dei risultati e controlli indipendenti</w:t>
       </w:r>
@@ -27777,7 +27777,7 @@
         <w:keepNext/>
         <w:spacing w:after="140"/>
       </w:pPr>
-      <w:bookmarkStart w:id="121" w:name="_Toc242229643"/>
+      <w:bookmarkStart w:id="121" w:name="_Toc242229908"/>
       <w:r>
         <w:t>Dalla domanda alla capacità</w:t>
       </w:r>
@@ -27797,7 +27797,7 @@
         <w:keepNext/>
         <w:spacing w:after="140"/>
       </w:pPr>
-      <w:bookmarkStart w:id="122" w:name="_Toc242229644"/>
+      <w:bookmarkStart w:id="122" w:name="_Toc242229909"/>
       <w:r>
         <w:t>Controllo numerico e fisico</w:t>
       </w:r>
@@ -27817,7 +27817,7 @@
         <w:keepNext/>
         <w:spacing w:after="140"/>
       </w:pPr>
-      <w:bookmarkStart w:id="123" w:name="_Toc242229645"/>
+      <w:bookmarkStart w:id="123" w:name="_Toc242229910"/>
       <w:r>
         <w:t>Archiviazione</w:t>
       </w:r>
@@ -27837,7 +27837,7 @@
         <w:keepNext/>
         <w:spacing w:after="140"/>
       </w:pPr>
-      <w:bookmarkStart w:id="124" w:name="_Toc242229646"/>
+      <w:bookmarkStart w:id="124" w:name="_Toc242229911"/>
       <w:r>
         <w:lastRenderedPageBreak/>
         <w:t>Tutorial dal modello Beam alla verifica di sezione</w:t>
@@ -27858,7 +27858,7 @@
         <w:keepNext/>
         <w:spacing w:after="140"/>
       </w:pPr>
-      <w:bookmarkStart w:id="125" w:name="_Toc242229647"/>
+      <w:bookmarkStart w:id="125" w:name="_Toc242229912"/>
       <w:r>
         <w:t>Capisci e controlla</w:t>
       </w:r>
@@ -27878,7 +27878,7 @@
         <w:keepNext/>
         <w:spacing w:after="140"/>
       </w:pPr>
-      <w:bookmarkStart w:id="126" w:name="_Toc242229648"/>
+      <w:bookmarkStart w:id="126" w:name="_Toc242229913"/>
       <w:r>
         <w:t>Calcola e modifica</w:t>
       </w:r>
@@ -27898,7 +27898,7 @@
         <w:keepNext/>
         <w:spacing w:after="140"/>
       </w:pPr>
-      <w:bookmarkStart w:id="127" w:name="_Toc242229649"/>
+      <w:bookmarkStart w:id="127" w:name="_Toc242229914"/>
       <w:r>
         <w:t>Osserva e archivia</w:t>
       </w:r>

</xml_diff>

<commit_message>
R15: testo della regola in sezione interamente tesa reso preciso; guide Rev31 rigenerate
In sezione interamente tesa (x = 0) h − x della fascia interna vale min[εmax/|∇ε|; altezza lungo il
gradiente]: il limite agisce solo dove εmax/|∇ε| supera l'altezza (fasce lontane dall'asse neutro e
tutte le fasce vicino alla trazione uniforme); una fascia vicina alla faccia meno tesa conserva
εmax/|∇ε|. Commento e guida dicevano invece che h − x è sempre quell'altezza (osservazione del
revisore). Solo testo: codice invariato. Indice Wiki e edizioni Word/PDF Rev31 rigenerate (pratica 65
pagine, teorica 135; 26 parti ITEC identiche, 321 formule); pagina 25 della teorica controllata a vista.

Co-Authored-By: Claude Opus 5.5 <noreply@anthropic.com>
</commit_message>
<xml_diff>
--- a/supporto/documentazione/Guide_ANTHEA/ANTHEA_Guida_pratica_ITEC_Rev31.docx
+++ b/supporto/documentazione/Guide_ANTHEA/ANTHEA_Guida_pratica_ITEC_Rev31.docx
@@ -2334,7 +2334,7 @@
       <w:r>
         <w:fldChar w:fldCharType="separate"/>
       </w:r>
-      <w:hyperlink w:anchor="_Toc242275599" w:history="1">
+      <w:hyperlink w:anchor="_Toc242275913" w:history="1">
         <w:r>
           <w:rPr>
             <w:rStyle w:val="Collegamentoipertestuale"/>
@@ -2382,7 +2382,7 @@
             <w:noProof/>
             <w:webHidden/>
           </w:rPr>
-          <w:instrText xml:space="preserve"> PAGEREF _Toc242275599 \h </w:instrText>
+          <w:instrText xml:space="preserve"> PAGEREF _Toc242275913 \h </w:instrText>
         </w:r>
         <w:r>
           <w:rPr>
@@ -2429,7 +2429,7 @@
           <w14:ligatures w14:val="standardContextual"/>
         </w:rPr>
       </w:pPr>
-      <w:hyperlink w:anchor="_Toc242275600" w:history="1">
+      <w:hyperlink w:anchor="_Toc242275914" w:history="1">
         <w:r>
           <w:rPr>
             <w:rStyle w:val="Collegamentoipertestuale"/>
@@ -2474,7 +2474,7 @@
             <w:noProof/>
             <w:webHidden/>
           </w:rPr>
-          <w:instrText xml:space="preserve"> PAGEREF _Toc242275600 \h </w:instrText>
+          <w:instrText xml:space="preserve"> PAGEREF _Toc242275914 \h </w:instrText>
         </w:r>
         <w:r>
           <w:rPr>
@@ -2521,7 +2521,7 @@
           <w14:ligatures w14:val="standardContextual"/>
         </w:rPr>
       </w:pPr>
-      <w:hyperlink w:anchor="_Toc242275601" w:history="1">
+      <w:hyperlink w:anchor="_Toc242275915" w:history="1">
         <w:r>
           <w:rPr>
             <w:rStyle w:val="Collegamentoipertestuale"/>
@@ -2566,7 +2566,7 @@
             <w:noProof/>
             <w:webHidden/>
           </w:rPr>
-          <w:instrText xml:space="preserve"> PAGEREF _Toc242275601 \h </w:instrText>
+          <w:instrText xml:space="preserve"> PAGEREF _Toc242275915 \h </w:instrText>
         </w:r>
         <w:r>
           <w:rPr>
@@ -2613,7 +2613,7 @@
           <w14:ligatures w14:val="standardContextual"/>
         </w:rPr>
       </w:pPr>
-      <w:hyperlink w:anchor="_Toc242275602" w:history="1">
+      <w:hyperlink w:anchor="_Toc242275916" w:history="1">
         <w:r>
           <w:rPr>
             <w:rStyle w:val="Collegamentoipertestuale"/>
@@ -2658,7 +2658,7 @@
             <w:noProof/>
             <w:webHidden/>
           </w:rPr>
-          <w:instrText xml:space="preserve"> PAGEREF _Toc242275602 \h </w:instrText>
+          <w:instrText xml:space="preserve"> PAGEREF _Toc242275916 \h </w:instrText>
         </w:r>
         <w:r>
           <w:rPr>
@@ -2705,7 +2705,7 @@
           <w14:ligatures w14:val="standardContextual"/>
         </w:rPr>
       </w:pPr>
-      <w:hyperlink w:anchor="_Toc242275603" w:history="1">
+      <w:hyperlink w:anchor="_Toc242275917" w:history="1">
         <w:r>
           <w:rPr>
             <w:rStyle w:val="Collegamentoipertestuale"/>
@@ -2750,7 +2750,7 @@
             <w:noProof/>
             <w:webHidden/>
           </w:rPr>
-          <w:instrText xml:space="preserve"> PAGEREF _Toc242275603 \h </w:instrText>
+          <w:instrText xml:space="preserve"> PAGEREF _Toc242275917 \h </w:instrText>
         </w:r>
         <w:r>
           <w:rPr>
@@ -2796,7 +2796,7 @@
           <w14:ligatures w14:val="standardContextual"/>
         </w:rPr>
       </w:pPr>
-      <w:hyperlink w:anchor="_Toc242275604" w:history="1">
+      <w:hyperlink w:anchor="_Toc242275918" w:history="1">
         <w:r>
           <w:rPr>
             <w:rStyle w:val="Collegamentoipertestuale"/>
@@ -2844,7 +2844,7 @@
             <w:noProof/>
             <w:webHidden/>
           </w:rPr>
-          <w:instrText xml:space="preserve"> PAGEREF _Toc242275604 \h </w:instrText>
+          <w:instrText xml:space="preserve"> PAGEREF _Toc242275918 \h </w:instrText>
         </w:r>
         <w:r>
           <w:rPr>
@@ -2891,7 +2891,7 @@
           <w14:ligatures w14:val="standardContextual"/>
         </w:rPr>
       </w:pPr>
-      <w:hyperlink w:anchor="_Toc242275605" w:history="1">
+      <w:hyperlink w:anchor="_Toc242275919" w:history="1">
         <w:r>
           <w:rPr>
             <w:rStyle w:val="Collegamentoipertestuale"/>
@@ -2936,7 +2936,7 @@
             <w:noProof/>
             <w:webHidden/>
           </w:rPr>
-          <w:instrText xml:space="preserve"> PAGEREF _Toc242275605 \h </w:instrText>
+          <w:instrText xml:space="preserve"> PAGEREF _Toc242275919 \h </w:instrText>
         </w:r>
         <w:r>
           <w:rPr>
@@ -2983,7 +2983,7 @@
           <w14:ligatures w14:val="standardContextual"/>
         </w:rPr>
       </w:pPr>
-      <w:hyperlink w:anchor="_Toc242275606" w:history="1">
+      <w:hyperlink w:anchor="_Toc242275920" w:history="1">
         <w:r>
           <w:rPr>
             <w:rStyle w:val="Collegamentoipertestuale"/>
@@ -3028,7 +3028,7 @@
             <w:noProof/>
             <w:webHidden/>
           </w:rPr>
-          <w:instrText xml:space="preserve"> PAGEREF _Toc242275606 \h </w:instrText>
+          <w:instrText xml:space="preserve"> PAGEREF _Toc242275920 \h </w:instrText>
         </w:r>
         <w:r>
           <w:rPr>
@@ -3075,7 +3075,7 @@
           <w14:ligatures w14:val="standardContextual"/>
         </w:rPr>
       </w:pPr>
-      <w:hyperlink w:anchor="_Toc242275607" w:history="1">
+      <w:hyperlink w:anchor="_Toc242275921" w:history="1">
         <w:r>
           <w:rPr>
             <w:rStyle w:val="Collegamentoipertestuale"/>
@@ -3120,7 +3120,7 @@
             <w:noProof/>
             <w:webHidden/>
           </w:rPr>
-          <w:instrText xml:space="preserve"> PAGEREF _Toc242275607 \h </w:instrText>
+          <w:instrText xml:space="preserve"> PAGEREF _Toc242275921 \h </w:instrText>
         </w:r>
         <w:r>
           <w:rPr>
@@ -3167,7 +3167,7 @@
           <w14:ligatures w14:val="standardContextual"/>
         </w:rPr>
       </w:pPr>
-      <w:hyperlink w:anchor="_Toc242275608" w:history="1">
+      <w:hyperlink w:anchor="_Toc242275922" w:history="1">
         <w:r>
           <w:rPr>
             <w:rStyle w:val="Collegamentoipertestuale"/>
@@ -3212,7 +3212,7 @@
             <w:noProof/>
             <w:webHidden/>
           </w:rPr>
-          <w:instrText xml:space="preserve"> PAGEREF _Toc242275608 \h </w:instrText>
+          <w:instrText xml:space="preserve"> PAGEREF _Toc242275922 \h </w:instrText>
         </w:r>
         <w:r>
           <w:rPr>
@@ -3259,7 +3259,7 @@
           <w14:ligatures w14:val="standardContextual"/>
         </w:rPr>
       </w:pPr>
-      <w:hyperlink w:anchor="_Toc242275609" w:history="1">
+      <w:hyperlink w:anchor="_Toc242275923" w:history="1">
         <w:r>
           <w:rPr>
             <w:rStyle w:val="Collegamentoipertestuale"/>
@@ -3304,7 +3304,7 @@
             <w:noProof/>
             <w:webHidden/>
           </w:rPr>
-          <w:instrText xml:space="preserve"> PAGEREF _Toc242275609 \h </w:instrText>
+          <w:instrText xml:space="preserve"> PAGEREF _Toc242275923 \h </w:instrText>
         </w:r>
         <w:r>
           <w:rPr>
@@ -3351,7 +3351,7 @@
           <w14:ligatures w14:val="standardContextual"/>
         </w:rPr>
       </w:pPr>
-      <w:hyperlink w:anchor="_Toc242275610" w:history="1">
+      <w:hyperlink w:anchor="_Toc242275924" w:history="1">
         <w:r>
           <w:rPr>
             <w:rStyle w:val="Collegamentoipertestuale"/>
@@ -3396,7 +3396,7 @@
             <w:noProof/>
             <w:webHidden/>
           </w:rPr>
-          <w:instrText xml:space="preserve"> PAGEREF _Toc242275610 \h </w:instrText>
+          <w:instrText xml:space="preserve"> PAGEREF _Toc242275924 \h </w:instrText>
         </w:r>
         <w:r>
           <w:rPr>
@@ -3442,7 +3442,7 @@
           <w14:ligatures w14:val="standardContextual"/>
         </w:rPr>
       </w:pPr>
-      <w:hyperlink w:anchor="_Toc242275611" w:history="1">
+      <w:hyperlink w:anchor="_Toc242275925" w:history="1">
         <w:r>
           <w:rPr>
             <w:rStyle w:val="Collegamentoipertestuale"/>
@@ -3490,7 +3490,7 @@
             <w:noProof/>
             <w:webHidden/>
           </w:rPr>
-          <w:instrText xml:space="preserve"> PAGEREF _Toc242275611 \h </w:instrText>
+          <w:instrText xml:space="preserve"> PAGEREF _Toc242275925 \h </w:instrText>
         </w:r>
         <w:r>
           <w:rPr>
@@ -3537,7 +3537,7 @@
           <w14:ligatures w14:val="standardContextual"/>
         </w:rPr>
       </w:pPr>
-      <w:hyperlink w:anchor="_Toc242275612" w:history="1">
+      <w:hyperlink w:anchor="_Toc242275926" w:history="1">
         <w:r>
           <w:rPr>
             <w:rStyle w:val="Collegamentoipertestuale"/>
@@ -3582,7 +3582,7 @@
             <w:noProof/>
             <w:webHidden/>
           </w:rPr>
-          <w:instrText xml:space="preserve"> PAGEREF _Toc242275612 \h </w:instrText>
+          <w:instrText xml:space="preserve"> PAGEREF _Toc242275926 \h </w:instrText>
         </w:r>
         <w:r>
           <w:rPr>
@@ -3629,7 +3629,7 @@
           <w14:ligatures w14:val="standardContextual"/>
         </w:rPr>
       </w:pPr>
-      <w:hyperlink w:anchor="_Toc242275613" w:history="1">
+      <w:hyperlink w:anchor="_Toc242275927" w:history="1">
         <w:r>
           <w:rPr>
             <w:rStyle w:val="Collegamentoipertestuale"/>
@@ -3674,7 +3674,7 @@
             <w:noProof/>
             <w:webHidden/>
           </w:rPr>
-          <w:instrText xml:space="preserve"> PAGEREF _Toc242275613 \h </w:instrText>
+          <w:instrText xml:space="preserve"> PAGEREF _Toc242275927 \h </w:instrText>
         </w:r>
         <w:r>
           <w:rPr>
@@ -3720,7 +3720,7 @@
           <w14:ligatures w14:val="standardContextual"/>
         </w:rPr>
       </w:pPr>
-      <w:hyperlink w:anchor="_Toc242275614" w:history="1">
+      <w:hyperlink w:anchor="_Toc242275928" w:history="1">
         <w:r>
           <w:rPr>
             <w:rStyle w:val="Collegamentoipertestuale"/>
@@ -3768,7 +3768,7 @@
             <w:noProof/>
             <w:webHidden/>
           </w:rPr>
-          <w:instrText xml:space="preserve"> PAGEREF _Toc242275614 \h </w:instrText>
+          <w:instrText xml:space="preserve"> PAGEREF _Toc242275928 \h </w:instrText>
         </w:r>
         <w:r>
           <w:rPr>
@@ -3815,7 +3815,7 @@
           <w14:ligatures w14:val="standardContextual"/>
         </w:rPr>
       </w:pPr>
-      <w:hyperlink w:anchor="_Toc242275615" w:history="1">
+      <w:hyperlink w:anchor="_Toc242275929" w:history="1">
         <w:r>
           <w:rPr>
             <w:rStyle w:val="Collegamentoipertestuale"/>
@@ -3860,7 +3860,7 @@
             <w:noProof/>
             <w:webHidden/>
           </w:rPr>
-          <w:instrText xml:space="preserve"> PAGEREF _Toc242275615 \h </w:instrText>
+          <w:instrText xml:space="preserve"> PAGEREF _Toc242275929 \h </w:instrText>
         </w:r>
         <w:r>
           <w:rPr>
@@ -3907,7 +3907,7 @@
           <w14:ligatures w14:val="standardContextual"/>
         </w:rPr>
       </w:pPr>
-      <w:hyperlink w:anchor="_Toc242275616" w:history="1">
+      <w:hyperlink w:anchor="_Toc242275930" w:history="1">
         <w:r>
           <w:rPr>
             <w:rStyle w:val="Collegamentoipertestuale"/>
@@ -3952,7 +3952,7 @@
             <w:noProof/>
             <w:webHidden/>
           </w:rPr>
-          <w:instrText xml:space="preserve"> PAGEREF _Toc242275616 \h </w:instrText>
+          <w:instrText xml:space="preserve"> PAGEREF _Toc242275930 \h </w:instrText>
         </w:r>
         <w:r>
           <w:rPr>
@@ -3999,7 +3999,7 @@
           <w14:ligatures w14:val="standardContextual"/>
         </w:rPr>
       </w:pPr>
-      <w:hyperlink w:anchor="_Toc242275617" w:history="1">
+      <w:hyperlink w:anchor="_Toc242275931" w:history="1">
         <w:r>
           <w:rPr>
             <w:rStyle w:val="Collegamentoipertestuale"/>
@@ -4044,7 +4044,7 @@
             <w:noProof/>
             <w:webHidden/>
           </w:rPr>
-          <w:instrText xml:space="preserve"> PAGEREF _Toc242275617 \h </w:instrText>
+          <w:instrText xml:space="preserve"> PAGEREF _Toc242275931 \h </w:instrText>
         </w:r>
         <w:r>
           <w:rPr>
@@ -4091,7 +4091,7 @@
           <w14:ligatures w14:val="standardContextual"/>
         </w:rPr>
       </w:pPr>
-      <w:hyperlink w:anchor="_Toc242275618" w:history="1">
+      <w:hyperlink w:anchor="_Toc242275932" w:history="1">
         <w:r>
           <w:rPr>
             <w:rStyle w:val="Collegamentoipertestuale"/>
@@ -4136,7 +4136,7 @@
             <w:noProof/>
             <w:webHidden/>
           </w:rPr>
-          <w:instrText xml:space="preserve"> PAGEREF _Toc242275618 \h </w:instrText>
+          <w:instrText xml:space="preserve"> PAGEREF _Toc242275932 \h </w:instrText>
         </w:r>
         <w:r>
           <w:rPr>
@@ -4182,7 +4182,7 @@
           <w14:ligatures w14:val="standardContextual"/>
         </w:rPr>
       </w:pPr>
-      <w:hyperlink w:anchor="_Toc242275619" w:history="1">
+      <w:hyperlink w:anchor="_Toc242275933" w:history="1">
         <w:r>
           <w:rPr>
             <w:rStyle w:val="Collegamentoipertestuale"/>
@@ -4230,7 +4230,7 @@
             <w:noProof/>
             <w:webHidden/>
           </w:rPr>
-          <w:instrText xml:space="preserve"> PAGEREF _Toc242275619 \h </w:instrText>
+          <w:instrText xml:space="preserve"> PAGEREF _Toc242275933 \h </w:instrText>
         </w:r>
         <w:r>
           <w:rPr>
@@ -4277,7 +4277,7 @@
           <w14:ligatures w14:val="standardContextual"/>
         </w:rPr>
       </w:pPr>
-      <w:hyperlink w:anchor="_Toc242275620" w:history="1">
+      <w:hyperlink w:anchor="_Toc242275934" w:history="1">
         <w:r>
           <w:rPr>
             <w:rStyle w:val="Collegamentoipertestuale"/>
@@ -4322,7 +4322,7 @@
             <w:noProof/>
             <w:webHidden/>
           </w:rPr>
-          <w:instrText xml:space="preserve"> PAGEREF _Toc242275620 \h </w:instrText>
+          <w:instrText xml:space="preserve"> PAGEREF _Toc242275934 \h </w:instrText>
         </w:r>
         <w:r>
           <w:rPr>
@@ -4369,7 +4369,7 @@
           <w14:ligatures w14:val="standardContextual"/>
         </w:rPr>
       </w:pPr>
-      <w:hyperlink w:anchor="_Toc242275621" w:history="1">
+      <w:hyperlink w:anchor="_Toc242275935" w:history="1">
         <w:r>
           <w:rPr>
             <w:rStyle w:val="Collegamentoipertestuale"/>
@@ -4414,7 +4414,7 @@
             <w:noProof/>
             <w:webHidden/>
           </w:rPr>
-          <w:instrText xml:space="preserve"> PAGEREF _Toc242275621 \h </w:instrText>
+          <w:instrText xml:space="preserve"> PAGEREF _Toc242275935 \h </w:instrText>
         </w:r>
         <w:r>
           <w:rPr>
@@ -4460,7 +4460,7 @@
           <w14:ligatures w14:val="standardContextual"/>
         </w:rPr>
       </w:pPr>
-      <w:hyperlink w:anchor="_Toc242275622" w:history="1">
+      <w:hyperlink w:anchor="_Toc242275936" w:history="1">
         <w:r>
           <w:rPr>
             <w:rStyle w:val="Collegamentoipertestuale"/>
@@ -4508,7 +4508,7 @@
             <w:noProof/>
             <w:webHidden/>
           </w:rPr>
-          <w:instrText xml:space="preserve"> PAGEREF _Toc242275622 \h </w:instrText>
+          <w:instrText xml:space="preserve"> PAGEREF _Toc242275936 \h </w:instrText>
         </w:r>
         <w:r>
           <w:rPr>
@@ -4555,7 +4555,7 @@
           <w14:ligatures w14:val="standardContextual"/>
         </w:rPr>
       </w:pPr>
-      <w:hyperlink w:anchor="_Toc242275623" w:history="1">
+      <w:hyperlink w:anchor="_Toc242275937" w:history="1">
         <w:r>
           <w:rPr>
             <w:rStyle w:val="Collegamentoipertestuale"/>
@@ -4600,7 +4600,7 @@
             <w:noProof/>
             <w:webHidden/>
           </w:rPr>
-          <w:instrText xml:space="preserve"> PAGEREF _Toc242275623 \h </w:instrText>
+          <w:instrText xml:space="preserve"> PAGEREF _Toc242275937 \h </w:instrText>
         </w:r>
         <w:r>
           <w:rPr>
@@ -4647,7 +4647,7 @@
           <w14:ligatures w14:val="standardContextual"/>
         </w:rPr>
       </w:pPr>
-      <w:hyperlink w:anchor="_Toc242275624" w:history="1">
+      <w:hyperlink w:anchor="_Toc242275938" w:history="1">
         <w:r>
           <w:rPr>
             <w:rStyle w:val="Collegamentoipertestuale"/>
@@ -4692,7 +4692,7 @@
             <w:noProof/>
             <w:webHidden/>
           </w:rPr>
-          <w:instrText xml:space="preserve"> PAGEREF _Toc242275624 \h </w:instrText>
+          <w:instrText xml:space="preserve"> PAGEREF _Toc242275938 \h </w:instrText>
         </w:r>
         <w:r>
           <w:rPr>
@@ -4739,7 +4739,7 @@
           <w14:ligatures w14:val="standardContextual"/>
         </w:rPr>
       </w:pPr>
-      <w:hyperlink w:anchor="_Toc242275625" w:history="1">
+      <w:hyperlink w:anchor="_Toc242275939" w:history="1">
         <w:r>
           <w:rPr>
             <w:rStyle w:val="Collegamentoipertestuale"/>
@@ -4784,7 +4784,7 @@
             <w:noProof/>
             <w:webHidden/>
           </w:rPr>
-          <w:instrText xml:space="preserve"> PAGEREF _Toc242275625 \h </w:instrText>
+          <w:instrText xml:space="preserve"> PAGEREF _Toc242275939 \h </w:instrText>
         </w:r>
         <w:r>
           <w:rPr>
@@ -4831,7 +4831,7 @@
           <w14:ligatures w14:val="standardContextual"/>
         </w:rPr>
       </w:pPr>
-      <w:hyperlink w:anchor="_Toc242275626" w:history="1">
+      <w:hyperlink w:anchor="_Toc242275940" w:history="1">
         <w:r>
           <w:rPr>
             <w:rStyle w:val="Collegamentoipertestuale"/>
@@ -4876,7 +4876,7 @@
             <w:noProof/>
             <w:webHidden/>
           </w:rPr>
-          <w:instrText xml:space="preserve"> PAGEREF _Toc242275626 \h </w:instrText>
+          <w:instrText xml:space="preserve"> PAGEREF _Toc242275940 \h </w:instrText>
         </w:r>
         <w:r>
           <w:rPr>
@@ -4923,7 +4923,7 @@
           <w14:ligatures w14:val="standardContextual"/>
         </w:rPr>
       </w:pPr>
-      <w:hyperlink w:anchor="_Toc242275627" w:history="1">
+      <w:hyperlink w:anchor="_Toc242275941" w:history="1">
         <w:r>
           <w:rPr>
             <w:rStyle w:val="Collegamentoipertestuale"/>
@@ -4968,7 +4968,7 @@
             <w:noProof/>
             <w:webHidden/>
           </w:rPr>
-          <w:instrText xml:space="preserve"> PAGEREF _Toc242275627 \h </w:instrText>
+          <w:instrText xml:space="preserve"> PAGEREF _Toc242275941 \h </w:instrText>
         </w:r>
         <w:r>
           <w:rPr>
@@ -5014,7 +5014,7 @@
           <w14:ligatures w14:val="standardContextual"/>
         </w:rPr>
       </w:pPr>
-      <w:hyperlink w:anchor="_Toc242275628" w:history="1">
+      <w:hyperlink w:anchor="_Toc242275942" w:history="1">
         <w:r>
           <w:rPr>
             <w:rStyle w:val="Collegamentoipertestuale"/>
@@ -5062,7 +5062,7 @@
             <w:noProof/>
             <w:webHidden/>
           </w:rPr>
-          <w:instrText xml:space="preserve"> PAGEREF _Toc242275628 \h </w:instrText>
+          <w:instrText xml:space="preserve"> PAGEREF _Toc242275942 \h </w:instrText>
         </w:r>
         <w:r>
           <w:rPr>
@@ -5109,7 +5109,7 @@
           <w14:ligatures w14:val="standardContextual"/>
         </w:rPr>
       </w:pPr>
-      <w:hyperlink w:anchor="_Toc242275629" w:history="1">
+      <w:hyperlink w:anchor="_Toc242275943" w:history="1">
         <w:r>
           <w:rPr>
             <w:rStyle w:val="Collegamentoipertestuale"/>
@@ -5154,7 +5154,7 @@
             <w:noProof/>
             <w:webHidden/>
           </w:rPr>
-          <w:instrText xml:space="preserve"> PAGEREF _Toc242275629 \h </w:instrText>
+          <w:instrText xml:space="preserve"> PAGEREF _Toc242275943 \h </w:instrText>
         </w:r>
         <w:r>
           <w:rPr>
@@ -5201,7 +5201,7 @@
           <w14:ligatures w14:val="standardContextual"/>
         </w:rPr>
       </w:pPr>
-      <w:hyperlink w:anchor="_Toc242275630" w:history="1">
+      <w:hyperlink w:anchor="_Toc242275944" w:history="1">
         <w:r>
           <w:rPr>
             <w:rStyle w:val="Collegamentoipertestuale"/>
@@ -5246,7 +5246,7 @@
             <w:noProof/>
             <w:webHidden/>
           </w:rPr>
-          <w:instrText xml:space="preserve"> PAGEREF _Toc242275630 \h </w:instrText>
+          <w:instrText xml:space="preserve"> PAGEREF _Toc242275944 \h </w:instrText>
         </w:r>
         <w:r>
           <w:rPr>
@@ -5293,7 +5293,7 @@
           <w14:ligatures w14:val="standardContextual"/>
         </w:rPr>
       </w:pPr>
-      <w:hyperlink w:anchor="_Toc242275631" w:history="1">
+      <w:hyperlink w:anchor="_Toc242275945" w:history="1">
         <w:r>
           <w:rPr>
             <w:rStyle w:val="Collegamentoipertestuale"/>
@@ -5338,7 +5338,7 @@
             <w:noProof/>
             <w:webHidden/>
           </w:rPr>
-          <w:instrText xml:space="preserve"> PAGEREF _Toc242275631 \h </w:instrText>
+          <w:instrText xml:space="preserve"> PAGEREF _Toc242275945 \h </w:instrText>
         </w:r>
         <w:r>
           <w:rPr>
@@ -5385,7 +5385,7 @@
           <w14:ligatures w14:val="standardContextual"/>
         </w:rPr>
       </w:pPr>
-      <w:hyperlink w:anchor="_Toc242275632" w:history="1">
+      <w:hyperlink w:anchor="_Toc242275946" w:history="1">
         <w:r>
           <w:rPr>
             <w:rStyle w:val="Collegamentoipertestuale"/>
@@ -5430,7 +5430,7 @@
             <w:noProof/>
             <w:webHidden/>
           </w:rPr>
-          <w:instrText xml:space="preserve"> PAGEREF _Toc242275632 \h </w:instrText>
+          <w:instrText xml:space="preserve"> PAGEREF _Toc242275946 \h </w:instrText>
         </w:r>
         <w:r>
           <w:rPr>
@@ -5477,7 +5477,7 @@
           <w14:ligatures w14:val="standardContextual"/>
         </w:rPr>
       </w:pPr>
-      <w:hyperlink w:anchor="_Toc242275633" w:history="1">
+      <w:hyperlink w:anchor="_Toc242275947" w:history="1">
         <w:r>
           <w:rPr>
             <w:rStyle w:val="Collegamentoipertestuale"/>
@@ -5522,7 +5522,7 @@
             <w:noProof/>
             <w:webHidden/>
           </w:rPr>
-          <w:instrText xml:space="preserve"> PAGEREF _Toc242275633 \h </w:instrText>
+          <w:instrText xml:space="preserve"> PAGEREF _Toc242275947 \h </w:instrText>
         </w:r>
         <w:r>
           <w:rPr>
@@ -5569,7 +5569,7 @@
           <w14:ligatures w14:val="standardContextual"/>
         </w:rPr>
       </w:pPr>
-      <w:hyperlink w:anchor="_Toc242275634" w:history="1">
+      <w:hyperlink w:anchor="_Toc242275948" w:history="1">
         <w:r>
           <w:rPr>
             <w:rStyle w:val="Collegamentoipertestuale"/>
@@ -5614,7 +5614,7 @@
             <w:noProof/>
             <w:webHidden/>
           </w:rPr>
-          <w:instrText xml:space="preserve"> PAGEREF _Toc242275634 \h </w:instrText>
+          <w:instrText xml:space="preserve"> PAGEREF _Toc242275948 \h </w:instrText>
         </w:r>
         <w:r>
           <w:rPr>
@@ -5661,7 +5661,7 @@
           <w14:ligatures w14:val="standardContextual"/>
         </w:rPr>
       </w:pPr>
-      <w:hyperlink w:anchor="_Toc242275635" w:history="1">
+      <w:hyperlink w:anchor="_Toc242275949" w:history="1">
         <w:r>
           <w:rPr>
             <w:rStyle w:val="Collegamentoipertestuale"/>
@@ -5706,7 +5706,7 @@
             <w:noProof/>
             <w:webHidden/>
           </w:rPr>
-          <w:instrText xml:space="preserve"> PAGEREF _Toc242275635 \h </w:instrText>
+          <w:instrText xml:space="preserve"> PAGEREF _Toc242275949 \h </w:instrText>
         </w:r>
         <w:r>
           <w:rPr>
@@ -5753,7 +5753,7 @@
           <w14:ligatures w14:val="standardContextual"/>
         </w:rPr>
       </w:pPr>
-      <w:hyperlink w:anchor="_Toc242275636" w:history="1">
+      <w:hyperlink w:anchor="_Toc242275950" w:history="1">
         <w:r>
           <w:rPr>
             <w:rStyle w:val="Collegamentoipertestuale"/>
@@ -5798,7 +5798,7 @@
             <w:noProof/>
             <w:webHidden/>
           </w:rPr>
-          <w:instrText xml:space="preserve"> PAGEREF _Toc242275636 \h </w:instrText>
+          <w:instrText xml:space="preserve"> PAGEREF _Toc242275950 \h </w:instrText>
         </w:r>
         <w:r>
           <w:rPr>
@@ -5845,7 +5845,7 @@
           <w14:ligatures w14:val="standardContextual"/>
         </w:rPr>
       </w:pPr>
-      <w:hyperlink w:anchor="_Toc242275637" w:history="1">
+      <w:hyperlink w:anchor="_Toc242275951" w:history="1">
         <w:r>
           <w:rPr>
             <w:rStyle w:val="Collegamentoipertestuale"/>
@@ -5890,7 +5890,7 @@
             <w:noProof/>
             <w:webHidden/>
           </w:rPr>
-          <w:instrText xml:space="preserve"> PAGEREF _Toc242275637 \h </w:instrText>
+          <w:instrText xml:space="preserve"> PAGEREF _Toc242275951 \h </w:instrText>
         </w:r>
         <w:r>
           <w:rPr>
@@ -5936,7 +5936,7 @@
           <w14:ligatures w14:val="standardContextual"/>
         </w:rPr>
       </w:pPr>
-      <w:hyperlink w:anchor="_Toc242275638" w:history="1">
+      <w:hyperlink w:anchor="_Toc242275952" w:history="1">
         <w:r>
           <w:rPr>
             <w:rStyle w:val="Collegamentoipertestuale"/>
@@ -5984,7 +5984,7 @@
             <w:noProof/>
             <w:webHidden/>
           </w:rPr>
-          <w:instrText xml:space="preserve"> PAGEREF _Toc242275638 \h </w:instrText>
+          <w:instrText xml:space="preserve"> PAGEREF _Toc242275952 \h </w:instrText>
         </w:r>
         <w:r>
           <w:rPr>
@@ -6031,7 +6031,7 @@
           <w14:ligatures w14:val="standardContextual"/>
         </w:rPr>
       </w:pPr>
-      <w:hyperlink w:anchor="_Toc242275639" w:history="1">
+      <w:hyperlink w:anchor="_Toc242275953" w:history="1">
         <w:r>
           <w:rPr>
             <w:rStyle w:val="Collegamentoipertestuale"/>
@@ -6076,7 +6076,7 @@
             <w:noProof/>
             <w:webHidden/>
           </w:rPr>
-          <w:instrText xml:space="preserve"> PAGEREF _Toc242275639 \h </w:instrText>
+          <w:instrText xml:space="preserve"> PAGEREF _Toc242275953 \h </w:instrText>
         </w:r>
         <w:r>
           <w:rPr>
@@ -6123,7 +6123,7 @@
           <w14:ligatures w14:val="standardContextual"/>
         </w:rPr>
       </w:pPr>
-      <w:hyperlink w:anchor="_Toc242275640" w:history="1">
+      <w:hyperlink w:anchor="_Toc242275954" w:history="1">
         <w:r>
           <w:rPr>
             <w:rStyle w:val="Collegamentoipertestuale"/>
@@ -6168,7 +6168,7 @@
             <w:noProof/>
             <w:webHidden/>
           </w:rPr>
-          <w:instrText xml:space="preserve"> PAGEREF _Toc242275640 \h </w:instrText>
+          <w:instrText xml:space="preserve"> PAGEREF _Toc242275954 \h </w:instrText>
         </w:r>
         <w:r>
           <w:rPr>
@@ -6215,7 +6215,7 @@
           <w14:ligatures w14:val="standardContextual"/>
         </w:rPr>
       </w:pPr>
-      <w:hyperlink w:anchor="_Toc242275641" w:history="1">
+      <w:hyperlink w:anchor="_Toc242275955" w:history="1">
         <w:r>
           <w:rPr>
             <w:rStyle w:val="Collegamentoipertestuale"/>
@@ -6260,7 +6260,7 @@
             <w:noProof/>
             <w:webHidden/>
           </w:rPr>
-          <w:instrText xml:space="preserve"> PAGEREF _Toc242275641 \h </w:instrText>
+          <w:instrText xml:space="preserve"> PAGEREF _Toc242275955 \h </w:instrText>
         </w:r>
         <w:r>
           <w:rPr>
@@ -6307,7 +6307,7 @@
           <w14:ligatures w14:val="standardContextual"/>
         </w:rPr>
       </w:pPr>
-      <w:hyperlink w:anchor="_Toc242275642" w:history="1">
+      <w:hyperlink w:anchor="_Toc242275956" w:history="1">
         <w:r>
           <w:rPr>
             <w:rStyle w:val="Collegamentoipertestuale"/>
@@ -6352,7 +6352,7 @@
             <w:noProof/>
             <w:webHidden/>
           </w:rPr>
-          <w:instrText xml:space="preserve"> PAGEREF _Toc242275642 \h </w:instrText>
+          <w:instrText xml:space="preserve"> PAGEREF _Toc242275956 \h </w:instrText>
         </w:r>
         <w:r>
           <w:rPr>
@@ -6399,7 +6399,7 @@
           <w14:ligatures w14:val="standardContextual"/>
         </w:rPr>
       </w:pPr>
-      <w:hyperlink w:anchor="_Toc242275643" w:history="1">
+      <w:hyperlink w:anchor="_Toc242275957" w:history="1">
         <w:r>
           <w:rPr>
             <w:rStyle w:val="Collegamentoipertestuale"/>
@@ -6444,7 +6444,7 @@
             <w:noProof/>
             <w:webHidden/>
           </w:rPr>
-          <w:instrText xml:space="preserve"> PAGEREF _Toc242275643 \h </w:instrText>
+          <w:instrText xml:space="preserve"> PAGEREF _Toc242275957 \h </w:instrText>
         </w:r>
         <w:r>
           <w:rPr>
@@ -6491,7 +6491,7 @@
           <w14:ligatures w14:val="standardContextual"/>
         </w:rPr>
       </w:pPr>
-      <w:hyperlink w:anchor="_Toc242275644" w:history="1">
+      <w:hyperlink w:anchor="_Toc242275958" w:history="1">
         <w:r>
           <w:rPr>
             <w:rStyle w:val="Collegamentoipertestuale"/>
@@ -6536,7 +6536,7 @@
             <w:noProof/>
             <w:webHidden/>
           </w:rPr>
-          <w:instrText xml:space="preserve"> PAGEREF _Toc242275644 \h </w:instrText>
+          <w:instrText xml:space="preserve"> PAGEREF _Toc242275958 \h </w:instrText>
         </w:r>
         <w:r>
           <w:rPr>
@@ -6583,7 +6583,7 @@
           <w14:ligatures w14:val="standardContextual"/>
         </w:rPr>
       </w:pPr>
-      <w:hyperlink w:anchor="_Toc242275645" w:history="1">
+      <w:hyperlink w:anchor="_Toc242275959" w:history="1">
         <w:r>
           <w:rPr>
             <w:rStyle w:val="Collegamentoipertestuale"/>
@@ -6628,7 +6628,7 @@
             <w:noProof/>
             <w:webHidden/>
           </w:rPr>
-          <w:instrText xml:space="preserve"> PAGEREF _Toc242275645 \h </w:instrText>
+          <w:instrText xml:space="preserve"> PAGEREF _Toc242275959 \h </w:instrText>
         </w:r>
         <w:r>
           <w:rPr>
@@ -6675,7 +6675,7 @@
           <w14:ligatures w14:val="standardContextual"/>
         </w:rPr>
       </w:pPr>
-      <w:hyperlink w:anchor="_Toc242275646" w:history="1">
+      <w:hyperlink w:anchor="_Toc242275960" w:history="1">
         <w:r>
           <w:rPr>
             <w:rStyle w:val="Collegamentoipertestuale"/>
@@ -6720,7 +6720,7 @@
             <w:noProof/>
             <w:webHidden/>
           </w:rPr>
-          <w:instrText xml:space="preserve"> PAGEREF _Toc242275646 \h </w:instrText>
+          <w:instrText xml:space="preserve"> PAGEREF _Toc242275960 \h </w:instrText>
         </w:r>
         <w:r>
           <w:rPr>
@@ -6767,7 +6767,7 @@
           <w14:ligatures w14:val="standardContextual"/>
         </w:rPr>
       </w:pPr>
-      <w:hyperlink w:anchor="_Toc242275647" w:history="1">
+      <w:hyperlink w:anchor="_Toc242275961" w:history="1">
         <w:r>
           <w:rPr>
             <w:rStyle w:val="Collegamentoipertestuale"/>
@@ -6812,7 +6812,7 @@
             <w:noProof/>
             <w:webHidden/>
           </w:rPr>
-          <w:instrText xml:space="preserve"> PAGEREF _Toc242275647 \h </w:instrText>
+          <w:instrText xml:space="preserve"> PAGEREF _Toc242275961 \h </w:instrText>
         </w:r>
         <w:r>
           <w:rPr>
@@ -6859,7 +6859,7 @@
           <w14:ligatures w14:val="standardContextual"/>
         </w:rPr>
       </w:pPr>
-      <w:hyperlink w:anchor="_Toc242275648" w:history="1">
+      <w:hyperlink w:anchor="_Toc242275962" w:history="1">
         <w:r>
           <w:rPr>
             <w:rStyle w:val="Collegamentoipertestuale"/>
@@ -6904,7 +6904,7 @@
             <w:noProof/>
             <w:webHidden/>
           </w:rPr>
-          <w:instrText xml:space="preserve"> PAGEREF _Toc242275648 \h </w:instrText>
+          <w:instrText xml:space="preserve"> PAGEREF _Toc242275962 \h </w:instrText>
         </w:r>
         <w:r>
           <w:rPr>
@@ -6951,7 +6951,7 @@
           <w14:ligatures w14:val="standardContextual"/>
         </w:rPr>
       </w:pPr>
-      <w:hyperlink w:anchor="_Toc242275649" w:history="1">
+      <w:hyperlink w:anchor="_Toc242275963" w:history="1">
         <w:r>
           <w:rPr>
             <w:rStyle w:val="Collegamentoipertestuale"/>
@@ -6996,7 +6996,7 @@
             <w:noProof/>
             <w:webHidden/>
           </w:rPr>
-          <w:instrText xml:space="preserve"> PAGEREF _Toc242275649 \h </w:instrText>
+          <w:instrText xml:space="preserve"> PAGEREF _Toc242275963 \h </w:instrText>
         </w:r>
         <w:r>
           <w:rPr>
@@ -7043,7 +7043,7 @@
           <w14:ligatures w14:val="standardContextual"/>
         </w:rPr>
       </w:pPr>
-      <w:hyperlink w:anchor="_Toc242275650" w:history="1">
+      <w:hyperlink w:anchor="_Toc242275964" w:history="1">
         <w:r>
           <w:rPr>
             <w:rStyle w:val="Collegamentoipertestuale"/>
@@ -7088,7 +7088,7 @@
             <w:noProof/>
             <w:webHidden/>
           </w:rPr>
-          <w:instrText xml:space="preserve"> PAGEREF _Toc242275650 \h </w:instrText>
+          <w:instrText xml:space="preserve"> PAGEREF _Toc242275964 \h </w:instrText>
         </w:r>
         <w:r>
           <w:rPr>
@@ -7135,7 +7135,7 @@
           <w14:ligatures w14:val="standardContextual"/>
         </w:rPr>
       </w:pPr>
-      <w:hyperlink w:anchor="_Toc242275651" w:history="1">
+      <w:hyperlink w:anchor="_Toc242275965" w:history="1">
         <w:r>
           <w:rPr>
             <w:rStyle w:val="Collegamentoipertestuale"/>
@@ -7180,7 +7180,7 @@
             <w:noProof/>
             <w:webHidden/>
           </w:rPr>
-          <w:instrText xml:space="preserve"> PAGEREF _Toc242275651 \h </w:instrText>
+          <w:instrText xml:space="preserve"> PAGEREF _Toc242275965 \h </w:instrText>
         </w:r>
         <w:r>
           <w:rPr>
@@ -7227,7 +7227,7 @@
           <w14:ligatures w14:val="standardContextual"/>
         </w:rPr>
       </w:pPr>
-      <w:hyperlink w:anchor="_Toc242275652" w:history="1">
+      <w:hyperlink w:anchor="_Toc242275966" w:history="1">
         <w:r>
           <w:rPr>
             <w:rStyle w:val="Collegamentoipertestuale"/>
@@ -7272,7 +7272,7 @@
             <w:noProof/>
             <w:webHidden/>
           </w:rPr>
-          <w:instrText xml:space="preserve"> PAGEREF _Toc242275652 \h </w:instrText>
+          <w:instrText xml:space="preserve"> PAGEREF _Toc242275966 \h </w:instrText>
         </w:r>
         <w:r>
           <w:rPr>
@@ -7318,7 +7318,7 @@
           <w14:ligatures w14:val="standardContextual"/>
         </w:rPr>
       </w:pPr>
-      <w:hyperlink w:anchor="_Toc242275653" w:history="1">
+      <w:hyperlink w:anchor="_Toc242275967" w:history="1">
         <w:r>
           <w:rPr>
             <w:rStyle w:val="Collegamentoipertestuale"/>
@@ -7366,7 +7366,7 @@
             <w:noProof/>
             <w:webHidden/>
           </w:rPr>
-          <w:instrText xml:space="preserve"> PAGEREF _Toc242275653 \h </w:instrText>
+          <w:instrText xml:space="preserve"> PAGEREF _Toc242275967 \h </w:instrText>
         </w:r>
         <w:r>
           <w:rPr>
@@ -7413,7 +7413,7 @@
           <w14:ligatures w14:val="standardContextual"/>
         </w:rPr>
       </w:pPr>
-      <w:hyperlink w:anchor="_Toc242275654" w:history="1">
+      <w:hyperlink w:anchor="_Toc242275968" w:history="1">
         <w:r>
           <w:rPr>
             <w:rStyle w:val="Collegamentoipertestuale"/>
@@ -7458,7 +7458,7 @@
             <w:noProof/>
             <w:webHidden/>
           </w:rPr>
-          <w:instrText xml:space="preserve"> PAGEREF _Toc242275654 \h </w:instrText>
+          <w:instrText xml:space="preserve"> PAGEREF _Toc242275968 \h </w:instrText>
         </w:r>
         <w:r>
           <w:rPr>
@@ -7505,7 +7505,7 @@
           <w14:ligatures w14:val="standardContextual"/>
         </w:rPr>
       </w:pPr>
-      <w:hyperlink w:anchor="_Toc242275655" w:history="1">
+      <w:hyperlink w:anchor="_Toc242275969" w:history="1">
         <w:r>
           <w:rPr>
             <w:rStyle w:val="Collegamentoipertestuale"/>
@@ -7550,7 +7550,7 @@
             <w:noProof/>
             <w:webHidden/>
           </w:rPr>
-          <w:instrText xml:space="preserve"> PAGEREF _Toc242275655 \h </w:instrText>
+          <w:instrText xml:space="preserve"> PAGEREF _Toc242275969 \h </w:instrText>
         </w:r>
         <w:r>
           <w:rPr>
@@ -7597,7 +7597,7 @@
           <w14:ligatures w14:val="standardContextual"/>
         </w:rPr>
       </w:pPr>
-      <w:hyperlink w:anchor="_Toc242275656" w:history="1">
+      <w:hyperlink w:anchor="_Toc242275970" w:history="1">
         <w:r>
           <w:rPr>
             <w:rStyle w:val="Collegamentoipertestuale"/>
@@ -7642,7 +7642,7 @@
             <w:noProof/>
             <w:webHidden/>
           </w:rPr>
-          <w:instrText xml:space="preserve"> PAGEREF _Toc242275656 \h </w:instrText>
+          <w:instrText xml:space="preserve"> PAGEREF _Toc242275970 \h </w:instrText>
         </w:r>
         <w:r>
           <w:rPr>
@@ -7688,7 +7688,7 @@
           <w14:ligatures w14:val="standardContextual"/>
         </w:rPr>
       </w:pPr>
-      <w:hyperlink w:anchor="_Toc242275657" w:history="1">
+      <w:hyperlink w:anchor="_Toc242275971" w:history="1">
         <w:r>
           <w:rPr>
             <w:rStyle w:val="Collegamentoipertestuale"/>
@@ -7736,7 +7736,7 @@
             <w:noProof/>
             <w:webHidden/>
           </w:rPr>
-          <w:instrText xml:space="preserve"> PAGEREF _Toc242275657 \h </w:instrText>
+          <w:instrText xml:space="preserve"> PAGEREF _Toc242275971 \h </w:instrText>
         </w:r>
         <w:r>
           <w:rPr>
@@ -7782,7 +7782,7 @@
           <w14:ligatures w14:val="standardContextual"/>
         </w:rPr>
       </w:pPr>
-      <w:hyperlink w:anchor="_Toc242275658" w:history="1">
+      <w:hyperlink w:anchor="_Toc242275972" w:history="1">
         <w:r>
           <w:rPr>
             <w:rStyle w:val="Collegamentoipertestuale"/>
@@ -7830,7 +7830,7 @@
             <w:noProof/>
             <w:webHidden/>
           </w:rPr>
-          <w:instrText xml:space="preserve"> PAGEREF _Toc242275658 \h </w:instrText>
+          <w:instrText xml:space="preserve"> PAGEREF _Toc242275972 \h </w:instrText>
         </w:r>
         <w:r>
           <w:rPr>
@@ -7877,7 +7877,7 @@
           <w14:ligatures w14:val="standardContextual"/>
         </w:rPr>
       </w:pPr>
-      <w:hyperlink w:anchor="_Toc242275659" w:history="1">
+      <w:hyperlink w:anchor="_Toc242275973" w:history="1">
         <w:r>
           <w:rPr>
             <w:rStyle w:val="Collegamentoipertestuale"/>
@@ -7922,7 +7922,7 @@
             <w:noProof/>
             <w:webHidden/>
           </w:rPr>
-          <w:instrText xml:space="preserve"> PAGEREF _Toc242275659 \h </w:instrText>
+          <w:instrText xml:space="preserve"> PAGEREF _Toc242275973 \h </w:instrText>
         </w:r>
         <w:r>
           <w:rPr>
@@ -7968,7 +7968,7 @@
           <w14:ligatures w14:val="standardContextual"/>
         </w:rPr>
       </w:pPr>
-      <w:hyperlink w:anchor="_Toc242275660" w:history="1">
+      <w:hyperlink w:anchor="_Toc242275974" w:history="1">
         <w:r>
           <w:rPr>
             <w:rStyle w:val="Collegamentoipertestuale"/>
@@ -8016,7 +8016,7 @@
             <w:noProof/>
             <w:webHidden/>
           </w:rPr>
-          <w:instrText xml:space="preserve"> PAGEREF _Toc242275660 \h </w:instrText>
+          <w:instrText xml:space="preserve"> PAGEREF _Toc242275974 \h </w:instrText>
         </w:r>
         <w:r>
           <w:rPr>
@@ -8063,7 +8063,7 @@
           <w14:ligatures w14:val="standardContextual"/>
         </w:rPr>
       </w:pPr>
-      <w:hyperlink w:anchor="_Toc242275661" w:history="1">
+      <w:hyperlink w:anchor="_Toc242275975" w:history="1">
         <w:r>
           <w:rPr>
             <w:rStyle w:val="Collegamentoipertestuale"/>
@@ -8108,7 +8108,7 @@
             <w:noProof/>
             <w:webHidden/>
           </w:rPr>
-          <w:instrText xml:space="preserve"> PAGEREF _Toc242275661 \h </w:instrText>
+          <w:instrText xml:space="preserve"> PAGEREF _Toc242275975 \h </w:instrText>
         </w:r>
         <w:r>
           <w:rPr>
@@ -8155,7 +8155,7 @@
           <w14:ligatures w14:val="standardContextual"/>
         </w:rPr>
       </w:pPr>
-      <w:hyperlink w:anchor="_Toc242275662" w:history="1">
+      <w:hyperlink w:anchor="_Toc242275976" w:history="1">
         <w:r>
           <w:rPr>
             <w:rStyle w:val="Collegamentoipertestuale"/>
@@ -8200,7 +8200,7 @@
             <w:noProof/>
             <w:webHidden/>
           </w:rPr>
-          <w:instrText xml:space="preserve"> PAGEREF _Toc242275662 \h </w:instrText>
+          <w:instrText xml:space="preserve"> PAGEREF _Toc242275976 \h </w:instrText>
         </w:r>
         <w:r>
           <w:rPr>
@@ -8247,7 +8247,7 @@
           <w14:ligatures w14:val="standardContextual"/>
         </w:rPr>
       </w:pPr>
-      <w:hyperlink w:anchor="_Toc242275663" w:history="1">
+      <w:hyperlink w:anchor="_Toc242275977" w:history="1">
         <w:r>
           <w:rPr>
             <w:rStyle w:val="Collegamentoipertestuale"/>
@@ -8292,7 +8292,7 @@
             <w:noProof/>
             <w:webHidden/>
           </w:rPr>
-          <w:instrText xml:space="preserve"> PAGEREF _Toc242275663 \h </w:instrText>
+          <w:instrText xml:space="preserve"> PAGEREF _Toc242275977 \h </w:instrText>
         </w:r>
         <w:r>
           <w:rPr>
@@ -8339,7 +8339,7 @@
           <w14:ligatures w14:val="standardContextual"/>
         </w:rPr>
       </w:pPr>
-      <w:hyperlink w:anchor="_Toc242275664" w:history="1">
+      <w:hyperlink w:anchor="_Toc242275978" w:history="1">
         <w:r>
           <w:rPr>
             <w:rStyle w:val="Collegamentoipertestuale"/>
@@ -8384,7 +8384,7 @@
             <w:noProof/>
             <w:webHidden/>
           </w:rPr>
-          <w:instrText xml:space="preserve"> PAGEREF _Toc242275664 \h </w:instrText>
+          <w:instrText xml:space="preserve"> PAGEREF _Toc242275978 \h </w:instrText>
         </w:r>
         <w:r>
           <w:rPr>
@@ -8431,7 +8431,7 @@
           <w14:ligatures w14:val="standardContextual"/>
         </w:rPr>
       </w:pPr>
-      <w:hyperlink w:anchor="_Toc242275665" w:history="1">
+      <w:hyperlink w:anchor="_Toc242275979" w:history="1">
         <w:r>
           <w:rPr>
             <w:rStyle w:val="Collegamentoipertestuale"/>
@@ -8476,7 +8476,7 @@
             <w:noProof/>
             <w:webHidden/>
           </w:rPr>
-          <w:instrText xml:space="preserve"> PAGEREF _Toc242275665 \h </w:instrText>
+          <w:instrText xml:space="preserve"> PAGEREF _Toc242275979 \h </w:instrText>
         </w:r>
         <w:r>
           <w:rPr>
@@ -8523,7 +8523,7 @@
           <w14:ligatures w14:val="standardContextual"/>
         </w:rPr>
       </w:pPr>
-      <w:hyperlink w:anchor="_Toc242275666" w:history="1">
+      <w:hyperlink w:anchor="_Toc242275980" w:history="1">
         <w:r>
           <w:rPr>
             <w:rStyle w:val="Collegamentoipertestuale"/>
@@ -8568,7 +8568,7 @@
             <w:noProof/>
             <w:webHidden/>
           </w:rPr>
-          <w:instrText xml:space="preserve"> PAGEREF _Toc242275666 \h </w:instrText>
+          <w:instrText xml:space="preserve"> PAGEREF _Toc242275980 \h </w:instrText>
         </w:r>
         <w:r>
           <w:rPr>
@@ -8614,7 +8614,7 @@
           <w14:ligatures w14:val="standardContextual"/>
         </w:rPr>
       </w:pPr>
-      <w:hyperlink w:anchor="_Toc242275667" w:history="1">
+      <w:hyperlink w:anchor="_Toc242275981" w:history="1">
         <w:r>
           <w:rPr>
             <w:rStyle w:val="Collegamentoipertestuale"/>
@@ -8662,7 +8662,7 @@
             <w:noProof/>
             <w:webHidden/>
           </w:rPr>
-          <w:instrText xml:space="preserve"> PAGEREF _Toc242275667 \h </w:instrText>
+          <w:instrText xml:space="preserve"> PAGEREF _Toc242275981 \h </w:instrText>
         </w:r>
         <w:r>
           <w:rPr>
@@ -8709,7 +8709,7 @@
           <w14:ligatures w14:val="standardContextual"/>
         </w:rPr>
       </w:pPr>
-      <w:hyperlink w:anchor="_Toc242275668" w:history="1">
+      <w:hyperlink w:anchor="_Toc242275982" w:history="1">
         <w:r>
           <w:rPr>
             <w:rStyle w:val="Collegamentoipertestuale"/>
@@ -8754,7 +8754,7 @@
             <w:noProof/>
             <w:webHidden/>
           </w:rPr>
-          <w:instrText xml:space="preserve"> PAGEREF _Toc242275668 \h </w:instrText>
+          <w:instrText xml:space="preserve"> PAGEREF _Toc242275982 \h </w:instrText>
         </w:r>
         <w:r>
           <w:rPr>
@@ -8801,7 +8801,7 @@
           <w14:ligatures w14:val="standardContextual"/>
         </w:rPr>
       </w:pPr>
-      <w:hyperlink w:anchor="_Toc242275669" w:history="1">
+      <w:hyperlink w:anchor="_Toc242275983" w:history="1">
         <w:r>
           <w:rPr>
             <w:rStyle w:val="Collegamentoipertestuale"/>
@@ -8846,7 +8846,7 @@
             <w:noProof/>
             <w:webHidden/>
           </w:rPr>
-          <w:instrText xml:space="preserve"> PAGEREF _Toc242275669 \h </w:instrText>
+          <w:instrText xml:space="preserve"> PAGEREF _Toc242275983 \h </w:instrText>
         </w:r>
         <w:r>
           <w:rPr>
@@ -8893,7 +8893,7 @@
           <w14:ligatures w14:val="standardContextual"/>
         </w:rPr>
       </w:pPr>
-      <w:hyperlink w:anchor="_Toc242275670" w:history="1">
+      <w:hyperlink w:anchor="_Toc242275984" w:history="1">
         <w:r>
           <w:rPr>
             <w:rStyle w:val="Collegamentoipertestuale"/>
@@ -8938,7 +8938,7 @@
             <w:noProof/>
             <w:webHidden/>
           </w:rPr>
-          <w:instrText xml:space="preserve"> PAGEREF _Toc242275670 \h </w:instrText>
+          <w:instrText xml:space="preserve"> PAGEREF _Toc242275984 \h </w:instrText>
         </w:r>
         <w:r>
           <w:rPr>
@@ -8985,7 +8985,7 @@
           <w14:ligatures w14:val="standardContextual"/>
         </w:rPr>
       </w:pPr>
-      <w:hyperlink w:anchor="_Toc242275671" w:history="1">
+      <w:hyperlink w:anchor="_Toc242275985" w:history="1">
         <w:r>
           <w:rPr>
             <w:rStyle w:val="Collegamentoipertestuale"/>
@@ -9030,7 +9030,7 @@
             <w:noProof/>
             <w:webHidden/>
           </w:rPr>
-          <w:instrText xml:space="preserve"> PAGEREF _Toc242275671 \h </w:instrText>
+          <w:instrText xml:space="preserve"> PAGEREF _Toc242275985 \h </w:instrText>
         </w:r>
         <w:r>
           <w:rPr>
@@ -9077,7 +9077,7 @@
           <w14:ligatures w14:val="standardContextual"/>
         </w:rPr>
       </w:pPr>
-      <w:hyperlink w:anchor="_Toc242275672" w:history="1">
+      <w:hyperlink w:anchor="_Toc242275986" w:history="1">
         <w:r>
           <w:rPr>
             <w:rStyle w:val="Collegamentoipertestuale"/>
@@ -9122,7 +9122,7 @@
             <w:noProof/>
             <w:webHidden/>
           </w:rPr>
-          <w:instrText xml:space="preserve"> PAGEREF _Toc242275672 \h </w:instrText>
+          <w:instrText xml:space="preserve"> PAGEREF _Toc242275986 \h </w:instrText>
         </w:r>
         <w:r>
           <w:rPr>
@@ -9169,7 +9169,7 @@
           <w14:ligatures w14:val="standardContextual"/>
         </w:rPr>
       </w:pPr>
-      <w:hyperlink w:anchor="_Toc242275673" w:history="1">
+      <w:hyperlink w:anchor="_Toc242275987" w:history="1">
         <w:r>
           <w:rPr>
             <w:rStyle w:val="Collegamentoipertestuale"/>
@@ -9214,7 +9214,7 @@
             <w:noProof/>
             <w:webHidden/>
           </w:rPr>
-          <w:instrText xml:space="preserve"> PAGEREF _Toc242275673 \h </w:instrText>
+          <w:instrText xml:space="preserve"> PAGEREF _Toc242275987 \h </w:instrText>
         </w:r>
         <w:r>
           <w:rPr>
@@ -9261,7 +9261,7 @@
           <w14:ligatures w14:val="standardContextual"/>
         </w:rPr>
       </w:pPr>
-      <w:hyperlink w:anchor="_Toc242275674" w:history="1">
+      <w:hyperlink w:anchor="_Toc242275988" w:history="1">
         <w:r>
           <w:rPr>
             <w:rStyle w:val="Collegamentoipertestuale"/>
@@ -9306,7 +9306,7 @@
             <w:noProof/>
             <w:webHidden/>
           </w:rPr>
-          <w:instrText xml:space="preserve"> PAGEREF _Toc242275674 \h </w:instrText>
+          <w:instrText xml:space="preserve"> PAGEREF _Toc242275988 \h </w:instrText>
         </w:r>
         <w:r>
           <w:rPr>
@@ -9352,7 +9352,7 @@
           <w14:ligatures w14:val="standardContextual"/>
         </w:rPr>
       </w:pPr>
-      <w:hyperlink w:anchor="_Toc242275675" w:history="1">
+      <w:hyperlink w:anchor="_Toc242275989" w:history="1">
         <w:r>
           <w:rPr>
             <w:rStyle w:val="Collegamentoipertestuale"/>
@@ -9400,7 +9400,7 @@
             <w:noProof/>
             <w:webHidden/>
           </w:rPr>
-          <w:instrText xml:space="preserve"> PAGEREF _Toc242275675 \h </w:instrText>
+          <w:instrText xml:space="preserve"> PAGEREF _Toc242275989 \h </w:instrText>
         </w:r>
         <w:r>
           <w:rPr>
@@ -9447,7 +9447,7 @@
           <w14:ligatures w14:val="standardContextual"/>
         </w:rPr>
       </w:pPr>
-      <w:hyperlink w:anchor="_Toc242275676" w:history="1">
+      <w:hyperlink w:anchor="_Toc242275990" w:history="1">
         <w:r>
           <w:rPr>
             <w:rStyle w:val="Collegamentoipertestuale"/>
@@ -9492,7 +9492,7 @@
             <w:noProof/>
             <w:webHidden/>
           </w:rPr>
-          <w:instrText xml:space="preserve"> PAGEREF _Toc242275676 \h </w:instrText>
+          <w:instrText xml:space="preserve"> PAGEREF _Toc242275990 \h </w:instrText>
         </w:r>
         <w:r>
           <w:rPr>
@@ -9539,7 +9539,7 @@
           <w14:ligatures w14:val="standardContextual"/>
         </w:rPr>
       </w:pPr>
-      <w:hyperlink w:anchor="_Toc242275677" w:history="1">
+      <w:hyperlink w:anchor="_Toc242275991" w:history="1">
         <w:r>
           <w:rPr>
             <w:rStyle w:val="Collegamentoipertestuale"/>
@@ -9584,7 +9584,7 @@
             <w:noProof/>
             <w:webHidden/>
           </w:rPr>
-          <w:instrText xml:space="preserve"> PAGEREF _Toc242275677 \h </w:instrText>
+          <w:instrText xml:space="preserve"> PAGEREF _Toc242275991 \h </w:instrText>
         </w:r>
         <w:r>
           <w:rPr>
@@ -9631,7 +9631,7 @@
           <w14:ligatures w14:val="standardContextual"/>
         </w:rPr>
       </w:pPr>
-      <w:hyperlink w:anchor="_Toc242275678" w:history="1">
+      <w:hyperlink w:anchor="_Toc242275992" w:history="1">
         <w:r>
           <w:rPr>
             <w:rStyle w:val="Collegamentoipertestuale"/>
@@ -9676,7 +9676,7 @@
             <w:noProof/>
             <w:webHidden/>
           </w:rPr>
-          <w:instrText xml:space="preserve"> PAGEREF _Toc242275678 \h </w:instrText>
+          <w:instrText xml:space="preserve"> PAGEREF _Toc242275992 \h </w:instrText>
         </w:r>
         <w:r>
           <w:rPr>
@@ -9722,7 +9722,7 @@
           <w14:ligatures w14:val="standardContextual"/>
         </w:rPr>
       </w:pPr>
-      <w:hyperlink w:anchor="_Toc242275679" w:history="1">
+      <w:hyperlink w:anchor="_Toc242275993" w:history="1">
         <w:r>
           <w:rPr>
             <w:rStyle w:val="Collegamentoipertestuale"/>
@@ -9770,7 +9770,7 @@
             <w:noProof/>
             <w:webHidden/>
           </w:rPr>
-          <w:instrText xml:space="preserve"> PAGEREF _Toc242275679 \h </w:instrText>
+          <w:instrText xml:space="preserve"> PAGEREF _Toc242275993 \h </w:instrText>
         </w:r>
         <w:r>
           <w:rPr>
@@ -9817,7 +9817,7 @@
           <w14:ligatures w14:val="standardContextual"/>
         </w:rPr>
       </w:pPr>
-      <w:hyperlink w:anchor="_Toc242275680" w:history="1">
+      <w:hyperlink w:anchor="_Toc242275994" w:history="1">
         <w:r>
           <w:rPr>
             <w:rStyle w:val="Collegamentoipertestuale"/>
@@ -9862,7 +9862,7 @@
             <w:noProof/>
             <w:webHidden/>
           </w:rPr>
-          <w:instrText xml:space="preserve"> PAGEREF _Toc242275680 \h </w:instrText>
+          <w:instrText xml:space="preserve"> PAGEREF _Toc242275994 \h </w:instrText>
         </w:r>
         <w:r>
           <w:rPr>
@@ -9909,7 +9909,7 @@
           <w14:ligatures w14:val="standardContextual"/>
         </w:rPr>
       </w:pPr>
-      <w:hyperlink w:anchor="_Toc242275681" w:history="1">
+      <w:hyperlink w:anchor="_Toc242275995" w:history="1">
         <w:r>
           <w:rPr>
             <w:rStyle w:val="Collegamentoipertestuale"/>
@@ -9954,7 +9954,7 @@
             <w:noProof/>
             <w:webHidden/>
           </w:rPr>
-          <w:instrText xml:space="preserve"> PAGEREF _Toc242275681 \h </w:instrText>
+          <w:instrText xml:space="preserve"> PAGEREF _Toc242275995 \h </w:instrText>
         </w:r>
         <w:r>
           <w:rPr>
@@ -10001,7 +10001,7 @@
           <w14:ligatures w14:val="standardContextual"/>
         </w:rPr>
       </w:pPr>
-      <w:hyperlink w:anchor="_Toc242275682" w:history="1">
+      <w:hyperlink w:anchor="_Toc242275996" w:history="1">
         <w:r>
           <w:rPr>
             <w:rStyle w:val="Collegamentoipertestuale"/>
@@ -10046,7 +10046,7 @@
             <w:noProof/>
             <w:webHidden/>
           </w:rPr>
-          <w:instrText xml:space="preserve"> PAGEREF _Toc242275682 \h </w:instrText>
+          <w:instrText xml:space="preserve"> PAGEREF _Toc242275996 \h </w:instrText>
         </w:r>
         <w:r>
           <w:rPr>
@@ -10093,7 +10093,7 @@
           <w14:ligatures w14:val="standardContextual"/>
         </w:rPr>
       </w:pPr>
-      <w:hyperlink w:anchor="_Toc242275683" w:history="1">
+      <w:hyperlink w:anchor="_Toc242275997" w:history="1">
         <w:r>
           <w:rPr>
             <w:rStyle w:val="Collegamentoipertestuale"/>
@@ -10138,7 +10138,7 @@
             <w:noProof/>
             <w:webHidden/>
           </w:rPr>
-          <w:instrText xml:space="preserve"> PAGEREF _Toc242275683 \h </w:instrText>
+          <w:instrText xml:space="preserve"> PAGEREF _Toc242275997 \h </w:instrText>
         </w:r>
         <w:r>
           <w:rPr>
@@ -10185,7 +10185,7 @@
           <w14:ligatures w14:val="standardContextual"/>
         </w:rPr>
       </w:pPr>
-      <w:hyperlink w:anchor="_Toc242275684" w:history="1">
+      <w:hyperlink w:anchor="_Toc242275998" w:history="1">
         <w:r>
           <w:rPr>
             <w:rStyle w:val="Collegamentoipertestuale"/>
@@ -10230,7 +10230,7 @@
             <w:noProof/>
             <w:webHidden/>
           </w:rPr>
-          <w:instrText xml:space="preserve"> PAGEREF _Toc242275684 \h </w:instrText>
+          <w:instrText xml:space="preserve"> PAGEREF _Toc242275998 \h </w:instrText>
         </w:r>
         <w:r>
           <w:rPr>
@@ -10277,7 +10277,7 @@
           <w14:ligatures w14:val="standardContextual"/>
         </w:rPr>
       </w:pPr>
-      <w:hyperlink w:anchor="_Toc242275685" w:history="1">
+      <w:hyperlink w:anchor="_Toc242275999" w:history="1">
         <w:r>
           <w:rPr>
             <w:rStyle w:val="Collegamentoipertestuale"/>
@@ -10322,7 +10322,7 @@
             <w:noProof/>
             <w:webHidden/>
           </w:rPr>
-          <w:instrText xml:space="preserve"> PAGEREF _Toc242275685 \h </w:instrText>
+          <w:instrText xml:space="preserve"> PAGEREF _Toc242275999 \h </w:instrText>
         </w:r>
         <w:r>
           <w:rPr>
@@ -10369,7 +10369,7 @@
           <w14:ligatures w14:val="standardContextual"/>
         </w:rPr>
       </w:pPr>
-      <w:hyperlink w:anchor="_Toc242275686" w:history="1">
+      <w:hyperlink w:anchor="_Toc242276000" w:history="1">
         <w:r>
           <w:rPr>
             <w:rStyle w:val="Collegamentoipertestuale"/>
@@ -10414,7 +10414,7 @@
             <w:noProof/>
             <w:webHidden/>
           </w:rPr>
-          <w:instrText xml:space="preserve"> PAGEREF _Toc242275686 \h </w:instrText>
+          <w:instrText xml:space="preserve"> PAGEREF _Toc242276000 \h </w:instrText>
         </w:r>
         <w:r>
           <w:rPr>
@@ -10461,7 +10461,7 @@
           <w14:ligatures w14:val="standardContextual"/>
         </w:rPr>
       </w:pPr>
-      <w:hyperlink w:anchor="_Toc242275687" w:history="1">
+      <w:hyperlink w:anchor="_Toc242276001" w:history="1">
         <w:r>
           <w:rPr>
             <w:rStyle w:val="Collegamentoipertestuale"/>
@@ -10506,7 +10506,7 @@
             <w:noProof/>
             <w:webHidden/>
           </w:rPr>
-          <w:instrText xml:space="preserve"> PAGEREF _Toc242275687 \h </w:instrText>
+          <w:instrText xml:space="preserve"> PAGEREF _Toc242276001 \h </w:instrText>
         </w:r>
         <w:r>
           <w:rPr>
@@ -10553,7 +10553,7 @@
           <w14:ligatures w14:val="standardContextual"/>
         </w:rPr>
       </w:pPr>
-      <w:hyperlink w:anchor="_Toc242275688" w:history="1">
+      <w:hyperlink w:anchor="_Toc242276002" w:history="1">
         <w:r>
           <w:rPr>
             <w:rStyle w:val="Collegamentoipertestuale"/>
@@ -10598,7 +10598,7 @@
             <w:noProof/>
             <w:webHidden/>
           </w:rPr>
-          <w:instrText xml:space="preserve"> PAGEREF _Toc242275688 \h </w:instrText>
+          <w:instrText xml:space="preserve"> PAGEREF _Toc242276002 \h </w:instrText>
         </w:r>
         <w:r>
           <w:rPr>
@@ -10645,7 +10645,7 @@
           <w14:ligatures w14:val="standardContextual"/>
         </w:rPr>
       </w:pPr>
-      <w:hyperlink w:anchor="_Toc242275689" w:history="1">
+      <w:hyperlink w:anchor="_Toc242276003" w:history="1">
         <w:r>
           <w:rPr>
             <w:rStyle w:val="Collegamentoipertestuale"/>
@@ -10690,7 +10690,7 @@
             <w:noProof/>
             <w:webHidden/>
           </w:rPr>
-          <w:instrText xml:space="preserve"> PAGEREF _Toc242275689 \h </w:instrText>
+          <w:instrText xml:space="preserve"> PAGEREF _Toc242276003 \h </w:instrText>
         </w:r>
         <w:r>
           <w:rPr>
@@ -10737,7 +10737,7 @@
           <w14:ligatures w14:val="standardContextual"/>
         </w:rPr>
       </w:pPr>
-      <w:hyperlink w:anchor="_Toc242275690" w:history="1">
+      <w:hyperlink w:anchor="_Toc242276004" w:history="1">
         <w:r>
           <w:rPr>
             <w:rStyle w:val="Collegamentoipertestuale"/>
@@ -10782,7 +10782,7 @@
             <w:noProof/>
             <w:webHidden/>
           </w:rPr>
-          <w:instrText xml:space="preserve"> PAGEREF _Toc242275690 \h </w:instrText>
+          <w:instrText xml:space="preserve"> PAGEREF _Toc242276004 \h </w:instrText>
         </w:r>
         <w:r>
           <w:rPr>
@@ -10829,7 +10829,7 @@
           <w14:ligatures w14:val="standardContextual"/>
         </w:rPr>
       </w:pPr>
-      <w:hyperlink w:anchor="_Toc242275691" w:history="1">
+      <w:hyperlink w:anchor="_Toc242276005" w:history="1">
         <w:r>
           <w:rPr>
             <w:rStyle w:val="Collegamentoipertestuale"/>
@@ -10874,7 +10874,7 @@
             <w:noProof/>
             <w:webHidden/>
           </w:rPr>
-          <w:instrText xml:space="preserve"> PAGEREF _Toc242275691 \h </w:instrText>
+          <w:instrText xml:space="preserve"> PAGEREF _Toc242276005 \h </w:instrText>
         </w:r>
         <w:r>
           <w:rPr>
@@ -10920,7 +10920,7 @@
           <w14:ligatures w14:val="standardContextual"/>
         </w:rPr>
       </w:pPr>
-      <w:hyperlink w:anchor="_Toc242275692" w:history="1">
+      <w:hyperlink w:anchor="_Toc242276006" w:history="1">
         <w:r>
           <w:rPr>
             <w:rStyle w:val="Collegamentoipertestuale"/>
@@ -10968,7 +10968,7 @@
             <w:noProof/>
             <w:webHidden/>
           </w:rPr>
-          <w:instrText xml:space="preserve"> PAGEREF _Toc242275692 \h </w:instrText>
+          <w:instrText xml:space="preserve"> PAGEREF _Toc242276006 \h </w:instrText>
         </w:r>
         <w:r>
           <w:rPr>
@@ -11015,7 +11015,7 @@
           <w14:ligatures w14:val="standardContextual"/>
         </w:rPr>
       </w:pPr>
-      <w:hyperlink w:anchor="_Toc242275693" w:history="1">
+      <w:hyperlink w:anchor="_Toc242276007" w:history="1">
         <w:r>
           <w:rPr>
             <w:rStyle w:val="Collegamentoipertestuale"/>
@@ -11060,7 +11060,7 @@
             <w:noProof/>
             <w:webHidden/>
           </w:rPr>
-          <w:instrText xml:space="preserve"> PAGEREF _Toc242275693 \h </w:instrText>
+          <w:instrText xml:space="preserve"> PAGEREF _Toc242276007 \h </w:instrText>
         </w:r>
         <w:r>
           <w:rPr>
@@ -11107,7 +11107,7 @@
           <w14:ligatures w14:val="standardContextual"/>
         </w:rPr>
       </w:pPr>
-      <w:hyperlink w:anchor="_Toc242275694" w:history="1">
+      <w:hyperlink w:anchor="_Toc242276008" w:history="1">
         <w:r>
           <w:rPr>
             <w:rStyle w:val="Collegamentoipertestuale"/>
@@ -11152,7 +11152,7 @@
             <w:noProof/>
             <w:webHidden/>
           </w:rPr>
-          <w:instrText xml:space="preserve"> PAGEREF _Toc242275694 \h </w:instrText>
+          <w:instrText xml:space="preserve"> PAGEREF _Toc242276008 \h </w:instrText>
         </w:r>
         <w:r>
           <w:rPr>
@@ -11199,7 +11199,7 @@
           <w14:ligatures w14:val="standardContextual"/>
         </w:rPr>
       </w:pPr>
-      <w:hyperlink w:anchor="_Toc242275695" w:history="1">
+      <w:hyperlink w:anchor="_Toc242276009" w:history="1">
         <w:r>
           <w:rPr>
             <w:rStyle w:val="Collegamentoipertestuale"/>
@@ -11244,7 +11244,7 @@
             <w:noProof/>
             <w:webHidden/>
           </w:rPr>
-          <w:instrText xml:space="preserve"> PAGEREF _Toc242275695 \h </w:instrText>
+          <w:instrText xml:space="preserve"> PAGEREF _Toc242276009 \h </w:instrText>
         </w:r>
         <w:r>
           <w:rPr>
@@ -11291,7 +11291,7 @@
           <w14:ligatures w14:val="standardContextual"/>
         </w:rPr>
       </w:pPr>
-      <w:hyperlink w:anchor="_Toc242275696" w:history="1">
+      <w:hyperlink w:anchor="_Toc242276010" w:history="1">
         <w:r>
           <w:rPr>
             <w:rStyle w:val="Collegamentoipertestuale"/>
@@ -11336,7 +11336,7 @@
             <w:noProof/>
             <w:webHidden/>
           </w:rPr>
-          <w:instrText xml:space="preserve"> PAGEREF _Toc242275696 \h </w:instrText>
+          <w:instrText xml:space="preserve"> PAGEREF _Toc242276010 \h </w:instrText>
         </w:r>
         <w:r>
           <w:rPr>
@@ -11383,7 +11383,7 @@
           <w14:ligatures w14:val="standardContextual"/>
         </w:rPr>
       </w:pPr>
-      <w:hyperlink w:anchor="_Toc242275697" w:history="1">
+      <w:hyperlink w:anchor="_Toc242276011" w:history="1">
         <w:r>
           <w:rPr>
             <w:rStyle w:val="Collegamentoipertestuale"/>
@@ -11428,7 +11428,7 @@
             <w:noProof/>
             <w:webHidden/>
           </w:rPr>
-          <w:instrText xml:space="preserve"> PAGEREF _Toc242275697 \h </w:instrText>
+          <w:instrText xml:space="preserve"> PAGEREF _Toc242276011 \h </w:instrText>
         </w:r>
         <w:r>
           <w:rPr>
@@ -11475,7 +11475,7 @@
           <w14:ligatures w14:val="standardContextual"/>
         </w:rPr>
       </w:pPr>
-      <w:hyperlink w:anchor="_Toc242275698" w:history="1">
+      <w:hyperlink w:anchor="_Toc242276012" w:history="1">
         <w:r>
           <w:rPr>
             <w:rStyle w:val="Collegamentoipertestuale"/>
@@ -11520,7 +11520,7 @@
             <w:noProof/>
             <w:webHidden/>
           </w:rPr>
-          <w:instrText xml:space="preserve"> PAGEREF _Toc242275698 \h </w:instrText>
+          <w:instrText xml:space="preserve"> PAGEREF _Toc242276012 \h </w:instrText>
         </w:r>
         <w:r>
           <w:rPr>
@@ -11567,7 +11567,7 @@
           <w14:ligatures w14:val="standardContextual"/>
         </w:rPr>
       </w:pPr>
-      <w:hyperlink w:anchor="_Toc242275699" w:history="1">
+      <w:hyperlink w:anchor="_Toc242276013" w:history="1">
         <w:r>
           <w:rPr>
             <w:rStyle w:val="Collegamentoipertestuale"/>
@@ -11612,7 +11612,7 @@
             <w:noProof/>
             <w:webHidden/>
           </w:rPr>
-          <w:instrText xml:space="preserve"> PAGEREF _Toc242275699 \h </w:instrText>
+          <w:instrText xml:space="preserve"> PAGEREF _Toc242276013 \h </w:instrText>
         </w:r>
         <w:r>
           <w:rPr>
@@ -11658,7 +11658,7 @@
           <w14:ligatures w14:val="standardContextual"/>
         </w:rPr>
       </w:pPr>
-      <w:hyperlink w:anchor="_Toc242275700" w:history="1">
+      <w:hyperlink w:anchor="_Toc242276014" w:history="1">
         <w:r>
           <w:rPr>
             <w:rStyle w:val="Collegamentoipertestuale"/>
@@ -11706,7 +11706,7 @@
             <w:noProof/>
             <w:webHidden/>
           </w:rPr>
-          <w:instrText xml:space="preserve"> PAGEREF _Toc242275700 \h </w:instrText>
+          <w:instrText xml:space="preserve"> PAGEREF _Toc242276014 \h </w:instrText>
         </w:r>
         <w:r>
           <w:rPr>
@@ -11753,7 +11753,7 @@
           <w14:ligatures w14:val="standardContextual"/>
         </w:rPr>
       </w:pPr>
-      <w:hyperlink w:anchor="_Toc242275701" w:history="1">
+      <w:hyperlink w:anchor="_Toc242276015" w:history="1">
         <w:r>
           <w:rPr>
             <w:rStyle w:val="Collegamentoipertestuale"/>
@@ -11798,7 +11798,7 @@
             <w:noProof/>
             <w:webHidden/>
           </w:rPr>
-          <w:instrText xml:space="preserve"> PAGEREF _Toc242275701 \h </w:instrText>
+          <w:instrText xml:space="preserve"> PAGEREF _Toc242276015 \h </w:instrText>
         </w:r>
         <w:r>
           <w:rPr>
@@ -11845,7 +11845,7 @@
           <w14:ligatures w14:val="standardContextual"/>
         </w:rPr>
       </w:pPr>
-      <w:hyperlink w:anchor="_Toc242275702" w:history="1">
+      <w:hyperlink w:anchor="_Toc242276016" w:history="1">
         <w:r>
           <w:rPr>
             <w:rStyle w:val="Collegamentoipertestuale"/>
@@ -11890,7 +11890,7 @@
             <w:noProof/>
             <w:webHidden/>
           </w:rPr>
-          <w:instrText xml:space="preserve"> PAGEREF _Toc242275702 \h </w:instrText>
+          <w:instrText xml:space="preserve"> PAGEREF _Toc242276016 \h </w:instrText>
         </w:r>
         <w:r>
           <w:rPr>
@@ -11937,7 +11937,7 @@
           <w14:ligatures w14:val="standardContextual"/>
         </w:rPr>
       </w:pPr>
-      <w:hyperlink w:anchor="_Toc242275703" w:history="1">
+      <w:hyperlink w:anchor="_Toc242276017" w:history="1">
         <w:r>
           <w:rPr>
             <w:rStyle w:val="Collegamentoipertestuale"/>
@@ -11982,7 +11982,7 @@
             <w:noProof/>
             <w:webHidden/>
           </w:rPr>
-          <w:instrText xml:space="preserve"> PAGEREF _Toc242275703 \h </w:instrText>
+          <w:instrText xml:space="preserve"> PAGEREF _Toc242276017 \h </w:instrText>
         </w:r>
         <w:r>
           <w:rPr>
@@ -12029,7 +12029,7 @@
           <w14:ligatures w14:val="standardContextual"/>
         </w:rPr>
       </w:pPr>
-      <w:hyperlink w:anchor="_Toc242275704" w:history="1">
+      <w:hyperlink w:anchor="_Toc242276018" w:history="1">
         <w:r>
           <w:rPr>
             <w:rStyle w:val="Collegamentoipertestuale"/>
@@ -12074,7 +12074,7 @@
             <w:noProof/>
             <w:webHidden/>
           </w:rPr>
-          <w:instrText xml:space="preserve"> PAGEREF _Toc242275704 \h </w:instrText>
+          <w:instrText xml:space="preserve"> PAGEREF _Toc242276018 \h </w:instrText>
         </w:r>
         <w:r>
           <w:rPr>
@@ -12121,7 +12121,7 @@
           <w14:ligatures w14:val="standardContextual"/>
         </w:rPr>
       </w:pPr>
-      <w:hyperlink w:anchor="_Toc242275705" w:history="1">
+      <w:hyperlink w:anchor="_Toc242276019" w:history="1">
         <w:r>
           <w:rPr>
             <w:rStyle w:val="Collegamentoipertestuale"/>
@@ -12166,7 +12166,7 @@
             <w:noProof/>
             <w:webHidden/>
           </w:rPr>
-          <w:instrText xml:space="preserve"> PAGEREF _Toc242275705 \h </w:instrText>
+          <w:instrText xml:space="preserve"> PAGEREF _Toc242276019 \h </w:instrText>
         </w:r>
         <w:r>
           <w:rPr>
@@ -12213,7 +12213,7 @@
           <w14:ligatures w14:val="standardContextual"/>
         </w:rPr>
       </w:pPr>
-      <w:hyperlink w:anchor="_Toc242275706" w:history="1">
+      <w:hyperlink w:anchor="_Toc242276020" w:history="1">
         <w:r>
           <w:rPr>
             <w:rStyle w:val="Collegamentoipertestuale"/>
@@ -12258,7 +12258,7 @@
             <w:noProof/>
             <w:webHidden/>
           </w:rPr>
-          <w:instrText xml:space="preserve"> PAGEREF _Toc242275706 \h </w:instrText>
+          <w:instrText xml:space="preserve"> PAGEREF _Toc242276020 \h </w:instrText>
         </w:r>
         <w:r>
           <w:rPr>
@@ -12305,7 +12305,7 @@
           <w14:ligatures w14:val="standardContextual"/>
         </w:rPr>
       </w:pPr>
-      <w:hyperlink w:anchor="_Toc242275707" w:history="1">
+      <w:hyperlink w:anchor="_Toc242276021" w:history="1">
         <w:r>
           <w:rPr>
             <w:rStyle w:val="Collegamentoipertestuale"/>
@@ -12350,7 +12350,7 @@
             <w:noProof/>
             <w:webHidden/>
           </w:rPr>
-          <w:instrText xml:space="preserve"> PAGEREF _Toc242275707 \h </w:instrText>
+          <w:instrText xml:space="preserve"> PAGEREF _Toc242276021 \h </w:instrText>
         </w:r>
         <w:r>
           <w:rPr>
@@ -12397,7 +12397,7 @@
           <w14:ligatures w14:val="standardContextual"/>
         </w:rPr>
       </w:pPr>
-      <w:hyperlink w:anchor="_Toc242275708" w:history="1">
+      <w:hyperlink w:anchor="_Toc242276022" w:history="1">
         <w:r>
           <w:rPr>
             <w:rStyle w:val="Collegamentoipertestuale"/>
@@ -12442,7 +12442,7 @@
             <w:noProof/>
             <w:webHidden/>
           </w:rPr>
-          <w:instrText xml:space="preserve"> PAGEREF _Toc242275708 \h </w:instrText>
+          <w:instrText xml:space="preserve"> PAGEREF _Toc242276022 \h </w:instrText>
         </w:r>
         <w:r>
           <w:rPr>
@@ -12489,7 +12489,7 @@
           <w14:ligatures w14:val="standardContextual"/>
         </w:rPr>
       </w:pPr>
-      <w:hyperlink w:anchor="_Toc242275709" w:history="1">
+      <w:hyperlink w:anchor="_Toc242276023" w:history="1">
         <w:r>
           <w:rPr>
             <w:rStyle w:val="Collegamentoipertestuale"/>
@@ -12534,7 +12534,7 @@
             <w:noProof/>
             <w:webHidden/>
           </w:rPr>
-          <w:instrText xml:space="preserve"> PAGEREF _Toc242275709 \h </w:instrText>
+          <w:instrText xml:space="preserve"> PAGEREF _Toc242276023 \h </w:instrText>
         </w:r>
         <w:r>
           <w:rPr>
@@ -12581,7 +12581,7 @@
           <w14:ligatures w14:val="standardContextual"/>
         </w:rPr>
       </w:pPr>
-      <w:hyperlink w:anchor="_Toc242275710" w:history="1">
+      <w:hyperlink w:anchor="_Toc242276024" w:history="1">
         <w:r>
           <w:rPr>
             <w:rStyle w:val="Collegamentoipertestuale"/>
@@ -12626,7 +12626,7 @@
             <w:noProof/>
             <w:webHidden/>
           </w:rPr>
-          <w:instrText xml:space="preserve"> PAGEREF _Toc242275710 \h </w:instrText>
+          <w:instrText xml:space="preserve"> PAGEREF _Toc242276024 \h </w:instrText>
         </w:r>
         <w:r>
           <w:rPr>
@@ -12673,7 +12673,7 @@
           <w14:ligatures w14:val="standardContextual"/>
         </w:rPr>
       </w:pPr>
-      <w:hyperlink w:anchor="_Toc242275711" w:history="1">
+      <w:hyperlink w:anchor="_Toc242276025" w:history="1">
         <w:r>
           <w:rPr>
             <w:rStyle w:val="Collegamentoipertestuale"/>
@@ -12718,7 +12718,7 @@
             <w:noProof/>
             <w:webHidden/>
           </w:rPr>
-          <w:instrText xml:space="preserve"> PAGEREF _Toc242275711 \h </w:instrText>
+          <w:instrText xml:space="preserve"> PAGEREF _Toc242276025 \h </w:instrText>
         </w:r>
         <w:r>
           <w:rPr>
@@ -12765,7 +12765,7 @@
           <w14:ligatures w14:val="standardContextual"/>
         </w:rPr>
       </w:pPr>
-      <w:hyperlink w:anchor="_Toc242275712" w:history="1">
+      <w:hyperlink w:anchor="_Toc242276026" w:history="1">
         <w:r>
           <w:rPr>
             <w:rStyle w:val="Collegamentoipertestuale"/>
@@ -12810,7 +12810,7 @@
             <w:noProof/>
             <w:webHidden/>
           </w:rPr>
-          <w:instrText xml:space="preserve"> PAGEREF _Toc242275712 \h </w:instrText>
+          <w:instrText xml:space="preserve"> PAGEREF _Toc242276026 \h </w:instrText>
         </w:r>
         <w:r>
           <w:rPr>
@@ -12857,7 +12857,7 @@
           <w14:ligatures w14:val="standardContextual"/>
         </w:rPr>
       </w:pPr>
-      <w:hyperlink w:anchor="_Toc242275713" w:history="1">
+      <w:hyperlink w:anchor="_Toc242276027" w:history="1">
         <w:r>
           <w:rPr>
             <w:rStyle w:val="Collegamentoipertestuale"/>
@@ -12902,7 +12902,7 @@
             <w:noProof/>
             <w:webHidden/>
           </w:rPr>
-          <w:instrText xml:space="preserve"> PAGEREF _Toc242275713 \h </w:instrText>
+          <w:instrText xml:space="preserve"> PAGEREF _Toc242276027 \h </w:instrText>
         </w:r>
         <w:r>
           <w:rPr>
@@ -12949,7 +12949,7 @@
           <w14:ligatures w14:val="standardContextual"/>
         </w:rPr>
       </w:pPr>
-      <w:hyperlink w:anchor="_Toc242275714" w:history="1">
+      <w:hyperlink w:anchor="_Toc242276028" w:history="1">
         <w:r>
           <w:rPr>
             <w:rStyle w:val="Collegamentoipertestuale"/>
@@ -12994,7 +12994,7 @@
             <w:noProof/>
             <w:webHidden/>
           </w:rPr>
-          <w:instrText xml:space="preserve"> PAGEREF _Toc242275714 \h </w:instrText>
+          <w:instrText xml:space="preserve"> PAGEREF _Toc242276028 \h </w:instrText>
         </w:r>
         <w:r>
           <w:rPr>
@@ -13041,7 +13041,7 @@
           <w14:ligatures w14:val="standardContextual"/>
         </w:rPr>
       </w:pPr>
-      <w:hyperlink w:anchor="_Toc242275715" w:history="1">
+      <w:hyperlink w:anchor="_Toc242276029" w:history="1">
         <w:r>
           <w:rPr>
             <w:rStyle w:val="Collegamentoipertestuale"/>
@@ -13086,7 +13086,7 @@
             <w:noProof/>
             <w:webHidden/>
           </w:rPr>
-          <w:instrText xml:space="preserve"> PAGEREF _Toc242275715 \h </w:instrText>
+          <w:instrText xml:space="preserve"> PAGEREF _Toc242276029 \h </w:instrText>
         </w:r>
         <w:r>
           <w:rPr>
@@ -13133,7 +13133,7 @@
           <w14:ligatures w14:val="standardContextual"/>
         </w:rPr>
       </w:pPr>
-      <w:hyperlink w:anchor="_Toc242275716" w:history="1">
+      <w:hyperlink w:anchor="_Toc242276030" w:history="1">
         <w:r>
           <w:rPr>
             <w:rStyle w:val="Collegamentoipertestuale"/>
@@ -13178,7 +13178,7 @@
             <w:noProof/>
             <w:webHidden/>
           </w:rPr>
-          <w:instrText xml:space="preserve"> PAGEREF _Toc242275716 \h </w:instrText>
+          <w:instrText xml:space="preserve"> PAGEREF _Toc242276030 \h </w:instrText>
         </w:r>
         <w:r>
           <w:rPr>
@@ -13224,7 +13224,7 @@
           <w14:ligatures w14:val="standardContextual"/>
         </w:rPr>
       </w:pPr>
-      <w:hyperlink w:anchor="_Toc242275717" w:history="1">
+      <w:hyperlink w:anchor="_Toc242276031" w:history="1">
         <w:r>
           <w:rPr>
             <w:rStyle w:val="Collegamentoipertestuale"/>
@@ -13272,7 +13272,7 @@
             <w:noProof/>
             <w:webHidden/>
           </w:rPr>
-          <w:instrText xml:space="preserve"> PAGEREF _Toc242275717 \h </w:instrText>
+          <w:instrText xml:space="preserve"> PAGEREF _Toc242276031 \h </w:instrText>
         </w:r>
         <w:r>
           <w:rPr>
@@ -13319,7 +13319,7 @@
           <w14:ligatures w14:val="standardContextual"/>
         </w:rPr>
       </w:pPr>
-      <w:hyperlink w:anchor="_Toc242275718" w:history="1">
+      <w:hyperlink w:anchor="_Toc242276032" w:history="1">
         <w:r>
           <w:rPr>
             <w:rStyle w:val="Collegamentoipertestuale"/>
@@ -13364,7 +13364,7 @@
             <w:noProof/>
             <w:webHidden/>
           </w:rPr>
-          <w:instrText xml:space="preserve"> PAGEREF _Toc242275718 \h </w:instrText>
+          <w:instrText xml:space="preserve"> PAGEREF _Toc242276032 \h </w:instrText>
         </w:r>
         <w:r>
           <w:rPr>
@@ -13411,7 +13411,7 @@
           <w14:ligatures w14:val="standardContextual"/>
         </w:rPr>
       </w:pPr>
-      <w:hyperlink w:anchor="_Toc242275719" w:history="1">
+      <w:hyperlink w:anchor="_Toc242276033" w:history="1">
         <w:r>
           <w:rPr>
             <w:rStyle w:val="Collegamentoipertestuale"/>
@@ -13456,7 +13456,7 @@
             <w:noProof/>
             <w:webHidden/>
           </w:rPr>
-          <w:instrText xml:space="preserve"> PAGEREF _Toc242275719 \h </w:instrText>
+          <w:instrText xml:space="preserve"> PAGEREF _Toc242276033 \h </w:instrText>
         </w:r>
         <w:r>
           <w:rPr>
@@ -13503,7 +13503,7 @@
           <w14:ligatures w14:val="standardContextual"/>
         </w:rPr>
       </w:pPr>
-      <w:hyperlink w:anchor="_Toc242275720" w:history="1">
+      <w:hyperlink w:anchor="_Toc242276034" w:history="1">
         <w:r>
           <w:rPr>
             <w:rStyle w:val="Collegamentoipertestuale"/>
@@ -13548,7 +13548,7 @@
             <w:noProof/>
             <w:webHidden/>
           </w:rPr>
-          <w:instrText xml:space="preserve"> PAGEREF _Toc242275720 \h </w:instrText>
+          <w:instrText xml:space="preserve"> PAGEREF _Toc242276034 \h </w:instrText>
         </w:r>
         <w:r>
           <w:rPr>
@@ -13594,7 +13594,7 @@
           <w14:ligatures w14:val="standardContextual"/>
         </w:rPr>
       </w:pPr>
-      <w:hyperlink w:anchor="_Toc242275721" w:history="1">
+      <w:hyperlink w:anchor="_Toc242276035" w:history="1">
         <w:r>
           <w:rPr>
             <w:rStyle w:val="Collegamentoipertestuale"/>
@@ -13642,7 +13642,7 @@
             <w:noProof/>
             <w:webHidden/>
           </w:rPr>
-          <w:instrText xml:space="preserve"> PAGEREF _Toc242275721 \h </w:instrText>
+          <w:instrText xml:space="preserve"> PAGEREF _Toc242276035 \h </w:instrText>
         </w:r>
         <w:r>
           <w:rPr>
@@ -13689,7 +13689,7 @@
           <w14:ligatures w14:val="standardContextual"/>
         </w:rPr>
       </w:pPr>
-      <w:hyperlink w:anchor="_Toc242275722" w:history="1">
+      <w:hyperlink w:anchor="_Toc242276036" w:history="1">
         <w:r>
           <w:rPr>
             <w:rStyle w:val="Collegamentoipertestuale"/>
@@ -13734,7 +13734,7 @@
             <w:noProof/>
             <w:webHidden/>
           </w:rPr>
-          <w:instrText xml:space="preserve"> PAGEREF _Toc242275722 \h </w:instrText>
+          <w:instrText xml:space="preserve"> PAGEREF _Toc242276036 \h </w:instrText>
         </w:r>
         <w:r>
           <w:rPr>
@@ -13781,7 +13781,7 @@
           <w14:ligatures w14:val="standardContextual"/>
         </w:rPr>
       </w:pPr>
-      <w:hyperlink w:anchor="_Toc242275723" w:history="1">
+      <w:hyperlink w:anchor="_Toc242276037" w:history="1">
         <w:r>
           <w:rPr>
             <w:rStyle w:val="Collegamentoipertestuale"/>
@@ -13826,7 +13826,7 @@
             <w:noProof/>
             <w:webHidden/>
           </w:rPr>
-          <w:instrText xml:space="preserve"> PAGEREF _Toc242275723 \h </w:instrText>
+          <w:instrText xml:space="preserve"> PAGEREF _Toc242276037 \h </w:instrText>
         </w:r>
         <w:r>
           <w:rPr>
@@ -13873,7 +13873,7 @@
           <w14:ligatures w14:val="standardContextual"/>
         </w:rPr>
       </w:pPr>
-      <w:hyperlink w:anchor="_Toc242275724" w:history="1">
+      <w:hyperlink w:anchor="_Toc242276038" w:history="1">
         <w:r>
           <w:rPr>
             <w:rStyle w:val="Collegamentoipertestuale"/>
@@ -13918,7 +13918,7 @@
             <w:noProof/>
             <w:webHidden/>
           </w:rPr>
-          <w:instrText xml:space="preserve"> PAGEREF _Toc242275724 \h </w:instrText>
+          <w:instrText xml:space="preserve"> PAGEREF _Toc242276038 \h </w:instrText>
         </w:r>
         <w:r>
           <w:rPr>
@@ -13983,7 +13983,7 @@
         <w:keepNext/>
         <w:spacing w:after="140"/>
       </w:pPr>
-      <w:bookmarkStart w:id="2" w:name="_Toc242275599"/>
+      <w:bookmarkStart w:id="2" w:name="_Toc242275913"/>
       <w:r>
         <w:t>Avvio e scelta del modulo</w:t>
       </w:r>
@@ -13995,7 +13995,7 @@
         <w:keepNext/>
         <w:spacing w:after="140"/>
       </w:pPr>
-      <w:bookmarkStart w:id="3" w:name="_Toc242275600"/>
+      <w:bookmarkStart w:id="3" w:name="_Toc242275914"/>
       <w:r>
         <w:t>Avviare la versione aggiornata</w:t>
       </w:r>
@@ -14023,7 +14023,7 @@
         <w:keepNext/>
         <w:spacing w:after="140"/>
       </w:pPr>
-      <w:bookmarkStart w:id="4" w:name="_Toc242275601"/>
+      <w:bookmarkStart w:id="4" w:name="_Toc242275915"/>
       <w:r>
         <w:t>Scegliere l’aspetto</w:t>
       </w:r>
@@ -14051,7 +14051,7 @@
         <w:keepNext/>
         <w:spacing w:after="140"/>
       </w:pPr>
-      <w:bookmarkStart w:id="5" w:name="_Toc242275602"/>
+      <w:bookmarkStart w:id="5" w:name="_Toc242275916"/>
       <w:r>
         <w:t>Scegliere il foglio adatto</w:t>
       </w:r>
@@ -15037,7 +15037,7 @@
         <w:keepNext/>
         <w:spacing w:after="140"/>
       </w:pPr>
-      <w:bookmarkStart w:id="6" w:name="_Toc242275603"/>
+      <w:bookmarkStart w:id="6" w:name="_Toc242275917"/>
       <w:r>
         <w:t>Leggere e compilare i campi</w:t>
       </w:r>
@@ -15074,7 +15074,7 @@
         <w:keepNext/>
         <w:spacing w:after="140"/>
       </w:pPr>
-      <w:bookmarkStart w:id="7" w:name="_Toc242275604"/>
+      <w:bookmarkStart w:id="7" w:name="_Toc242275918"/>
       <w:r>
         <w:t>Progetti e gestione del lavoro</w:t>
       </w:r>
@@ -15086,7 +15086,7 @@
         <w:keepNext/>
         <w:spacing w:after="140"/>
       </w:pPr>
-      <w:bookmarkStart w:id="8" w:name="_Toc242275605"/>
+      <w:bookmarkStart w:id="8" w:name="_Toc242275919"/>
       <w:r>
         <w:t>Costruire una struttura leggibile</w:t>
       </w:r>
@@ -15122,7 +15122,7 @@
         <w:keepNext/>
         <w:spacing w:after="140"/>
       </w:pPr>
-      <w:bookmarkStart w:id="9" w:name="_Toc242275606"/>
+      <w:bookmarkStart w:id="9" w:name="_Toc242275920"/>
       <w:r>
         <w:t>Comprendere i dati comuni</w:t>
       </w:r>
@@ -15170,7 +15170,7 @@
         <w:keepNext/>
         <w:spacing w:after="140"/>
       </w:pPr>
-      <w:bookmarkStart w:id="10" w:name="_Toc242275607"/>
+      <w:bookmarkStart w:id="10" w:name="_Toc242275921"/>
       <w:r>
         <w:t>Spostare duplicare e annullare</w:t>
       </w:r>
@@ -15206,7 +15206,7 @@
         <w:keepNext/>
         <w:spacing w:after="140"/>
       </w:pPr>
-      <w:bookmarkStart w:id="11" w:name="_Toc242275608"/>
+      <w:bookmarkStart w:id="11" w:name="_Toc242275922"/>
       <w:r>
         <w:t>Usare le revisioni</w:t>
       </w:r>
@@ -15242,7 +15242,7 @@
         <w:keepNext/>
         <w:spacing w:after="140"/>
       </w:pPr>
-      <w:bookmarkStart w:id="12" w:name="_Toc242275609"/>
+      <w:bookmarkStart w:id="12" w:name="_Toc242275923"/>
       <w:r>
         <w:lastRenderedPageBreak/>
         <w:t>Report del ramo e compatibilità degli archivi</w:t>
@@ -15279,7 +15279,7 @@
         <w:keepNext/>
         <w:spacing w:after="140"/>
       </w:pPr>
-      <w:bookmarkStart w:id="13" w:name="_Toc242275610"/>
+      <w:bookmarkStart w:id="13" w:name="_Toc242275924"/>
       <w:r>
         <w:t>Controllo della condivisione</w:t>
       </w:r>
@@ -15307,7 +15307,7 @@
         <w:keepNext/>
         <w:spacing w:after="140"/>
       </w:pPr>
-      <w:bookmarkStart w:id="14" w:name="_Toc242275611"/>
+      <w:bookmarkStart w:id="14" w:name="_Toc242275925"/>
       <w:r>
         <w:t>Materiali e durabilità</w:t>
       </w:r>
@@ -15319,7 +15319,7 @@
         <w:keepNext/>
         <w:spacing w:after="140"/>
       </w:pPr>
-      <w:bookmarkStart w:id="15" w:name="_Toc242275612"/>
+      <w:bookmarkStart w:id="15" w:name="_Toc242275926"/>
       <w:r>
         <w:t>Preparare il calcestruzzo</w:t>
       </w:r>
@@ -15367,7 +15367,7 @@
         <w:keepNext/>
         <w:spacing w:after="140"/>
       </w:pPr>
-      <w:bookmarkStart w:id="16" w:name="_Toc242275613"/>
+      <w:bookmarkStart w:id="16" w:name="_Toc242275927"/>
       <w:r>
         <w:t>Preparare l'acciaio per armature</w:t>
       </w:r>
@@ -15403,7 +15403,7 @@
         <w:keepNext/>
         <w:spacing w:after="140"/>
       </w:pPr>
-      <w:bookmarkStart w:id="17" w:name="_Toc242275614"/>
+      <w:bookmarkStart w:id="17" w:name="_Toc242275928"/>
       <w:r>
         <w:t>Palo verticale</w:t>
       </w:r>
@@ -15415,7 +15415,7 @@
         <w:keepNext/>
         <w:spacing w:after="140"/>
       </w:pPr>
-      <w:bookmarkStart w:id="18" w:name="_Toc242275615"/>
+      <w:bookmarkStart w:id="18" w:name="_Toc242275929"/>
       <w:r>
         <w:t>Compilazione ordinata</w:t>
       </w:r>
@@ -15478,7 +15478,7 @@
         <w:keepNext/>
         <w:spacing w:after="140"/>
       </w:pPr>
-      <w:bookmarkStart w:id="19" w:name="_Toc242275616"/>
+      <w:bookmarkStart w:id="19" w:name="_Toc242275930"/>
       <w:r>
         <w:t>Coefficienti e gruppo di pali</w:t>
       </w:r>
@@ -15524,7 +15524,7 @@
         <w:keepNext/>
         <w:spacing w:after="140"/>
       </w:pPr>
-      <w:bookmarkStart w:id="20" w:name="_Toc242275617"/>
+      <w:bookmarkStart w:id="20" w:name="_Toc242275931"/>
       <w:r>
         <w:t>Leggere i risultati</w:t>
       </w:r>
@@ -15560,7 +15560,7 @@
         <w:keepNext/>
         <w:spacing w:after="140"/>
       </w:pPr>
-      <w:bookmarkStart w:id="21" w:name="_Toc242275618"/>
+      <w:bookmarkStart w:id="21" w:name="_Toc242275932"/>
       <w:r>
         <w:t>Esempio di controllo manuale</w:t>
       </w:r>
@@ -15655,7 +15655,7 @@
         <w:keepNext/>
         <w:spacing w:after="140"/>
       </w:pPr>
-      <w:bookmarkStart w:id="22" w:name="_Toc242275619"/>
+      <w:bookmarkStart w:id="22" w:name="_Toc242275933"/>
       <w:r>
         <w:t>Micropalo verticale</w:t>
       </w:r>
@@ -15667,7 +15667,7 @@
         <w:keepNext/>
         <w:spacing w:after="140"/>
       </w:pPr>
-      <w:bookmarkStart w:id="23" w:name="_Toc242275620"/>
+      <w:bookmarkStart w:id="23" w:name="_Toc242275934"/>
       <w:r>
         <w:t>Dati del bulbo e dell'iniezione</w:t>
       </w:r>
@@ -15712,7 +15712,7 @@
         <w:keepNext/>
         <w:spacing w:after="140"/>
       </w:pPr>
-      <w:bookmarkStart w:id="24" w:name="_Toc242275621"/>
+      <w:bookmarkStart w:id="24" w:name="_Toc242275935"/>
       <w:r>
         <w:t>Tubo e peso</w:t>
       </w:r>
@@ -15749,7 +15749,7 @@
         <w:keepNext/>
         <w:spacing w:after="140"/>
       </w:pPr>
-      <w:bookmarkStart w:id="25" w:name="_Toc242275622"/>
+      <w:bookmarkStart w:id="25" w:name="_Toc242275936"/>
       <w:r>
         <w:t>Pali e micropali caricati orizzontalmente</w:t>
       </w:r>
@@ -15761,7 +15761,7 @@
         <w:keepNext/>
         <w:spacing w:after="140"/>
       </w:pPr>
-      <w:bookmarkStart w:id="26" w:name="_Toc242275623"/>
+      <w:bookmarkStart w:id="26" w:name="_Toc242275937"/>
       <w:r>
         <w:t>Preparare un modello coerente</w:t>
       </w:r>
@@ -15798,7 +15798,7 @@
         <w:keepNext/>
         <w:spacing w:after="140"/>
       </w:pPr>
-      <w:bookmarkStart w:id="27" w:name="_Toc242275624"/>
+      <w:bookmarkStart w:id="27" w:name="_Toc242275938"/>
       <w:r>
         <w:t>Momento resistente del palo in calcestruzzo</w:t>
       </w:r>
@@ -15826,7 +15826,7 @@
         <w:keepNext/>
         <w:spacing w:after="140"/>
       </w:pPr>
-      <w:bookmarkStart w:id="28" w:name="_Toc242275625"/>
+      <w:bookmarkStart w:id="28" w:name="_Toc242275939"/>
       <w:r>
         <w:t>Sezione CHS del micropalo</w:t>
       </w:r>
@@ -15854,7 +15854,7 @@
         <w:keepNext/>
         <w:spacing w:after="140"/>
       </w:pPr>
-      <w:bookmarkStart w:id="29" w:name="_Toc242275626"/>
+      <w:bookmarkStart w:id="29" w:name="_Toc242275940"/>
       <w:r>
         <w:t>Interpretare diagrammi e capacità</w:t>
       </w:r>
@@ -15886,7 +15886,7 @@
         <w:keepNext/>
         <w:spacing w:after="140"/>
       </w:pPr>
-      <w:bookmarkStart w:id="30" w:name="_Toc242275627"/>
+      <w:bookmarkStart w:id="30" w:name="_Toc242275941"/>
       <w:r>
         <w:t>Separare tubo e diametro geotecnico</w:t>
       </w:r>
@@ -15922,7 +15922,7 @@
         <w:keepNext/>
         <w:spacing w:after="140"/>
       </w:pPr>
-      <w:bookmarkStart w:id="31" w:name="_Toc242275628"/>
+      <w:bookmarkStart w:id="31" w:name="_Toc242275942"/>
       <w:r>
         <w:t>Sezione composta da ponte</w:t>
       </w:r>
@@ -15934,7 +15934,7 @@
         <w:keepNext/>
         <w:spacing w:after="140"/>
       </w:pPr>
-      <w:bookmarkStart w:id="32" w:name="_Toc242275629"/>
+      <w:bookmarkStart w:id="32" w:name="_Toc242275943"/>
       <w:r>
         <w:t>Definire la sezione locale</w:t>
       </w:r>
@@ -15982,7 +15982,7 @@
         <w:keepNext/>
         <w:spacing w:after="140"/>
       </w:pPr>
-      <w:bookmarkStart w:id="33" w:name="_Toc242275630"/>
+      <w:bookmarkStart w:id="33" w:name="_Toc242275944"/>
       <w:r>
         <w:t>Compilare la sezione con anima inclinata</w:t>
       </w:r>
@@ -16017,7 +16017,7 @@
           <w:noProof/>
         </w:rPr>
         <w:drawing>
-          <wp:inline distT="0" distB="0" distL="0" distR="0" wp14:anchorId="07CF86B0" wp14:editId="3F6ECA8E">
+          <wp:inline distT="0" distB="0" distL="0" distR="0" wp14:anchorId="76753CD8" wp14:editId="0AAC1D56">
             <wp:extent cx="6120000" cy="3677403"/>
             <wp:effectExtent l="0" t="0" r="0" b="0"/>
             <wp:docPr id="1" name="Picture 1" descr="H con anima inclinata e scostamento positivo di 300 mm"/>
@@ -16075,7 +16075,7 @@
         <w:keepNext/>
         <w:spacing w:after="140"/>
       </w:pPr>
-      <w:bookmarkStart w:id="34" w:name="_Toc242275631"/>
+      <w:bookmarkStart w:id="34" w:name="_Toc242275945"/>
       <w:r>
         <w:lastRenderedPageBreak/>
         <w:t>Compilare il cassoncino</w:t>
@@ -16116,7 +16116,7 @@
           <w:noProof/>
         </w:rPr>
         <w:drawing>
-          <wp:inline distT="0" distB="0" distL="0" distR="0" wp14:anchorId="185D8168" wp14:editId="563A21C3">
+          <wp:inline distT="0" distB="0" distL="0" distR="0" wp14:anchorId="07EE3141" wp14:editId="57E44941">
             <wp:extent cx="6120000" cy="3677403"/>
             <wp:effectExtent l="0" t="0" r="0" b="0"/>
             <wp:docPr id="2" name="Picture 2" descr="Cassoncino con due anime inclinate e due piattabande superiori"/>
@@ -16178,7 +16178,7 @@
         <w:keepNext/>
         <w:spacing w:after="140"/>
       </w:pPr>
-      <w:bookmarkStart w:id="35" w:name="_Toc242275632"/>
+      <w:bookmarkStart w:id="35" w:name="_Toc242275946"/>
       <w:r>
         <w:t>Leggere le proprietà e riconoscere i limiti</w:t>
       </w:r>
@@ -16665,7 +16665,7 @@
         <w:keepNext/>
         <w:spacing w:after="140"/>
       </w:pPr>
-      <w:bookmarkStart w:id="36" w:name="_Toc242275633"/>
+      <w:bookmarkStart w:id="36" w:name="_Toc242275947"/>
       <w:r>
         <w:t>Scegliere consapevolmente il metodo</w:t>
       </w:r>
@@ -17033,7 +17033,7 @@
         <w:keepNext/>
         <w:spacing w:after="140"/>
       </w:pPr>
-      <w:bookmarkStart w:id="37" w:name="_Toc242275634"/>
+      <w:bookmarkStart w:id="37" w:name="_Toc242275948"/>
       <w:r>
         <w:t>Costruire le fasi</w:t>
       </w:r>
@@ -17087,7 +17087,7 @@
         <w:keepNext/>
         <w:spacing w:after="140"/>
       </w:pPr>
-      <w:bookmarkStart w:id="38" w:name="_Toc242275635"/>
+      <w:bookmarkStart w:id="38" w:name="_Toc242275949"/>
       <w:r>
         <w:t>Leggere efficacia tensioni e controlli locali</w:t>
       </w:r>
@@ -17149,7 +17149,7 @@
         <w:keepNext/>
         <w:spacing w:after="140"/>
       </w:pPr>
-      <w:bookmarkStart w:id="39" w:name="_Toc242275636"/>
+      <w:bookmarkStart w:id="39" w:name="_Toc242275950"/>
       <w:r>
         <w:t>Torsione distorsione e diaframmi del cassoncino</w:t>
       </w:r>
@@ -17228,7 +17228,7 @@
           <w:noProof/>
         </w:rPr>
         <w:drawing>
-          <wp:inline distT="0" distB="0" distL="0" distR="0" wp14:anchorId="0F2E0B69" wp14:editId="74787F40">
+          <wp:inline distT="0" distB="0" distL="0" distR="0" wp14:anchorId="6BDB16C1" wp14:editId="4F04E9A4">
             <wp:extent cx="6120000" cy="3677403"/>
             <wp:effectExtent l="0" t="0" r="0" b="0"/>
             <wp:docPr id="3" name="Picture 3" descr="Riquadro delle verifiche a torsione del cassoncino"/>
@@ -17303,7 +17303,7 @@
           <w:noProof/>
         </w:rPr>
         <w:drawing>
-          <wp:inline distT="0" distB="0" distL="0" distR="0" wp14:anchorId="4DB6BEB9" wp14:editId="76BF9E70">
+          <wp:inline distT="0" distB="0" distL="0" distR="0" wp14:anchorId="0A84186A" wp14:editId="08A95A33">
             <wp:extent cx="6120000" cy="3677403"/>
             <wp:effectExtent l="0" t="0" r="0" b="0"/>
             <wp:docPr id="4" name="Picture 4" descr="Flussi di torsione per fase nella scheda Verifiche"/>
@@ -17387,7 +17387,7 @@
         <w:keepNext/>
         <w:spacing w:after="140"/>
       </w:pPr>
-      <w:bookmarkStart w:id="40" w:name="_Toc242275637"/>
+      <w:bookmarkStart w:id="40" w:name="_Toc242275951"/>
       <w:r>
         <w:t>Curve di risposta</w:t>
       </w:r>
@@ -17442,7 +17442,7 @@
         <w:keepNext/>
         <w:spacing w:after="140"/>
       </w:pPr>
-      <w:bookmarkStart w:id="41" w:name="_Toc242275638"/>
+      <w:bookmarkStart w:id="41" w:name="_Toc242275952"/>
       <w:r>
         <w:t>Bridge Design</w:t>
       </w:r>
@@ -17470,7 +17470,7 @@
         <w:keepNext/>
         <w:spacing w:after="140"/>
       </w:pPr>
-      <w:bookmarkStart w:id="42" w:name="_Toc242275639"/>
+      <w:bookmarkStart w:id="42" w:name="_Toc242275953"/>
       <w:r>
         <w:t>Preparare i dati prima di aprire la ricerca</w:t>
       </w:r>
@@ -18152,7 +18152,7 @@
         <w:keepNext/>
         <w:spacing w:after="140"/>
       </w:pPr>
-      <w:bookmarkStart w:id="43" w:name="_Toc242275640"/>
+      <w:bookmarkStart w:id="43" w:name="_Toc242275954"/>
       <w:r>
         <w:t>Creare il progetto di riferimento</w:t>
       </w:r>
@@ -18247,7 +18247,7 @@
         <w:keepNext/>
         <w:spacing w:after="140"/>
       </w:pPr>
-      <w:bookmarkStart w:id="44" w:name="_Toc242275641"/>
+      <w:bookmarkStart w:id="44" w:name="_Toc242275955"/>
       <w:r>
         <w:t>Leggere sezioni spessori e lunghezze</w:t>
       </w:r>
@@ -18291,7 +18291,7 @@
         <w:keepNext/>
         <w:spacing w:after="140"/>
       </w:pPr>
-      <w:bookmarkStart w:id="45" w:name="_Toc242275642"/>
+      <w:bookmarkStart w:id="45" w:name="_Toc242275956"/>
       <w:r>
         <w:t>Scegliere obiettivo e costanti</w:t>
       </w:r>
@@ -18981,7 +18981,7 @@
         <w:keepNext/>
         <w:spacing w:after="140"/>
       </w:pPr>
-      <w:bookmarkStart w:id="46" w:name="_Toc242275643"/>
+      <w:bookmarkStart w:id="46" w:name="_Toc242275957"/>
       <w:r>
         <w:t>Impostare range utili</w:t>
       </w:r>
@@ -19034,7 +19034,7 @@
         <w:keepNext/>
         <w:spacing w:after="140"/>
       </w:pPr>
-      <w:bookmarkStart w:id="47" w:name="_Toc242275644"/>
+      <w:bookmarkStart w:id="47" w:name="_Toc242275958"/>
       <w:r>
         <w:t>Avviare e leggere l’avanzamento</w:t>
       </w:r>
@@ -19070,7 +19070,7 @@
         <w:keepNext/>
         <w:spacing w:after="140"/>
       </w:pPr>
-      <w:bookmarkStart w:id="48" w:name="_Toc242275645"/>
+      <w:bookmarkStart w:id="48" w:name="_Toc242275959"/>
       <w:r>
         <w:t>Usare i grafici</w:t>
       </w:r>
@@ -19111,7 +19111,7 @@
         </w:rPr>
         <w:lastRenderedPageBreak/>
         <w:drawing>
-          <wp:inline distT="0" distB="0" distL="0" distR="0" wp14:anchorId="302E29B9" wp14:editId="76035B92">
+          <wp:inline distT="0" distB="0" distL="0" distR="0" wp14:anchorId="63F61923" wp14:editId="732F3FE9">
             <wp:extent cx="6120000" cy="3519000"/>
             <wp:effectExtent l="0" t="0" r="0" b="0"/>
             <wp:docPr id="5" name="Picture 5" descr="Nuvola costo e CO₂ ricavata dai risultati riproducibili dell’esempio"/>
@@ -19173,7 +19173,7 @@
           <w:noProof/>
         </w:rPr>
         <w:drawing>
-          <wp:inline distT="0" distB="0" distL="0" distR="0" wp14:anchorId="79DCE72C" wp14:editId="2A9D7BFF">
+          <wp:inline distT="0" distB="0" distL="0" distR="0" wp14:anchorId="76B3B292" wp14:editId="66D67EA7">
             <wp:extent cx="6120000" cy="3519000"/>
             <wp:effectExtent l="0" t="0" r="0" b="0"/>
             <wp:docPr id="6" name="Picture 6" descr="Variazione di altezza e costo durante l’enumerazione dell’esempio"/>
@@ -19223,7 +19223,7 @@
         <w:keepNext/>
         <w:spacing w:after="140"/>
       </w:pPr>
-      <w:bookmarkStart w:id="49" w:name="_Toc242275646"/>
+      <w:bookmarkStart w:id="49" w:name="_Toc242275960"/>
       <w:r>
         <w:lastRenderedPageBreak/>
         <w:t>Esempio guidato da centoventi metri</w:t>
@@ -19958,7 +19958,7 @@
           <w:noProof/>
         </w:rPr>
         <w:drawing>
-          <wp:inline distT="0" distB="0" distL="0" distR="0" wp14:anchorId="76AAA699" wp14:editId="0BC627EF">
+          <wp:inline distT="0" distB="0" distL="0" distR="0" wp14:anchorId="4DC5B0FF" wp14:editId="342408CB">
             <wp:extent cx="6120000" cy="2601000"/>
             <wp:effectExtent l="0" t="0" r="0" b="0"/>
             <wp:docPr id="7" name="Picture 7" descr="Differenze di costo fra il riferimento e alcuni scenari dell’esempio"/>
@@ -20024,7 +20024,7 @@
         <w:keepNext/>
         <w:spacing w:after="140"/>
       </w:pPr>
-      <w:bookmarkStart w:id="50" w:name="_Toc242275647"/>
+      <w:bookmarkStart w:id="50" w:name="_Toc242275961"/>
       <w:r>
         <w:t>Selezionare applicare e conservare le alternative</w:t>
       </w:r>
@@ -20069,7 +20069,7 @@
         <w:keepNext/>
         <w:spacing w:after="140"/>
       </w:pPr>
-      <w:bookmarkStart w:id="51" w:name="_Toc242275648"/>
+      <w:bookmarkStart w:id="51" w:name="_Toc242275962"/>
       <w:r>
         <w:t>Prezzi geotecnica e scenari da confrontare</w:t>
       </w:r>
@@ -20105,7 +20105,7 @@
         <w:keepNext/>
         <w:spacing w:after="140"/>
       </w:pPr>
-      <w:bookmarkStart w:id="52" w:name="_Toc242275649"/>
+      <w:bookmarkStart w:id="52" w:name="_Toc242275963"/>
       <w:r>
         <w:t>Usare le famiglie speciali</w:t>
       </w:r>
@@ -20150,7 +20150,7 @@
         <w:keepNext/>
         <w:spacing w:after="140"/>
       </w:pPr>
-      <w:bookmarkStart w:id="53" w:name="_Toc242275650"/>
+      <w:bookmarkStart w:id="53" w:name="_Toc242275964"/>
       <w:r>
         <w:t>Risolvere i messaggi più comuni</w:t>
       </w:r>
@@ -21057,7 +21057,7 @@
         <w:keepNext/>
         <w:spacing w:after="140"/>
       </w:pPr>
-      <w:bookmarkStart w:id="54" w:name="_Toc242275651"/>
+      <w:bookmarkStart w:id="54" w:name="_Toc242275965"/>
       <w:r>
         <w:t>Esportare un confronto leggibile</w:t>
       </w:r>
@@ -21089,7 +21089,7 @@
         <w:keepNext/>
         <w:spacing w:after="140"/>
       </w:pPr>
-      <w:bookmarkStart w:id="55" w:name="_Toc242275652"/>
+      <w:bookmarkStart w:id="55" w:name="_Toc242275966"/>
       <w:r>
         <w:t>Quanto fidarsi dei risultati</w:t>
       </w:r>
@@ -21125,7 +21125,7 @@
         <w:keepNext/>
         <w:spacing w:after="140"/>
       </w:pPr>
-      <w:bookmarkStart w:id="56" w:name="_Toc242275653"/>
+      <w:bookmarkStart w:id="56" w:name="_Toc242275967"/>
       <w:r>
         <w:t>Salvataggio e report</w:t>
       </w:r>
@@ -21137,7 +21137,7 @@
         <w:keepNext/>
         <w:spacing w:after="140"/>
       </w:pPr>
-      <w:bookmarkStart w:id="57" w:name="_Toc242275654"/>
+      <w:bookmarkStart w:id="57" w:name="_Toc242275968"/>
       <w:r>
         <w:t>Conservare dati modificabili</w:t>
       </w:r>
@@ -21165,7 +21165,7 @@
         <w:keepNext/>
         <w:spacing w:after="140"/>
       </w:pPr>
-      <w:bookmarkStart w:id="58" w:name="_Toc242275655"/>
+      <w:bookmarkStart w:id="58" w:name="_Toc242275969"/>
       <w:r>
         <w:t>Report del singolo foglio e del progetto</w:t>
       </w:r>
@@ -21202,7 +21202,7 @@
         <w:keepNext/>
         <w:spacing w:after="140"/>
       </w:pPr>
-      <w:bookmarkStart w:id="59" w:name="_Toc242275656"/>
+      <w:bookmarkStart w:id="59" w:name="_Toc242275970"/>
       <w:r>
         <w:t>Conservare dati e risultati insieme</w:t>
       </w:r>
@@ -21230,7 +21230,7 @@
         <w:keepNext/>
         <w:spacing w:after="140"/>
       </w:pPr>
-      <w:bookmarkStart w:id="60" w:name="_Toc242275657"/>
+      <w:bookmarkStart w:id="60" w:name="_Toc242275971"/>
       <w:r>
         <w:t>Percorso completo per un primo progetto</w:t>
       </w:r>
@@ -21313,7 +21313,7 @@
         <w:keepNext/>
         <w:spacing w:after="140"/>
       </w:pPr>
-      <w:bookmarkStart w:id="61" w:name="_Toc242275658"/>
+      <w:bookmarkStart w:id="61" w:name="_Toc242275972"/>
       <w:r>
         <w:lastRenderedPageBreak/>
         <w:t>Problemi frequenti e controlli finali</w:t>
@@ -21900,7 +21900,7 @@
         <w:keepNext/>
         <w:spacing w:after="140"/>
       </w:pPr>
-      <w:bookmarkStart w:id="62" w:name="_Toc242275659"/>
+      <w:bookmarkStart w:id="62" w:name="_Toc242275973"/>
       <w:r>
         <w:t>Riferimenti per approfondire</w:t>
       </w:r>
@@ -21923,7 +21923,7 @@
         <w:keepNext/>
         <w:spacing w:after="140"/>
       </w:pPr>
-      <w:bookmarkStart w:id="63" w:name="_Toc242275660"/>
+      <w:bookmarkStart w:id="63" w:name="_Toc242275974"/>
       <w:r>
         <w:lastRenderedPageBreak/>
         <w:t>Muri di sostegno con stratigrafie di monte e valle</w:t>
@@ -21991,7 +21991,7 @@
         <w:keepNext/>
         <w:spacing w:after="140"/>
       </w:pPr>
-      <w:bookmarkStart w:id="64" w:name="_Toc242275661"/>
+      <w:bookmarkStart w:id="64" w:name="_Toc242275975"/>
       <w:r>
         <w:t>Materiali e copriferro del muro</w:t>
       </w:r>
@@ -22058,7 +22058,7 @@
         <w:keepNext/>
         <w:spacing w:after="140"/>
       </w:pPr>
-      <w:bookmarkStart w:id="65" w:name="_Toc242275662"/>
+      <w:bookmarkStart w:id="65" w:name="_Toc242275976"/>
       <w:r>
         <w:t>Avviare la verifica globale</w:t>
       </w:r>
@@ -22105,7 +22105,7 @@
         <w:keepNext/>
         <w:spacing w:after="140"/>
       </w:pPr>
-      <w:bookmarkStart w:id="66" w:name="_Toc242275663"/>
+      <w:bookmarkStart w:id="66" w:name="_Toc242275977"/>
       <w:r>
         <w:t>Inserire spessori e proprietà dei terreni</w:t>
       </w:r>
@@ -22826,7 +22826,7 @@
           <w:noProof/>
         </w:rPr>
         <w:drawing>
-          <wp:inline distT="0" distB="0" distL="0" distR="0" wp14:anchorId="4BF6A21D" wp14:editId="4FB60568">
+          <wp:inline distT="0" distB="0" distL="0" distR="0" wp14:anchorId="65722BA3" wp14:editId="6800E886">
             <wp:extent cx="6120000" cy="2570400"/>
             <wp:effectExtent l="0" t="0" r="0" b="0"/>
             <wp:docPr id="8" name="Picture 8" descr="Profilo dell’esempio stratificato con terreno sotto la fondazione e limiti di ricerca evidenziati in blu."/>
@@ -22884,7 +22884,7 @@
         <w:keepNext/>
         <w:spacing w:after="140"/>
       </w:pPr>
-      <w:bookmarkStart w:id="67" w:name="_Toc242275664"/>
+      <w:bookmarkStart w:id="67" w:name="_Toc242275978"/>
       <w:r>
         <w:t>Controllare rilievo falda sisma e ricerca</w:t>
       </w:r>
@@ -22933,7 +22933,7 @@
         <w:keepNext/>
         <w:spacing w:after="140"/>
       </w:pPr>
-      <w:bookmarkStart w:id="68" w:name="_Toc242275665"/>
+      <w:bookmarkStart w:id="68" w:name="_Toc242275979"/>
       <w:r>
         <w:t>Leggere il risultato e riprodurre l’esempio</w:t>
       </w:r>
@@ -23031,7 +23031,7 @@
         <w:keepNext/>
         <w:spacing w:after="140"/>
       </w:pPr>
-      <w:bookmarkStart w:id="69" w:name="_Toc242275666"/>
+      <w:bookmarkStart w:id="69" w:name="_Toc242275980"/>
       <w:r>
         <w:t>Esempio salvato e risultati ripercorribili</w:t>
       </w:r>
@@ -23487,7 +23487,7 @@
           <w:noProof/>
         </w:rPr>
         <w:drawing>
-          <wp:inline distT="0" distB="0" distL="0" distR="0" wp14:anchorId="14FA3C94" wp14:editId="5EF2AC6A">
+          <wp:inline distT="0" distB="0" distL="0" distR="0" wp14:anchorId="05E5547E" wp14:editId="49E72A42">
             <wp:extent cx="6120000" cy="2570400"/>
             <wp:effectExtent l="0" t="0" r="0" b="0"/>
             <wp:docPr id="9" name="Picture 9" descr="Superficie della seconda combinazione: il tasso supera 1 e il cerchio è rosso. L’esempio conserva l’esito sfavorevole per mostrare la lettura della verifica."/>
@@ -23554,7 +23554,7 @@
         <w:keepNext/>
         <w:spacing w:after="140"/>
       </w:pPr>
-      <w:bookmarkStart w:id="70" w:name="_Toc242275667"/>
+      <w:bookmarkStart w:id="70" w:name="_Toc242275981"/>
       <w:r>
         <w:t>Portanza, cedimenti e armature dei muri: procedura</w:t>
       </w:r>
@@ -23574,7 +23574,7 @@
         <w:keepNext/>
         <w:spacing w:after="140"/>
       </w:pPr>
-      <w:bookmarkStart w:id="71" w:name="_Toc242275668"/>
+      <w:bookmarkStart w:id="71" w:name="_Toc242275982"/>
       <w:r>
         <w:lastRenderedPageBreak/>
         <w:t>Scegliere il controllo</w:t>
@@ -24084,7 +24084,7 @@
         <w:keepNext/>
         <w:spacing w:after="140"/>
       </w:pPr>
-      <w:bookmarkStart w:id="72" w:name="_Toc242275669"/>
+      <w:bookmarkStart w:id="72" w:name="_Toc242275983"/>
       <w:r>
         <w:t>Procedura e lettura</w:t>
       </w:r>
@@ -24120,7 +24120,7 @@
         <w:keepNext/>
         <w:spacing w:after="140"/>
       </w:pPr>
-      <w:bookmarkStart w:id="73" w:name="_Toc242275670"/>
+      <w:bookmarkStart w:id="73" w:name="_Toc242275984"/>
       <w:r>
         <w:t>Dati della portanza sismica</w:t>
       </w:r>
@@ -24197,7 +24197,7 @@
         <w:keepNext/>
         <w:spacing w:after="140"/>
       </w:pPr>
-      <w:bookmarkStart w:id="74" w:name="_Toc242275671"/>
+      <w:bookmarkStart w:id="74" w:name="_Toc242275985"/>
       <w:r>
         <w:t>Dati dei cedimenti</w:t>
       </w:r>
@@ -24234,7 +24234,7 @@
         <w:keepNext/>
         <w:spacing w:after="140"/>
       </w:pPr>
-      <w:bookmarkStart w:id="75" w:name="_Toc242275672"/>
+      <w:bookmarkStart w:id="75" w:name="_Toc242275986"/>
       <w:r>
         <w:t>Importare una storia Newmark</w:t>
       </w:r>
@@ -24262,7 +24262,7 @@
         <w:keepNext/>
         <w:spacing w:after="140"/>
       </w:pPr>
-      <w:bookmarkStart w:id="76" w:name="_Toc242275673"/>
+      <w:bookmarkStart w:id="76" w:name="_Toc242275987"/>
       <w:r>
         <w:t>Disporre e proporre le armature</w:t>
       </w:r>
@@ -24313,7 +24313,7 @@
         <w:keepNext/>
         <w:spacing w:after="140"/>
       </w:pPr>
-      <w:bookmarkStart w:id="77" w:name="_Toc242275674"/>
+      <w:bookmarkStart w:id="77" w:name="_Toc242275988"/>
       <w:r>
         <w:t>Tavola delle armature e distinta ferri del muro</w:t>
       </w:r>
@@ -24365,7 +24365,7 @@
         </w:rPr>
         <w:lastRenderedPageBreak/>
         <w:drawing>
-          <wp:inline distT="0" distB="0" distL="0" distR="0" wp14:anchorId="1ECD569F" wp14:editId="4680CBC2">
+          <wp:inline distT="0" distB="0" distL="0" distR="0" wp14:anchorId="444D0091" wp14:editId="591B854E">
             <wp:extent cx="6120000" cy="4316786"/>
             <wp:effectExtent l="0" t="0" r="0" b="0"/>
             <wp:docPr id="10" name="Picture 10" descr="Esempio di distinta del muro con due zone di armatura e tratto di quattro metri"/>
@@ -24423,7 +24423,7 @@
         <w:keepNext/>
         <w:spacing w:after="140"/>
       </w:pPr>
-      <w:bookmarkStart w:id="78" w:name="_Toc242275675"/>
+      <w:bookmarkStart w:id="78" w:name="_Toc242275989"/>
       <w:r>
         <w:t>Efficienza orizzontale della palificata</w:t>
       </w:r>
@@ -24443,7 +24443,7 @@
         <w:keepNext/>
         <w:spacing w:after="140"/>
       </w:pPr>
-      <w:bookmarkStart w:id="79" w:name="_Toc242275676"/>
+      <w:bookmarkStart w:id="79" w:name="_Toc242275990"/>
       <w:r>
         <w:t>Apertura e geometria</w:t>
       </w:r>
@@ -24483,7 +24483,7 @@
         <w:keepNext/>
         <w:spacing w:after="140"/>
       </w:pPr>
-      <w:bookmarkStart w:id="80" w:name="_Toc242275677"/>
+      <w:bookmarkStart w:id="80" w:name="_Toc242275991"/>
       <w:r>
         <w:t>Metodo e applicabilità</w:t>
       </w:r>
@@ -25101,7 +25101,7 @@
         <w:keepNext/>
         <w:spacing w:after="140"/>
       </w:pPr>
-      <w:bookmarkStart w:id="81" w:name="_Toc242275678"/>
+      <w:bookmarkStart w:id="81" w:name="_Toc242275992"/>
       <w:r>
         <w:t>Risultati e confronto</w:t>
       </w:r>
@@ -25148,7 +25148,7 @@
         <w:keepNext/>
         <w:spacing w:after="140"/>
       </w:pPr>
-      <w:bookmarkStart w:id="82" w:name="_Toc242275679"/>
+      <w:bookmarkStart w:id="82" w:name="_Toc242275993"/>
       <w:r>
         <w:lastRenderedPageBreak/>
         <w:t>Risposta elastica del palo orizzontale</w:t>
@@ -25169,7 +25169,7 @@
         <w:keepNext/>
         <w:spacing w:after="140"/>
       </w:pPr>
-      <w:bookmarkStart w:id="83" w:name="_Toc242275680"/>
+      <w:bookmarkStart w:id="83" w:name="_Toc242275994"/>
       <w:r>
         <w:t>Dati iniziali condivisi</w:t>
       </w:r>
@@ -25225,7 +25225,7 @@
         <w:keepNext/>
         <w:spacing w:after="140"/>
       </w:pPr>
-      <w:bookmarkStart w:id="84" w:name="_Toc242275681"/>
+      <w:bookmarkStart w:id="84" w:name="_Toc242275995"/>
       <w:r>
         <w:t>Parametri nella riga dello strato</w:t>
       </w:r>
@@ -25277,7 +25277,7 @@
         <w:keepNext/>
         <w:spacing w:after="140"/>
       </w:pPr>
-      <w:bookmarkStart w:id="85" w:name="_Toc242275682"/>
+      <w:bookmarkStart w:id="85" w:name="_Toc242275996"/>
       <w:r>
         <w:t>Sforzo normale e lettura dei diagrammi</w:t>
       </w:r>
@@ -25314,7 +25314,7 @@
         <w:keepNext/>
         <w:spacing w:after="140"/>
       </w:pPr>
-      <w:bookmarkStart w:id="86" w:name="_Toc242275683"/>
+      <w:bookmarkStart w:id="86" w:name="_Toc242275997"/>
       <w:r>
         <w:t>Materiali e parametri per strato</w:t>
       </w:r>
@@ -25365,7 +25365,7 @@
         <w:keepNext/>
         <w:spacing w:after="140"/>
       </w:pPr>
-      <w:bookmarkStart w:id="87" w:name="_Toc242275684"/>
+      <w:bookmarkStart w:id="87" w:name="_Toc242275998"/>
       <w:r>
         <w:t>Avanzamento e controlli da completare</w:t>
       </w:r>
@@ -25415,7 +25415,7 @@
         <w:keepNext/>
         <w:spacing w:after="140"/>
       </w:pPr>
-      <w:bookmarkStart w:id="88" w:name="_Toc242275685"/>
+      <w:bookmarkStart w:id="88" w:name="_Toc242275999"/>
       <w:r>
         <w:lastRenderedPageBreak/>
         <w:t>Tratti colorati e verificatore della sezione</w:t>
@@ -25499,7 +25499,7 @@
         <w:keepNext/>
         <w:spacing w:after="140"/>
       </w:pPr>
-      <w:bookmarkStart w:id="89" w:name="_Toc242275686"/>
+      <w:bookmarkStart w:id="89" w:name="_Toc242276000"/>
       <w:r>
         <w:t>Approvazione delle ipotesi ed esito delle armature</w:t>
       </w:r>
@@ -25560,7 +25560,7 @@
         <w:keepNext/>
         <w:spacing w:after="140"/>
       </w:pPr>
-      <w:bookmarkStart w:id="90" w:name="_Toc242275687"/>
+      <w:bookmarkStart w:id="90" w:name="_Toc242276001"/>
       <w:r>
         <w:lastRenderedPageBreak/>
         <w:t>Controlli sismici della testa del palo</w:t>
@@ -25646,7 +25646,7 @@
         <w:keepNext/>
         <w:spacing w:after="140"/>
       </w:pPr>
-      <w:bookmarkStart w:id="91" w:name="_Toc242275688"/>
+      <w:bookmarkStart w:id="91" w:name="_Toc242276002"/>
       <w:r>
         <w:t>Ricalcolo delle sollecitazioni e delle resistenze</w:t>
       </w:r>
@@ -25669,7 +25669,7 @@
         <w:keepNext/>
         <w:spacing w:after="140"/>
       </w:pPr>
-      <w:bookmarkStart w:id="92" w:name="_Toc242275689"/>
+      <w:bookmarkStart w:id="92" w:name="_Toc242276003"/>
       <w:r>
         <w:t>Tratti e verifica delle sezioni</w:t>
       </w:r>
@@ -25711,7 +25711,7 @@
         <w:keepNext/>
         <w:spacing w:after="140"/>
       </w:pPr>
-      <w:bookmarkStart w:id="93" w:name="_Toc242275690"/>
+      <w:bookmarkStart w:id="93" w:name="_Toc242276004"/>
       <w:r>
         <w:t>Proposte e vista delle armature</w:t>
       </w:r>
@@ -25806,7 +25806,7 @@
         <w:keepNext/>
         <w:spacing w:after="140"/>
       </w:pPr>
-      <w:bookmarkStart w:id="94" w:name="_Toc242275691"/>
+      <w:bookmarkStart w:id="94" w:name="_Toc242276005"/>
       <w:r>
         <w:t>Esempio riproducibile e limiti</w:t>
       </w:r>
@@ -25837,7 +25837,7 @@
         <w:keepNext/>
         <w:spacing w:after="140"/>
       </w:pPr>
-      <w:bookmarkStart w:id="95" w:name="_Toc242275692"/>
+      <w:bookmarkStart w:id="95" w:name="_Toc242276006"/>
       <w:r>
         <w:t>Wiki e centro della conoscenza</w:t>
       </w:r>
@@ -25849,7 +25849,7 @@
         <w:keepNext/>
         <w:spacing w:after="140"/>
       </w:pPr>
-      <w:bookmarkStart w:id="96" w:name="_Toc242275693"/>
+      <w:bookmarkStart w:id="96" w:name="_Toc242276007"/>
       <w:r>
         <w:t>Wiki del modulo e aiuti sui singoli dati</w:t>
       </w:r>
@@ -25877,7 +25877,7 @@
         <w:keepNext/>
         <w:spacing w:after="140"/>
       </w:pPr>
-      <w:bookmarkStart w:id="97" w:name="_Toc242275694"/>
+      <w:bookmarkStart w:id="97" w:name="_Toc242276008"/>
       <w:r>
         <w:t>Consultare la nuova biblioteca tecnica</w:t>
       </w:r>
@@ -25901,7 +25901,7 @@
         <w:keepNext/>
         <w:spacing w:after="140"/>
       </w:pPr>
-      <w:bookmarkStart w:id="98" w:name="_Toc242275695"/>
+      <w:bookmarkStart w:id="98" w:name="_Toc242276009"/>
       <w:r>
         <w:t>Engineering Handbook</w:t>
       </w:r>
@@ -25959,7 +25959,7 @@
         <w:keepNext/>
         <w:spacing w:after="140"/>
       </w:pPr>
-      <w:bookmarkStart w:id="99" w:name="_Toc242275696"/>
+      <w:bookmarkStart w:id="99" w:name="_Toc242276010"/>
       <w:r>
         <w:t>Cercare e scegliere un percorso</w:t>
       </w:r>
@@ -25979,7 +25979,7 @@
         <w:keepNext/>
         <w:spacing w:after="140"/>
       </w:pPr>
-      <w:bookmarkStart w:id="100" w:name="_Toc242275697"/>
+      <w:bookmarkStart w:id="100" w:name="_Toc242276011"/>
       <w:r>
         <w:lastRenderedPageBreak/>
         <w:t>Leggere e riprendere</w:t>
@@ -26008,7 +26008,7 @@
         <w:keepNext/>
         <w:spacing w:after="140"/>
       </w:pPr>
-      <w:bookmarkStart w:id="101" w:name="_Toc242275698"/>
+      <w:bookmarkStart w:id="101" w:name="_Toc242276012"/>
       <w:r>
         <w:t>Passare dalla teoria al calcolo</w:t>
       </w:r>
@@ -26044,7 +26044,7 @@
         <w:keepNext/>
         <w:spacing w:after="140"/>
       </w:pPr>
-      <w:bookmarkStart w:id="102" w:name="_Toc242275699"/>
+      <w:bookmarkStart w:id="102" w:name="_Toc242276013"/>
       <w:r>
         <w:t>Progetti e problemi frequenti</w:t>
       </w:r>
@@ -26064,7 +26064,7 @@
         <w:keepNext/>
         <w:spacing w:after="140"/>
       </w:pPr>
-      <w:bookmarkStart w:id="103" w:name="_Toc242275700"/>
+      <w:bookmarkStart w:id="103" w:name="_Toc242276014"/>
       <w:r>
         <w:t>Modulo Sezione in c.a.</w:t>
       </w:r>
@@ -26088,7 +26088,7 @@
         <w:keepNext/>
         <w:spacing w:after="140"/>
       </w:pPr>
-      <w:bookmarkStart w:id="104" w:name="_Toc242275701"/>
+      <w:bookmarkStart w:id="104" w:name="_Toc242276015"/>
       <w:r>
         <w:t>A cosa serve e quando usarlo</w:t>
       </w:r>
@@ -26116,7 +26116,7 @@
         <w:keepNext/>
         <w:spacing w:after="140"/>
       </w:pPr>
-      <w:bookmarkStart w:id="105" w:name="_Toc242275702"/>
+      <w:bookmarkStart w:id="105" w:name="_Toc242276016"/>
       <w:r>
         <w:t>Input geometria e unità</w:t>
       </w:r>
@@ -26711,7 +26711,7 @@
         <w:keepNext/>
         <w:spacing w:after="140"/>
       </w:pPr>
-      <w:bookmarkStart w:id="106" w:name="_Toc242275703"/>
+      <w:bookmarkStart w:id="106" w:name="_Toc242276017"/>
       <w:r>
         <w:t>Input materiali armature e default</w:t>
       </w:r>
@@ -26748,7 +26748,7 @@
         <w:keepNext/>
         <w:spacing w:after="140"/>
       </w:pPr>
-      <w:bookmarkStart w:id="107" w:name="_Toc242275704"/>
+      <w:bookmarkStart w:id="107" w:name="_Toc242276018"/>
       <w:r>
         <w:t>Input azioni e convenzioni</w:t>
       </w:r>
@@ -26776,7 +26776,7 @@
         <w:keepNext/>
         <w:spacing w:after="140"/>
       </w:pPr>
-      <w:bookmarkStart w:id="108" w:name="_Toc242275705"/>
+      <w:bookmarkStart w:id="108" w:name="_Toc242276019"/>
       <w:r>
         <w:t>Descrizione del calcolo</w:t>
       </w:r>
@@ -26804,7 +26804,7 @@
         <w:keepNext/>
         <w:spacing w:after="140"/>
       </w:pPr>
-      <w:bookmarkStart w:id="109" w:name="_Toc242275706"/>
+      <w:bookmarkStart w:id="109" w:name="_Toc242276020"/>
       <w:r>
         <w:t>Output e lettura dei risultati</w:t>
       </w:r>
@@ -27322,7 +27322,7 @@
         <w:keepNext/>
         <w:spacing w:after="140"/>
       </w:pPr>
-      <w:bookmarkStart w:id="110" w:name="_Toc242275707"/>
+      <w:bookmarkStart w:id="110" w:name="_Toc242276021"/>
       <w:r>
         <w:t>Warning e problemi frequenti</w:t>
       </w:r>
@@ -27360,7 +27360,7 @@
         <w:keepNext/>
         <w:spacing w:after="140"/>
       </w:pPr>
-      <w:bookmarkStart w:id="111" w:name="_Toc242275708"/>
+      <w:bookmarkStart w:id="111" w:name="_Toc242276022"/>
       <w:r>
         <w:t>Esempio completo dalla Wiki</w:t>
       </w:r>
@@ -27443,7 +27443,7 @@
         <w:keepNext/>
         <w:spacing w:after="140"/>
       </w:pPr>
-      <w:bookmarkStart w:id="112" w:name="_Toc242275709"/>
+      <w:bookmarkStart w:id="112" w:name="_Toc242276023"/>
       <w:r>
         <w:t>Teoria collegata e riepilogo</w:t>
       </w:r>
@@ -27471,7 +27471,7 @@
         <w:keepNext/>
         <w:spacing w:after="140"/>
       </w:pPr>
-      <w:bookmarkStart w:id="113" w:name="_Toc242275710"/>
+      <w:bookmarkStart w:id="113" w:name="_Toc242276024"/>
       <w:r>
         <w:t>Domini tridimensionali e bidimensionali</w:t>
       </w:r>
@@ -27507,7 +27507,7 @@
         <w:keepNext/>
         <w:spacing w:after="140"/>
       </w:pPr>
-      <w:bookmarkStart w:id="114" w:name="_Toc242275711"/>
+      <w:bookmarkStart w:id="114" w:name="_Toc242276025"/>
       <w:r>
         <w:t>Tensioni e fessurazione</w:t>
       </w:r>
@@ -27547,7 +27547,7 @@
         <w:keepNext/>
         <w:spacing w:after="140"/>
       </w:pPr>
-      <w:bookmarkStart w:id="115" w:name="_Toc242275712"/>
+      <w:bookmarkStart w:id="115" w:name="_Toc242276026"/>
       <w:r>
         <w:t>Taglio torsione e dettagli</w:t>
       </w:r>
@@ -27583,7 +27583,7 @@
         <w:keepNext/>
         <w:spacing w:after="140"/>
       </w:pPr>
-      <w:bookmarkStart w:id="116" w:name="_Toc242275713"/>
+      <w:bookmarkStart w:id="116" w:name="_Toc242276027"/>
       <w:r>
         <w:t>Curva momento curvatura e aggiornamento</w:t>
       </w:r>
@@ -27628,7 +27628,7 @@
         <w:keepNext/>
         <w:spacing w:after="140"/>
       </w:pPr>
-      <w:bookmarkStart w:id="117" w:name="_Toc242275714"/>
+      <w:bookmarkStart w:id="117" w:name="_Toc242276028"/>
       <w:r>
         <w:lastRenderedPageBreak/>
         <w:t>Importare ed esportare le azioni</w:t>
@@ -27673,7 +27673,7 @@
         <w:keepNext/>
         <w:spacing w:after="140"/>
       </w:pPr>
-      <w:bookmarkStart w:id="118" w:name="_Toc242275715"/>
+      <w:bookmarkStart w:id="118" w:name="_Toc242276029"/>
       <w:r>
         <w:t>Report short della sezione in calcestruzzo armato</w:t>
       </w:r>
@@ -27721,7 +27721,7 @@
         <w:keepNext/>
         <w:spacing w:after="140"/>
       </w:pPr>
-      <w:bookmarkStart w:id="119" w:name="_Toc242275716"/>
+      <w:bookmarkStart w:id="119" w:name="_Toc242276030"/>
       <w:r>
         <w:t>Leggere asse neutro, mappe e report</w:t>
       </w:r>
@@ -27757,7 +27757,7 @@
         <w:keepNext/>
         <w:spacing w:after="140"/>
       </w:pPr>
-      <w:bookmarkStart w:id="120" w:name="_Toc242275717"/>
+      <w:bookmarkStart w:id="120" w:name="_Toc242276031"/>
       <w:r>
         <w:t>Interpretazione dei risultati e controlli indipendenti</w:t>
       </w:r>
@@ -27777,7 +27777,7 @@
         <w:keepNext/>
         <w:spacing w:after="140"/>
       </w:pPr>
-      <w:bookmarkStart w:id="121" w:name="_Toc242275718"/>
+      <w:bookmarkStart w:id="121" w:name="_Toc242276032"/>
       <w:r>
         <w:t>Dalla domanda alla capacità</w:t>
       </w:r>
@@ -27797,7 +27797,7 @@
         <w:keepNext/>
         <w:spacing w:after="140"/>
       </w:pPr>
-      <w:bookmarkStart w:id="122" w:name="_Toc242275719"/>
+      <w:bookmarkStart w:id="122" w:name="_Toc242276033"/>
       <w:r>
         <w:t>Controllo numerico e fisico</w:t>
       </w:r>
@@ -27817,7 +27817,7 @@
         <w:keepNext/>
         <w:spacing w:after="140"/>
       </w:pPr>
-      <w:bookmarkStart w:id="123" w:name="_Toc242275720"/>
+      <w:bookmarkStart w:id="123" w:name="_Toc242276034"/>
       <w:r>
         <w:t>Archiviazione</w:t>
       </w:r>
@@ -27837,7 +27837,7 @@
         <w:keepNext/>
         <w:spacing w:after="140"/>
       </w:pPr>
-      <w:bookmarkStart w:id="124" w:name="_Toc242275721"/>
+      <w:bookmarkStart w:id="124" w:name="_Toc242276035"/>
       <w:r>
         <w:lastRenderedPageBreak/>
         <w:t>Tutorial dal modello Beam alla verifica di sezione</w:t>
@@ -27858,7 +27858,7 @@
         <w:keepNext/>
         <w:spacing w:after="140"/>
       </w:pPr>
-      <w:bookmarkStart w:id="125" w:name="_Toc242275722"/>
+      <w:bookmarkStart w:id="125" w:name="_Toc242276036"/>
       <w:r>
         <w:t>Capisci e controlla</w:t>
       </w:r>
@@ -27878,7 +27878,7 @@
         <w:keepNext/>
         <w:spacing w:after="140"/>
       </w:pPr>
-      <w:bookmarkStart w:id="126" w:name="_Toc242275723"/>
+      <w:bookmarkStart w:id="126" w:name="_Toc242276037"/>
       <w:r>
         <w:t>Calcola e modifica</w:t>
       </w:r>
@@ -27898,7 +27898,7 @@
         <w:keepNext/>
         <w:spacing w:after="140"/>
       </w:pPr>
-      <w:bookmarkStart w:id="127" w:name="_Toc242275724"/>
+      <w:bookmarkStart w:id="127" w:name="_Toc242276038"/>
       <w:r>
         <w:t>Osserva e archivia</w:t>
       </w:r>

</xml_diff>